<commit_message>
Neues Konzept: 510 m² Gastro, 2 Ankermieter-Büros, 3+5 Wohnungen; Excel, Decks, Businessplan angepasst
Co-Authored-By: Claude Sonnet 5.5 <noreply@anthropic.com>
Claude-Session: https://claude.ai/code/session_01HJGZfxHv7bzYyqdLwg8aFJ
</commit_message>
<xml_diff>
--- a/praesentation/Businessplan_Baufeld3_Neue-Mitte-Werlte.docx
+++ b/praesentation/Businessplan_Baufeld3_Neue-Mitte-Werlte.docx
@@ -185,7 +185,7 @@
               <w:rPr>
                 <w:sz w:val="20"/>
               </w:rPr>
-              <w:t>Neubau eines gemischt genutzten Gebäudes mit Gastro im Erdgeschoss und 8 Mietwohnungen auf 1. Obergeschoss und Staffelgeschoss in Holzbau</w:t>
+              <w:t>Neubau eines gemischt genutzten Gebäudes: große Gastro im Erdgeschoss, 2 Büro-Ankermieter und 3 Wohnungen im 1. Obergeschoss, 5 Wohnungen im Staffelgeschoss in Holzbau</w:t>
             </w:r>
           </w:p>
         </w:tc>
@@ -267,7 +267,7 @@
               <w:rPr>
                 <w:sz w:val="20"/>
               </w:rPr>
-              <w:t>4.490.838 € (100 % Fremdkapital), davon KfW-Kredite 1.982.000 €</w:t>
+              <w:t>4.845.506 € (100 % Fremdkapital), davon KfW-Kredite 2.347.500 €</w:t>
             </w:r>
           </w:p>
         </w:tc>
@@ -347,7 +347,7 @@
           <w:b w:val="0"/>
           <w:i w:val="0"/>
         </w:rPr>
-        <w:t>Auf dem Baufeld 3 der Neuen Mitte Werlte entsteht ein dreigeschossiges Gebäude (zwei Vollgeschosse plus Staffelgeschoss in Holzbau) mit 540 m² Grundfläche und 1.540 m² Bruttogrundfläche (BGF, alle Geschossflächen zusammen). Im Erdgeschoss liegt eine große Gastro mit ca. 460 m², darüber 8 Wohnungen mit zusammen 725 m² Wohnfläche. Die Wohnungen werden langfristig vermietet.</w:t>
+        <w:t>Auf dem Baufeld 3 der Neuen Mitte Werlte entsteht ein dreigeschossiges Gebäude (zwei Vollgeschosse plus Staffelgeschoss in Holzbau) mit 576 m² Grundfläche (32 × 18 m, das Maximum der Grundflächenzahl 0,6) und 1.650 m² Bruttogrundfläche (BGF, alle Geschossflächen zusammen). Im Erdgeschoss liegt eine große Gastro mit ca. 510 m² und ca. 190 Plätzen. Im 1. Obergeschoss mieten zwei Ankermieter Büros (100 m² Versicherungsgesellschaft o. ä., 65 m² Makler o. ä., 10 Jahre fest), dazu kommen 3 Wohnungen. Im Staffelgeschoss in Holzbau liegen 5 Wohnungen. Die 8 Wohnungen haben zusammen 655 m² Wohnfläche und werden langfristig vermietet.</w:t>
       </w:r>
     </w:p>
     <w:tbl>
@@ -455,7 +455,7 @@
               <w:rPr>
                 <w:sz w:val="19"/>
               </w:rPr>
-              <w:t>4.490.838 €</w:t>
+              <w:t>4.845.506 €</w:t>
             </w:r>
           </w:p>
         </w:tc>
@@ -497,7 +497,7 @@
               <w:rPr>
                 <w:sz w:val="19"/>
               </w:rPr>
-              <w:t>4.490.838 €</w:t>
+              <w:t>4.845.506 €</w:t>
             </w:r>
           </w:p>
         </w:tc>
@@ -539,7 +539,7 @@
               <w:rPr>
                 <w:sz w:val="19"/>
               </w:rPr>
-              <w:t>1.982.000 € (44 %)</w:t>
+              <w:t>2.347.500 € (48 %)</w:t>
             </w:r>
           </w:p>
         </w:tc>
@@ -581,7 +581,7 @@
               <w:rPr>
                 <w:sz w:val="19"/>
               </w:rPr>
-              <w:t>3,43 %</w:t>
+              <w:t>3,39 %</w:t>
             </w:r>
           </w:p>
         </w:tc>
@@ -623,7 +623,7 @@
               <w:rPr>
                 <w:sz w:val="19"/>
               </w:rPr>
-              <w:t>16.560 €</w:t>
+              <w:t>17.733 €</w:t>
             </w:r>
           </w:p>
         </w:tc>
@@ -665,7 +665,7 @@
               <w:rPr>
                 <w:sz w:val="19"/>
               </w:rPr>
-              <w:t>21.991 €</w:t>
+              <w:t>27.344 €</w:t>
             </w:r>
           </w:p>
         </w:tc>
@@ -707,7 +707,7 @@
               <w:rPr>
                 <w:sz w:val="19"/>
               </w:rPr>
-              <w:t>+5.430 €</w:t>
+              <w:t>+9.610 €</w:t>
             </w:r>
           </w:p>
         </w:tc>
@@ -749,7 +749,7 @@
               <w:rPr>
                 <w:sz w:val="19"/>
               </w:rPr>
-              <w:t>1,33 gesamt, 0,74 nur Immobilie</w:t>
+              <w:t>1,54 gesamt, 0,71 nur Immobilie</w:t>
             </w:r>
           </w:p>
         </w:tc>
@@ -791,7 +791,7 @@
               <w:rPr>
                 <w:sz w:val="19"/>
               </w:rPr>
-              <w:t>3.060.908 €</w:t>
+              <w:t>2.877.244 €</w:t>
             </w:r>
           </w:p>
         </w:tc>
@@ -833,7 +833,7 @@
               <w:rPr>
                 <w:sz w:val="19"/>
               </w:rPr>
-              <w:t>2.754.817 €</w:t>
+              <w:t>2.589.520 €</w:t>
             </w:r>
           </w:p>
         </w:tc>
@@ -873,7 +873,7 @@
               <w:rPr>
                 <w:sz w:val="19"/>
               </w:rPr>
-              <w:t>163 %</w:t>
+              <w:t>187 %</w:t>
             </w:r>
           </w:p>
         </w:tc>
@@ -909,7 +909,22 @@
         <w:t xml:space="preserve">Der Ertrag trägt die Raten, aber nur mit der Gastro. </w:t>
       </w:r>
       <w:r>
-        <w:t>Mit dem Gastro-Gewinn liegt die Kapitaldienstdeckung bei 1,33. Allein aus Miete und Pacht wären es 0,74, die Immobilie trägt sich also nicht selbst.</w:t>
+        <w:t>Mit dem Gastro-Gewinn liegt die Kapitaldienstdeckung bei 1,54. Allein aus Miete, Büromiete und Pacht wären es 0,71, aus Wohnen und Büro allein 0,45.</w:t>
+      </w:r>
+    </w:p>
+    <w:p>
+      <w:pPr>
+        <w:pStyle w:val="ListBullet"/>
+        <w:spacing w:after="60"/>
+      </w:pPr>
+      <w:r>
+        <w:rPr>
+          <w:b/>
+        </w:rPr>
+        <w:t xml:space="preserve">Die Büro-Ankermieter sichern einen Teil. </w:t>
+      </w:r>
+      <w:r>
+        <w:t>Die zwei Büros bringen 19.200 € im Jahr über 10 Jahre fest und decken 8 % des Kapitaldienstes, zusammen mit den Wohnungen decken die langfristigen Mieten 45 %.</w:t>
       </w:r>
     </w:p>
     <w:p>
@@ -924,7 +939,7 @@
         <w:t xml:space="preserve">KfW senkt die Zinslast deutlich. </w:t>
       </w:r>
       <w:r>
-        <w:t>Die drei KfW-Kreditprogramme decken 44 % des Darlehens zu 2,5 bis 3,0 % ab, der Mischzins liegt bei 3,43 % statt 4,0 %.</w:t>
+        <w:t>Die drei KfW-Kreditprogramme decken 48 % des Darlehens zu 2,5 bis 3,0 % ab, der Mischzins liegt bei 3,39 % statt 4,0 %.</w:t>
       </w:r>
     </w:p>
     <w:p>
@@ -939,7 +954,7 @@
         <w:t xml:space="preserve">Der Beleihungswert ist die Hürde. </w:t>
       </w:r>
       <w:r>
-        <w:t>Der Ertragswert von 3,06 Mio. € liegt unter den Kosten von 4,49 Mio. €. Die Bank wird zusätzliche Sicherheiten oder Eigenkapital in der Größenordnung von 2,29 Mio. € verlangen.</w:t>
+        <w:t>Der Ertragswert von 2,88 Mio. € liegt weit unter den Kosten von 4,85 Mio. €. Die Bank wird zusätzliche Sicherheiten oder Eigenkapital in der Größenordnung von 2,77 Mio. € verlangen.</w:t>
       </w:r>
     </w:p>
     <w:p>
@@ -1117,7 +1132,7 @@
               <w:rPr>
                 <w:sz w:val="18"/>
               </w:rPr>
-              <w:t>540 m² (56 %)</w:t>
+              <w:t>576 m² (60 %, Maximum)</w:t>
             </w:r>
           </w:p>
         </w:tc>
@@ -1350,7 +1365,7 @@
               <w:rPr>
                 <w:sz w:val="18"/>
               </w:rPr>
-              <w:t>ca. 8–10 auf dem Grundstück, Bedarf ca. 45</w:t>
+              <w:t>ca. 6–8 auf dem Grundstück, Bedarf ca. 55</w:t>
             </w:r>
           </w:p>
         </w:tc>
@@ -1370,7 +1385,7 @@
           <w:b w:val="0"/>
           <w:i w:val="0"/>
         </w:rPr>
-        <w:t>Offene Punkte mit der Stadt: Zulässigkeit der 540 m² Grundfläche (das Baufenster im Plan wirkt nach unserer Schätzung kleiner), Einordnung des Staffelgeschosses (460 m², 85 % der Fläche darunter) und des Flachdachs sowie die Stellplätze (Mitnutzung der öffentlichen Parkfläche oder Ablöse). Diese Punkte sind schriftlich zu klären.</w:t>
+        <w:t>Offene Punkte mit der Stadt: Zulässigkeit der 576 m² Grundfläche (das Baufenster im Plan wirkt nach unserer Schätzung kleiner), Einordnung des Staffelgeschosses (498 m², 86 % der Fläche darunter) und des Flachdachs sowie die Stellplätze (Mitnutzung der öffentlichen Parkfläche oder Ablöse). Diese Punkte sind schriftlich zu klären.</w:t>
       </w:r>
     </w:p>
     <w:p>
@@ -1396,7 +1411,7 @@
           <w:b w:val="0"/>
           <w:i w:val="0"/>
         </w:rPr>
-        <w:t>Das Gebäude hat eine Grundfläche von ca. 30 × 18 m. Das Erdgeschoss ist vollverglast und nimmt die Gastro auf, Treppenhaus und Aufzug liegen am Westende und erschließen die Wohnungen getrennt von der Gastro. Das 1. Obergeschoss ist in rotbraunem Klinker mit Balkonen und Milchglas-Brüstungen ausgeführt, das Staffelgeschoss in Holzbau mit schmaler Dachterrasse (ca. 0,8 m, 72 m²) rundum. Holzbau spart ca. 184.000 € gegenüber Massivbau (Annahme, Angebot der Zimmerei nötig) und hilft beim Effizienzhaus-40-Standard.</w:t>
+        <w:t>Das Gebäude hat eine Grundfläche von 32 × 18 m (576 m², das Maximum der Grundflächenzahl). Das Erdgeschoss ist vollverglast und gehört ganz der Gastro, Treppenhaus und Aufzug liegen am Westende und erschließen Büros und Wohnungen getrennt von der Gastro. Im 1. Obergeschoss liegen die zwei Büros und 3 Wohnungen, im Staffelgeschoss 5 Wohnungen. Das 1. Obergeschoss ist in rotbraunem Klinker mit Balkonen und Milchglas-Brüstungen ausgeführt, das Staffelgeschoss in Holzbau mit schmaler Dachterrasse (ca. 0,8 m, 77 m²) rundum. Holzbau spart ca. 184.000 € gegenüber Massivbau (Annahme, Angebot der Zimmerei nötig) und hilft beim Effizienzhaus-40-Standard.</w:t>
       </w:r>
     </w:p>
     <w:tbl>
@@ -1568,7 +1583,7 @@
               <w:rPr>
                 <w:sz w:val="18"/>
               </w:rPr>
-              <w:t>540 m²</w:t>
+              <w:t>576 m²</w:t>
             </w:r>
           </w:p>
         </w:tc>
@@ -1622,7 +1637,7 @@
               <w:rPr>
                 <w:sz w:val="18"/>
               </w:rPr>
-              <w:t>ca. 460 m²</w:t>
+              <w:t>ca. 510 m²</w:t>
             </w:r>
           </w:p>
         </w:tc>
@@ -1663,7 +1678,7 @@
               <w:rPr>
                 <w:sz w:val="18"/>
               </w:rPr>
-              <w:t>540 m²</w:t>
+              <w:t>576 m²</w:t>
             </w:r>
           </w:p>
         </w:tc>
@@ -1681,7 +1696,7 @@
               <w:rPr>
                 <w:sz w:val="18"/>
               </w:rPr>
-              <w:t>Wohnen</w:t>
+              <w:t>Büro 1, Büro 2, Wohnen</w:t>
             </w:r>
           </w:p>
         </w:tc>
@@ -1699,7 +1714,7 @@
               <w:rPr>
                 <w:sz w:val="18"/>
               </w:rPr>
-              <w:t>5 × 83 m²</w:t>
+              <w:t>2 + 3 × 107 m²</w:t>
             </w:r>
           </w:p>
         </w:tc>
@@ -1717,7 +1732,7 @@
               <w:rPr>
                 <w:sz w:val="18"/>
               </w:rPr>
-              <w:t>415 m²</w:t>
+              <w:t>165 m² Büro, 321 m² Wohnen</w:t>
             </w:r>
           </w:p>
         </w:tc>
@@ -1758,7 +1773,7 @@
               <w:rPr>
                 <w:sz w:val="18"/>
               </w:rPr>
-              <w:t>460 m²</w:t>
+              <w:t>498 m²</w:t>
             </w:r>
           </w:p>
         </w:tc>
@@ -1776,7 +1791,7 @@
               <w:rPr>
                 <w:sz w:val="18"/>
               </w:rPr>
-              <w:t>Wohnen (Penthouses)</w:t>
+              <w:t>Wohnen</w:t>
             </w:r>
           </w:p>
         </w:tc>
@@ -1794,7 +1809,7 @@
               <w:rPr>
                 <w:sz w:val="18"/>
               </w:rPr>
-              <w:t>3 × 103 m²</w:t>
+              <w:t>5 × 67 m²</w:t>
             </w:r>
           </w:p>
         </w:tc>
@@ -1812,7 +1827,7 @@
               <w:rPr>
                 <w:sz w:val="18"/>
               </w:rPr>
-              <w:t>310 m²</w:t>
+              <w:t>334 m²</w:t>
             </w:r>
           </w:p>
         </w:tc>
@@ -1855,7 +1870,7 @@
                 <w:b/>
                 <w:sz w:val="18"/>
               </w:rPr>
-              <w:t>1.540 m²</w:t>
+              <w:t>1.650 m²</w:t>
             </w:r>
           </w:p>
         </w:tc>
@@ -1892,7 +1907,7 @@
                 <w:b/>
                 <w:sz w:val="18"/>
               </w:rPr>
-              <w:t>8 Wohnungen</w:t>
+              <w:t>8 Wohnungen, 2 Büros</w:t>
             </w:r>
           </w:p>
         </w:tc>
@@ -1911,7 +1926,7 @@
                 <w:b/>
                 <w:sz w:val="18"/>
               </w:rPr>
-              <w:t>725 m² Wohnfläche</w:t>
+              <w:t>655 m² Wohnen, 165 m² Büro</w:t>
             </w:r>
           </w:p>
         </w:tc>
@@ -2149,7 +2164,7 @@
               <w:rPr>
                 <w:sz w:val="18"/>
               </w:rPr>
-              <w:t>83,0 m²</w:t>
+              <w:t>107,0 m²</w:t>
             </w:r>
           </w:p>
         </w:tc>
@@ -2187,7 +2202,7 @@
               <w:rPr>
                 <w:sz w:val="18"/>
               </w:rPr>
-              <w:t>928 €</w:t>
+              <w:t>1.196 €</w:t>
             </w:r>
           </w:p>
         </w:tc>
@@ -2206,7 +2221,7 @@
               <w:rPr>
                 <w:sz w:val="18"/>
               </w:rPr>
-              <w:t>11.132 €</w:t>
+              <w:t>14.351 €</w:t>
             </w:r>
           </w:p>
         </w:tc>
@@ -2266,7 +2281,7 @@
               <w:rPr>
                 <w:sz w:val="18"/>
               </w:rPr>
-              <w:t>83,0 m²</w:t>
+              <w:t>107,0 m²</w:t>
             </w:r>
           </w:p>
         </w:tc>
@@ -2304,7 +2319,7 @@
               <w:rPr>
                 <w:sz w:val="18"/>
               </w:rPr>
-              <w:t>928 €</w:t>
+              <w:t>1.196 €</w:t>
             </w:r>
           </w:p>
         </w:tc>
@@ -2323,7 +2338,7 @@
               <w:rPr>
                 <w:sz w:val="18"/>
               </w:rPr>
-              <w:t>11.132 €</w:t>
+              <w:t>14.351 €</w:t>
             </w:r>
           </w:p>
         </w:tc>
@@ -2383,7 +2398,7 @@
               <w:rPr>
                 <w:sz w:val="18"/>
               </w:rPr>
-              <w:t>83,0 m²</w:t>
+              <w:t>107,0 m²</w:t>
             </w:r>
           </w:p>
         </w:tc>
@@ -2421,7 +2436,7 @@
               <w:rPr>
                 <w:sz w:val="18"/>
               </w:rPr>
-              <w:t>928 €</w:t>
+              <w:t>1.196 €</w:t>
             </w:r>
           </w:p>
         </w:tc>
@@ -2440,7 +2455,7 @@
               <w:rPr>
                 <w:sz w:val="18"/>
               </w:rPr>
-              <w:t>11.132 €</w:t>
+              <w:t>14.351 €</w:t>
             </w:r>
           </w:p>
         </w:tc>
@@ -2481,7 +2496,7 @@
               <w:rPr>
                 <w:sz w:val="18"/>
               </w:rPr>
-              <w:t>1. OG</w:t>
+              <w:t>Staffel</w:t>
             </w:r>
           </w:p>
         </w:tc>
@@ -2500,7 +2515,7 @@
               <w:rPr>
                 <w:sz w:val="18"/>
               </w:rPr>
-              <w:t>83,0 m²</w:t>
+              <w:t>66,8 m²</w:t>
             </w:r>
           </w:p>
         </w:tc>
@@ -2538,7 +2553,7 @@
               <w:rPr>
                 <w:sz w:val="18"/>
               </w:rPr>
-              <w:t>928 €</w:t>
+              <w:t>747 €</w:t>
             </w:r>
           </w:p>
         </w:tc>
@@ -2557,7 +2572,7 @@
               <w:rPr>
                 <w:sz w:val="18"/>
               </w:rPr>
-              <w:t>11.132 €</w:t>
+              <w:t>8.959 €</w:t>
             </w:r>
           </w:p>
         </w:tc>
@@ -2598,7 +2613,7 @@
               <w:rPr>
                 <w:sz w:val="18"/>
               </w:rPr>
-              <w:t>1. OG</w:t>
+              <w:t>Staffel</w:t>
             </w:r>
           </w:p>
         </w:tc>
@@ -2617,7 +2632,7 @@
               <w:rPr>
                 <w:sz w:val="18"/>
               </w:rPr>
-              <w:t>83,0 m²</w:t>
+              <w:t>66,8 m²</w:t>
             </w:r>
           </w:p>
         </w:tc>
@@ -2655,7 +2670,7 @@
               <w:rPr>
                 <w:sz w:val="18"/>
               </w:rPr>
-              <w:t>928 €</w:t>
+              <w:t>747 €</w:t>
             </w:r>
           </w:p>
         </w:tc>
@@ -2674,7 +2689,7 @@
               <w:rPr>
                 <w:sz w:val="18"/>
               </w:rPr>
-              <w:t>11.132 €</w:t>
+              <w:t>8.959 €</w:t>
             </w:r>
           </w:p>
         </w:tc>
@@ -2734,7 +2749,7 @@
               <w:rPr>
                 <w:sz w:val="18"/>
               </w:rPr>
-              <w:t>103,3 m²</w:t>
+              <w:t>66,8 m²</w:t>
             </w:r>
           </w:p>
         </w:tc>
@@ -2772,7 +2787,7 @@
               <w:rPr>
                 <w:sz w:val="18"/>
               </w:rPr>
-              <w:t>1.155 €</w:t>
+              <w:t>747 €</w:t>
             </w:r>
           </w:p>
         </w:tc>
@@ -2791,7 +2806,7 @@
               <w:rPr>
                 <w:sz w:val="18"/>
               </w:rPr>
-              <w:t>13.859 €</w:t>
+              <w:t>8.959 €</w:t>
             </w:r>
           </w:p>
         </w:tc>
@@ -2851,7 +2866,7 @@
               <w:rPr>
                 <w:sz w:val="18"/>
               </w:rPr>
-              <w:t>103,3 m²</w:t>
+              <w:t>66,8 m²</w:t>
             </w:r>
           </w:p>
         </w:tc>
@@ -2889,7 +2904,7 @@
               <w:rPr>
                 <w:sz w:val="18"/>
               </w:rPr>
-              <w:t>1.155 €</w:t>
+              <w:t>747 €</w:t>
             </w:r>
           </w:p>
         </w:tc>
@@ -2908,7 +2923,7 @@
               <w:rPr>
                 <w:sz w:val="18"/>
               </w:rPr>
-              <w:t>13.859 €</w:t>
+              <w:t>8.959 €</w:t>
             </w:r>
           </w:p>
         </w:tc>
@@ -2968,7 +2983,7 @@
               <w:rPr>
                 <w:sz w:val="18"/>
               </w:rPr>
-              <w:t>103,3 m²</w:t>
+              <w:t>66,8 m²</w:t>
             </w:r>
           </w:p>
         </w:tc>
@@ -3006,7 +3021,7 @@
               <w:rPr>
                 <w:sz w:val="18"/>
               </w:rPr>
-              <w:t>1.155 €</w:t>
+              <w:t>747 €</w:t>
             </w:r>
           </w:p>
         </w:tc>
@@ -3025,7 +3040,7 @@
               <w:rPr>
                 <w:sz w:val="18"/>
               </w:rPr>
-              <w:t>13.859 €</w:t>
+              <w:t>8.959 €</w:t>
             </w:r>
           </w:p>
         </w:tc>
@@ -3090,7 +3105,7 @@
                 <w:b/>
                 <w:sz w:val="18"/>
               </w:rPr>
-              <w:t>725,0 m²</w:t>
+              <w:t>655,0 m²</w:t>
             </w:r>
           </w:p>
         </w:tc>
@@ -3131,7 +3146,7 @@
                 <w:b/>
                 <w:sz w:val="18"/>
               </w:rPr>
-              <w:t>8.103 €</w:t>
+              <w:t>7.321 €</w:t>
             </w:r>
           </w:p>
         </w:tc>
@@ -3152,7 +3167,7 @@
                 <w:b/>
                 <w:sz w:val="18"/>
               </w:rPr>
-              <w:t>97.235 €</w:t>
+              <w:t>87.847 €</w:t>
             </w:r>
           </w:p>
         </w:tc>
@@ -3175,7 +3190,7 @@
               <w:rPr>
                 <w:sz w:val="18"/>
               </w:rPr>
-              <w:t>Gastro-Pacht (12 €/m²)</w:t>
+              <w:t>Gastro-Pacht (10 €/m²)</w:t>
             </w:r>
           </w:p>
         </w:tc>
@@ -3212,7 +3227,7 @@
               <w:rPr>
                 <w:sz w:val="18"/>
               </w:rPr>
-              <w:t>460,0 m²</w:t>
+              <w:t>510,0 m²</w:t>
             </w:r>
           </w:p>
         </w:tc>
@@ -3231,7 +3246,7 @@
               <w:rPr>
                 <w:sz w:val="18"/>
               </w:rPr>
-              <w:t>12,00 €</w:t>
+              <w:t>10,00 €</w:t>
             </w:r>
           </w:p>
         </w:tc>
@@ -3250,7 +3265,7 @@
               <w:rPr>
                 <w:sz w:val="18"/>
               </w:rPr>
-              <w:t>5.520 €</w:t>
+              <w:t>5.100 €</w:t>
             </w:r>
           </w:p>
         </w:tc>
@@ -3269,7 +3284,7 @@
               <w:rPr>
                 <w:sz w:val="18"/>
               </w:rPr>
-              <w:t>66.240 €</w:t>
+              <w:t>61.200 €</w:t>
             </w:r>
           </w:p>
         </w:tc>
@@ -3281,6 +3296,240 @@
         <w:tc>
           <w:tcPr>
             <w:tcW w:type="dxa" w:w="2041"/>
+          </w:tcPr>
+          <w:p>
+            <w:pPr>
+              <w:keepNext/>
+              <w:spacing w:after="20" w:before="20"/>
+            </w:pPr>
+            <w:r/>
+            <w:r>
+              <w:rPr>
+                <w:sz w:val="18"/>
+              </w:rPr>
+              <w:t>Büro 1 (Ankermieter)</w:t>
+            </w:r>
+          </w:p>
+        </w:tc>
+        <w:tc>
+          <w:tcPr>
+            <w:tcW w:type="dxa" w:w="1134"/>
+          </w:tcPr>
+          <w:p>
+            <w:pPr>
+              <w:keepNext/>
+              <w:spacing w:after="20" w:before="20"/>
+            </w:pPr>
+            <w:r/>
+            <w:r>
+              <w:rPr>
+                <w:sz w:val="18"/>
+              </w:rPr>
+              <w:t>1. OG</w:t>
+            </w:r>
+          </w:p>
+        </w:tc>
+        <w:tc>
+          <w:tcPr>
+            <w:tcW w:type="dxa" w:w="1361"/>
+          </w:tcPr>
+          <w:p>
+            <w:pPr>
+              <w:keepNext/>
+              <w:spacing w:after="20" w:before="20"/>
+              <w:jc w:val="right"/>
+            </w:pPr>
+            <w:r/>
+            <w:r>
+              <w:rPr>
+                <w:sz w:val="18"/>
+              </w:rPr>
+              <w:t>100,0 m²</w:t>
+            </w:r>
+          </w:p>
+        </w:tc>
+        <w:tc>
+          <w:tcPr>
+            <w:tcW w:type="dxa" w:w="1361"/>
+          </w:tcPr>
+          <w:p>
+            <w:pPr>
+              <w:keepNext/>
+              <w:spacing w:after="20" w:before="20"/>
+              <w:jc w:val="right"/>
+            </w:pPr>
+            <w:r/>
+            <w:r>
+              <w:rPr>
+                <w:sz w:val="18"/>
+              </w:rPr>
+              <w:t>9,50 €</w:t>
+            </w:r>
+          </w:p>
+        </w:tc>
+        <w:tc>
+          <w:tcPr>
+            <w:tcW w:type="dxa" w:w="1814"/>
+          </w:tcPr>
+          <w:p>
+            <w:pPr>
+              <w:keepNext/>
+              <w:spacing w:after="20" w:before="20"/>
+              <w:jc w:val="right"/>
+            </w:pPr>
+            <w:r/>
+            <w:r>
+              <w:rPr>
+                <w:sz w:val="18"/>
+              </w:rPr>
+              <w:t>950 €</w:t>
+            </w:r>
+          </w:p>
+        </w:tc>
+        <w:tc>
+          <w:tcPr>
+            <w:tcW w:type="dxa" w:w="1701"/>
+          </w:tcPr>
+          <w:p>
+            <w:pPr>
+              <w:keepNext/>
+              <w:spacing w:after="20" w:before="20"/>
+              <w:jc w:val="right"/>
+            </w:pPr>
+            <w:r/>
+            <w:r>
+              <w:rPr>
+                <w:sz w:val="18"/>
+              </w:rPr>
+              <w:t>11.400 €</w:t>
+            </w:r>
+          </w:p>
+        </w:tc>
+      </w:tr>
+      <w:tr>
+        <w:trPr>
+          <w:cantSplit/>
+        </w:trPr>
+        <w:tc>
+          <w:tcPr>
+            <w:tcW w:type="dxa" w:w="2041"/>
+          </w:tcPr>
+          <w:p>
+            <w:pPr>
+              <w:keepNext/>
+              <w:spacing w:after="20" w:before="20"/>
+            </w:pPr>
+            <w:r/>
+            <w:r>
+              <w:rPr>
+                <w:sz w:val="18"/>
+              </w:rPr>
+              <w:t>Büro 2 (Ankermieter)</w:t>
+            </w:r>
+          </w:p>
+        </w:tc>
+        <w:tc>
+          <w:tcPr>
+            <w:tcW w:type="dxa" w:w="1134"/>
+          </w:tcPr>
+          <w:p>
+            <w:pPr>
+              <w:keepNext/>
+              <w:spacing w:after="20" w:before="20"/>
+            </w:pPr>
+            <w:r/>
+            <w:r>
+              <w:rPr>
+                <w:sz w:val="18"/>
+              </w:rPr>
+              <w:t>1. OG</w:t>
+            </w:r>
+          </w:p>
+        </w:tc>
+        <w:tc>
+          <w:tcPr>
+            <w:tcW w:type="dxa" w:w="1361"/>
+          </w:tcPr>
+          <w:p>
+            <w:pPr>
+              <w:keepNext/>
+              <w:spacing w:after="20" w:before="20"/>
+              <w:jc w:val="right"/>
+            </w:pPr>
+            <w:r/>
+            <w:r>
+              <w:rPr>
+                <w:sz w:val="18"/>
+              </w:rPr>
+              <w:t>65,0 m²</w:t>
+            </w:r>
+          </w:p>
+        </w:tc>
+        <w:tc>
+          <w:tcPr>
+            <w:tcW w:type="dxa" w:w="1361"/>
+          </w:tcPr>
+          <w:p>
+            <w:pPr>
+              <w:keepNext/>
+              <w:spacing w:after="20" w:before="20"/>
+              <w:jc w:val="right"/>
+            </w:pPr>
+            <w:r/>
+            <w:r>
+              <w:rPr>
+                <w:sz w:val="18"/>
+              </w:rPr>
+              <w:t>10,00 €</w:t>
+            </w:r>
+          </w:p>
+        </w:tc>
+        <w:tc>
+          <w:tcPr>
+            <w:tcW w:type="dxa" w:w="1814"/>
+          </w:tcPr>
+          <w:p>
+            <w:pPr>
+              <w:keepNext/>
+              <w:spacing w:after="20" w:before="20"/>
+              <w:jc w:val="right"/>
+            </w:pPr>
+            <w:r/>
+            <w:r>
+              <w:rPr>
+                <w:sz w:val="18"/>
+              </w:rPr>
+              <w:t>650 €</w:t>
+            </w:r>
+          </w:p>
+        </w:tc>
+        <w:tc>
+          <w:tcPr>
+            <w:tcW w:type="dxa" w:w="1701"/>
+          </w:tcPr>
+          <w:p>
+            <w:pPr>
+              <w:keepNext/>
+              <w:spacing w:after="20" w:before="20"/>
+              <w:jc w:val="right"/>
+            </w:pPr>
+            <w:r/>
+            <w:r>
+              <w:rPr>
+                <w:sz w:val="18"/>
+              </w:rPr>
+              <w:t>7.800 €</w:t>
+            </w:r>
+          </w:p>
+        </w:tc>
+      </w:tr>
+      <w:tr>
+        <w:trPr>
+          <w:cantSplit/>
+        </w:trPr>
+        <w:tc>
+          <w:tcPr>
+            <w:tcW w:type="dxa" w:w="2041"/>
             <w:shd w:val="clear" w:color="auto" w:fill="E3E8E5"/>
           </w:tcPr>
           <w:p>
@@ -3369,7 +3618,7 @@
                 <w:b/>
                 <w:sz w:val="18"/>
               </w:rPr>
-              <w:t>13.623 €</w:t>
+              <w:t>14.021 €</w:t>
             </w:r>
           </w:p>
         </w:tc>
@@ -3389,7 +3638,7 @@
                 <w:b/>
                 <w:sz w:val="18"/>
               </w:rPr>
-              <w:t>163.475 €</w:t>
+              <w:t>168.247 €</w:t>
             </w:r>
           </w:p>
         </w:tc>
@@ -3416,7 +3665,7 @@
         <w:pStyle w:val="Heading1"/>
       </w:pPr>
       <w:r>
-        <w:t>4  Gastro-Konzept</w:t>
+        <w:t>4  Gewerbeflächen: große Gastro und zwei Ankermieter</w:t>
       </w:r>
     </w:p>
     <w:p>
@@ -3425,7 +3674,1126 @@
           <w:b w:val="0"/>
           <w:i w:val="0"/>
         </w:rPr>
-        <w:t>Die Gastro nutzt das ganze Erdgeschoss (ca. 460 m²) als Bar-Restaurant für den ganzen Tag: Frühstück und Brunch am Wochenende, Mittagstisch für Beschäftigte aus Rathaus und Umgebung, Abendrestaurant mit regionaler, moderner Küche, Bar mit Theke und ein Séparée (abgetrennter Raum) mit 20 Plätzen für Feiern. Die Gestaltung folgt dem Referenzbild des Bauherrn: olivgrüne Vertäfelung, Cognac-Samtbanketten, Eiche, anthrazitfarbene Theke, Stahl-Glas-Trennwand und warmes Licht.</w:t>
+        <w:t>Die Grundfläche wurde auf das zulässige Maximum von 576 m² (GRZ 0,6 × 960 m²) vergrößert. Das Erdgeschoss gehört vollständig der Gastro, abzüglich Treppenhaus, Aufzug und Eingängen (66 m²) bleiben 510 m². Die Größe ist aus dem Platzbedarf abgeleitet: 160 Plätze im Gastraum und 30 im Séparée brauchen mit Bar, Küche, Lager, WC und Eingang genau diese Fläche. Das sind 2,7 m² je Platz (Richtwert 2,5 bis 3 m²).</w:t>
+      </w:r>
+    </w:p>
+    <w:tbl>
+      <w:tblPr>
+        <w:tblW w:type="auto" w:w="0"/>
+        <w:jc w:val="center"/>
+        <w:tblLayout w:type="fixed"/>
+        <w:tblLook w:firstColumn="1" w:firstRow="1" w:lastColumn="0" w:lastRow="0" w:noHBand="0" w:noVBand="1" w:val="04A0"/>
+        <w:tblBorders>
+          <w:top w:val="single" w:sz="4" w:color="D0D0D0"/>
+          <w:left w:val="single" w:sz="4" w:color="D0D0D0"/>
+          <w:bottom w:val="single" w:sz="4" w:color="D0D0D0"/>
+          <w:right w:val="single" w:sz="4" w:color="D0D0D0"/>
+          <w:insideH w:val="single" w:sz="4" w:color="D0D0D0"/>
+          <w:insideV w:val="single" w:sz="4" w:color="D0D0D0"/>
+        </w:tblBorders>
+        <w:tblLayout w:type="fixed"/>
+      </w:tblPr>
+      <w:tblGrid>
+        <w:gridCol w:w="5102"/>
+        <w:gridCol w:w="2154"/>
+        <w:gridCol w:w="2154"/>
+      </w:tblGrid>
+      <w:tr>
+        <w:trPr>
+          <w:cantSplit/>
+        </w:trPr>
+        <w:tc>
+          <w:tcPr>
+            <w:tcW w:type="dxa" w:w="5102"/>
+            <w:shd w:val="clear" w:color="auto" w:fill="2F4A3E"/>
+          </w:tcPr>
+          <w:p>
+            <w:pPr>
+              <w:keepNext/>
+              <w:spacing w:after="20" w:before="20"/>
+            </w:pPr>
+            <w:r/>
+            <w:r>
+              <w:rPr>
+                <w:b/>
+                <w:color w:val="FFFFFF"/>
+                <w:sz w:val="18"/>
+              </w:rPr>
+              <w:t>Gastro-Flächenbedarf</w:t>
+            </w:r>
+          </w:p>
+        </w:tc>
+        <w:tc>
+          <w:tcPr>
+            <w:tcW w:type="dxa" w:w="2154"/>
+            <w:shd w:val="clear" w:color="auto" w:fill="2F4A3E"/>
+          </w:tcPr>
+          <w:p>
+            <w:pPr>
+              <w:keepNext/>
+              <w:spacing w:after="20" w:before="20"/>
+              <w:jc w:val="right"/>
+            </w:pPr>
+            <w:r/>
+            <w:r>
+              <w:rPr>
+                <w:b/>
+                <w:color w:val="FFFFFF"/>
+                <w:sz w:val="18"/>
+              </w:rPr>
+              <w:t>Menge</w:t>
+            </w:r>
+          </w:p>
+        </w:tc>
+        <w:tc>
+          <w:tcPr>
+            <w:tcW w:type="dxa" w:w="2154"/>
+            <w:shd w:val="clear" w:color="auto" w:fill="2F4A3E"/>
+          </w:tcPr>
+          <w:p>
+            <w:pPr>
+              <w:keepNext/>
+              <w:spacing w:after="20" w:before="20"/>
+              <w:jc w:val="right"/>
+            </w:pPr>
+            <w:r/>
+            <w:r>
+              <w:rPr>
+                <w:b/>
+                <w:color w:val="FFFFFF"/>
+                <w:sz w:val="18"/>
+              </w:rPr>
+              <w:t>Fläche</w:t>
+            </w:r>
+          </w:p>
+        </w:tc>
+      </w:tr>
+      <w:tr>
+        <w:trPr>
+          <w:cantSplit/>
+        </w:trPr>
+        <w:tc>
+          <w:tcPr>
+            <w:tcW w:type="dxa" w:w="5102"/>
+          </w:tcPr>
+          <w:p>
+            <w:pPr>
+              <w:keepNext/>
+              <w:spacing w:after="20" w:before="20"/>
+            </w:pPr>
+            <w:r/>
+            <w:r>
+              <w:rPr>
+                <w:sz w:val="18"/>
+              </w:rPr>
+              <w:t>Gastraum inkl. Lounge</w:t>
+            </w:r>
+          </w:p>
+        </w:tc>
+        <w:tc>
+          <w:tcPr>
+            <w:tcW w:type="dxa" w:w="2154"/>
+          </w:tcPr>
+          <w:p>
+            <w:pPr>
+              <w:keepNext/>
+              <w:spacing w:after="20" w:before="20"/>
+              <w:jc w:val="right"/>
+            </w:pPr>
+            <w:r/>
+            <w:r>
+              <w:rPr>
+                <w:sz w:val="18"/>
+              </w:rPr>
+              <w:t>160 Plätze</w:t>
+            </w:r>
+          </w:p>
+        </w:tc>
+        <w:tc>
+          <w:tcPr>
+            <w:tcW w:type="dxa" w:w="2154"/>
+          </w:tcPr>
+          <w:p>
+            <w:pPr>
+              <w:keepNext/>
+              <w:spacing w:after="20" w:before="20"/>
+              <w:jc w:val="right"/>
+            </w:pPr>
+            <w:r/>
+            <w:r>
+              <w:rPr>
+                <w:sz w:val="18"/>
+              </w:rPr>
+              <w:t>304 m²</w:t>
+            </w:r>
+          </w:p>
+        </w:tc>
+      </w:tr>
+      <w:tr>
+        <w:trPr>
+          <w:cantSplit/>
+        </w:trPr>
+        <w:tc>
+          <w:tcPr>
+            <w:tcW w:type="dxa" w:w="5102"/>
+          </w:tcPr>
+          <w:p>
+            <w:pPr>
+              <w:keepNext/>
+              <w:spacing w:after="20" w:before="20"/>
+            </w:pPr>
+            <w:r/>
+            <w:r>
+              <w:rPr>
+                <w:sz w:val="18"/>
+              </w:rPr>
+              <w:t>Séparée (Feiern)</w:t>
+            </w:r>
+          </w:p>
+        </w:tc>
+        <w:tc>
+          <w:tcPr>
+            <w:tcW w:type="dxa" w:w="2154"/>
+          </w:tcPr>
+          <w:p>
+            <w:pPr>
+              <w:keepNext/>
+              <w:spacing w:after="20" w:before="20"/>
+              <w:jc w:val="right"/>
+            </w:pPr>
+            <w:r/>
+            <w:r>
+              <w:rPr>
+                <w:sz w:val="18"/>
+              </w:rPr>
+              <w:t>30 Plätze</w:t>
+            </w:r>
+          </w:p>
+        </w:tc>
+        <w:tc>
+          <w:tcPr>
+            <w:tcW w:type="dxa" w:w="2154"/>
+          </w:tcPr>
+          <w:p>
+            <w:pPr>
+              <w:keepNext/>
+              <w:spacing w:after="20" w:before="20"/>
+              <w:jc w:val="right"/>
+            </w:pPr>
+            <w:r/>
+            <w:r>
+              <w:rPr>
+                <w:sz w:val="18"/>
+              </w:rPr>
+              <w:t>42 m²</w:t>
+            </w:r>
+          </w:p>
+        </w:tc>
+      </w:tr>
+      <w:tr>
+        <w:trPr>
+          <w:cantSplit/>
+        </w:trPr>
+        <w:tc>
+          <w:tcPr>
+            <w:tcW w:type="dxa" w:w="5102"/>
+          </w:tcPr>
+          <w:p>
+            <w:pPr>
+              <w:keepNext/>
+              <w:spacing w:after="20" w:before="20"/>
+            </w:pPr>
+            <w:r/>
+            <w:r>
+              <w:rPr>
+                <w:sz w:val="18"/>
+              </w:rPr>
+              <w:t>Bar und Theken-Zone</w:t>
+            </w:r>
+          </w:p>
+        </w:tc>
+        <w:tc>
+          <w:tcPr>
+            <w:tcW w:type="dxa" w:w="2154"/>
+          </w:tcPr>
+          <w:p>
+            <w:pPr>
+              <w:keepNext/>
+              <w:spacing w:after="20" w:before="20"/>
+              <w:jc w:val="right"/>
+            </w:pPr>
+            <w:r/>
+            <w:r>
+              <w:rPr>
+                <w:sz w:val="18"/>
+              </w:rPr>
+              <w:t>–</w:t>
+            </w:r>
+          </w:p>
+        </w:tc>
+        <w:tc>
+          <w:tcPr>
+            <w:tcW w:type="dxa" w:w="2154"/>
+          </w:tcPr>
+          <w:p>
+            <w:pPr>
+              <w:keepNext/>
+              <w:spacing w:after="20" w:before="20"/>
+              <w:jc w:val="right"/>
+            </w:pPr>
+            <w:r/>
+            <w:r>
+              <w:rPr>
+                <w:sz w:val="18"/>
+              </w:rPr>
+              <w:t>25 m²</w:t>
+            </w:r>
+          </w:p>
+        </w:tc>
+      </w:tr>
+      <w:tr>
+        <w:trPr>
+          <w:cantSplit/>
+        </w:trPr>
+        <w:tc>
+          <w:tcPr>
+            <w:tcW w:type="dxa" w:w="5102"/>
+          </w:tcPr>
+          <w:p>
+            <w:pPr>
+              <w:keepNext/>
+              <w:spacing w:after="20" w:before="20"/>
+            </w:pPr>
+            <w:r/>
+            <w:r>
+              <w:rPr>
+                <w:sz w:val="18"/>
+              </w:rPr>
+              <w:t>Küche mit Spülküche</w:t>
+            </w:r>
+          </w:p>
+        </w:tc>
+        <w:tc>
+          <w:tcPr>
+            <w:tcW w:type="dxa" w:w="2154"/>
+          </w:tcPr>
+          <w:p>
+            <w:pPr>
+              <w:keepNext/>
+              <w:spacing w:after="20" w:before="20"/>
+              <w:jc w:val="right"/>
+            </w:pPr>
+            <w:r/>
+            <w:r>
+              <w:rPr>
+                <w:sz w:val="18"/>
+              </w:rPr>
+              <w:t>–</w:t>
+            </w:r>
+          </w:p>
+        </w:tc>
+        <w:tc>
+          <w:tcPr>
+            <w:tcW w:type="dxa" w:w="2154"/>
+          </w:tcPr>
+          <w:p>
+            <w:pPr>
+              <w:keepNext/>
+              <w:spacing w:after="20" w:before="20"/>
+              <w:jc w:val="right"/>
+            </w:pPr>
+            <w:r/>
+            <w:r>
+              <w:rPr>
+                <w:sz w:val="18"/>
+              </w:rPr>
+              <w:t>55 m²</w:t>
+            </w:r>
+          </w:p>
+        </w:tc>
+      </w:tr>
+      <w:tr>
+        <w:trPr>
+          <w:cantSplit/>
+        </w:trPr>
+        <w:tc>
+          <w:tcPr>
+            <w:tcW w:type="dxa" w:w="5102"/>
+          </w:tcPr>
+          <w:p>
+            <w:pPr>
+              <w:keepNext/>
+              <w:spacing w:after="20" w:before="20"/>
+            </w:pPr>
+            <w:r/>
+            <w:r>
+              <w:rPr>
+                <w:sz w:val="18"/>
+              </w:rPr>
+              <w:t>Lager, Kühlung, Anlieferung</w:t>
+            </w:r>
+          </w:p>
+        </w:tc>
+        <w:tc>
+          <w:tcPr>
+            <w:tcW w:type="dxa" w:w="2154"/>
+          </w:tcPr>
+          <w:p>
+            <w:pPr>
+              <w:keepNext/>
+              <w:spacing w:after="20" w:before="20"/>
+              <w:jc w:val="right"/>
+            </w:pPr>
+            <w:r/>
+            <w:r>
+              <w:rPr>
+                <w:sz w:val="18"/>
+              </w:rPr>
+              <w:t>–</w:t>
+            </w:r>
+          </w:p>
+        </w:tc>
+        <w:tc>
+          <w:tcPr>
+            <w:tcW w:type="dxa" w:w="2154"/>
+          </w:tcPr>
+          <w:p>
+            <w:pPr>
+              <w:keepNext/>
+              <w:spacing w:after="20" w:before="20"/>
+              <w:jc w:val="right"/>
+            </w:pPr>
+            <w:r/>
+            <w:r>
+              <w:rPr>
+                <w:sz w:val="18"/>
+              </w:rPr>
+              <w:t>25 m²</w:t>
+            </w:r>
+          </w:p>
+        </w:tc>
+      </w:tr>
+      <w:tr>
+        <w:trPr>
+          <w:cantSplit/>
+        </w:trPr>
+        <w:tc>
+          <w:tcPr>
+            <w:tcW w:type="dxa" w:w="5102"/>
+          </w:tcPr>
+          <w:p>
+            <w:pPr>
+              <w:keepNext/>
+              <w:spacing w:after="20" w:before="20"/>
+            </w:pPr>
+            <w:r/>
+            <w:r>
+              <w:rPr>
+                <w:sz w:val="18"/>
+              </w:rPr>
+              <w:t>WC (Herren, Damen, barrierefrei)</w:t>
+            </w:r>
+          </w:p>
+        </w:tc>
+        <w:tc>
+          <w:tcPr>
+            <w:tcW w:type="dxa" w:w="2154"/>
+          </w:tcPr>
+          <w:p>
+            <w:pPr>
+              <w:keepNext/>
+              <w:spacing w:after="20" w:before="20"/>
+              <w:jc w:val="right"/>
+            </w:pPr>
+            <w:r/>
+            <w:r>
+              <w:rPr>
+                <w:sz w:val="18"/>
+              </w:rPr>
+              <w:t>–</w:t>
+            </w:r>
+          </w:p>
+        </w:tc>
+        <w:tc>
+          <w:tcPr>
+            <w:tcW w:type="dxa" w:w="2154"/>
+          </w:tcPr>
+          <w:p>
+            <w:pPr>
+              <w:keepNext/>
+              <w:spacing w:after="20" w:before="20"/>
+              <w:jc w:val="right"/>
+            </w:pPr>
+            <w:r/>
+            <w:r>
+              <w:rPr>
+                <w:sz w:val="18"/>
+              </w:rPr>
+              <w:t>22 m²</w:t>
+            </w:r>
+          </w:p>
+        </w:tc>
+      </w:tr>
+      <w:tr>
+        <w:trPr>
+          <w:cantSplit/>
+        </w:trPr>
+        <w:tc>
+          <w:tcPr>
+            <w:tcW w:type="dxa" w:w="5102"/>
+          </w:tcPr>
+          <w:p>
+            <w:pPr>
+              <w:keepNext/>
+              <w:spacing w:after="20" w:before="20"/>
+            </w:pPr>
+            <w:r/>
+            <w:r>
+              <w:rPr>
+                <w:sz w:val="18"/>
+              </w:rPr>
+              <w:t>Eingang, Garderobe, Flure, Technik</w:t>
+            </w:r>
+          </w:p>
+        </w:tc>
+        <w:tc>
+          <w:tcPr>
+            <w:tcW w:type="dxa" w:w="2154"/>
+          </w:tcPr>
+          <w:p>
+            <w:pPr>
+              <w:keepNext/>
+              <w:spacing w:after="20" w:before="20"/>
+              <w:jc w:val="right"/>
+            </w:pPr>
+            <w:r/>
+            <w:r>
+              <w:rPr>
+                <w:sz w:val="18"/>
+              </w:rPr>
+              <w:t>–</w:t>
+            </w:r>
+          </w:p>
+        </w:tc>
+        <w:tc>
+          <w:tcPr>
+            <w:tcW w:type="dxa" w:w="2154"/>
+          </w:tcPr>
+          <w:p>
+            <w:pPr>
+              <w:keepNext/>
+              <w:spacing w:after="20" w:before="20"/>
+              <w:jc w:val="right"/>
+            </w:pPr>
+            <w:r/>
+            <w:r>
+              <w:rPr>
+                <w:sz w:val="18"/>
+              </w:rPr>
+              <w:t>37 m²</w:t>
+            </w:r>
+          </w:p>
+        </w:tc>
+      </w:tr>
+      <w:tr>
+        <w:trPr>
+          <w:cantSplit/>
+        </w:trPr>
+        <w:tc>
+          <w:tcPr>
+            <w:tcW w:type="dxa" w:w="5102"/>
+            <w:shd w:val="clear" w:color="auto" w:fill="E3E8E5"/>
+          </w:tcPr>
+          <w:p>
+            <w:pPr>
+              <w:spacing w:after="20" w:before="20"/>
+            </w:pPr>
+            <w:r/>
+            <w:r>
+              <w:rPr>
+                <w:b/>
+                <w:sz w:val="18"/>
+              </w:rPr>
+              <w:t>Gastro gesamt (ca. 190 Plätze)</w:t>
+            </w:r>
+          </w:p>
+        </w:tc>
+        <w:tc>
+          <w:tcPr>
+            <w:tcW w:type="dxa" w:w="2154"/>
+            <w:shd w:val="clear" w:color="auto" w:fill="E3E8E5"/>
+          </w:tcPr>
+          <w:p>
+            <w:pPr>
+              <w:spacing w:after="20" w:before="20"/>
+              <w:jc w:val="right"/>
+            </w:pPr>
+            <w:r/>
+            <w:r>
+              <w:rPr>
+                <w:b/>
+                <w:sz w:val="18"/>
+              </w:rPr>
+            </w:r>
+          </w:p>
+        </w:tc>
+        <w:tc>
+          <w:tcPr>
+            <w:tcW w:type="dxa" w:w="2154"/>
+            <w:shd w:val="clear" w:color="auto" w:fill="E3E8E5"/>
+          </w:tcPr>
+          <w:p>
+            <w:pPr>
+              <w:spacing w:after="20" w:before="20"/>
+              <w:jc w:val="right"/>
+            </w:pPr>
+            <w:r/>
+            <w:r>
+              <w:rPr>
+                <w:b/>
+                <w:sz w:val="18"/>
+              </w:rPr>
+              <w:t>510 m²</w:t>
+            </w:r>
+          </w:p>
+        </w:tc>
+      </w:tr>
+    </w:tbl>
+    <w:p>
+      <w:pPr>
+        <w:spacing w:after="40"/>
+      </w:pPr>
+    </w:p>
+    <w:p>
+      <w:pPr>
+        <w:spacing w:after="80"/>
+      </w:pPr>
+      <w:r>
+        <w:rPr>
+          <w:b w:val="0"/>
+          <w:i w:val="0"/>
+        </w:rPr>
+        <w:t>Der Gastro-Umsatz von 65.000 € im Monat entspricht ca. 4.105 € je Sitzplatz und Jahr. Zum Vergleich: Der Median in Österreich liegt für Betriebe mit weniger als 100 Plätzen bei ca. 12.000 € (Fitness-Check Gastronomie 2026). Die Annahme ist also sehr vorsichtig. Die Pacht von 10 €/m² entspricht 7,8 % vom Umsatz (üblich 6 bis 12 %).</w:t>
+      </w:r>
+    </w:p>
+    <w:p>
+      <w:pPr>
+        <w:spacing w:after="40"/>
+      </w:pPr>
+      <w:r>
+        <w:rPr>
+          <w:b/>
+          <w:i w:val="0"/>
+          <w:color w:val="2F4A3E"/>
+        </w:rPr>
+        <w:t>Ankermieter Büro</w:t>
+      </w:r>
+    </w:p>
+    <w:p>
+      <w:r>
+        <w:rPr>
+          <w:b w:val="0"/>
+          <w:i w:val="0"/>
+        </w:rPr>
+        <w:t>Im 1. Obergeschoss mit Aufzug und eigenem Eingang liegen zwei Büros für langfristige Ankermieter: ein größeres Büro (100 m², Versicherungsgesellschaft oder ähnlicher Mieter mit zentralem Büro) und ein kleineres Büro (65 m², kleiner Makler oder Dienstleister). Beide Mietverträge sollen 10 Jahre fest laufen, mit Indexmiete (Anpassung an die Inflation). Der Vermieter übernimmt einen Grundausbau (Böden, Decken, Elektro) von 150 €/m², der Mieter den Rest.</w:t>
+      </w:r>
+    </w:p>
+    <w:tbl>
+      <w:tblPr>
+        <w:tblW w:type="auto" w:w="0"/>
+        <w:jc w:val="center"/>
+        <w:tblLayout w:type="fixed"/>
+        <w:tblLook w:firstColumn="1" w:firstRow="1" w:lastColumn="0" w:lastRow="0" w:noHBand="0" w:noVBand="1" w:val="04A0"/>
+        <w:tblBorders>
+          <w:top w:val="single" w:sz="4" w:color="D0D0D0"/>
+          <w:left w:val="single" w:sz="4" w:color="D0D0D0"/>
+          <w:bottom w:val="single" w:sz="4" w:color="D0D0D0"/>
+          <w:right w:val="single" w:sz="4" w:color="D0D0D0"/>
+          <w:insideH w:val="single" w:sz="4" w:color="D0D0D0"/>
+          <w:insideV w:val="single" w:sz="4" w:color="D0D0D0"/>
+        </w:tblBorders>
+        <w:tblLayout w:type="fixed"/>
+      </w:tblPr>
+      <w:tblGrid>
+        <w:gridCol w:w="3402"/>
+        <w:gridCol w:w="1247"/>
+        <w:gridCol w:w="1361"/>
+        <w:gridCol w:w="1701"/>
+        <w:gridCol w:w="1701"/>
+      </w:tblGrid>
+      <w:tr>
+        <w:trPr>
+          <w:cantSplit/>
+        </w:trPr>
+        <w:tc>
+          <w:tcPr>
+            <w:tcW w:type="dxa" w:w="3402"/>
+            <w:shd w:val="clear" w:color="auto" w:fill="2F4A3E"/>
+          </w:tcPr>
+          <w:p>
+            <w:pPr>
+              <w:keepNext/>
+              <w:spacing w:after="20" w:before="20"/>
+            </w:pPr>
+            <w:r/>
+            <w:r>
+              <w:rPr>
+                <w:b/>
+                <w:color w:val="FFFFFF"/>
+                <w:sz w:val="18"/>
+              </w:rPr>
+              <w:t>Ankermieter</w:t>
+            </w:r>
+          </w:p>
+        </w:tc>
+        <w:tc>
+          <w:tcPr>
+            <w:tcW w:type="dxa" w:w="1247"/>
+            <w:shd w:val="clear" w:color="auto" w:fill="2F4A3E"/>
+          </w:tcPr>
+          <w:p>
+            <w:pPr>
+              <w:keepNext/>
+              <w:spacing w:after="20" w:before="20"/>
+              <w:jc w:val="right"/>
+            </w:pPr>
+            <w:r/>
+            <w:r>
+              <w:rPr>
+                <w:b/>
+                <w:color w:val="FFFFFF"/>
+                <w:sz w:val="18"/>
+              </w:rPr>
+              <w:t>Fläche</w:t>
+            </w:r>
+          </w:p>
+        </w:tc>
+        <w:tc>
+          <w:tcPr>
+            <w:tcW w:type="dxa" w:w="1361"/>
+            <w:shd w:val="clear" w:color="auto" w:fill="2F4A3E"/>
+          </w:tcPr>
+          <w:p>
+            <w:pPr>
+              <w:keepNext/>
+              <w:spacing w:after="20" w:before="20"/>
+              <w:jc w:val="right"/>
+            </w:pPr>
+            <w:r/>
+            <w:r>
+              <w:rPr>
+                <w:b/>
+                <w:color w:val="FFFFFF"/>
+                <w:sz w:val="18"/>
+              </w:rPr>
+              <w:t>Miete je m²</w:t>
+            </w:r>
+          </w:p>
+        </w:tc>
+        <w:tc>
+          <w:tcPr>
+            <w:tcW w:type="dxa" w:w="1701"/>
+            <w:shd w:val="clear" w:color="auto" w:fill="2F4A3E"/>
+          </w:tcPr>
+          <w:p>
+            <w:pPr>
+              <w:keepNext/>
+              <w:spacing w:after="20" w:before="20"/>
+              <w:jc w:val="right"/>
+            </w:pPr>
+            <w:r/>
+            <w:r>
+              <w:rPr>
+                <w:b/>
+                <w:color w:val="FFFFFF"/>
+                <w:sz w:val="18"/>
+              </w:rPr>
+              <w:t>Miete pro Monat</w:t>
+            </w:r>
+          </w:p>
+        </w:tc>
+        <w:tc>
+          <w:tcPr>
+            <w:tcW w:type="dxa" w:w="1701"/>
+            <w:shd w:val="clear" w:color="auto" w:fill="2F4A3E"/>
+          </w:tcPr>
+          <w:p>
+            <w:pPr>
+              <w:keepNext/>
+              <w:spacing w:after="20" w:before="20"/>
+              <w:jc w:val="right"/>
+            </w:pPr>
+            <w:r/>
+            <w:r>
+              <w:rPr>
+                <w:b/>
+                <w:color w:val="FFFFFF"/>
+                <w:sz w:val="18"/>
+              </w:rPr>
+              <w:t>Miete pro Jahr</w:t>
+            </w:r>
+          </w:p>
+        </w:tc>
+      </w:tr>
+      <w:tr>
+        <w:trPr>
+          <w:cantSplit/>
+        </w:trPr>
+        <w:tc>
+          <w:tcPr>
+            <w:tcW w:type="dxa" w:w="3402"/>
+          </w:tcPr>
+          <w:p>
+            <w:pPr>
+              <w:keepNext/>
+              <w:spacing w:after="20" w:before="20"/>
+            </w:pPr>
+            <w:r/>
+            <w:r>
+              <w:rPr>
+                <w:sz w:val="18"/>
+              </w:rPr>
+              <w:t>Büro 1: Versicherungsgesellschaft o. ä.</w:t>
+            </w:r>
+          </w:p>
+        </w:tc>
+        <w:tc>
+          <w:tcPr>
+            <w:tcW w:type="dxa" w:w="1247"/>
+          </w:tcPr>
+          <w:p>
+            <w:pPr>
+              <w:keepNext/>
+              <w:spacing w:after="20" w:before="20"/>
+              <w:jc w:val="right"/>
+            </w:pPr>
+            <w:r/>
+            <w:r>
+              <w:rPr>
+                <w:sz w:val="18"/>
+              </w:rPr>
+              <w:t>100 m²</w:t>
+            </w:r>
+          </w:p>
+        </w:tc>
+        <w:tc>
+          <w:tcPr>
+            <w:tcW w:type="dxa" w:w="1361"/>
+          </w:tcPr>
+          <w:p>
+            <w:pPr>
+              <w:keepNext/>
+              <w:spacing w:after="20" w:before="20"/>
+              <w:jc w:val="right"/>
+            </w:pPr>
+            <w:r/>
+            <w:r>
+              <w:rPr>
+                <w:sz w:val="18"/>
+              </w:rPr>
+              <w:t>9,50 €</w:t>
+            </w:r>
+          </w:p>
+        </w:tc>
+        <w:tc>
+          <w:tcPr>
+            <w:tcW w:type="dxa" w:w="1701"/>
+          </w:tcPr>
+          <w:p>
+            <w:pPr>
+              <w:keepNext/>
+              <w:spacing w:after="20" w:before="20"/>
+              <w:jc w:val="right"/>
+            </w:pPr>
+            <w:r/>
+            <w:r>
+              <w:rPr>
+                <w:sz w:val="18"/>
+              </w:rPr>
+              <w:t>950 €</w:t>
+            </w:r>
+          </w:p>
+        </w:tc>
+        <w:tc>
+          <w:tcPr>
+            <w:tcW w:type="dxa" w:w="1701"/>
+          </w:tcPr>
+          <w:p>
+            <w:pPr>
+              <w:keepNext/>
+              <w:spacing w:after="20" w:before="20"/>
+              <w:jc w:val="right"/>
+            </w:pPr>
+            <w:r/>
+            <w:r>
+              <w:rPr>
+                <w:sz w:val="18"/>
+              </w:rPr>
+              <w:t>11.400 €</w:t>
+            </w:r>
+          </w:p>
+        </w:tc>
+      </w:tr>
+      <w:tr>
+        <w:trPr>
+          <w:cantSplit/>
+        </w:trPr>
+        <w:tc>
+          <w:tcPr>
+            <w:tcW w:type="dxa" w:w="3402"/>
+          </w:tcPr>
+          <w:p>
+            <w:pPr>
+              <w:keepNext/>
+              <w:spacing w:after="20" w:before="20"/>
+            </w:pPr>
+            <w:r/>
+            <w:r>
+              <w:rPr>
+                <w:sz w:val="18"/>
+              </w:rPr>
+              <w:t>Büro 2: Makler o. ä.</w:t>
+            </w:r>
+          </w:p>
+        </w:tc>
+        <w:tc>
+          <w:tcPr>
+            <w:tcW w:type="dxa" w:w="1247"/>
+          </w:tcPr>
+          <w:p>
+            <w:pPr>
+              <w:keepNext/>
+              <w:spacing w:after="20" w:before="20"/>
+              <w:jc w:val="right"/>
+            </w:pPr>
+            <w:r/>
+            <w:r>
+              <w:rPr>
+                <w:sz w:val="18"/>
+              </w:rPr>
+              <w:t>65 m²</w:t>
+            </w:r>
+          </w:p>
+        </w:tc>
+        <w:tc>
+          <w:tcPr>
+            <w:tcW w:type="dxa" w:w="1361"/>
+          </w:tcPr>
+          <w:p>
+            <w:pPr>
+              <w:keepNext/>
+              <w:spacing w:after="20" w:before="20"/>
+              <w:jc w:val="right"/>
+            </w:pPr>
+            <w:r/>
+            <w:r>
+              <w:rPr>
+                <w:sz w:val="18"/>
+              </w:rPr>
+              <w:t>10,00 €</w:t>
+            </w:r>
+          </w:p>
+        </w:tc>
+        <w:tc>
+          <w:tcPr>
+            <w:tcW w:type="dxa" w:w="1701"/>
+          </w:tcPr>
+          <w:p>
+            <w:pPr>
+              <w:keepNext/>
+              <w:spacing w:after="20" w:before="20"/>
+              <w:jc w:val="right"/>
+            </w:pPr>
+            <w:r/>
+            <w:r>
+              <w:rPr>
+                <w:sz w:val="18"/>
+              </w:rPr>
+              <w:t>650 €</w:t>
+            </w:r>
+          </w:p>
+        </w:tc>
+        <w:tc>
+          <w:tcPr>
+            <w:tcW w:type="dxa" w:w="1701"/>
+          </w:tcPr>
+          <w:p>
+            <w:pPr>
+              <w:keepNext/>
+              <w:spacing w:after="20" w:before="20"/>
+              <w:jc w:val="right"/>
+            </w:pPr>
+            <w:r/>
+            <w:r>
+              <w:rPr>
+                <w:sz w:val="18"/>
+              </w:rPr>
+              <w:t>7.800 €</w:t>
+            </w:r>
+          </w:p>
+        </w:tc>
+      </w:tr>
+      <w:tr>
+        <w:trPr>
+          <w:cantSplit/>
+        </w:trPr>
+        <w:tc>
+          <w:tcPr>
+            <w:tcW w:type="dxa" w:w="3402"/>
+            <w:shd w:val="clear" w:color="auto" w:fill="E3E8E5"/>
+          </w:tcPr>
+          <w:p>
+            <w:pPr>
+              <w:spacing w:after="20" w:before="20"/>
+            </w:pPr>
+            <w:r/>
+            <w:r>
+              <w:rPr>
+                <w:b/>
+                <w:sz w:val="18"/>
+              </w:rPr>
+              <w:t>Summe Büro, 10 Jahre fest</w:t>
+            </w:r>
+          </w:p>
+        </w:tc>
+        <w:tc>
+          <w:tcPr>
+            <w:tcW w:type="dxa" w:w="1247"/>
+            <w:shd w:val="clear" w:color="auto" w:fill="E3E8E5"/>
+          </w:tcPr>
+          <w:p>
+            <w:pPr>
+              <w:spacing w:after="20" w:before="20"/>
+              <w:jc w:val="right"/>
+            </w:pPr>
+            <w:r/>
+            <w:r>
+              <w:rPr>
+                <w:b/>
+                <w:sz w:val="18"/>
+              </w:rPr>
+              <w:t>165 m²</w:t>
+            </w:r>
+          </w:p>
+        </w:tc>
+        <w:tc>
+          <w:tcPr>
+            <w:tcW w:type="dxa" w:w="1361"/>
+            <w:shd w:val="clear" w:color="auto" w:fill="E3E8E5"/>
+          </w:tcPr>
+          <w:p>
+            <w:pPr>
+              <w:spacing w:after="20" w:before="20"/>
+              <w:jc w:val="right"/>
+            </w:pPr>
+            <w:r/>
+            <w:r>
+              <w:rPr>
+                <w:b/>
+                <w:sz w:val="18"/>
+              </w:rPr>
+              <w:t>9,70 €</w:t>
+            </w:r>
+          </w:p>
+        </w:tc>
+        <w:tc>
+          <w:tcPr>
+            <w:tcW w:type="dxa" w:w="1701"/>
+            <w:shd w:val="clear" w:color="auto" w:fill="E3E8E5"/>
+          </w:tcPr>
+          <w:p>
+            <w:pPr>
+              <w:spacing w:after="20" w:before="20"/>
+              <w:jc w:val="right"/>
+            </w:pPr>
+            <w:r/>
+            <w:r>
+              <w:rPr>
+                <w:b/>
+                <w:sz w:val="18"/>
+              </w:rPr>
+              <w:t>1.600 €</w:t>
+            </w:r>
+          </w:p>
+        </w:tc>
+        <w:tc>
+          <w:tcPr>
+            <w:tcW w:type="dxa" w:w="1701"/>
+            <w:shd w:val="clear" w:color="auto" w:fill="E3E8E5"/>
+          </w:tcPr>
+          <w:p>
+            <w:pPr>
+              <w:spacing w:after="20" w:before="20"/>
+              <w:jc w:val="right"/>
+            </w:pPr>
+            <w:r/>
+            <w:r>
+              <w:rPr>
+                <w:b/>
+                <w:sz w:val="18"/>
+              </w:rPr>
+              <w:t>19.200 €</w:t>
+            </w:r>
+          </w:p>
+        </w:tc>
+      </w:tr>
+    </w:tbl>
+    <w:p>
+      <w:pPr>
+        <w:spacing w:after="40"/>
+      </w:pPr>
+    </w:p>
+    <w:p>
+      <w:pPr>
+        <w:pStyle w:val="ListBullet"/>
+        <w:spacing w:after="60"/>
+      </w:pPr>
+      <w:r>
+        <w:t>Die Büros bringen über die Vertragslaufzeit von 10 Jahren zusammen ca. 0,21 Mio. € (mit Indexierung von 2 % pro Jahr) und machen 11 % des Rohertrags aus.</w:t>
+      </w:r>
+    </w:p>
+    <w:p>
+      <w:pPr>
+        <w:pStyle w:val="ListBullet"/>
+        <w:spacing w:after="60"/>
+      </w:pPr>
+      <w:r>
+        <w:t>Sie decken 8 % des Kapitaldienstes. Zusammen mit den Wohnungen decken die langfristigen Mieten 45 %, den Rest tragen Pacht und Gastro-Gewinn.</w:t>
+      </w:r>
+    </w:p>
+    <w:p>
+      <w:pPr>
+        <w:pStyle w:val="ListBullet"/>
+        <w:spacing w:after="60"/>
+      </w:pPr>
+      <w:r>
+        <w:t>Büromieten sind Annahmen (9,50 und 10,00 €/m²), für Werlte liegen keine Büromarktdaten vor. Vorverträge mit den Ankermietern sollten vor Baubeginn vorliegen, sie sind für die Bank ein wichtiger Nachweis.</w:t>
+      </w:r>
+    </w:p>
+    <w:p>
+      <w:pPr>
+        <w:pStyle w:val="ListBullet"/>
+        <w:spacing w:after="60"/>
+      </w:pPr>
+      <w:r>
+        <w:t>Die Büros zählen zum Nichtwohnteil und werden mit der Gastro über das KfW-Programm 299 finanziert.</w:t>
+      </w:r>
+    </w:p>
+    <w:p>
+      <w:pPr>
+        <w:pStyle w:val="Heading1"/>
+      </w:pPr>
+      <w:r>
+        <w:t>5  Gastro-Konzept</w:t>
+      </w:r>
+    </w:p>
+    <w:p>
+      <w:r>
+        <w:rPr>
+          <w:b w:val="0"/>
+          <w:i w:val="0"/>
+        </w:rPr>
+        <w:t>Die Gastro nutzt das ganze Erdgeschoss (ca. 510 m²) als Bar-Restaurant für den ganzen Tag: Frühstück und Brunch am Wochenende, Mittagstisch für Beschäftigte aus Rathaus und Umgebung, Abendrestaurant mit regionaler, moderner Küche, Bar mit Theke und ein Séparée (abgetrennter Raum) mit 30 Plätzen für Feiern. Die Gestaltung folgt dem Referenzbild des Bauherrn: olivgrüne Vertäfelung, Cognac-Samtbanketten, Eiche, anthrazitfarbene Theke, Stahl-Glas-Trennwand und warmes Licht.</w:t>
       </w:r>
     </w:p>
     <w:tbl>
@@ -3531,7 +4899,7 @@
               <w:rPr>
                 <w:sz w:val="18"/>
               </w:rPr>
-              <w:t>ca. 150 innen (130 Gastraum, 20 Séparée), ca. 40 auf der Terrasse, 10 Barhocker</w:t>
+              <w:t>ca. 190 innen (160 Gastraum, 30 Séparée), ca. 60 auf der Terrasse, 12 Barhocker</w:t>
             </w:r>
           </w:p>
         </w:tc>
@@ -3613,7 +4981,7 @@
               <w:rPr>
                 <w:sz w:val="18"/>
               </w:rPr>
-              <w:t>50.000 € pro Monat (netto), vorsichtig für 460 m² und ca. 150 Plätze</w:t>
+              <w:t>65.000 € pro Monat (netto), ca. 4.100 € je Sitzplatz und Jahr, vorsichtig</w:t>
             </w:r>
           </w:p>
         </w:tc>
@@ -3695,7 +5063,7 @@
               <w:rPr>
                 <w:sz w:val="18"/>
               </w:rPr>
-              <w:t>12 €/m², 5.520 € pro Monat</w:t>
+              <w:t>10 €/m², 5.100 € pro Monat (ca. 8 % vom Umsatz)</w:t>
             </w:r>
           </w:p>
         </w:tc>
@@ -3734,7 +5102,7 @@
               <w:rPr>
                 <w:sz w:val="18"/>
               </w:rPr>
-              <w:t>150.000 € (Annahme des Bauherrn, für diese Fläche knapp, Angebote nötig)</w:t>
+              <w:t>190.000 € (1.000 € je Platz nach dem Budget des Bauherrn, Angebote nötig), dazu Büro-Ausbau 150 €/m²</w:t>
             </w:r>
           </w:p>
         </w:tc>
@@ -3854,7 +5222,7 @@
               <w:rPr>
                 <w:sz w:val="18"/>
               </w:rPr>
-              <w:t>30.000 €</w:t>
+              <w:t>40.000 €</w:t>
             </w:r>
           </w:p>
         </w:tc>
@@ -3873,7 +5241,7 @@
               <w:rPr>
                 <w:sz w:val="18"/>
               </w:rPr>
-              <w:t>9.150 €</w:t>
+              <w:t>12.200 €</w:t>
             </w:r>
           </w:p>
         </w:tc>
@@ -3892,7 +5260,7 @@
               <w:rPr>
                 <w:sz w:val="18"/>
               </w:rPr>
-              <w:t>+3.630 €</w:t>
+              <w:t>+7.100 €</w:t>
             </w:r>
           </w:p>
         </w:tc>
@@ -3915,7 +5283,7 @@
               <w:rPr>
                 <w:sz w:val="18"/>
               </w:rPr>
-              <w:t>40.000 €</w:t>
+              <w:t>50.000 €</w:t>
             </w:r>
           </w:p>
         </w:tc>
@@ -3934,7 +5302,7 @@
               <w:rPr>
                 <w:sz w:val="18"/>
               </w:rPr>
-              <w:t>12.200 €</w:t>
+              <w:t>15.250 €</w:t>
             </w:r>
           </w:p>
         </w:tc>
@@ -3953,7 +5321,7 @@
               <w:rPr>
                 <w:sz w:val="18"/>
               </w:rPr>
-              <w:t>+6.680 €</w:t>
+              <w:t>+10.150 €</w:t>
             </w:r>
           </w:p>
         </w:tc>
@@ -3978,7 +5346,7 @@
                 <w:b/>
                 <w:sz w:val="18"/>
               </w:rPr>
-              <w:t>50.000 €</w:t>
+              <w:t>65.000 €</w:t>
             </w:r>
           </w:p>
         </w:tc>
@@ -3999,7 +5367,7 @@
                 <w:b/>
                 <w:sz w:val="18"/>
               </w:rPr>
-              <w:t>15.250 €</w:t>
+              <w:t>19.825 €</w:t>
             </w:r>
           </w:p>
         </w:tc>
@@ -4020,7 +5388,7 @@
                 <w:b/>
                 <w:sz w:val="18"/>
               </w:rPr>
-              <w:t>+9.730 €</w:t>
+              <w:t>+14.725 €</w:t>
             </w:r>
           </w:p>
         </w:tc>
@@ -4043,7 +5411,7 @@
               <w:rPr>
                 <w:sz w:val="18"/>
               </w:rPr>
-              <w:t>60.000 €</w:t>
+              <w:t>80.000 €</w:t>
             </w:r>
           </w:p>
         </w:tc>
@@ -4062,7 +5430,7 @@
               <w:rPr>
                 <w:sz w:val="18"/>
               </w:rPr>
-              <w:t>18.300 €</w:t>
+              <w:t>24.400 €</w:t>
             </w:r>
           </w:p>
         </w:tc>
@@ -4081,7 +5449,7 @@
               <w:rPr>
                 <w:sz w:val="18"/>
               </w:rPr>
-              <w:t>+12.780 €</w:t>
+              <w:t>+19.300 €</w:t>
             </w:r>
           </w:p>
         </w:tc>
@@ -4103,7 +5471,7 @@
               <w:rPr>
                 <w:sz w:val="18"/>
               </w:rPr>
-              <w:t>70.000 €</w:t>
+              <w:t>90.000 €</w:t>
             </w:r>
           </w:p>
         </w:tc>
@@ -4121,7 +5489,7 @@
               <w:rPr>
                 <w:sz w:val="18"/>
               </w:rPr>
-              <w:t>21.350 €</w:t>
+              <w:t>27.450 €</w:t>
             </w:r>
           </w:p>
         </w:tc>
@@ -4139,7 +5507,7 @@
               <w:rPr>
                 <w:sz w:val="18"/>
               </w:rPr>
-              <w:t>+15.830 €</w:t>
+              <w:t>+22.350 €</w:t>
             </w:r>
           </w:p>
         </w:tc>
@@ -4159,7 +5527,7 @@
           <w:b w:val="0"/>
           <w:i w:val="0"/>
         </w:rPr>
-        <w:t>Der Gastro-Betrieb deckt seine Pacht ab ca. 18.100 € Umsatz im Monat. Der Lohn des Bauherrn ist nicht gerechnet. Ausführliche Gestaltung, Grundriss, Speisekarte und Personalplan stehen im Gastro-Konzept.</w:t>
+        <w:t>Der Gastro-Betrieb deckt seine Pacht ab ca. 16.700 € Umsatz im Monat. Der Lohn des Bauherrn ist nicht gerechnet. Ausführliche Gestaltung, Grundriss, Speisekarte und Personalplan stehen im Gastro-Konzept.</w:t>
       </w:r>
     </w:p>
     <w:p>
@@ -4167,7 +5535,7 @@
         <w:pStyle w:val="Heading1"/>
       </w:pPr>
       <w:r>
-        <w:t>5  Kosten</w:t>
+        <w:t>6  Kosten</w:t>
       </w:r>
     </w:p>
     <w:tbl>
@@ -4357,7 +5725,7 @@
               <w:rPr>
                 <w:sz w:val="18"/>
               </w:rPr>
-              <w:t>5,3 %</w:t>
+              <w:t>4,9 %</w:t>
             </w:r>
           </w:p>
         </w:tc>
@@ -4398,7 +5766,7 @@
               <w:rPr>
                 <w:sz w:val="18"/>
               </w:rPr>
-              <w:t>1.540 m² × 2.200 €</w:t>
+              <w:t>1.650 m² × 2.200 €</w:t>
             </w:r>
           </w:p>
         </w:tc>
@@ -4417,7 +5785,7 @@
               <w:rPr>
                 <w:sz w:val="18"/>
               </w:rPr>
-              <w:t>3.388.000 €</w:t>
+              <w:t>3.630.000 €</w:t>
             </w:r>
           </w:p>
         </w:tc>
@@ -4436,7 +5804,7 @@
               <w:rPr>
                 <w:sz w:val="18"/>
               </w:rPr>
-              <w:t>75,4 %</w:t>
+              <w:t>74,9 %</w:t>
             </w:r>
           </w:p>
         </w:tc>
@@ -4477,7 +5845,7 @@
               <w:rPr>
                 <w:sz w:val="18"/>
               </w:rPr>
-              <w:t>460 m² × 400 €</w:t>
+              <w:t>498 m² × 400 €</w:t>
             </w:r>
           </w:p>
         </w:tc>
@@ -4496,7 +5864,7 @@
               <w:rPr>
                 <w:sz w:val="18"/>
               </w:rPr>
-              <w:t>−184.000 €</w:t>
+              <w:t>−199.200 €</w:t>
             </w:r>
           </w:p>
         </w:tc>
@@ -4556,7 +5924,7 @@
               <w:rPr>
                 <w:sz w:val="18"/>
               </w:rPr>
-              <w:t>72 m² × 450 €</w:t>
+              <w:t>77 m² × 450 €</w:t>
             </w:r>
           </w:p>
         </w:tc>
@@ -4575,7 +5943,7 @@
               <w:rPr>
                 <w:sz w:val="18"/>
               </w:rPr>
-              <w:t>32.400 €</w:t>
+              <w:t>34.650 €</w:t>
             </w:r>
           </w:p>
         </w:tc>
@@ -4654,7 +6022,7 @@
               <w:rPr>
                 <w:sz w:val="18"/>
               </w:rPr>
-              <w:t>485.460 €</w:t>
+              <w:t>519.818 €</w:t>
             </w:r>
           </w:p>
         </w:tc>
@@ -4673,7 +6041,7 @@
               <w:rPr>
                 <w:sz w:val="18"/>
               </w:rPr>
-              <w:t>10,8 %</w:t>
+              <w:t>10,7 %</w:t>
             </w:r>
           </w:p>
         </w:tc>
@@ -4733,7 +6101,7 @@
               <w:rPr>
                 <w:sz w:val="18"/>
               </w:rPr>
-              <w:t>111.656 €</w:t>
+              <w:t>119.558 €</w:t>
             </w:r>
           </w:p>
         </w:tc>
@@ -4775,7 +6143,7 @@
               <w:rPr>
                 <w:sz w:val="18"/>
               </w:rPr>
-              <w:t>Gastro-Ausbau</w:t>
+              <w:t>Ausbau Gastro und Büros</w:t>
             </w:r>
           </w:p>
         </w:tc>
@@ -4793,7 +6161,7 @@
               <w:rPr>
                 <w:sz w:val="18"/>
               </w:rPr>
-              <w:t>Annahme Bauherr</w:t>
+              <w:t>190.000 € + Büros 150 €/m²</w:t>
             </w:r>
           </w:p>
         </w:tc>
@@ -4812,7 +6180,7 @@
               <w:rPr>
                 <w:sz w:val="18"/>
               </w:rPr>
-              <w:t>150.000 €</w:t>
+              <w:t>214.750 €</w:t>
             </w:r>
           </w:p>
         </w:tc>
@@ -4831,7 +6199,7 @@
               <w:rPr>
                 <w:sz w:val="18"/>
               </w:rPr>
-              <w:t>3,3 %</w:t>
+              <w:t>4,4 %</w:t>
             </w:r>
           </w:p>
         </w:tc>
@@ -4891,7 +6259,7 @@
               <w:rPr>
                 <w:sz w:val="18"/>
               </w:rPr>
-              <w:t>271.066 €</w:t>
+              <w:t>289.674 €</w:t>
             </w:r>
           </w:p>
         </w:tc>
@@ -4972,7 +6340,7 @@
                 <w:b/>
                 <w:sz w:val="18"/>
               </w:rPr>
-              <w:t>4.490.838 €</w:t>
+              <w:t>4.845.506 €</w:t>
             </w:r>
           </w:p>
         </w:tc>
@@ -5011,7 +6379,7 @@
           <w:color w:val="5B6770"/>
           <w:sz w:val="18"/>
         </w:rPr>
-        <w:t>Das entspricht 2.916 € je m² BGF. Baukosten von 2.200 €/m² (Bekanntenpreis des Bauherrn) und die Baunebenkosten sind durch Angebote von Bauunternehmen und Zimmerei zu belegen. QNG steht für das Qualitätssiegel Nachhaltiges Gebäude.</w:t>
+        <w:t>Das entspricht 2.937 € je m² BGF. Baukosten von 2.200 €/m² (Bekanntenpreis des Bauherrn) und die Baunebenkosten sind durch Angebote von Bauunternehmen und Zimmerei zu belegen. QNG steht für das Qualitätssiegel Nachhaltiges Gebäude.</w:t>
       </w:r>
     </w:p>
     <w:p>
@@ -5019,7 +6387,7 @@
         <w:pStyle w:val="Heading1"/>
       </w:pPr>
       <w:r>
-        <w:t>6  Finanzierung mit KfW-Krediten</w:t>
+        <w:t>7  Finanzierung mit KfW-Krediten</w:t>
       </w:r>
     </w:p>
     <w:p>
@@ -5396,7 +6764,7 @@
               <w:rPr>
                 <w:sz w:val="18"/>
               </w:rPr>
-              <w:t>Gastro (Nichtwohngebäude)</w:t>
+              <w:t>Gastro und Büros (Nichtwohngebäude)</w:t>
             </w:r>
           </w:p>
         </w:tc>
@@ -5433,7 +6801,7 @@
               <w:rPr>
                 <w:sz w:val="18"/>
               </w:rPr>
-              <w:t>782.000 €</w:t>
+              <w:t>1.147.500 €</w:t>
             </w:r>
           </w:p>
         </w:tc>
@@ -5530,7 +6898,7 @@
               <w:rPr>
                 <w:sz w:val="18"/>
               </w:rPr>
-              <w:t>2.508.838 €</w:t>
+              <w:t>2.498.006 €</w:t>
             </w:r>
           </w:p>
         </w:tc>
@@ -5629,7 +6997,7 @@
                 <w:b/>
                 <w:sz w:val="18"/>
               </w:rPr>
-              <w:t>4.490.838 €</w:t>
+              <w:t>4.845.506 €</w:t>
             </w:r>
           </w:p>
         </w:tc>
@@ -5649,7 +7017,7 @@
                 <w:b/>
                 <w:sz w:val="18"/>
               </w:rPr>
-              <w:t>3,43 %</w:t>
+              <w:t>3,39 %</w:t>
             </w:r>
           </w:p>
         </w:tc>
@@ -5737,7 +7105,7 @@
           <w:b w:val="0"/>
           <w:i w:val="0"/>
         </w:rPr>
-        <w:t>Das Grundstück wird zu Beginn bezahlt, die Baukosten fließen über 15 Monate. Danach folgen 12 Monate tilgungsfreie Anlaufzeit, in der nur Zinsen anfallen und von der Hausbank mitfinanziert werden (mit der Bank zu verhandeln). Zinsen und Bereitstellungsgebühr (3 % p. a. ab Monat 7 auf die noch nicht abgerufene Bausumme) betragen in dieser Zeit 271.066 €. Zu Beginn der Rückzahlung stehen 4.490.838 € Darlehen.</w:t>
+        <w:t>Das Grundstück wird zu Beginn bezahlt, die Baukosten fließen über 15 Monate. Danach folgen 12 Monate tilgungsfreie Anlaufzeit, in der nur Zinsen anfallen und von der Hausbank mitfinanziert werden (mit der Bank zu verhandeln). Zinsen und Bereitstellungsgebühr (3 % p. a. ab Monat 7 auf die noch nicht abgerufene Bausumme) betragen in dieser Zeit 289.674 €. Zu Beginn der Rückzahlung stehen 4.845.506 € Darlehen.</w:t>
       </w:r>
     </w:p>
     <w:p>
@@ -5745,7 +7113,7 @@
         <w:pStyle w:val="Heading1"/>
       </w:pPr>
       <w:r>
-        <w:t>7  Abzahlungsplan</w:t>
+        <w:t>8  Abzahlungsplan</w:t>
       </w:r>
     </w:p>
     <w:p>
@@ -6072,7 +7440,7 @@
               <w:rPr>
                 <w:sz w:val="18"/>
               </w:rPr>
-              <w:t>782.000 €</w:t>
+              <w:t>1.147.500 €</w:t>
             </w:r>
           </w:p>
         </w:tc>
@@ -6129,7 +7497,7 @@
               <w:rPr>
                 <w:sz w:val="18"/>
               </w:rPr>
-              <w:t>2.607 €</w:t>
+              <w:t>3.825 €</w:t>
             </w:r>
           </w:p>
         </w:tc>
@@ -6148,7 +7516,7 @@
               <w:rPr>
                 <w:sz w:val="18"/>
               </w:rPr>
-              <w:t>31.280 €</w:t>
+              <w:t>45.900 €</w:t>
             </w:r>
           </w:p>
         </w:tc>
@@ -6190,7 +7558,7 @@
               <w:rPr>
                 <w:sz w:val="18"/>
               </w:rPr>
-              <w:t>2.508.838 €</w:t>
+              <w:t>2.498.006 €</w:t>
             </w:r>
           </w:p>
         </w:tc>
@@ -6247,7 +7615,7 @@
               <w:rPr>
                 <w:sz w:val="18"/>
               </w:rPr>
-              <w:t>10.453 €</w:t>
+              <w:t>10.408 €</w:t>
             </w:r>
           </w:p>
         </w:tc>
@@ -6266,7 +7634,7 @@
               <w:rPr>
                 <w:sz w:val="18"/>
               </w:rPr>
-              <w:t>125.442 €</w:t>
+              <w:t>124.900 €</w:t>
             </w:r>
           </w:p>
         </w:tc>
@@ -6310,7 +7678,7 @@
                 <w:b/>
                 <w:sz w:val="18"/>
               </w:rPr>
-              <w:t>4.490.838 €</w:t>
+              <w:t>4.845.506 €</w:t>
             </w:r>
           </w:p>
         </w:tc>
@@ -6330,7 +7698,7 @@
                 <w:b/>
                 <w:sz w:val="18"/>
               </w:rPr>
-              <w:t>3,43 %</w:t>
+              <w:t>3,39 %</w:t>
             </w:r>
           </w:p>
         </w:tc>
@@ -6369,7 +7737,7 @@
                 <w:b/>
                 <w:sz w:val="18"/>
               </w:rPr>
-              <w:t>16.560 €</w:t>
+              <w:t>17.733 €</w:t>
             </w:r>
           </w:p>
         </w:tc>
@@ -6389,7 +7757,7 @@
                 <w:b/>
                 <w:sz w:val="18"/>
               </w:rPr>
-              <w:t>198.722 €</w:t>
+              <w:t>212.800 €</w:t>
             </w:r>
           </w:p>
         </w:tc>
@@ -6574,7 +7942,7 @@
               <w:rPr>
                 <w:sz w:val="18"/>
               </w:rPr>
-              <w:t>153.102 €</w:t>
+              <w:t>163.585 €</w:t>
             </w:r>
           </w:p>
         </w:tc>
@@ -6593,7 +7961,7 @@
               <w:rPr>
                 <w:sz w:val="18"/>
               </w:rPr>
-              <w:t>45.620 €</w:t>
+              <w:t>49.216 €</w:t>
             </w:r>
           </w:p>
         </w:tc>
@@ -6612,7 +7980,7 @@
               <w:rPr>
                 <w:sz w:val="18"/>
               </w:rPr>
-              <w:t>198.722 €</w:t>
+              <w:t>212.800 €</w:t>
             </w:r>
           </w:p>
         </w:tc>
@@ -6631,7 +7999,7 @@
               <w:rPr>
                 <w:sz w:val="18"/>
               </w:rPr>
-              <w:t>4.445.217 €</w:t>
+              <w:t>4.796.290 €</w:t>
             </w:r>
           </w:p>
         </w:tc>
@@ -6673,7 +8041,7 @@
               <w:rPr>
                 <w:sz w:val="18"/>
               </w:rPr>
-              <w:t>151.512 €</w:t>
+              <w:t>161.887 €</w:t>
             </w:r>
           </w:p>
         </w:tc>
@@ -6692,7 +8060,7 @@
               <w:rPr>
                 <w:sz w:val="18"/>
               </w:rPr>
-              <w:t>47.210 €</w:t>
+              <w:t>50.913 €</w:t>
             </w:r>
           </w:p>
         </w:tc>
@@ -6711,7 +8079,7 @@
               <w:rPr>
                 <w:sz w:val="18"/>
               </w:rPr>
-              <w:t>198.722 €</w:t>
+              <w:t>212.800 €</w:t>
             </w:r>
           </w:p>
         </w:tc>
@@ -6730,7 +8098,7 @@
               <w:rPr>
                 <w:sz w:val="18"/>
               </w:rPr>
-              <w:t>4.398.008 €</w:t>
+              <w:t>4.745.377 €</w:t>
             </w:r>
           </w:p>
         </w:tc>
@@ -6772,7 +8140,7 @@
               <w:rPr>
                 <w:sz w:val="18"/>
               </w:rPr>
-              <w:t>149.866 €</w:t>
+              <w:t>160.129 €</w:t>
             </w:r>
           </w:p>
         </w:tc>
@@ -6791,7 +8159,7 @@
               <w:rPr>
                 <w:sz w:val="18"/>
               </w:rPr>
-              <w:t>48.856 €</w:t>
+              <w:t>52.671 €</w:t>
             </w:r>
           </w:p>
         </w:tc>
@@ -6810,7 +8178,7 @@
               <w:rPr>
                 <w:sz w:val="18"/>
               </w:rPr>
-              <w:t>198.722 €</w:t>
+              <w:t>212.800 €</w:t>
             </w:r>
           </w:p>
         </w:tc>
@@ -6829,7 +8197,7 @@
               <w:rPr>
                 <w:sz w:val="18"/>
               </w:rPr>
-              <w:t>4.349.151 €</w:t>
+              <w:t>4.692.706 €</w:t>
             </w:r>
           </w:p>
         </w:tc>
@@ -6871,7 +8239,7 @@
               <w:rPr>
                 <w:sz w:val="18"/>
               </w:rPr>
-              <w:t>146.391 €</w:t>
+              <w:t>156.421 €</w:t>
             </w:r>
           </w:p>
         </w:tc>
@@ -6890,7 +8258,7 @@
               <w:rPr>
                 <w:sz w:val="18"/>
               </w:rPr>
-              <w:t>52.331 €</w:t>
+              <w:t>56.379 €</w:t>
             </w:r>
           </w:p>
         </w:tc>
@@ -6909,7 +8277,7 @@
               <w:rPr>
                 <w:sz w:val="18"/>
               </w:rPr>
-              <w:t>198.722 €</w:t>
+              <w:t>212.800 €</w:t>
             </w:r>
           </w:p>
         </w:tc>
@@ -6928,7 +8296,7 @@
               <w:rPr>
                 <w:sz w:val="18"/>
               </w:rPr>
-              <w:t>4.246.258 €</w:t>
+              <w:t>4.581.834 €</w:t>
             </w:r>
           </w:p>
         </w:tc>
@@ -6974,7 +8342,7 @@
                 <w:b/>
                 <w:sz w:val="18"/>
               </w:rPr>
-              <w:t>136.537 €</w:t>
+              <w:t>145.921 €</w:t>
             </w:r>
           </w:p>
         </w:tc>
@@ -6995,7 +8363,7 @@
                 <w:b/>
                 <w:sz w:val="18"/>
               </w:rPr>
-              <w:t>62.185 €</w:t>
+              <w:t>66.879 €</w:t>
             </w:r>
           </w:p>
         </w:tc>
@@ -7016,7 +8384,7 @@
                 <w:b/>
                 <w:sz w:val="18"/>
               </w:rPr>
-              <w:t>198.722 €</w:t>
+              <w:t>212.800 €</w:t>
             </w:r>
           </w:p>
         </w:tc>
@@ -7037,7 +8405,7 @@
                 <w:b/>
                 <w:sz w:val="18"/>
               </w:rPr>
-              <w:t>3.955.746 €</w:t>
+              <w:t>4.269.180 €</w:t>
             </w:r>
           </w:p>
         </w:tc>
@@ -7079,7 +8447,7 @@
               <w:rPr>
                 <w:sz w:val="18"/>
               </w:rPr>
-              <w:t>124.748 €</w:t>
+              <w:t>133.383 €</w:t>
             </w:r>
           </w:p>
         </w:tc>
@@ -7098,7 +8466,7 @@
               <w:rPr>
                 <w:sz w:val="18"/>
               </w:rPr>
-              <w:t>73.974 €</w:t>
+              <w:t>79.418 €</w:t>
             </w:r>
           </w:p>
         </w:tc>
@@ -7117,7 +8485,7 @@
               <w:rPr>
                 <w:sz w:val="18"/>
               </w:rPr>
-              <w:t>198.722 €</w:t>
+              <w:t>212.800 €</w:t>
             </w:r>
           </w:p>
         </w:tc>
@@ -7136,7 +8504,7 @@
               <w:rPr>
                 <w:sz w:val="18"/>
               </w:rPr>
-              <w:t>3.610.303 €</w:t>
+              <w:t>3.898.060 €</w:t>
             </w:r>
           </w:p>
         </w:tc>
@@ -7178,7 +8546,7 @@
               <w:rPr>
                 <w:sz w:val="18"/>
               </w:rPr>
-              <w:t>110.632 €</w:t>
+              <w:t>118.398 €</w:t>
             </w:r>
           </w:p>
         </w:tc>
@@ -7197,7 +8565,7 @@
               <w:rPr>
                 <w:sz w:val="18"/>
               </w:rPr>
-              <w:t>88.090 €</w:t>
+              <w:t>94.403 €</w:t>
             </w:r>
           </w:p>
         </w:tc>
@@ -7216,7 +8584,7 @@
               <w:rPr>
                 <w:sz w:val="18"/>
               </w:rPr>
-              <w:t>198.722 €</w:t>
+              <w:t>212.800 €</w:t>
             </w:r>
           </w:p>
         </w:tc>
@@ -7235,7 +8603,7 @@
               <w:rPr>
                 <w:sz w:val="18"/>
               </w:rPr>
-              <w:t>3.199.105 €</w:t>
+              <w:t>3.457.088 €</w:t>
             </w:r>
           </w:p>
         </w:tc>
@@ -7277,7 +8645,7 @@
               <w:rPr>
                 <w:sz w:val="18"/>
               </w:rPr>
-              <w:t>93.713 €</w:t>
+              <w:t>100.473 €</w:t>
             </w:r>
           </w:p>
         </w:tc>
@@ -7296,7 +8664,7 @@
               <w:rPr>
                 <w:sz w:val="18"/>
               </w:rPr>
-              <w:t>105.009 €</w:t>
+              <w:t>112.328 €</w:t>
             </w:r>
           </w:p>
         </w:tc>
@@ -7315,7 +8683,7 @@
               <w:rPr>
                 <w:sz w:val="18"/>
               </w:rPr>
-              <w:t>198.722 €</w:t>
+              <w:t>212.800 €</w:t>
             </w:r>
           </w:p>
         </w:tc>
@@ -7334,7 +8702,7 @@
               <w:rPr>
                 <w:sz w:val="18"/>
               </w:rPr>
-              <w:t>2.709.124 €</w:t>
+              <w:t>2.932.587 €</w:t>
             </w:r>
           </w:p>
         </w:tc>
@@ -7376,7 +8744,7 @@
               <w:rPr>
                 <w:sz w:val="18"/>
               </w:rPr>
-              <w:t>73.417 €</w:t>
+              <w:t>79.012 €</w:t>
             </w:r>
           </w:p>
         </w:tc>
@@ -7395,7 +8763,7 @@
               <w:rPr>
                 <w:sz w:val="18"/>
               </w:rPr>
-              <w:t>125.304 €</w:t>
+              <w:t>133.789 €</w:t>
             </w:r>
           </w:p>
         </w:tc>
@@ -7414,7 +8782,7 @@
               <w:rPr>
                 <w:sz w:val="18"/>
               </w:rPr>
-              <w:t>198.722 €</w:t>
+              <w:t>212.800 €</w:t>
             </w:r>
           </w:p>
         </w:tc>
@@ -7433,7 +8801,7 @@
               <w:rPr>
                 <w:sz w:val="18"/>
               </w:rPr>
-              <w:t>2.124.672 €</w:t>
+              <w:t>2.308.113 €</w:t>
             </w:r>
           </w:p>
         </w:tc>
@@ -7473,7 +8841,7 @@
               <w:rPr>
                 <w:sz w:val="18"/>
               </w:rPr>
-              <w:t>49.052 €</w:t>
+              <w:t>53.296 €</w:t>
             </w:r>
           </w:p>
         </w:tc>
@@ -7491,7 +8859,7 @@
               <w:rPr>
                 <w:sz w:val="18"/>
               </w:rPr>
-              <w:t>149.670 €</w:t>
+              <w:t>159.505 €</w:t>
             </w:r>
           </w:p>
         </w:tc>
@@ -7509,7 +8877,7 @@
               <w:rPr>
                 <w:sz w:val="18"/>
               </w:rPr>
-              <w:t>198.722 €</w:t>
+              <w:t>212.800 €</w:t>
             </w:r>
           </w:p>
         </w:tc>
@@ -7527,7 +8895,7 @@
               <w:rPr>
                 <w:sz w:val="18"/>
               </w:rPr>
-              <w:t>1.426.837 €</w:t>
+              <w:t>1.563.885 €</w:t>
             </w:r>
           </w:p>
         </w:tc>
@@ -7547,7 +8915,7 @@
           <w:b w:val="0"/>
           <w:i w:val="0"/>
         </w:rPr>
-        <w:t>Nach 10 Jahren beträgt die Restschuld 3.955.746 €. Die Anschlussfinanzierung ist eingeplant, ein Zinsanstieg um einen Prozentpunkt auf die Restschuld kostet ca. 3.296 € pro Monat mehr. Die Bank kann eine höhere Tilgung verlangen, im Modell ist sie einstellbar.</w:t>
+        <w:t>Nach 10 Jahren beträgt die Restschuld 4.269.180 €. Die Anschlussfinanzierung ist eingeplant, ein Zinsanstieg um einen Prozentpunkt auf die Restschuld kostet ca. 3.558 € pro Monat mehr. Die Bank kann eine höhere Tilgung verlangen, im Modell ist sie einstellbar.</w:t>
       </w:r>
     </w:p>
     <w:p>
@@ -7555,7 +8923,7 @@
         <w:pStyle w:val="Heading1"/>
       </w:pPr>
       <w:r>
-        <w:t>8  Ertrag und Kapitaldienst</w:t>
+        <w:t>9  Ertrag und Kapitaldienst</w:t>
       </w:r>
     </w:p>
     <w:tbl>
@@ -7686,7 +9054,7 @@
               <w:rPr>
                 <w:sz w:val="18"/>
               </w:rPr>
-              <w:t>+8.103 €</w:t>
+              <w:t>+7.321 €</w:t>
             </w:r>
           </w:p>
         </w:tc>
@@ -7705,7 +9073,7 @@
               <w:rPr>
                 <w:sz w:val="18"/>
               </w:rPr>
-              <w:t>+97.235 €</w:t>
+              <w:t>+87.847 €</w:t>
             </w:r>
           </w:p>
         </w:tc>
@@ -7728,7 +9096,7 @@
               <w:rPr>
                 <w:sz w:val="18"/>
               </w:rPr>
-              <w:t>Pacht Gastro (460 m² × 12 €)</w:t>
+              <w:t>Büromieten (2 Ankermieter, 10 Jahre fest)</w:t>
             </w:r>
           </w:p>
         </w:tc>
@@ -7747,7 +9115,7 @@
               <w:rPr>
                 <w:sz w:val="18"/>
               </w:rPr>
-              <w:t>+5.520 €</w:t>
+              <w:t>+1.600 €</w:t>
             </w:r>
           </w:p>
         </w:tc>
@@ -7766,7 +9134,7 @@
               <w:rPr>
                 <w:sz w:val="18"/>
               </w:rPr>
-              <w:t>+66.240 €</w:t>
+              <w:t>+19.200 €</w:t>
             </w:r>
           </w:p>
         </w:tc>
@@ -7789,7 +9157,7 @@
               <w:rPr>
                 <w:sz w:val="18"/>
               </w:rPr>
-              <w:t>Rücklagen (10 % von Miete und Pacht)</w:t>
+              <w:t>Pacht Gastro (510 m² × 10 €)</w:t>
             </w:r>
           </w:p>
         </w:tc>
@@ -7808,7 +9176,7 @@
               <w:rPr>
                 <w:sz w:val="18"/>
               </w:rPr>
-              <w:t>−1.362 €</w:t>
+              <w:t>+5.100 €</w:t>
             </w:r>
           </w:p>
         </w:tc>
@@ -7827,7 +9195,7 @@
               <w:rPr>
                 <w:sz w:val="18"/>
               </w:rPr>
-              <w:t>−16.348 €</w:t>
+              <w:t>+61.200 €</w:t>
             </w:r>
           </w:p>
         </w:tc>
@@ -7839,27 +9207,24 @@
         <w:tc>
           <w:tcPr>
             <w:tcW w:type="dxa" w:w="5102"/>
-            <w:shd w:val="clear" w:color="auto" w:fill="E3E8E5"/>
-          </w:tcPr>
-          <w:p>
-            <w:pPr>
-              <w:keepNext/>
-              <w:spacing w:after="20" w:before="20"/>
-            </w:pPr>
-            <w:r/>
-            <w:r>
-              <w:rPr>
-                <w:b/>
-                <w:sz w:val="18"/>
-              </w:rPr>
-              <w:t>Nettoertrag Immobilie</w:t>
+          </w:tcPr>
+          <w:p>
+            <w:pPr>
+              <w:keepNext/>
+              <w:spacing w:after="20" w:before="20"/>
+            </w:pPr>
+            <w:r/>
+            <w:r>
+              <w:rPr>
+                <w:sz w:val="18"/>
+              </w:rPr>
+              <w:t>Rücklagen (10 % von Miete, Büro und Pacht)</w:t>
             </w:r>
           </w:p>
         </w:tc>
         <w:tc>
           <w:tcPr>
             <w:tcW w:type="dxa" w:w="2154"/>
-            <w:shd w:val="clear" w:color="auto" w:fill="E3E8E5"/>
           </w:tcPr>
           <w:p>
             <w:pPr>
@@ -7870,17 +9235,15 @@
             <w:r/>
             <w:r>
               <w:rPr>
-                <w:b/>
-                <w:sz w:val="18"/>
-              </w:rPr>
-              <w:t>+12.261 €</w:t>
+                <w:sz w:val="18"/>
+              </w:rPr>
+              <w:t>−1.402 €</w:t>
             </w:r>
           </w:p>
         </w:tc>
         <w:tc>
           <w:tcPr>
             <w:tcW w:type="dxa" w:w="2154"/>
-            <w:shd w:val="clear" w:color="auto" w:fill="E3E8E5"/>
           </w:tcPr>
           <w:p>
             <w:pPr>
@@ -7891,10 +9254,9 @@
             <w:r/>
             <w:r>
               <w:rPr>
-                <w:b/>
-                <w:sz w:val="18"/>
-              </w:rPr>
-              <w:t>+147.128 €</w:t>
+                <w:sz w:val="18"/>
+              </w:rPr>
+              <w:t>−16.825 €</w:t>
             </w:r>
           </w:p>
         </w:tc>
@@ -7906,24 +9268,27 @@
         <w:tc>
           <w:tcPr>
             <w:tcW w:type="dxa" w:w="5102"/>
-          </w:tcPr>
-          <w:p>
-            <w:pPr>
-              <w:keepNext/>
-              <w:spacing w:after="20" w:before="20"/>
-            </w:pPr>
-            <w:r/>
-            <w:r>
-              <w:rPr>
-                <w:sz w:val="18"/>
-              </w:rPr>
-              <w:t>Betriebsergebnis Gastro nach Pacht (50.000 € Umsatz)</w:t>
+            <w:shd w:val="clear" w:color="auto" w:fill="E3E8E5"/>
+          </w:tcPr>
+          <w:p>
+            <w:pPr>
+              <w:keepNext/>
+              <w:spacing w:after="20" w:before="20"/>
+            </w:pPr>
+            <w:r/>
+            <w:r>
+              <w:rPr>
+                <w:b/>
+                <w:sz w:val="18"/>
+              </w:rPr>
+              <w:t>Nettoertrag Immobilie</w:t>
             </w:r>
           </w:p>
         </w:tc>
         <w:tc>
           <w:tcPr>
             <w:tcW w:type="dxa" w:w="2154"/>
+            <w:shd w:val="clear" w:color="auto" w:fill="E3E8E5"/>
           </w:tcPr>
           <w:p>
             <w:pPr>
@@ -7934,15 +9299,17 @@
             <w:r/>
             <w:r>
               <w:rPr>
-                <w:sz w:val="18"/>
-              </w:rPr>
-              <w:t>+9.730 €</w:t>
+                <w:b/>
+                <w:sz w:val="18"/>
+              </w:rPr>
+              <w:t>+12.619 €</w:t>
             </w:r>
           </w:p>
         </w:tc>
         <w:tc>
           <w:tcPr>
             <w:tcW w:type="dxa" w:w="2154"/>
+            <w:shd w:val="clear" w:color="auto" w:fill="E3E8E5"/>
           </w:tcPr>
           <w:p>
             <w:pPr>
@@ -7953,9 +9320,10 @@
             <w:r/>
             <w:r>
               <w:rPr>
-                <w:sz w:val="18"/>
-              </w:rPr>
-              <w:t>+116.760 €</w:t>
+                <w:b/>
+                <w:sz w:val="18"/>
+              </w:rPr>
+              <w:t>+151.422 €</w:t>
             </w:r>
           </w:p>
         </w:tc>
@@ -7967,27 +9335,24 @@
         <w:tc>
           <w:tcPr>
             <w:tcW w:type="dxa" w:w="5102"/>
-            <w:shd w:val="clear" w:color="auto" w:fill="E3E8E5"/>
-          </w:tcPr>
-          <w:p>
-            <w:pPr>
-              <w:keepNext/>
-              <w:spacing w:after="20" w:before="20"/>
-            </w:pPr>
-            <w:r/>
-            <w:r>
-              <w:rPr>
-                <w:b/>
-                <w:sz w:val="18"/>
-              </w:rPr>
-              <w:t>Nettoertrag vor Kapitaldienst</w:t>
+          </w:tcPr>
+          <w:p>
+            <w:pPr>
+              <w:keepNext/>
+              <w:spacing w:after="20" w:before="20"/>
+            </w:pPr>
+            <w:r/>
+            <w:r>
+              <w:rPr>
+                <w:sz w:val="18"/>
+              </w:rPr>
+              <w:t>Betriebsergebnis Gastro nach Pacht (65.000 € Umsatz)</w:t>
             </w:r>
           </w:p>
         </w:tc>
         <w:tc>
           <w:tcPr>
             <w:tcW w:type="dxa" w:w="2154"/>
-            <w:shd w:val="clear" w:color="auto" w:fill="E3E8E5"/>
           </w:tcPr>
           <w:p>
             <w:pPr>
@@ -7998,17 +9363,15 @@
             <w:r/>
             <w:r>
               <w:rPr>
-                <w:b/>
-                <w:sz w:val="18"/>
-              </w:rPr>
-              <w:t>+21.991 €</w:t>
+                <w:sz w:val="18"/>
+              </w:rPr>
+              <w:t>+14.725 €</w:t>
             </w:r>
           </w:p>
         </w:tc>
         <w:tc>
           <w:tcPr>
             <w:tcW w:type="dxa" w:w="2154"/>
-            <w:shd w:val="clear" w:color="auto" w:fill="E3E8E5"/>
           </w:tcPr>
           <w:p>
             <w:pPr>
@@ -8019,10 +9382,9 @@
             <w:r/>
             <w:r>
               <w:rPr>
-                <w:b/>
-                <w:sz w:val="18"/>
-              </w:rPr>
-              <w:t>+263.888 €</w:t>
+                <w:sz w:val="18"/>
+              </w:rPr>
+              <w:t>+176.700 €</w:t>
             </w:r>
           </w:p>
         </w:tc>
@@ -8034,24 +9396,27 @@
         <w:tc>
           <w:tcPr>
             <w:tcW w:type="dxa" w:w="5102"/>
-          </w:tcPr>
-          <w:p>
-            <w:pPr>
-              <w:keepNext/>
-              <w:spacing w:after="20" w:before="20"/>
-            </w:pPr>
-            <w:r/>
-            <w:r>
-              <w:rPr>
-                <w:sz w:val="18"/>
-              </w:rPr>
-              <w:t>Kapitaldienst (Zinsen und Tilgung)</w:t>
+            <w:shd w:val="clear" w:color="auto" w:fill="E3E8E5"/>
+          </w:tcPr>
+          <w:p>
+            <w:pPr>
+              <w:keepNext/>
+              <w:spacing w:after="20" w:before="20"/>
+            </w:pPr>
+            <w:r/>
+            <w:r>
+              <w:rPr>
+                <w:b/>
+                <w:sz w:val="18"/>
+              </w:rPr>
+              <w:t>Nettoertrag vor Kapitaldienst</w:t>
             </w:r>
           </w:p>
         </w:tc>
         <w:tc>
           <w:tcPr>
             <w:tcW w:type="dxa" w:w="2154"/>
+            <w:shd w:val="clear" w:color="auto" w:fill="E3E8E5"/>
           </w:tcPr>
           <w:p>
             <w:pPr>
@@ -8062,15 +9427,17 @@
             <w:r/>
             <w:r>
               <w:rPr>
-                <w:sz w:val="18"/>
-              </w:rPr>
-              <w:t>−16.560 €</w:t>
+                <w:b/>
+                <w:sz w:val="18"/>
+              </w:rPr>
+              <w:t>+27.344 €</w:t>
             </w:r>
           </w:p>
         </w:tc>
         <w:tc>
           <w:tcPr>
             <w:tcW w:type="dxa" w:w="2154"/>
+            <w:shd w:val="clear" w:color="auto" w:fill="E3E8E5"/>
           </w:tcPr>
           <w:p>
             <w:pPr>
@@ -8081,9 +9448,10 @@
             <w:r/>
             <w:r>
               <w:rPr>
-                <w:sz w:val="18"/>
-              </w:rPr>
-              <w:t>−198.722 €</w:t>
+                <w:b/>
+                <w:sz w:val="18"/>
+              </w:rPr>
+              <w:t>+328.122 €</w:t>
             </w:r>
           </w:p>
         </w:tc>
@@ -8095,6 +9463,67 @@
         <w:tc>
           <w:tcPr>
             <w:tcW w:type="dxa" w:w="5102"/>
+          </w:tcPr>
+          <w:p>
+            <w:pPr>
+              <w:keepNext/>
+              <w:spacing w:after="20" w:before="20"/>
+            </w:pPr>
+            <w:r/>
+            <w:r>
+              <w:rPr>
+                <w:sz w:val="18"/>
+              </w:rPr>
+              <w:t>Kapitaldienst (Zinsen und Tilgung)</w:t>
+            </w:r>
+          </w:p>
+        </w:tc>
+        <w:tc>
+          <w:tcPr>
+            <w:tcW w:type="dxa" w:w="2154"/>
+          </w:tcPr>
+          <w:p>
+            <w:pPr>
+              <w:keepNext/>
+              <w:spacing w:after="20" w:before="20"/>
+              <w:jc w:val="right"/>
+            </w:pPr>
+            <w:r/>
+            <w:r>
+              <w:rPr>
+                <w:sz w:val="18"/>
+              </w:rPr>
+              <w:t>−17.733 €</w:t>
+            </w:r>
+          </w:p>
+        </w:tc>
+        <w:tc>
+          <w:tcPr>
+            <w:tcW w:type="dxa" w:w="2154"/>
+          </w:tcPr>
+          <w:p>
+            <w:pPr>
+              <w:keepNext/>
+              <w:spacing w:after="20" w:before="20"/>
+              <w:jc w:val="right"/>
+            </w:pPr>
+            <w:r/>
+            <w:r>
+              <w:rPr>
+                <w:sz w:val="18"/>
+              </w:rPr>
+              <w:t>−212.800 €</w:t>
+            </w:r>
+          </w:p>
+        </w:tc>
+      </w:tr>
+      <w:tr>
+        <w:trPr>
+          <w:cantSplit/>
+        </w:trPr>
+        <w:tc>
+          <w:tcPr>
+            <w:tcW w:type="dxa" w:w="5102"/>
             <w:shd w:val="clear" w:color="auto" w:fill="E3E8E5"/>
           </w:tcPr>
           <w:p>
@@ -8127,7 +9556,7 @@
                 <w:b/>
                 <w:sz w:val="18"/>
               </w:rPr>
-              <w:t>+5.430 €</w:t>
+              <w:t>+9.610 €</w:t>
             </w:r>
           </w:p>
         </w:tc>
@@ -8147,7 +9576,7 @@
                 <w:b/>
                 <w:sz w:val="18"/>
               </w:rPr>
-              <w:t>+65.166 €</w:t>
+              <w:t>+115.322 €</w:t>
             </w:r>
           </w:p>
         </w:tc>
@@ -8170,7 +9599,7 @@
         <w:t xml:space="preserve">Kapitaldienstdeckung (DSCR): </w:t>
       </w:r>
       <w:r>
-        <w:t>1,33 gesamt, 0,74 nur aus Miete und Pacht. Banken verlangen meist mindestens 1,2.</w:t>
+        <w:t>1,54 gesamt, 0,71 nur aus Miete, Büro und Pacht, 0,45 nur aus Wohnen und Büro. Banken verlangen meist mindestens 1,2.</w:t>
       </w:r>
     </w:p>
     <w:p>
@@ -8185,7 +9614,7 @@
         <w:t xml:space="preserve">Zinsdeckung: </w:t>
       </w:r>
       <w:r>
-        <w:t>1,72 (Ertrag vor Kapitaldienst im Verhältnis zu den Zinsen).</w:t>
+        <w:t>2,01 (Ertrag vor Kapitaldienst im Verhältnis zu den Zinsen).</w:t>
       </w:r>
     </w:p>
     <w:p>
@@ -8200,7 +9629,7 @@
         <w:t xml:space="preserve">Anfangsrendite: </w:t>
       </w:r>
       <w:r>
-        <w:t>3,28 % (Nettoertrag der Immobilie auf die Gesamtkosten).</w:t>
+        <w:t>3,13 % (Nettoertrag der Immobilie auf die Gesamtkosten).</w:t>
       </w:r>
     </w:p>
     <w:p>
@@ -8215,7 +9644,7 @@
         <w:t xml:space="preserve">Break-even: </w:t>
       </w:r>
       <w:r>
-        <w:t>Das Haus ist ab ca. 32.200 € Gastro-Umsatz im Monat im Plus, alle Raten sind dann bezahlt.</w:t>
+        <w:t>Das Haus ist ab ca. 33.500 € Gastro-Umsatz im Monat im Plus, alle Raten sind dann bezahlt.</w:t>
       </w:r>
     </w:p>
     <w:p>
@@ -8234,7 +9663,7 @@
         <w:pStyle w:val="Heading1"/>
       </w:pPr>
       <w:r>
-        <w:t>9  Ertragswert und Beleihung</w:t>
+        <w:t>10  Ertragswert und Beleihung</w:t>
       </w:r>
     </w:p>
     <w:p>
@@ -8243,7 +9672,7 @@
           <w:b w:val="0"/>
           <w:i w:val="0"/>
         </w:rPr>
-        <w:t>Der Ertragswert wird vereinfacht nach der Immobilienwertermittlungsverordnung (ImmoWertV) berechnet: Rohertrag minus Bewirtschaftungskosten ergibt den Reinertrag, davon wird die Verzinsung des Bodenwerts abgezogen und der Rest mit einem Vervielfältiger (Barwertfaktor für die Restnutzungsdauer) kapitalisiert. Angesetzt sind ein Liegenschaftszins von 4,5 %, eine Restnutzungsdauer von 80 Jahren und Bewirtschaftungskosten nach üblichen Sätzen. Den verbindlichen Beleihungswert ermittelt der Gutachter der Bank.</w:t>
+        <w:t>Der Ertragswert wird vereinfacht nach der Immobilienwertermittlungsverordnung (ImmoWertV) berechnet: Rohertrag minus Bewirtschaftungskosten ergibt den Reinertrag, davon wird die Verzinsung des Bodenwerts abgezogen und der Rest mit einem Vervielfältiger (Barwertfaktor für die Restnutzungsdauer) kapitalisiert. Die Bewertung erfolgt getrennt nach Nutzung: Liegenschaftszins 4,0 % für Wohnen, 6,0 % für die Büros mit Ankermietern und 6,5 % für die Gastro-Pacht, Restnutzungsdauer 80 Jahre (Wohnen) bzw. 60 Jahre (Gewerbe), Bewirtschaftungskosten nach üblichen Sätzen. Den verbindlichen Beleihungswert ermittelt der Gutachter der Bank.</w:t>
       </w:r>
     </w:p>
     <w:tbl>
@@ -8351,7 +9780,7 @@
               <w:rPr>
                 <w:sz w:val="18"/>
               </w:rPr>
-              <w:t>163.475 €</w:t>
+              <w:t>168.247 €</w:t>
             </w:r>
           </w:p>
         </w:tc>
@@ -8393,7 +9822,7 @@
               <w:rPr>
                 <w:sz w:val="18"/>
               </w:rPr>
-              <w:t>−21.842 €</w:t>
+              <w:t>−23.141 €</w:t>
             </w:r>
           </w:p>
         </w:tc>
@@ -8439,7 +9868,7 @@
                 <w:b/>
                 <w:sz w:val="18"/>
               </w:rPr>
-              <w:t>141.634 €</w:t>
+              <w:t>145.106 €</w:t>
             </w:r>
           </w:p>
         </w:tc>
@@ -8504,7 +9933,7 @@
               <w:rPr>
                 <w:sz w:val="18"/>
               </w:rPr>
-              <w:t>Gebäudeertragswert (Vervielfältiger 21,6)</w:t>
+              <w:t>Gebäudeertragswert (mittlerer Vervielfältiger 19,9)</w:t>
             </w:r>
           </w:p>
         </w:tc>
@@ -8523,7 +9952,7 @@
               <w:rPr>
                 <w:sz w:val="18"/>
               </w:rPr>
-              <w:t>2.840.108 €</w:t>
+              <w:t>2.656.444 €</w:t>
             </w:r>
           </w:p>
         </w:tc>
@@ -8539,6 +9968,7 @@
           </w:tcPr>
           <w:p>
             <w:pPr>
+              <w:keepNext/>
               <w:spacing w:after="20" w:before="20"/>
             </w:pPr>
             <w:r/>
@@ -8558,6 +9988,7 @@
           </w:tcPr>
           <w:p>
             <w:pPr>
+              <w:keepNext/>
               <w:spacing w:after="20" w:before="20"/>
               <w:jc w:val="right"/>
             </w:pPr>
@@ -8567,7 +9998,131 @@
                 <w:b/>
                 <w:sz w:val="18"/>
               </w:rPr>
-              <w:t>3.060.908 €</w:t>
+              <w:t>2.877.244 €</w:t>
+            </w:r>
+          </w:p>
+        </w:tc>
+      </w:tr>
+      <w:tr>
+        <w:trPr>
+          <w:cantSplit/>
+        </w:trPr>
+        <w:tc>
+          <w:tcPr>
+            <w:tcW w:type="dxa" w:w="6236"/>
+          </w:tcPr>
+          <w:p>
+            <w:pPr>
+              <w:keepNext/>
+              <w:spacing w:after="20" w:before="20"/>
+            </w:pPr>
+            <w:r/>
+            <w:r>
+              <w:rPr>
+                <w:sz w:val="18"/>
+              </w:rPr>
+              <w:t>davon Wohnen</w:t>
+            </w:r>
+          </w:p>
+        </w:tc>
+        <w:tc>
+          <w:tcPr>
+            <w:tcW w:type="dxa" w:w="3175"/>
+          </w:tcPr>
+          <w:p>
+            <w:pPr>
+              <w:keepNext/>
+              <w:spacing w:after="20" w:before="20"/>
+              <w:jc w:val="right"/>
+            </w:pPr>
+            <w:r/>
+            <w:r>
+              <w:rPr>
+                <w:sz w:val="18"/>
+              </w:rPr>
+              <w:t>1.806.745 €</w:t>
+            </w:r>
+          </w:p>
+        </w:tc>
+      </w:tr>
+      <w:tr>
+        <w:trPr>
+          <w:cantSplit/>
+        </w:trPr>
+        <w:tc>
+          <w:tcPr>
+            <w:tcW w:type="dxa" w:w="6236"/>
+          </w:tcPr>
+          <w:p>
+            <w:pPr>
+              <w:keepNext/>
+              <w:spacing w:after="20" w:before="20"/>
+            </w:pPr>
+            <w:r/>
+            <w:r>
+              <w:rPr>
+                <w:sz w:val="18"/>
+              </w:rPr>
+              <w:t>davon Büro (Ankermieter)</w:t>
+            </w:r>
+          </w:p>
+        </w:tc>
+        <w:tc>
+          <w:tcPr>
+            <w:tcW w:type="dxa" w:w="3175"/>
+          </w:tcPr>
+          <w:p>
+            <w:pPr>
+              <w:keepNext/>
+              <w:spacing w:after="20" w:before="20"/>
+              <w:jc w:val="right"/>
+            </w:pPr>
+            <w:r/>
+            <w:r>
+              <w:rPr>
+                <w:sz w:val="18"/>
+              </w:rPr>
+              <w:t>274.282 €</w:t>
+            </w:r>
+          </w:p>
+        </w:tc>
+      </w:tr>
+      <w:tr>
+        <w:trPr>
+          <w:cantSplit/>
+        </w:trPr>
+        <w:tc>
+          <w:tcPr>
+            <w:tcW w:type="dxa" w:w="6236"/>
+          </w:tcPr>
+          <w:p>
+            <w:pPr>
+              <w:spacing w:after="20" w:before="20"/>
+            </w:pPr>
+            <w:r/>
+            <w:r>
+              <w:rPr>
+                <w:sz w:val="18"/>
+              </w:rPr>
+              <w:t>davon Gastro (Pacht)</w:t>
+            </w:r>
+          </w:p>
+        </w:tc>
+        <w:tc>
+          <w:tcPr>
+            <w:tcW w:type="dxa" w:w="3175"/>
+          </w:tcPr>
+          <w:p>
+            <w:pPr>
+              <w:spacing w:after="20" w:before="20"/>
+              <w:jc w:val="right"/>
+            </w:pPr>
+            <w:r/>
+            <w:r>
+              <w:rPr>
+                <w:sz w:val="18"/>
+              </w:rPr>
+              <w:t>796.217 €</w:t>
             </w:r>
           </w:p>
         </w:tc>
@@ -8683,7 +10238,7 @@
               <w:rPr>
                 <w:sz w:val="18"/>
               </w:rPr>
-              <w:t>4.054.316 €</w:t>
+              <w:t>4.325.626 €</w:t>
             </w:r>
           </w:p>
         </w:tc>
@@ -8725,7 +10280,7 @@
               <w:rPr>
                 <w:sz w:val="18"/>
               </w:rPr>
-              <w:t>2.754.817 €</w:t>
+              <w:t>2.589.520 €</w:t>
             </w:r>
           </w:p>
         </w:tc>
@@ -8767,7 +10322,7 @@
               <w:rPr>
                 <w:sz w:val="18"/>
               </w:rPr>
-              <w:t>4.490.838 €</w:t>
+              <w:t>4.845.506 €</w:t>
             </w:r>
           </w:p>
         </w:tc>
@@ -8813,7 +10368,7 @@
                 <w:b/>
                 <w:sz w:val="18"/>
               </w:rPr>
-              <w:t>163 %</w:t>
+              <w:t>187 %</w:t>
             </w:r>
           </w:p>
         </w:tc>
@@ -8855,7 +10410,7 @@
               <w:rPr>
                 <w:sz w:val="18"/>
               </w:rPr>
-              <w:t>−1.429.929 €</w:t>
+              <w:t>−1.968.262 €</w:t>
             </w:r>
           </w:p>
         </w:tc>
@@ -8895,7 +10450,7 @@
               <w:rPr>
                 <w:sz w:val="18"/>
               </w:rPr>
-              <w:t>2.286.984 €</w:t>
+              <w:t>2.773.890 €</w:t>
             </w:r>
           </w:p>
         </w:tc>
@@ -8925,7 +10480,7 @@
           <w:b w:val="0"/>
           <w:i w:val="0"/>
         </w:rPr>
-        <w:t>Die Mieten und die Pacht tragen einen Ertragswert von 3,06 Mio. €, die Kosten liegen bei 4,49 Mio. €. Bei 100 % Fremdfinanzierung ergibt sich ein Beleihungsauslauf von 163 %, Banken beleihen üblicherweise nur bis ca. 80 %. Um das Darlehen darstellen zu können, bietet der Bauherr der Bank zusätzliche Sicherheiten an, etwa Grundschulden auf weitere Immobilien, eine Bürgschaft oder Eigenkapital. Rechnerisch geht es um ca. 2,29 Mio. €. Weitere Hebel sind höhere Mieten durch Vorvermietung, niedrigere Baukosten durch die Angebote der Bekannten-Unternehmen und eine Städtebauförderung (Zuschuss der Stadt, noch offen).</w:t>
+        <w:t>Die Mieten, Büromieten und die Pacht tragen einen Ertragswert von 2,88 Mio. €, die Kosten liegen bei 4,85 Mio. €. Bei 100 % Fremdfinanzierung ergibt sich ein Beleihungsauslauf von 187 %, Banken beleihen üblicherweise nur bis ca. 80 %. Um das Darlehen darstellen zu können, bietet der Bauherr der Bank zusätzliche Sicherheiten an, etwa Grundschulden auf weitere Immobilien, eine Bürgschaft oder Eigenkapital. Rechnerisch geht es um ca. 2,77 Mio. €. Weitere Hebel sind höhere Mieten durch Vorvermietung, niedrigere Baukosten durch die Angebote der Bekannten-Unternehmen und eine Städtebauförderung (Zuschuss der Stadt, noch offen).</w:t>
       </w:r>
     </w:p>
     <w:p>
@@ -8933,7 +10488,7 @@
         <w:pStyle w:val="Heading1"/>
       </w:pPr>
       <w:r>
-        <w:t>10  Prognose und Belastungstest</w:t>
+        <w:t>11  Prognose und Belastungstest</w:t>
       </w:r>
     </w:p>
     <w:tbl>
@@ -9133,7 +10688,7 @@
               <w:rPr>
                 <w:sz w:val="17"/>
               </w:rPr>
-              <w:t>263.888 €</w:t>
+              <w:t>328.122 €</w:t>
             </w:r>
           </w:p>
         </w:tc>
@@ -9152,7 +10707,7 @@
               <w:rPr>
                 <w:sz w:val="17"/>
               </w:rPr>
-              <w:t>271.864 €</w:t>
+              <w:t>338.216 €</w:t>
             </w:r>
           </w:p>
         </w:tc>
@@ -9171,7 +10726,7 @@
               <w:rPr>
                 <w:sz w:val="17"/>
               </w:rPr>
-              <w:t>280.081 €</w:t>
+              <w:t>348.621 €</w:t>
             </w:r>
           </w:p>
         </w:tc>
@@ -9190,7 +10745,7 @@
               <w:rPr>
                 <w:sz w:val="17"/>
               </w:rPr>
-              <w:t>288.546 €</w:t>
+              <w:t>359.349 €</w:t>
             </w:r>
           </w:p>
         </w:tc>
@@ -9209,7 +10764,7 @@
               <w:rPr>
                 <w:sz w:val="17"/>
               </w:rPr>
-              <w:t>301.727 €</w:t>
+              <w:t>376.065 €</w:t>
             </w:r>
           </w:p>
         </w:tc>
@@ -9251,7 +10806,7 @@
               <w:rPr>
                 <w:sz w:val="17"/>
               </w:rPr>
-              <w:t>−198.722 €</w:t>
+              <w:t>−212.800 €</w:t>
             </w:r>
           </w:p>
         </w:tc>
@@ -9270,7 +10825,7 @@
               <w:rPr>
                 <w:sz w:val="17"/>
               </w:rPr>
-              <w:t>−198.722 €</w:t>
+              <w:t>−212.800 €</w:t>
             </w:r>
           </w:p>
         </w:tc>
@@ -9289,7 +10844,7 @@
               <w:rPr>
                 <w:sz w:val="17"/>
               </w:rPr>
-              <w:t>−198.722 €</w:t>
+              <w:t>−212.800 €</w:t>
             </w:r>
           </w:p>
         </w:tc>
@@ -9308,7 +10863,7 @@
               <w:rPr>
                 <w:sz w:val="17"/>
               </w:rPr>
-              <w:t>−198.722 €</w:t>
+              <w:t>−212.800 €</w:t>
             </w:r>
           </w:p>
         </w:tc>
@@ -9327,7 +10882,7 @@
               <w:rPr>
                 <w:sz w:val="17"/>
               </w:rPr>
-              <w:t>−198.722 €</w:t>
+              <w:t>−212.800 €</w:t>
             </w:r>
           </w:p>
         </w:tc>
@@ -9373,7 +10928,7 @@
                 <w:b/>
                 <w:sz w:val="17"/>
               </w:rPr>
-              <w:t>65.166 €</w:t>
+              <w:t>115.322 €</w:t>
             </w:r>
           </w:p>
         </w:tc>
@@ -9394,7 +10949,7 @@
                 <w:b/>
                 <w:sz w:val="17"/>
               </w:rPr>
-              <w:t>73.142 €</w:t>
+              <w:t>125.415 €</w:t>
             </w:r>
           </w:p>
         </w:tc>
@@ -9415,7 +10970,7 @@
                 <w:b/>
                 <w:sz w:val="17"/>
               </w:rPr>
-              <w:t>81.359 €</w:t>
+              <w:t>135.821 €</w:t>
             </w:r>
           </w:p>
         </w:tc>
@@ -9436,7 +10991,7 @@
                 <w:b/>
                 <w:sz w:val="17"/>
               </w:rPr>
-              <w:t>89.824 €</w:t>
+              <w:t>146.548 €</w:t>
             </w:r>
           </w:p>
         </w:tc>
@@ -9457,7 +11012,7 @@
                 <w:b/>
                 <w:sz w:val="17"/>
               </w:rPr>
-              <w:t>103.005 €</w:t>
+              <w:t>163.265 €</w:t>
             </w:r>
           </w:p>
         </w:tc>
@@ -9499,7 +11054,7 @@
               <w:rPr>
                 <w:sz w:val="17"/>
               </w:rPr>
-              <w:t>1,33</w:t>
+              <w:t>1,54</w:t>
             </w:r>
           </w:p>
         </w:tc>
@@ -9518,7 +11073,7 @@
               <w:rPr>
                 <w:sz w:val="17"/>
               </w:rPr>
-              <w:t>1,37</w:t>
+              <w:t>1,59</w:t>
             </w:r>
           </w:p>
         </w:tc>
@@ -9537,7 +11092,7 @@
               <w:rPr>
                 <w:sz w:val="17"/>
               </w:rPr>
-              <w:t>1,41</w:t>
+              <w:t>1,64</w:t>
             </w:r>
           </w:p>
         </w:tc>
@@ -9556,7 +11111,7 @@
               <w:rPr>
                 <w:sz w:val="17"/>
               </w:rPr>
-              <w:t>1,45</w:t>
+              <w:t>1,69</w:t>
             </w:r>
           </w:p>
         </w:tc>
@@ -9575,7 +11130,7 @@
               <w:rPr>
                 <w:sz w:val="17"/>
               </w:rPr>
-              <w:t>1,52</w:t>
+              <w:t>1,77</w:t>
             </w:r>
           </w:p>
         </w:tc>
@@ -9615,7 +11170,7 @@
               <w:rPr>
                 <w:sz w:val="17"/>
               </w:rPr>
-              <w:t>4.445.217 €</w:t>
+              <w:t>4.796.290 €</w:t>
             </w:r>
           </w:p>
         </w:tc>
@@ -9633,7 +11188,7 @@
               <w:rPr>
                 <w:sz w:val="17"/>
               </w:rPr>
-              <w:t>4.349.151 €</w:t>
+              <w:t>4.692.706 €</w:t>
             </w:r>
           </w:p>
         </w:tc>
@@ -9651,7 +11206,7 @@
               <w:rPr>
                 <w:sz w:val="17"/>
               </w:rPr>
-              <w:t>4.246.258 €</w:t>
+              <w:t>4.581.834 €</w:t>
             </w:r>
           </w:p>
         </w:tc>
@@ -9669,7 +11224,7 @@
               <w:rPr>
                 <w:sz w:val="17"/>
               </w:rPr>
-              <w:t>4.136.032 €</w:t>
+              <w:t>4.463.143 €</w:t>
             </w:r>
           </w:p>
         </w:tc>
@@ -9687,7 +11242,7 @@
               <w:rPr>
                 <w:sz w:val="17"/>
               </w:rPr>
-              <w:t>3.955.746 €</w:t>
+              <w:t>4.269.180 €</w:t>
             </w:r>
           </w:p>
         </w:tc>
@@ -9706,7 +11261,7 @@
           <w:color w:val="5B6770"/>
           <w:sz w:val="18"/>
         </w:rPr>
-        <w:t>Annahme: Miete, Pacht und Gastro-Umsatz steigen um 1,5 % pro Jahr, der Kapitaldienst bleibt gleich. Die Kapitaldienstdeckung verbessert sich von 1,33 auf 1,52 in Jahr 10.</w:t>
+        <w:t>Annahme: Miete, Pacht und Gastro-Umsatz steigen um 1,5 % pro Jahr, Büromieten um 2 % (Indexmiete), der Kapitaldienst bleibt gleich. Die Kapitaldienstdeckung verbessert sich von 1,54 auf 1,77 in Jahr 10.</w:t>
       </w:r>
     </w:p>
     <w:tbl>
@@ -9864,7 +11419,7 @@
                 <w:b/>
                 <w:sz w:val="18"/>
               </w:rPr>
-              <w:t>+5.430 €</w:t>
+              <w:t>+9.610 €</w:t>
             </w:r>
           </w:p>
         </w:tc>
@@ -9885,7 +11440,7 @@
                 <w:b/>
                 <w:sz w:val="18"/>
               </w:rPr>
-              <w:t>1,33</w:t>
+              <w:t>1,54</w:t>
             </w:r>
           </w:p>
         </w:tc>
@@ -9947,7 +11502,7 @@
               <w:rPr>
                 <w:sz w:val="18"/>
               </w:rPr>
-              <w:t>+2.134 €</w:t>
+              <w:t>+6.053 €</w:t>
             </w:r>
           </w:p>
         </w:tc>
@@ -9966,7 +11521,7 @@
               <w:rPr>
                 <w:sz w:val="18"/>
               </w:rPr>
-              <w:t>1,11</w:t>
+              <w:t>1,28</w:t>
             </w:r>
           </w:p>
         </w:tc>
@@ -9985,7 +11540,7 @@
               <w:rPr>
                 <w:sz w:val="18"/>
               </w:rPr>
-              <w:t>−3.296 €</w:t>
+              <w:t>−3.558 €</w:t>
             </w:r>
           </w:p>
         </w:tc>
@@ -10027,7 +11582,7 @@
               <w:rPr>
                 <w:sz w:val="18"/>
               </w:rPr>
-              <w:t>+4.701 €</w:t>
+              <w:t>+8.951 €</w:t>
             </w:r>
           </w:p>
         </w:tc>
@@ -10046,7 +11601,7 @@
               <w:rPr>
                 <w:sz w:val="18"/>
               </w:rPr>
-              <w:t>1,28</w:t>
+              <w:t>1,50</w:t>
             </w:r>
           </w:p>
         </w:tc>
@@ -10065,7 +11620,7 @@
               <w:rPr>
                 <w:sz w:val="18"/>
               </w:rPr>
-              <w:t>−729 €</w:t>
+              <w:t>−659 €</w:t>
             </w:r>
           </w:p>
         </w:tc>
@@ -10107,7 +11662,7 @@
               <w:rPr>
                 <w:sz w:val="18"/>
               </w:rPr>
-              <w:t>+2.380 €</w:t>
+              <w:t>+5.645 €</w:t>
             </w:r>
           </w:p>
         </w:tc>
@@ -10126,7 +11681,7 @@
               <w:rPr>
                 <w:sz w:val="18"/>
               </w:rPr>
-              <w:t>1,14</w:t>
+              <w:t>1,32</w:t>
             </w:r>
           </w:p>
         </w:tc>
@@ -10145,7 +11700,7 @@
               <w:rPr>
                 <w:sz w:val="18"/>
               </w:rPr>
-              <w:t>−3.050 €</w:t>
+              <w:t>−3.965 €</w:t>
             </w:r>
           </w:p>
         </w:tc>
@@ -10187,7 +11742,7 @@
               <w:rPr>
                 <w:sz w:val="18"/>
               </w:rPr>
-              <w:t>−670 €</w:t>
+              <w:t>+1.680 €</w:t>
             </w:r>
           </w:p>
         </w:tc>
@@ -10206,7 +11761,7 @@
               <w:rPr>
                 <w:sz w:val="18"/>
               </w:rPr>
-              <w:t>0,96</w:t>
+              <w:t>1,09</w:t>
             </w:r>
           </w:p>
         </w:tc>
@@ -10225,7 +11780,7 @@
               <w:rPr>
                 <w:sz w:val="18"/>
               </w:rPr>
-              <w:t>−6.100 €</w:t>
+              <w:t>−7.930 €</w:t>
             </w:r>
           </w:p>
         </w:tc>
@@ -10267,7 +11822,7 @@
               <w:rPr>
                 <w:sz w:val="18"/>
               </w:rPr>
-              <w:t>+4.058 €</w:t>
+              <w:t>+8.152 €</w:t>
             </w:r>
           </w:p>
         </w:tc>
@@ -10286,7 +11841,7 @@
               <w:rPr>
                 <w:sz w:val="18"/>
               </w:rPr>
-              <w:t>1,23</w:t>
+              <w:t>1,42</w:t>
             </w:r>
           </w:p>
         </w:tc>
@@ -10305,7 +11860,7 @@
               <w:rPr>
                 <w:sz w:val="18"/>
               </w:rPr>
-              <w:t>−1.372 €</w:t>
+              <w:t>−1.459 €</w:t>
             </w:r>
           </w:p>
         </w:tc>
@@ -10320,6 +11875,166 @@
           </w:tcPr>
           <w:p>
             <w:pPr>
+              <w:keepNext/>
+              <w:spacing w:after="20" w:before="20"/>
+            </w:pPr>
+            <w:r/>
+            <w:r>
+              <w:rPr>
+                <w:sz w:val="18"/>
+              </w:rPr>
+              <w:t>Größerer Büro-Ankermieter zieht aus (Leerstand)</w:t>
+            </w:r>
+          </w:p>
+        </w:tc>
+        <w:tc>
+          <w:tcPr>
+            <w:tcW w:type="dxa" w:w="1587"/>
+          </w:tcPr>
+          <w:p>
+            <w:pPr>
+              <w:keepNext/>
+              <w:spacing w:after="20" w:before="20"/>
+              <w:jc w:val="right"/>
+            </w:pPr>
+            <w:r/>
+            <w:r>
+              <w:rPr>
+                <w:sz w:val="18"/>
+              </w:rPr>
+              <w:t>+8.755 €</w:t>
+            </w:r>
+          </w:p>
+        </w:tc>
+        <w:tc>
+          <w:tcPr>
+            <w:tcW w:type="dxa" w:w="1134"/>
+          </w:tcPr>
+          <w:p>
+            <w:pPr>
+              <w:keepNext/>
+              <w:spacing w:after="20" w:before="20"/>
+              <w:jc w:val="right"/>
+            </w:pPr>
+            <w:r/>
+            <w:r>
+              <w:rPr>
+                <w:sz w:val="18"/>
+              </w:rPr>
+              <w:t>1,49</w:t>
+            </w:r>
+          </w:p>
+        </w:tc>
+        <w:tc>
+          <w:tcPr>
+            <w:tcW w:type="dxa" w:w="1814"/>
+          </w:tcPr>
+          <w:p>
+            <w:pPr>
+              <w:keepNext/>
+              <w:spacing w:after="20" w:before="20"/>
+              <w:jc w:val="right"/>
+            </w:pPr>
+            <w:r/>
+            <w:r>
+              <w:rPr>
+                <w:sz w:val="18"/>
+              </w:rPr>
+              <w:t>−855 €</w:t>
+            </w:r>
+          </w:p>
+        </w:tc>
+      </w:tr>
+      <w:tr>
+        <w:trPr>
+          <w:cantSplit/>
+        </w:trPr>
+        <w:tc>
+          <w:tcPr>
+            <w:tcW w:type="dxa" w:w="4876"/>
+          </w:tcPr>
+          <w:p>
+            <w:pPr>
+              <w:keepNext/>
+              <w:spacing w:after="20" w:before="20"/>
+            </w:pPr>
+            <w:r/>
+            <w:r>
+              <w:rPr>
+                <w:sz w:val="18"/>
+              </w:rPr>
+              <w:t>Beide Büros leer</w:t>
+            </w:r>
+          </w:p>
+        </w:tc>
+        <w:tc>
+          <w:tcPr>
+            <w:tcW w:type="dxa" w:w="1587"/>
+          </w:tcPr>
+          <w:p>
+            <w:pPr>
+              <w:keepNext/>
+              <w:spacing w:after="20" w:before="20"/>
+              <w:jc w:val="right"/>
+            </w:pPr>
+            <w:r/>
+            <w:r>
+              <w:rPr>
+                <w:sz w:val="18"/>
+              </w:rPr>
+              <w:t>+8.170 €</w:t>
+            </w:r>
+          </w:p>
+        </w:tc>
+        <w:tc>
+          <w:tcPr>
+            <w:tcW w:type="dxa" w:w="1134"/>
+          </w:tcPr>
+          <w:p>
+            <w:pPr>
+              <w:keepNext/>
+              <w:spacing w:after="20" w:before="20"/>
+              <w:jc w:val="right"/>
+            </w:pPr>
+            <w:r/>
+            <w:r>
+              <w:rPr>
+                <w:sz w:val="18"/>
+              </w:rPr>
+              <w:t>1,46</w:t>
+            </w:r>
+          </w:p>
+        </w:tc>
+        <w:tc>
+          <w:tcPr>
+            <w:tcW w:type="dxa" w:w="1814"/>
+          </w:tcPr>
+          <w:p>
+            <w:pPr>
+              <w:keepNext/>
+              <w:spacing w:after="20" w:before="20"/>
+              <w:jc w:val="right"/>
+            </w:pPr>
+            <w:r/>
+            <w:r>
+              <w:rPr>
+                <w:sz w:val="18"/>
+              </w:rPr>
+              <w:t>−1.440 €</w:t>
+            </w:r>
+          </w:p>
+        </w:tc>
+      </w:tr>
+      <w:tr>
+        <w:trPr>
+          <w:cantSplit/>
+        </w:trPr>
+        <w:tc>
+          <w:tcPr>
+            <w:tcW w:type="dxa" w:w="4876"/>
+          </w:tcPr>
+          <w:p>
+            <w:pPr>
               <w:spacing w:after="20" w:before="20"/>
             </w:pPr>
             <w:r/>
@@ -10345,7 +12060,7 @@
               <w:rPr>
                 <w:sz w:val="18"/>
               </w:rPr>
-              <w:t>−9.268 €</w:t>
+              <w:t>−9.705 €</w:t>
             </w:r>
           </w:p>
         </w:tc>
@@ -10363,7 +12078,7 @@
               <w:rPr>
                 <w:sz w:val="18"/>
               </w:rPr>
-              <w:t>0,44</w:t>
+              <w:t>0,45</w:t>
             </w:r>
           </w:p>
         </w:tc>
@@ -10381,7 +12096,7 @@
               <w:rPr>
                 <w:sz w:val="18"/>
               </w:rPr>
-              <w:t>−14.698 €</w:t>
+              <w:t>−19.315 €</w:t>
             </w:r>
           </w:p>
         </w:tc>
@@ -10401,7 +12116,7 @@
           <w:b w:val="0"/>
           <w:i w:val="0"/>
         </w:rPr>
-        <w:t>Die Tests sind vereinfacht. Das Ergebnis reagiert am stärksten auf den Gastro-Umsatz und die Pacht. Bei einem Umsatz −40 % oder einem Ausfall der Gastro reicht der Ertrag nicht mehr für die Raten.</w:t>
+        <w:t>Die Tests sind vereinfacht. Das Ergebnis reagiert am stärksten auf den Gastro-Umsatz und die Pacht. Bei einem Umsatz −40 % ist die Kapitaldienstdeckung knapp über 1,0, bei einem Ausfall der Gastro reicht der Ertrag nicht mehr für die Raten. Ein Auszug eines Ankermieters ist verkraftbar.</w:t>
       </w:r>
     </w:p>
     <w:p>
@@ -10409,7 +12124,7 @@
         <w:pStyle w:val="Heading1"/>
       </w:pPr>
       <w:r>
-        <w:t>11  Prüfung: zwei Wohnungen als Airbnb</w:t>
+        <w:t>12  Prüfung: zwei Wohnungen als Airbnb</w:t>
       </w:r>
     </w:p>
     <w:p>
@@ -10508,7 +12223,7 @@
                 <w:color w:val="FFFFFF"/>
                 <w:sz w:val="18"/>
               </w:rPr>
-              <w:t>60 m²</w:t>
+              <w:t>55 m²</w:t>
             </w:r>
           </w:p>
         </w:tc>
@@ -10530,7 +12245,7 @@
                 <w:color w:val="FFFFFF"/>
                 <w:sz w:val="18"/>
               </w:rPr>
-              <w:t>83 m²</w:t>
+              <w:t>67 m²</w:t>
             </w:r>
           </w:p>
         </w:tc>
@@ -10591,7 +12306,7 @@
               <w:rPr>
                 <w:sz w:val="18"/>
               </w:rPr>
-              <w:t>95 €</w:t>
+              <w:t>90 €</w:t>
             </w:r>
           </w:p>
         </w:tc>
@@ -10610,7 +12325,7 @@
               <w:rPr>
                 <w:sz w:val="18"/>
               </w:rPr>
-              <w:t>115 €</w:t>
+              <w:t>105 €</w:t>
             </w:r>
           </w:p>
         </w:tc>
@@ -10671,7 +12386,7 @@
               <w:rPr>
                 <w:sz w:val="18"/>
               </w:rPr>
-              <w:t>636 €</w:t>
+              <w:t>602 €</w:t>
             </w:r>
           </w:p>
         </w:tc>
@@ -10690,7 +12405,7 @@
               <w:rPr>
                 <w:sz w:val="18"/>
               </w:rPr>
-              <w:t>770 €</w:t>
+              <w:t>703 €</w:t>
             </w:r>
           </w:p>
         </w:tc>
@@ -10751,7 +12466,7 @@
               <w:rPr>
                 <w:sz w:val="18"/>
               </w:rPr>
-              <w:t>604 €</w:t>
+              <w:t>553 €</w:t>
             </w:r>
           </w:p>
         </w:tc>
@@ -10770,7 +12485,7 @@
               <w:rPr>
                 <w:sz w:val="18"/>
               </w:rPr>
-              <w:t>835 €</w:t>
+              <w:t>674 €</w:t>
             </w:r>
           </w:p>
         </w:tc>
@@ -10831,7 +12546,7 @@
               <w:rPr>
                 <w:sz w:val="18"/>
               </w:rPr>
-              <w:t>36.000 €</w:t>
+              <w:t>33.000 €</w:t>
             </w:r>
           </w:p>
         </w:tc>
@@ -10850,7 +12565,7 @@
               <w:rPr>
                 <w:sz w:val="18"/>
               </w:rPr>
-              <w:t>49.800 €</w:t>
+              <w:t>40.200 €</w:t>
             </w:r>
           </w:p>
         </w:tc>
@@ -10914,7 +12629,7 @@
                 <w:b/>
                 <w:sz w:val="18"/>
               </w:rPr>
-              <w:t>−236 €</w:t>
+              <w:t>−177 €</w:t>
             </w:r>
           </w:p>
         </w:tc>
@@ -10934,7 +12649,7 @@
                 <w:b/>
                 <w:sz w:val="18"/>
               </w:rPr>
-              <w:t>−546 €</w:t>
+              <w:t>−278 €</w:t>
             </w:r>
           </w:p>
         </w:tc>
@@ -10960,7 +12675,7 @@
         <w:pStyle w:val="Heading1"/>
       </w:pPr>
       <w:r>
-        <w:t>12  Chancen und Risiken</w:t>
+        <w:t>13  Chancen und Risiken</w:t>
       </w:r>
     </w:p>
     <w:tbl>
@@ -11088,7 +12803,7 @@
               <w:rPr>
                 <w:sz w:val="17"/>
               </w:rPr>
-              <w:t>Beleihungsauslauf 163 % bei 100 % Fremdfinanzierung</w:t>
+              <w:t>Beleihungsauslauf 187 % bei 100 % Fremdfinanzierung</w:t>
             </w:r>
           </w:p>
         </w:tc>
@@ -11147,7 +12862,7 @@
               <w:rPr>
                 <w:sz w:val="17"/>
               </w:rPr>
-              <w:t>Haus ab ca. 32.000 € Umsatz im Plus; bei Ausfall der Gastro fehlen ca. 14.698 € pro Monat</w:t>
+              <w:t>Haus ab ca. 33.000 € Umsatz im Plus; bei Ausfall der Gastro fehlen ca. 19.315 € pro Monat</w:t>
             </w:r>
           </w:p>
         </w:tc>
@@ -11324,7 +13039,7 @@
               <w:rPr>
                 <w:sz w:val="17"/>
               </w:rPr>
-              <w:t>540 m², Staffelgeschoss, Flachdach, Stellplätze</w:t>
+              <w:t>576 m², Staffelgeschoss, Flachdach, Stellplätze</w:t>
             </w:r>
           </w:p>
         </w:tc>
@@ -11482,7 +13197,7 @@
         <w:pStyle w:val="Heading1"/>
       </w:pPr>
       <w:r>
-        <w:t>13  Zeitplan und nächste Schritte</w:t>
+        <w:t>14  Zeitplan und nächste Schritte</w:t>
       </w:r>
     </w:p>
     <w:tbl>
@@ -11588,7 +13303,7 @@
               <w:rPr>
                 <w:sz w:val="18"/>
               </w:rPr>
-              <w:t>Gespräch mit der Stadt: Preis, Förderung, Stellplätze, Zulässigkeit der 540 m²</w:t>
+              <w:t>Gespräch mit der Stadt: Preis, Förderung, Stellplätze, Zulässigkeit der 576 m²</w:t>
             </w:r>
           </w:p>
         </w:tc>
@@ -11807,7 +13522,7 @@
         <w:pStyle w:val="Heading1"/>
       </w:pPr>
       <w:r>
-        <w:t>14  Anlagen und Unterlagen für die Bank</w:t>
+        <w:t>15  Anlagen und Unterlagen für die Bank</w:t>
       </w:r>
     </w:p>
     <w:p>
@@ -12835,7 +14550,7 @@
               <w:rPr>
                 <w:sz w:val="17"/>
               </w:rPr>
-              <w:t>Einnahmen: Vorvermietungsabsichten</w:t>
+              <w:t>Einnahmen: Vorverträge Ankermieter Büro (2 Mieter)</w:t>
             </w:r>
           </w:p>
         </w:tc>
@@ -12891,7 +14606,7 @@
               <w:rPr>
                 <w:sz w:val="17"/>
               </w:rPr>
-              <w:t>Betrieb: Gastro-Kalkulation mit Wareneinsatz, Personal, Umsatz</w:t>
+              <w:t>Einnahmen: Vorvermietungsabsichten</w:t>
             </w:r>
           </w:p>
         </w:tc>
@@ -12908,7 +14623,7 @@
               <w:rPr>
                 <w:sz w:val="17"/>
               </w:rPr>
-              <w:t>vorhanden</w:t>
+              <w:t>offen</w:t>
             </w:r>
           </w:p>
         </w:tc>
@@ -12947,7 +14662,7 @@
               <w:rPr>
                 <w:sz w:val="17"/>
               </w:rPr>
-              <w:t>Betrieb: Nachweis Gastro-Erfahrung, Lebenslauf, Konzession</w:t>
+              <w:t>Betrieb: Gastro-Kalkulation mit Wareneinsatz, Personal, Umsatz</w:t>
             </w:r>
           </w:p>
         </w:tc>
@@ -12964,7 +14679,7 @@
               <w:rPr>
                 <w:sz w:val="17"/>
               </w:rPr>
-              <w:t>offen</w:t>
+              <w:t>vorhanden</w:t>
             </w:r>
           </w:p>
         </w:tc>
@@ -13003,7 +14718,7 @@
               <w:rPr>
                 <w:sz w:val="17"/>
               </w:rPr>
-              <w:t>Person: Selbstauskunft und Vermögensübersicht</w:t>
+              <w:t>Betrieb: Nachweis Gastro-Erfahrung, Lebenslauf, Konzession</w:t>
             </w:r>
           </w:p>
         </w:tc>
@@ -13059,7 +14774,7 @@
               <w:rPr>
                 <w:sz w:val="17"/>
               </w:rPr>
-              <w:t>Person: Einkommensnachweise, Steuerbescheide, BWA, Schufa</w:t>
+              <w:t>Person: Selbstauskunft und Vermögensübersicht</w:t>
             </w:r>
           </w:p>
         </w:tc>
@@ -13115,7 +14830,7 @@
               <w:rPr>
                 <w:sz w:val="17"/>
               </w:rPr>
-              <w:t>Person: Nachweis weiterer Sicherheiten</w:t>
+              <w:t>Person: Einkommensnachweise, Steuerbescheide, BWA, Schufa</w:t>
             </w:r>
           </w:p>
         </w:tc>
@@ -13171,7 +14886,7 @@
               <w:rPr>
                 <w:sz w:val="17"/>
               </w:rPr>
-              <w:t>Sicherheit: Wertermittlung / Beleihungswert</w:t>
+              <w:t>Person: Nachweis weiterer Sicherheiten</w:t>
             </w:r>
           </w:p>
         </w:tc>
@@ -13211,6 +14926,62 @@
                 <w:sz w:val="17"/>
               </w:rPr>
               <w:t>24</w:t>
+            </w:r>
+          </w:p>
+        </w:tc>
+        <w:tc>
+          <w:tcPr>
+            <w:tcW w:type="dxa" w:w="7030"/>
+          </w:tcPr>
+          <w:p>
+            <w:pPr>
+              <w:spacing w:after="20" w:before="20"/>
+            </w:pPr>
+            <w:r/>
+            <w:r>
+              <w:rPr>
+                <w:sz w:val="17"/>
+              </w:rPr>
+              <w:t>Sicherheit: Wertermittlung / Beleihungswert</w:t>
+            </w:r>
+          </w:p>
+        </w:tc>
+        <w:tc>
+          <w:tcPr>
+            <w:tcW w:type="dxa" w:w="1701"/>
+          </w:tcPr>
+          <w:p>
+            <w:pPr>
+              <w:spacing w:after="20" w:before="20"/>
+            </w:pPr>
+            <w:r/>
+            <w:r>
+              <w:rPr>
+                <w:sz w:val="17"/>
+              </w:rPr>
+              <w:t>offen</w:t>
+            </w:r>
+          </w:p>
+        </w:tc>
+      </w:tr>
+      <w:tr>
+        <w:trPr>
+          <w:cantSplit/>
+        </w:trPr>
+        <w:tc>
+          <w:tcPr>
+            <w:tcW w:type="dxa" w:w="680"/>
+          </w:tcPr>
+          <w:p>
+            <w:pPr>
+              <w:spacing w:after="20" w:before="20"/>
+            </w:pPr>
+            <w:r/>
+            <w:r>
+              <w:rPr>
+                <w:sz w:val="17"/>
+              </w:rPr>
+              <w:t>25</w:t>
             </w:r>
           </w:p>
         </w:tc>

</xml_diff>

<commit_message>
6 Wohneinheiten (3 im 1. OG à 107 m², 3 im Staffelgeschoss à 111 m²): Excel, Decks, Businessplan, Skizzen angepasst
Co-Authored-By: Claude Sonnet 5.5 <noreply@anthropic.com>
Claude-Session: https://claude.ai/code/session_01HJGZfxHv7bzYyqdLwg8aFJ
</commit_message>
<xml_diff>
--- a/praesentation/Businessplan_Baufeld3_Neue-Mitte-Werlte.docx
+++ b/praesentation/Businessplan_Baufeld3_Neue-Mitte-Werlte.docx
@@ -21,7 +21,7 @@
         <w:pStyle w:val="Title"/>
       </w:pPr>
       <w:r>
-        <w:t>Businessplan: Große Gastro und 8 Wohnungen</w:t>
+        <w:t>Businessplan: Große Gastro und 6 Wohnungen</w:t>
       </w:r>
     </w:p>
     <w:p>
@@ -185,7 +185,7 @@
               <w:rPr>
                 <w:sz w:val="20"/>
               </w:rPr>
-              <w:t>Neubau eines gemischt genutzten Gebäudes: große Gastro im Erdgeschoss, 2 Büro-Ankermieter und 3 Wohnungen im 1. Obergeschoss, 5 Wohnungen im Staffelgeschoss in Holzbau</w:t>
+              <w:t>Neubau eines gemischt genutzten Gebäudes: große Gastro im Erdgeschoss, 2 Büro-Ankermieter und 3 Wohnungen im 1. Obergeschoss, 3 Wohnungen im Staffelgeschoss in Holzbau</w:t>
             </w:r>
           </w:p>
         </w:tc>
@@ -267,7 +267,7 @@
               <w:rPr>
                 <w:sz w:val="20"/>
               </w:rPr>
-              <w:t>4.845.506 € (100 % Fremdkapital), davon KfW-Kredite 2.347.500 €</w:t>
+              <w:t>4.853.028 € (100 % Fremdkapital), davon KfW-Kredite 2.047.500 €</w:t>
             </w:r>
           </w:p>
         </w:tc>
@@ -347,7 +347,7 @@
           <w:b w:val="0"/>
           <w:i w:val="0"/>
         </w:rPr>
-        <w:t>Auf dem Baufeld 3 der Neuen Mitte Werlte entsteht ein dreigeschossiges Gebäude (zwei Vollgeschosse plus Staffelgeschoss in Holzbau) mit 576 m² Grundfläche (32 × 18 m, das Maximum der Grundflächenzahl 0,6) und 1.650 m² Bruttogrundfläche (BGF, alle Geschossflächen zusammen). Im Erdgeschoss liegt eine große Gastro mit ca. 510 m² und ca. 190 Plätzen. Im 1. Obergeschoss mieten zwei Ankermieter Büros (100 m² Versicherungsgesellschaft o. ä., 65 m² Makler o. ä., 10 Jahre fest), dazu kommen 3 Wohnungen. Im Staffelgeschoss in Holzbau liegen 5 Wohnungen. Die 8 Wohnungen haben zusammen 655 m² Wohnfläche und werden langfristig vermietet.</w:t>
+        <w:t>Auf dem Baufeld 3 der Neuen Mitte Werlte entsteht ein dreigeschossiges Gebäude (zwei Vollgeschosse plus Staffelgeschoss in Holzbau) mit 576 m² Grundfläche (32 × 18 m, das Maximum der Grundflächenzahl 0,6) und 1.650 m² Bruttogrundfläche (BGF, alle Geschossflächen zusammen). Im Erdgeschoss liegt eine große Gastro mit ca. 510 m² und ca. 190 Plätzen. Im 1. Obergeschoss mieten zwei Ankermieter Büros (100 m² Versicherungsgesellschaft o. ä., 65 m² Makler o. ä., 10 Jahre fest), dazu kommen 3 Wohnungen. Im Staffelgeschoss in Holzbau liegen 3 Wohnungen. Die 6 Wohnungen haben zusammen 655 m² Wohnfläche und werden langfristig vermietet.</w:t>
       </w:r>
     </w:p>
     <w:tbl>
@@ -455,7 +455,7 @@
               <w:rPr>
                 <w:sz w:val="19"/>
               </w:rPr>
-              <w:t>4.845.506 €</w:t>
+              <w:t>4.853.028 €</w:t>
             </w:r>
           </w:p>
         </w:tc>
@@ -497,7 +497,7 @@
               <w:rPr>
                 <w:sz w:val="19"/>
               </w:rPr>
-              <w:t>4.845.506 €</w:t>
+              <w:t>4.853.028 €</w:t>
             </w:r>
           </w:p>
         </w:tc>
@@ -539,7 +539,7 @@
               <w:rPr>
                 <w:sz w:val="19"/>
               </w:rPr>
-              <w:t>2.347.500 € (48 %)</w:t>
+              <w:t>2.047.500 € (42 %)</w:t>
             </w:r>
           </w:p>
         </w:tc>
@@ -581,7 +581,7 @@
               <w:rPr>
                 <w:sz w:val="19"/>
               </w:rPr>
-              <w:t>3,39 %</w:t>
+              <w:t>3,49 %</w:t>
             </w:r>
           </w:p>
         </w:tc>
@@ -623,7 +623,7 @@
               <w:rPr>
                 <w:sz w:val="19"/>
               </w:rPr>
-              <w:t>17.733 €</w:t>
+              <w:t>18.140 €</w:t>
             </w:r>
           </w:p>
         </w:tc>
@@ -707,7 +707,7 @@
               <w:rPr>
                 <w:sz w:val="19"/>
               </w:rPr>
-              <w:t>+9.610 €</w:t>
+              <w:t>+9.204 €</w:t>
             </w:r>
           </w:p>
         </w:tc>
@@ -749,7 +749,7 @@
               <w:rPr>
                 <w:sz w:val="19"/>
               </w:rPr>
-              <w:t>1,54 gesamt, 0,71 nur Immobilie</w:t>
+              <w:t>1,51 gesamt, 0,70 nur Immobilie</w:t>
             </w:r>
           </w:p>
         </w:tc>
@@ -791,7 +791,7 @@
               <w:rPr>
                 <w:sz w:val="19"/>
               </w:rPr>
-              <w:t>2.877.244 €</w:t>
+              <w:t>2.894.463 €</w:t>
             </w:r>
           </w:p>
         </w:tc>
@@ -833,7 +833,7 @@
               <w:rPr>
                 <w:sz w:val="19"/>
               </w:rPr>
-              <w:t>2.589.520 €</w:t>
+              <w:t>2.605.017 €</w:t>
             </w:r>
           </w:p>
         </w:tc>
@@ -873,7 +873,7 @@
               <w:rPr>
                 <w:sz w:val="19"/>
               </w:rPr>
-              <w:t>187 %</w:t>
+              <w:t>186 %</w:t>
             </w:r>
           </w:p>
         </w:tc>
@@ -909,7 +909,7 @@
         <w:t xml:space="preserve">Der Ertrag trägt die Raten, aber nur mit der Gastro. </w:t>
       </w:r>
       <w:r>
-        <w:t>Mit dem Gastro-Gewinn liegt die Kapitaldienstdeckung bei 1,54. Allein aus Miete, Büromiete und Pacht wären es 0,71, aus Wohnen und Büro allein 0,45.</w:t>
+        <w:t>Mit dem Gastro-Gewinn liegt die Kapitaldienstdeckung bei 1,51. Allein aus Miete, Büromiete und Pacht wären es 0,70, aus Wohnen und Büro allein 0,44.</w:t>
       </w:r>
     </w:p>
     <w:p>
@@ -924,7 +924,7 @@
         <w:t xml:space="preserve">Die Büro-Ankermieter sichern einen Teil. </w:t>
       </w:r>
       <w:r>
-        <w:t>Die zwei Büros bringen 19.200 € im Jahr über 10 Jahre fest und decken 8 % des Kapitaldienstes, zusammen mit den Wohnungen decken die langfristigen Mieten 45 %.</w:t>
+        <w:t>Die zwei Büros bringen 19.200 € im Jahr über 10 Jahre fest und decken 8 % des Kapitaldienstes, zusammen mit den Wohnungen decken die langfristigen Mieten 44 %.</w:t>
       </w:r>
     </w:p>
     <w:p>
@@ -939,7 +939,7 @@
         <w:t xml:space="preserve">KfW senkt die Zinslast deutlich. </w:t>
       </w:r>
       <w:r>
-        <w:t>Die drei KfW-Kreditprogramme decken 48 % des Darlehens zu 2,5 bis 3,0 % ab, der Mischzins liegt bei 3,39 % statt 4,0 %.</w:t>
+        <w:t>Die drei KfW-Kreditprogramme decken 42 % des Darlehens zu 2,5 bis 3,0 % ab, der Mischzins liegt bei 3,49 % statt 4,0 %.</w:t>
       </w:r>
     </w:p>
     <w:p>
@@ -954,7 +954,7 @@
         <w:t xml:space="preserve">Der Beleihungswert ist die Hürde. </w:t>
       </w:r>
       <w:r>
-        <w:t>Der Ertragswert von 2,88 Mio. € liegt weit unter den Kosten von 4,85 Mio. €. Die Bank wird zusätzliche Sicherheiten oder Eigenkapital in der Größenordnung von 2,77 Mio. € verlangen.</w:t>
+        <w:t>Der Ertragswert von 2,89 Mio. € liegt weit unter den Kosten von 4,85 Mio. €. Die Bank wird zusätzliche Sicherheiten oder Eigenkapital in der Größenordnung von 2,77 Mio. € verlangen.</w:t>
       </w:r>
     </w:p>
     <w:p>
@@ -969,7 +969,7 @@
         <w:t xml:space="preserve">Airbnb lohnt sich nicht. </w:t>
       </w:r>
       <w:r>
-        <w:t>Zwei Wohnungen als Kurzzeitvermietung bringen weniger als langfristige Mieter, deshalb bleiben alle 8 Wohnungen langfristig vermietet.</w:t>
+        <w:t>Zwei Wohnungen als Kurzzeitvermietung bringen weniger als langfristige Mieter, deshalb bleiben alle 6 Wohnungen langfristig vermietet.</w:t>
       </w:r>
     </w:p>
     <w:p>
@@ -1365,7 +1365,7 @@
               <w:rPr>
                 <w:sz w:val="18"/>
               </w:rPr>
-              <w:t>ca. 6–8 auf dem Grundstück, Bedarf ca. 55</w:t>
+              <w:t>ca. 6–8 auf dem Grundstück, Bedarf ca. 52</w:t>
             </w:r>
           </w:p>
         </w:tc>
@@ -1411,7 +1411,7 @@
           <w:b w:val="0"/>
           <w:i w:val="0"/>
         </w:rPr>
-        <w:t>Das Gebäude hat eine Grundfläche von 32 × 18 m (576 m², das Maximum der Grundflächenzahl). Das Erdgeschoss ist vollverglast und gehört ganz der Gastro, Treppenhaus und Aufzug liegen am Westende und erschließen Büros und Wohnungen getrennt von der Gastro. Im 1. Obergeschoss liegen die zwei Büros und 3 Wohnungen, im Staffelgeschoss 5 Wohnungen. Das 1. Obergeschoss ist in rotbraunem Klinker mit Balkonen und Milchglas-Brüstungen ausgeführt, das Staffelgeschoss in Holzbau mit schmaler Dachterrasse (ca. 0,8 m, 77 m²) rundum. Holzbau spart ca. 184.000 € gegenüber Massivbau (Annahme, Angebot der Zimmerei nötig) und hilft beim Effizienzhaus-40-Standard.</w:t>
+        <w:t>Das Gebäude hat eine Grundfläche von 32 × 18 m (576 m², das Maximum der Grundflächenzahl). Das Erdgeschoss ist vollverglast und gehört ganz der Gastro, Treppenhaus und Aufzug liegen am Westende und erschließen Büros und Wohnungen getrennt von der Gastro. Im 1. Obergeschoss liegen die zwei Büros und 3 Wohnungen, im Staffelgeschoss 3 Wohnungen. Das 1. Obergeschoss ist in rotbraunem Klinker mit Balkonen und Milchglas-Brüstungen ausgeführt, das Staffelgeschoss in Holzbau mit schmaler Dachterrasse (ca. 0,8 m, 77 m²) rundum. Holzbau spart ca. 184.000 € gegenüber Massivbau (Annahme, Angebot der Zimmerei nötig) und hilft beim Effizienzhaus-40-Standard.</w:t>
       </w:r>
     </w:p>
     <w:tbl>
@@ -1809,7 +1809,7 @@
               <w:rPr>
                 <w:sz w:val="18"/>
               </w:rPr>
-              <w:t>5 × 67 m²</w:t>
+              <w:t>3 × 111 m²</w:t>
             </w:r>
           </w:p>
         </w:tc>
@@ -1907,7 +1907,7 @@
                 <w:b/>
                 <w:sz w:val="18"/>
               </w:rPr>
-              <w:t>8 Wohnungen, 2 Büros</w:t>
+              <w:t>6 Wohnungen, 2 Büros</w:t>
             </w:r>
           </w:p>
         </w:tc>
@@ -2515,7 +2515,7 @@
               <w:rPr>
                 <w:sz w:val="18"/>
               </w:rPr>
-              <w:t>66,8 m²</w:t>
+              <w:t>111,3 m²</w:t>
             </w:r>
           </w:p>
         </w:tc>
@@ -2553,7 +2553,7 @@
               <w:rPr>
                 <w:sz w:val="18"/>
               </w:rPr>
-              <w:t>747 €</w:t>
+              <w:t>1.244 €</w:t>
             </w:r>
           </w:p>
         </w:tc>
@@ -2572,7 +2572,7 @@
               <w:rPr>
                 <w:sz w:val="18"/>
               </w:rPr>
-              <w:t>8.959 €</w:t>
+              <w:t>14.932 €</w:t>
             </w:r>
           </w:p>
         </w:tc>
@@ -2632,7 +2632,7 @@
               <w:rPr>
                 <w:sz w:val="18"/>
               </w:rPr>
-              <w:t>66,8 m²</w:t>
+              <w:t>111,3 m²</w:t>
             </w:r>
           </w:p>
         </w:tc>
@@ -2670,7 +2670,7 @@
               <w:rPr>
                 <w:sz w:val="18"/>
               </w:rPr>
-              <w:t>747 €</w:t>
+              <w:t>1.244 €</w:t>
             </w:r>
           </w:p>
         </w:tc>
@@ -2689,7 +2689,7 @@
               <w:rPr>
                 <w:sz w:val="18"/>
               </w:rPr>
-              <w:t>8.959 €</w:t>
+              <w:t>14.932 €</w:t>
             </w:r>
           </w:p>
         </w:tc>
@@ -2749,7 +2749,7 @@
               <w:rPr>
                 <w:sz w:val="18"/>
               </w:rPr>
-              <w:t>66,8 m²</w:t>
+              <w:t>111,3 m²</w:t>
             </w:r>
           </w:p>
         </w:tc>
@@ -2787,7 +2787,7 @@
               <w:rPr>
                 <w:sz w:val="18"/>
               </w:rPr>
-              <w:t>747 €</w:t>
+              <w:t>1.244 €</w:t>
             </w:r>
           </w:p>
         </w:tc>
@@ -2806,7 +2806,7 @@
               <w:rPr>
                 <w:sz w:val="18"/>
               </w:rPr>
-              <w:t>8.959 €</w:t>
+              <w:t>14.932 €</w:t>
             </w:r>
           </w:p>
         </w:tc>
@@ -2829,7 +2829,7 @@
               <w:rPr>
                 <w:sz w:val="18"/>
               </w:rPr>
-              <w:t>WE 7</w:t>
+              <w:t>Summe Wohnen</w:t>
             </w:r>
           </w:p>
         </w:tc>
@@ -2847,7 +2847,6 @@
               <w:rPr>
                 <w:sz w:val="18"/>
               </w:rPr>
-              <w:t>Staffel</w:t>
             </w:r>
           </w:p>
         </w:tc>
@@ -2866,7 +2865,7 @@
               <w:rPr>
                 <w:sz w:val="18"/>
               </w:rPr>
-              <w:t>66,8 m²</w:t>
+              <w:t>655,0 m²</w:t>
             </w:r>
           </w:p>
         </w:tc>
@@ -2885,7 +2884,6 @@
               <w:rPr>
                 <w:sz w:val="18"/>
               </w:rPr>
-              <w:t>11,18 €</w:t>
             </w:r>
           </w:p>
         </w:tc>
@@ -2904,7 +2902,7 @@
               <w:rPr>
                 <w:sz w:val="18"/>
               </w:rPr>
-              <w:t>747 €</w:t>
+              <w:t>7.321 €</w:t>
             </w:r>
           </w:p>
         </w:tc>
@@ -2923,7 +2921,7 @@
               <w:rPr>
                 <w:sz w:val="18"/>
               </w:rPr>
-              <w:t>8.959 €</w:t>
+              <w:t>87.847 €</w:t>
             </w:r>
           </w:p>
         </w:tc>
@@ -2946,7 +2944,7 @@
               <w:rPr>
                 <w:sz w:val="18"/>
               </w:rPr>
-              <w:t>WE 8</w:t>
+              <w:t>Gastro-Pacht (10 €/m²)</w:t>
             </w:r>
           </w:p>
         </w:tc>
@@ -2964,7 +2962,7 @@
               <w:rPr>
                 <w:sz w:val="18"/>
               </w:rPr>
-              <w:t>Staffel</w:t>
+              <w:t>EG</w:t>
             </w:r>
           </w:p>
         </w:tc>
@@ -2983,7 +2981,7 @@
               <w:rPr>
                 <w:sz w:val="18"/>
               </w:rPr>
-              <w:t>66,8 m²</w:t>
+              <w:t>510,0 m²</w:t>
             </w:r>
           </w:p>
         </w:tc>
@@ -3002,7 +3000,7 @@
               <w:rPr>
                 <w:sz w:val="18"/>
               </w:rPr>
-              <w:t>11,18 €</w:t>
+              <w:t>10,00 €</w:t>
             </w:r>
           </w:p>
         </w:tc>
@@ -3021,7 +3019,7 @@
               <w:rPr>
                 <w:sz w:val="18"/>
               </w:rPr>
-              <w:t>747 €</w:t>
+              <w:t>5.100 €</w:t>
             </w:r>
           </w:p>
         </w:tc>
@@ -3040,7 +3038,7 @@
               <w:rPr>
                 <w:sz w:val="18"/>
               </w:rPr>
-              <w:t>8.959 €</w:t>
+              <w:t>61.200 €</w:t>
             </w:r>
           </w:p>
         </w:tc>
@@ -3065,7 +3063,7 @@
                 <w:b/>
                 <w:sz w:val="18"/>
               </w:rPr>
-              <w:t>Summe Wohnen</w:t>
+              <w:t>Büro 1 (Ankermieter)</w:t>
             </w:r>
           </w:p>
         </w:tc>
@@ -3085,6 +3083,7 @@
                 <w:b/>
                 <w:sz w:val="18"/>
               </w:rPr>
+              <w:t>1. OG</w:t>
             </w:r>
           </w:p>
         </w:tc>
@@ -3105,7 +3104,7 @@
                 <w:b/>
                 <w:sz w:val="18"/>
               </w:rPr>
-              <w:t>655,0 m²</w:t>
+              <w:t>100,0 m²</w:t>
             </w:r>
           </w:p>
         </w:tc>
@@ -3126,6 +3125,7 @@
                 <w:b/>
                 <w:sz w:val="18"/>
               </w:rPr>
+              <w:t>9,50 €</w:t>
             </w:r>
           </w:p>
         </w:tc>
@@ -3146,7 +3146,7 @@
                 <w:b/>
                 <w:sz w:val="18"/>
               </w:rPr>
-              <w:t>7.321 €</w:t>
+              <w:t>950 €</w:t>
             </w:r>
           </w:p>
         </w:tc>
@@ -3167,7 +3167,7 @@
                 <w:b/>
                 <w:sz w:val="18"/>
               </w:rPr>
-              <w:t>87.847 €</w:t>
+              <w:t>11.400 €</w:t>
             </w:r>
           </w:p>
         </w:tc>
@@ -3190,7 +3190,7 @@
               <w:rPr>
                 <w:sz w:val="18"/>
               </w:rPr>
-              <w:t>Gastro-Pacht (10 €/m²)</w:t>
+              <w:t>Büro 2 (Ankermieter)</w:t>
             </w:r>
           </w:p>
         </w:tc>
@@ -3208,7 +3208,7 @@
               <w:rPr>
                 <w:sz w:val="18"/>
               </w:rPr>
-              <w:t>EG</w:t>
+              <w:t>1. OG</w:t>
             </w:r>
           </w:p>
         </w:tc>
@@ -3227,7 +3227,7 @@
               <w:rPr>
                 <w:sz w:val="18"/>
               </w:rPr>
-              <w:t>510,0 m²</w:t>
+              <w:t>65,0 m²</w:t>
             </w:r>
           </w:p>
         </w:tc>
@@ -3265,7 +3265,7 @@
               <w:rPr>
                 <w:sz w:val="18"/>
               </w:rPr>
-              <w:t>5.100 €</w:t>
+              <w:t>650 €</w:t>
             </w:r>
           </w:p>
         </w:tc>
@@ -3284,7 +3284,7 @@
               <w:rPr>
                 <w:sz w:val="18"/>
               </w:rPr>
-              <w:t>61.200 €</w:t>
+              <w:t>7.800 €</w:t>
             </w:r>
           </w:p>
         </w:tc>
@@ -3299,15 +3299,14 @@
           </w:tcPr>
           <w:p>
             <w:pPr>
-              <w:keepNext/>
-              <w:spacing w:after="20" w:before="20"/>
-            </w:pPr>
-            <w:r/>
-            <w:r>
-              <w:rPr>
-                <w:sz w:val="18"/>
-              </w:rPr>
-              <w:t>Büro 1 (Ankermieter)</w:t>
+              <w:spacing w:after="20" w:before="20"/>
+            </w:pPr>
+            <w:r/>
+            <w:r>
+              <w:rPr>
+                <w:sz w:val="18"/>
+              </w:rPr>
+              <w:t>Rohertrag gesamt</w:t>
             </w:r>
           </w:p>
         </w:tc>
@@ -3317,15 +3316,13 @@
           </w:tcPr>
           <w:p>
             <w:pPr>
-              <w:keepNext/>
-              <w:spacing w:after="20" w:before="20"/>
-            </w:pPr>
-            <w:r/>
-            <w:r>
-              <w:rPr>
-                <w:sz w:val="18"/>
-              </w:rPr>
-              <w:t>1. OG</w:t>
+              <w:spacing w:after="20" w:before="20"/>
+            </w:pPr>
+            <w:r/>
+            <w:r>
+              <w:rPr>
+                <w:sz w:val="18"/>
+              </w:rPr>
             </w:r>
           </w:p>
         </w:tc>
@@ -3335,7 +3332,6 @@
           </w:tcPr>
           <w:p>
             <w:pPr>
-              <w:keepNext/>
               <w:spacing w:after="20" w:before="20"/>
               <w:jc w:val="right"/>
             </w:pPr>
@@ -3344,7 +3340,6 @@
               <w:rPr>
                 <w:sz w:val="18"/>
               </w:rPr>
-              <w:t>100,0 m²</w:t>
             </w:r>
           </w:p>
         </w:tc>
@@ -3354,7 +3349,6 @@
           </w:tcPr>
           <w:p>
             <w:pPr>
-              <w:keepNext/>
               <w:spacing w:after="20" w:before="20"/>
               <w:jc w:val="right"/>
             </w:pPr>
@@ -3363,7 +3357,6 @@
               <w:rPr>
                 <w:sz w:val="18"/>
               </w:rPr>
-              <w:t>9,50 €</w:t>
             </w:r>
           </w:p>
         </w:tc>
@@ -3373,7 +3366,6 @@
           </w:tcPr>
           <w:p>
             <w:pPr>
-              <w:keepNext/>
               <w:spacing w:after="20" w:before="20"/>
               <w:jc w:val="right"/>
             </w:pPr>
@@ -3382,7 +3374,7 @@
               <w:rPr>
                 <w:sz w:val="18"/>
               </w:rPr>
-              <w:t>950 €</w:t>
+              <w:t>14.021 €</w:t>
             </w:r>
           </w:p>
         </w:tc>
@@ -3392,250 +3384,12 @@
           </w:tcPr>
           <w:p>
             <w:pPr>
-              <w:keepNext/>
               <w:spacing w:after="20" w:before="20"/>
               <w:jc w:val="right"/>
             </w:pPr>
             <w:r/>
             <w:r>
               <w:rPr>
-                <w:sz w:val="18"/>
-              </w:rPr>
-              <w:t>11.400 €</w:t>
-            </w:r>
-          </w:p>
-        </w:tc>
-      </w:tr>
-      <w:tr>
-        <w:trPr>
-          <w:cantSplit/>
-        </w:trPr>
-        <w:tc>
-          <w:tcPr>
-            <w:tcW w:type="dxa" w:w="2041"/>
-          </w:tcPr>
-          <w:p>
-            <w:pPr>
-              <w:keepNext/>
-              <w:spacing w:after="20" w:before="20"/>
-            </w:pPr>
-            <w:r/>
-            <w:r>
-              <w:rPr>
-                <w:sz w:val="18"/>
-              </w:rPr>
-              <w:t>Büro 2 (Ankermieter)</w:t>
-            </w:r>
-          </w:p>
-        </w:tc>
-        <w:tc>
-          <w:tcPr>
-            <w:tcW w:type="dxa" w:w="1134"/>
-          </w:tcPr>
-          <w:p>
-            <w:pPr>
-              <w:keepNext/>
-              <w:spacing w:after="20" w:before="20"/>
-            </w:pPr>
-            <w:r/>
-            <w:r>
-              <w:rPr>
-                <w:sz w:val="18"/>
-              </w:rPr>
-              <w:t>1. OG</w:t>
-            </w:r>
-          </w:p>
-        </w:tc>
-        <w:tc>
-          <w:tcPr>
-            <w:tcW w:type="dxa" w:w="1361"/>
-          </w:tcPr>
-          <w:p>
-            <w:pPr>
-              <w:keepNext/>
-              <w:spacing w:after="20" w:before="20"/>
-              <w:jc w:val="right"/>
-            </w:pPr>
-            <w:r/>
-            <w:r>
-              <w:rPr>
-                <w:sz w:val="18"/>
-              </w:rPr>
-              <w:t>65,0 m²</w:t>
-            </w:r>
-          </w:p>
-        </w:tc>
-        <w:tc>
-          <w:tcPr>
-            <w:tcW w:type="dxa" w:w="1361"/>
-          </w:tcPr>
-          <w:p>
-            <w:pPr>
-              <w:keepNext/>
-              <w:spacing w:after="20" w:before="20"/>
-              <w:jc w:val="right"/>
-            </w:pPr>
-            <w:r/>
-            <w:r>
-              <w:rPr>
-                <w:sz w:val="18"/>
-              </w:rPr>
-              <w:t>10,00 €</w:t>
-            </w:r>
-          </w:p>
-        </w:tc>
-        <w:tc>
-          <w:tcPr>
-            <w:tcW w:type="dxa" w:w="1814"/>
-          </w:tcPr>
-          <w:p>
-            <w:pPr>
-              <w:keepNext/>
-              <w:spacing w:after="20" w:before="20"/>
-              <w:jc w:val="right"/>
-            </w:pPr>
-            <w:r/>
-            <w:r>
-              <w:rPr>
-                <w:sz w:val="18"/>
-              </w:rPr>
-              <w:t>650 €</w:t>
-            </w:r>
-          </w:p>
-        </w:tc>
-        <w:tc>
-          <w:tcPr>
-            <w:tcW w:type="dxa" w:w="1701"/>
-          </w:tcPr>
-          <w:p>
-            <w:pPr>
-              <w:keepNext/>
-              <w:spacing w:after="20" w:before="20"/>
-              <w:jc w:val="right"/>
-            </w:pPr>
-            <w:r/>
-            <w:r>
-              <w:rPr>
-                <w:sz w:val="18"/>
-              </w:rPr>
-              <w:t>7.800 €</w:t>
-            </w:r>
-          </w:p>
-        </w:tc>
-      </w:tr>
-      <w:tr>
-        <w:trPr>
-          <w:cantSplit/>
-        </w:trPr>
-        <w:tc>
-          <w:tcPr>
-            <w:tcW w:type="dxa" w:w="2041"/>
-            <w:shd w:val="clear" w:color="auto" w:fill="E3E8E5"/>
-          </w:tcPr>
-          <w:p>
-            <w:pPr>
-              <w:spacing w:after="20" w:before="20"/>
-            </w:pPr>
-            <w:r/>
-            <w:r>
-              <w:rPr>
-                <w:b/>
-                <w:sz w:val="18"/>
-              </w:rPr>
-              <w:t>Rohertrag gesamt</w:t>
-            </w:r>
-          </w:p>
-        </w:tc>
-        <w:tc>
-          <w:tcPr>
-            <w:tcW w:type="dxa" w:w="1134"/>
-            <w:shd w:val="clear" w:color="auto" w:fill="E3E8E5"/>
-          </w:tcPr>
-          <w:p>
-            <w:pPr>
-              <w:spacing w:after="20" w:before="20"/>
-            </w:pPr>
-            <w:r/>
-            <w:r>
-              <w:rPr>
-                <w:b/>
-                <w:sz w:val="18"/>
-              </w:rPr>
-            </w:r>
-          </w:p>
-        </w:tc>
-        <w:tc>
-          <w:tcPr>
-            <w:tcW w:type="dxa" w:w="1361"/>
-            <w:shd w:val="clear" w:color="auto" w:fill="E3E8E5"/>
-          </w:tcPr>
-          <w:p>
-            <w:pPr>
-              <w:spacing w:after="20" w:before="20"/>
-              <w:jc w:val="right"/>
-            </w:pPr>
-            <w:r/>
-            <w:r>
-              <w:rPr>
-                <w:b/>
-                <w:sz w:val="18"/>
-              </w:rPr>
-            </w:r>
-          </w:p>
-        </w:tc>
-        <w:tc>
-          <w:tcPr>
-            <w:tcW w:type="dxa" w:w="1361"/>
-            <w:shd w:val="clear" w:color="auto" w:fill="E3E8E5"/>
-          </w:tcPr>
-          <w:p>
-            <w:pPr>
-              <w:spacing w:after="20" w:before="20"/>
-              <w:jc w:val="right"/>
-            </w:pPr>
-            <w:r/>
-            <w:r>
-              <w:rPr>
-                <w:b/>
-                <w:sz w:val="18"/>
-              </w:rPr>
-            </w:r>
-          </w:p>
-        </w:tc>
-        <w:tc>
-          <w:tcPr>
-            <w:tcW w:type="dxa" w:w="1814"/>
-            <w:shd w:val="clear" w:color="auto" w:fill="E3E8E5"/>
-          </w:tcPr>
-          <w:p>
-            <w:pPr>
-              <w:spacing w:after="20" w:before="20"/>
-              <w:jc w:val="right"/>
-            </w:pPr>
-            <w:r/>
-            <w:r>
-              <w:rPr>
-                <w:b/>
-                <w:sz w:val="18"/>
-              </w:rPr>
-              <w:t>14.021 €</w:t>
-            </w:r>
-          </w:p>
-        </w:tc>
-        <w:tc>
-          <w:tcPr>
-            <w:tcW w:type="dxa" w:w="1701"/>
-            <w:shd w:val="clear" w:color="auto" w:fill="E3E8E5"/>
-          </w:tcPr>
-          <w:p>
-            <w:pPr>
-              <w:spacing w:after="20" w:before="20"/>
-              <w:jc w:val="right"/>
-            </w:pPr>
-            <w:r/>
-            <w:r>
-              <w:rPr>
-                <w:b/>
                 <w:sz w:val="18"/>
               </w:rPr>
               <w:t>168.247 €</w:t>
@@ -4758,7 +4512,7 @@
         <w:spacing w:after="60"/>
       </w:pPr>
       <w:r>
-        <w:t>Sie decken 8 % des Kapitaldienstes. Zusammen mit den Wohnungen decken die langfristigen Mieten 45 %, den Rest tragen Pacht und Gastro-Gewinn.</w:t>
+        <w:t>Sie decken 8 % des Kapitaldienstes. Zusammen mit den Wohnungen decken die langfristigen Mieten 44 %, den Rest tragen Pacht und Gastro-Gewinn.</w:t>
       </w:r>
     </w:p>
     <w:p>
@@ -5804,7 +5558,7 @@
               <w:rPr>
                 <w:sz w:val="18"/>
               </w:rPr>
-              <w:t>74,9 %</w:t>
+              <w:t>74,8 %</w:t>
             </w:r>
           </w:p>
         </w:tc>
@@ -6259,7 +6013,7 @@
               <w:rPr>
                 <w:sz w:val="18"/>
               </w:rPr>
-              <w:t>289.674 €</w:t>
+              <w:t>297.196 €</w:t>
             </w:r>
           </w:p>
         </w:tc>
@@ -6278,7 +6032,7 @@
               <w:rPr>
                 <w:sz w:val="18"/>
               </w:rPr>
-              <w:t>6,0 %</w:t>
+              <w:t>6,1 %</w:t>
             </w:r>
           </w:p>
         </w:tc>
@@ -6340,7 +6094,7 @@
                 <w:b/>
                 <w:sz w:val="18"/>
               </w:rPr>
-              <w:t>4.845.506 €</w:t>
+              <w:t>4.853.028 €</w:t>
             </w:r>
           </w:p>
         </w:tc>
@@ -6379,7 +6133,7 @@
           <w:color w:val="5B6770"/>
           <w:sz w:val="18"/>
         </w:rPr>
-        <w:t>Das entspricht 2.937 € je m² BGF. Baukosten von 2.200 €/m² (Bekanntenpreis des Bauherrn) und die Baunebenkosten sind durch Angebote von Bauunternehmen und Zimmerei zu belegen. QNG steht für das Qualitätssiegel Nachhaltiges Gebäude.</w:t>
+        <w:t>Das entspricht 2.941 € je m² BGF. Baukosten von 2.200 €/m² (Bekanntenpreis des Bauherrn) und die Baunebenkosten sind durch Angebote von Bauunternehmen und Zimmerei zu belegen. QNG steht für das Qualitätssiegel Nachhaltiges Gebäude.</w:t>
       </w:r>
     </w:p>
     <w:p>
@@ -6704,7 +6458,7 @@
               <w:rPr>
                 <w:sz w:val="18"/>
               </w:rPr>
-              <w:t>1.200.000 €</w:t>
+              <w:t>900.000 €</w:t>
             </w:r>
           </w:p>
         </w:tc>
@@ -6898,7 +6652,7 @@
               <w:rPr>
                 <w:sz w:val="18"/>
               </w:rPr>
-              <w:t>2.498.006 €</w:t>
+              <w:t>2.805.528 €</w:t>
             </w:r>
           </w:p>
         </w:tc>
@@ -6997,7 +6751,7 @@
                 <w:b/>
                 <w:sz w:val="18"/>
               </w:rPr>
-              <w:t>4.845.506 €</w:t>
+              <w:t>4.853.028 €</w:t>
             </w:r>
           </w:p>
         </w:tc>
@@ -7017,7 +6771,7 @@
                 <w:b/>
                 <w:sz w:val="18"/>
               </w:rPr>
-              <w:t>3,39 %</w:t>
+              <w:t>3,49 %</w:t>
             </w:r>
           </w:p>
         </w:tc>
@@ -7074,7 +6828,7 @@
         <w:spacing w:after="60"/>
       </w:pPr>
       <w:r>
-        <w:t>Wohnteil (297/298) und Gastro (299) werden bei gemischter Nutzung getrennt gefördert. Das Programm 297 gilt für selbst genutzte Wohnungen, 298 für vermietete, die Konditionen sind gleich. Im Rechenmodell sind alle 8 Wohnungen vermietet (298), eine Selbstnutzung lässt sich im Blatt Annahmen einstellen.</w:t>
+        <w:t>Wohnteil (297/298) und Gastro (299) werden bei gemischter Nutzung getrennt gefördert. Das Programm 297 gilt für selbst genutzte Wohnungen, 298 für vermietete, die Konditionen sind gleich. Im Rechenmodell sind alle 6 Wohnungen vermietet (298), eine Selbstnutzung lässt sich im Blatt Annahmen einstellen.</w:t>
       </w:r>
     </w:p>
     <w:p>
@@ -7105,7 +6859,7 @@
           <w:b w:val="0"/>
           <w:i w:val="0"/>
         </w:rPr>
-        <w:t>Das Grundstück wird zu Beginn bezahlt, die Baukosten fließen über 15 Monate. Danach folgen 12 Monate tilgungsfreie Anlaufzeit, in der nur Zinsen anfallen und von der Hausbank mitfinanziert werden (mit der Bank zu verhandeln). Zinsen und Bereitstellungsgebühr (3 % p. a. ab Monat 7 auf die noch nicht abgerufene Bausumme) betragen in dieser Zeit 289.674 €. Zu Beginn der Rückzahlung stehen 4.845.506 € Darlehen.</w:t>
+        <w:t>Das Grundstück wird zu Beginn bezahlt, die Baukosten fließen über 15 Monate. Danach folgen 12 Monate tilgungsfreie Anlaufzeit, in der nur Zinsen anfallen und von der Hausbank mitfinanziert werden (mit der Bank zu verhandeln). Zinsen und Bereitstellungsgebühr (3 % p. a. ab Monat 7 auf die noch nicht abgerufene Bausumme) betragen in dieser Zeit 297.196 €. Zu Beginn der Rückzahlung stehen 4.853.028 € Darlehen.</w:t>
       </w:r>
     </w:p>
     <w:p>
@@ -7322,7 +7076,7 @@
               <w:rPr>
                 <w:sz w:val="18"/>
               </w:rPr>
-              <w:t>1.200.000 €</w:t>
+              <w:t>900.000 €</w:t>
             </w:r>
           </w:p>
         </w:tc>
@@ -7379,7 +7133,7 @@
               <w:rPr>
                 <w:sz w:val="18"/>
               </w:rPr>
-              <w:t>3.500 €</w:t>
+              <w:t>2.625 €</w:t>
             </w:r>
           </w:p>
         </w:tc>
@@ -7398,7 +7152,7 @@
               <w:rPr>
                 <w:sz w:val="18"/>
               </w:rPr>
-              <w:t>42.000 €</w:t>
+              <w:t>31.500 €</w:t>
             </w:r>
           </w:p>
         </w:tc>
@@ -7558,7 +7312,7 @@
               <w:rPr>
                 <w:sz w:val="18"/>
               </w:rPr>
-              <w:t>2.498.006 €</w:t>
+              <w:t>2.805.528 €</w:t>
             </w:r>
           </w:p>
         </w:tc>
@@ -7615,7 +7369,7 @@
               <w:rPr>
                 <w:sz w:val="18"/>
               </w:rPr>
-              <w:t>10.408 €</w:t>
+              <w:t>11.690 €</w:t>
             </w:r>
           </w:p>
         </w:tc>
@@ -7634,7 +7388,7 @@
               <w:rPr>
                 <w:sz w:val="18"/>
               </w:rPr>
-              <w:t>124.900 €</w:t>
+              <w:t>140.276 €</w:t>
             </w:r>
           </w:p>
         </w:tc>
@@ -7678,7 +7432,7 @@
                 <w:b/>
                 <w:sz w:val="18"/>
               </w:rPr>
-              <w:t>4.845.506 €</w:t>
+              <w:t>4.853.028 €</w:t>
             </w:r>
           </w:p>
         </w:tc>
@@ -7698,7 +7452,7 @@
                 <w:b/>
                 <w:sz w:val="18"/>
               </w:rPr>
-              <w:t>3,39 %</w:t>
+              <w:t>3,49 %</w:t>
             </w:r>
           </w:p>
         </w:tc>
@@ -7737,7 +7491,7 @@
                 <w:b/>
                 <w:sz w:val="18"/>
               </w:rPr>
-              <w:t>17.733 €</w:t>
+              <w:t>18.140 €</w:t>
             </w:r>
           </w:p>
         </w:tc>
@@ -7757,7 +7511,7 @@
                 <w:b/>
                 <w:sz w:val="18"/>
               </w:rPr>
-              <w:t>212.800 €</w:t>
+              <w:t>217.676 €</w:t>
             </w:r>
           </w:p>
         </w:tc>
@@ -7942,7 +7696,7 @@
               <w:rPr>
                 <w:sz w:val="18"/>
               </w:rPr>
-              <w:t>163.585 €</w:t>
+              <w:t>168.363 €</w:t>
             </w:r>
           </w:p>
         </w:tc>
@@ -7961,7 +7715,7 @@
               <w:rPr>
                 <w:sz w:val="18"/>
               </w:rPr>
-              <w:t>49.216 €</w:t>
+              <w:t>49.313 €</w:t>
             </w:r>
           </w:p>
         </w:tc>
@@ -7980,7 +7734,7 @@
               <w:rPr>
                 <w:sz w:val="18"/>
               </w:rPr>
-              <w:t>212.800 €</w:t>
+              <w:t>217.676 €</w:t>
             </w:r>
           </w:p>
         </w:tc>
@@ -7999,7 +7753,7 @@
               <w:rPr>
                 <w:sz w:val="18"/>
               </w:rPr>
-              <w:t>4.796.290 €</w:t>
+              <w:t>4.803.715 €</w:t>
             </w:r>
           </w:p>
         </w:tc>
@@ -8041,7 +7795,7 @@
               <w:rPr>
                 <w:sz w:val="18"/>
               </w:rPr>
-              <w:t>161.887 €</w:t>
+              <w:t>166.615 €</w:t>
             </w:r>
           </w:p>
         </w:tc>
@@ -8060,7 +7814,7 @@
               <w:rPr>
                 <w:sz w:val="18"/>
               </w:rPr>
-              <w:t>50.913 €</w:t>
+              <w:t>51.062 €</w:t>
             </w:r>
           </w:p>
         </w:tc>
@@ -8079,7 +7833,7 @@
               <w:rPr>
                 <w:sz w:val="18"/>
               </w:rPr>
-              <w:t>212.800 €</w:t>
+              <w:t>217.676 €</w:t>
             </w:r>
           </w:p>
         </w:tc>
@@ -8098,7 +7852,7 @@
               <w:rPr>
                 <w:sz w:val="18"/>
               </w:rPr>
-              <w:t>4.745.377 €</w:t>
+              <w:t>4.752.653 €</w:t>
             </w:r>
           </w:p>
         </w:tc>
@@ -8140,7 +7894,7 @@
               <w:rPr>
                 <w:sz w:val="18"/>
               </w:rPr>
-              <w:t>160.129 €</w:t>
+              <w:t>164.802 €</w:t>
             </w:r>
           </w:p>
         </w:tc>
@@ -8159,7 +7913,7 @@
               <w:rPr>
                 <w:sz w:val="18"/>
               </w:rPr>
-              <w:t>52.671 €</w:t>
+              <w:t>52.874 €</w:t>
             </w:r>
           </w:p>
         </w:tc>
@@ -8178,7 +7932,7 @@
               <w:rPr>
                 <w:sz w:val="18"/>
               </w:rPr>
-              <w:t>212.800 €</w:t>
+              <w:t>217.676 €</w:t>
             </w:r>
           </w:p>
         </w:tc>
@@ -8197,7 +7951,7 @@
               <w:rPr>
                 <w:sz w:val="18"/>
               </w:rPr>
-              <w:t>4.692.706 €</w:t>
+              <w:t>4.699.779 €</w:t>
             </w:r>
           </w:p>
         </w:tc>
@@ -8239,7 +7993,7 @@
               <w:rPr>
                 <w:sz w:val="18"/>
               </w:rPr>
-              <w:t>156.421 €</w:t>
+              <w:t>160.976 €</w:t>
             </w:r>
           </w:p>
         </w:tc>
@@ -8258,7 +8012,7 @@
               <w:rPr>
                 <w:sz w:val="18"/>
               </w:rPr>
-              <w:t>56.379 €</w:t>
+              <w:t>56.700 €</w:t>
             </w:r>
           </w:p>
         </w:tc>
@@ -8277,7 +8031,7 @@
               <w:rPr>
                 <w:sz w:val="18"/>
               </w:rPr>
-              <w:t>212.800 €</w:t>
+              <w:t>217.676 €</w:t>
             </w:r>
           </w:p>
         </w:tc>
@@ -8296,7 +8050,7 @@
               <w:rPr>
                 <w:sz w:val="18"/>
               </w:rPr>
-              <w:t>4.581.834 €</w:t>
+              <w:t>4.588.326 €</w:t>
             </w:r>
           </w:p>
         </w:tc>
@@ -8342,7 +8096,7 @@
                 <w:b/>
                 <w:sz w:val="18"/>
               </w:rPr>
-              <w:t>145.921 €</w:t>
+              <w:t>150.110 €</w:t>
             </w:r>
           </w:p>
         </w:tc>
@@ -8363,7 +8117,7 @@
                 <w:b/>
                 <w:sz w:val="18"/>
               </w:rPr>
-              <w:t>66.879 €</w:t>
+              <w:t>67.567 €</w:t>
             </w:r>
           </w:p>
         </w:tc>
@@ -8384,7 +8138,7 @@
                 <w:b/>
                 <w:sz w:val="18"/>
               </w:rPr>
-              <w:t>212.800 €</w:t>
+              <w:t>217.676 €</w:t>
             </w:r>
           </w:p>
         </w:tc>
@@ -8405,7 +8159,7 @@
                 <w:b/>
                 <w:sz w:val="18"/>
               </w:rPr>
-              <w:t>4.269.180 €</w:t>
+              <w:t>4.273.010 €</w:t>
             </w:r>
           </w:p>
         </w:tc>
@@ -8447,7 +8201,7 @@
               <w:rPr>
                 <w:sz w:val="18"/>
               </w:rPr>
-              <w:t>133.383 €</w:t>
+              <w:t>137.085 €</w:t>
             </w:r>
           </w:p>
         </w:tc>
@@ -8466,7 +8220,7 @@
               <w:rPr>
                 <w:sz w:val="18"/>
               </w:rPr>
-              <w:t>79.418 €</w:t>
+              <w:t>80.591 €</w:t>
             </w:r>
           </w:p>
         </w:tc>
@@ -8485,7 +8239,7 @@
               <w:rPr>
                 <w:sz w:val="18"/>
               </w:rPr>
-              <w:t>212.800 €</w:t>
+              <w:t>217.676 €</w:t>
             </w:r>
           </w:p>
         </w:tc>
@@ -8504,7 +8258,7 @@
               <w:rPr>
                 <w:sz w:val="18"/>
               </w:rPr>
-              <w:t>3.898.060 €</w:t>
+              <w:t>3.897.048 €</w:t>
             </w:r>
           </w:p>
         </w:tc>
@@ -8546,7 +8300,7 @@
               <w:rPr>
                 <w:sz w:val="18"/>
               </w:rPr>
-              <w:t>118.398 €</w:t>
+              <w:t>121.462 €</w:t>
             </w:r>
           </w:p>
         </w:tc>
@@ -8565,7 +8319,7 @@
               <w:rPr>
                 <w:sz w:val="18"/>
               </w:rPr>
-              <w:t>94.403 €</w:t>
+              <w:t>96.214 €</w:t>
             </w:r>
           </w:p>
         </w:tc>
@@ -8584,7 +8338,7 @@
               <w:rPr>
                 <w:sz w:val="18"/>
               </w:rPr>
-              <w:t>212.800 €</w:t>
+              <w:t>217.676 €</w:t>
             </w:r>
           </w:p>
         </w:tc>
@@ -8603,7 +8357,7 @@
               <w:rPr>
                 <w:sz w:val="18"/>
               </w:rPr>
-              <w:t>3.457.088 €</w:t>
+              <w:t>3.448.361 €</w:t>
             </w:r>
           </w:p>
         </w:tc>
@@ -8645,7 +8399,7 @@
               <w:rPr>
                 <w:sz w:val="18"/>
               </w:rPr>
-              <w:t>100.473 €</w:t>
+              <w:t>102.707 €</w:t>
             </w:r>
           </w:p>
         </w:tc>
@@ -8664,7 +8418,7 @@
               <w:rPr>
                 <w:sz w:val="18"/>
               </w:rPr>
-              <w:t>112.328 €</w:t>
+              <w:t>114.969 €</w:t>
             </w:r>
           </w:p>
         </w:tc>
@@ -8683,7 +8437,7 @@
               <w:rPr>
                 <w:sz w:val="18"/>
               </w:rPr>
-              <w:t>212.800 €</w:t>
+              <w:t>217.676 €</w:t>
             </w:r>
           </w:p>
         </w:tc>
@@ -8702,7 +8456,7 @@
               <w:rPr>
                 <w:sz w:val="18"/>
               </w:rPr>
-              <w:t>2.932.587 €</w:t>
+              <w:t>2.912.398 €</w:t>
             </w:r>
           </w:p>
         </w:tc>
@@ -8744,7 +8498,7 @@
               <w:rPr>
                 <w:sz w:val="18"/>
               </w:rPr>
-              <w:t>79.012 €</w:t>
+              <w:t>80.176 €</w:t>
             </w:r>
           </w:p>
         </w:tc>
@@ -8763,7 +8517,7 @@
               <w:rPr>
                 <w:sz w:val="18"/>
               </w:rPr>
-              <w:t>133.789 €</w:t>
+              <w:t>137.500 €</w:t>
             </w:r>
           </w:p>
         </w:tc>
@@ -8782,7 +8536,7 @@
               <w:rPr>
                 <w:sz w:val="18"/>
               </w:rPr>
-              <w:t>212.800 €</w:t>
+              <w:t>217.676 €</w:t>
             </w:r>
           </w:p>
         </w:tc>
@@ -8801,7 +8555,7 @@
               <w:rPr>
                 <w:sz w:val="18"/>
               </w:rPr>
-              <w:t>2.308.113 €</w:t>
+              <w:t>2.271.614 €</w:t>
             </w:r>
           </w:p>
         </w:tc>
@@ -8841,7 +8595,7 @@
               <w:rPr>
                 <w:sz w:val="18"/>
               </w:rPr>
-              <w:t>53.296 €</w:t>
+              <w:t>53.089 €</w:t>
             </w:r>
           </w:p>
         </w:tc>
@@ -8859,7 +8613,7 @@
               <w:rPr>
                 <w:sz w:val="18"/>
               </w:rPr>
-              <w:t>159.505 €</w:t>
+              <w:t>164.587 €</w:t>
             </w:r>
           </w:p>
         </w:tc>
@@ -8877,7 +8631,7 @@
               <w:rPr>
                 <w:sz w:val="18"/>
               </w:rPr>
-              <w:t>212.800 €</w:t>
+              <w:t>217.676 €</w:t>
             </w:r>
           </w:p>
         </w:tc>
@@ -8895,7 +8649,7 @@
               <w:rPr>
                 <w:sz w:val="18"/>
               </w:rPr>
-              <w:t>1.563.885 €</w:t>
+              <w:t>1.504.850 €</w:t>
             </w:r>
           </w:p>
         </w:tc>
@@ -8915,7 +8669,7 @@
           <w:b w:val="0"/>
           <w:i w:val="0"/>
         </w:rPr>
-        <w:t>Nach 10 Jahren beträgt die Restschuld 4.269.180 €. Die Anschlussfinanzierung ist eingeplant, ein Zinsanstieg um einen Prozentpunkt auf die Restschuld kostet ca. 3.558 € pro Monat mehr. Die Bank kann eine höhere Tilgung verlangen, im Modell ist sie einstellbar.</w:t>
+        <w:t>Nach 10 Jahren beträgt die Restschuld 4.273.010 €. Die Anschlussfinanzierung ist eingeplant, ein Zinsanstieg um einen Prozentpunkt auf die Restschuld kostet ca. 3.561 € pro Monat mehr. Die Bank kann eine höhere Tilgung verlangen, im Modell ist sie einstellbar.</w:t>
       </w:r>
     </w:p>
     <w:p>
@@ -9035,7 +8789,7 @@
               <w:rPr>
                 <w:sz w:val="18"/>
               </w:rPr>
-              <w:t>Kaltmiete Wohnen (8 Wohnungen)</w:t>
+              <w:t>Kaltmiete Wohnen (6 Wohnungen)</w:t>
             </w:r>
           </w:p>
         </w:tc>
@@ -9493,7 +9247,7 @@
               <w:rPr>
                 <w:sz w:val="18"/>
               </w:rPr>
-              <w:t>−17.733 €</w:t>
+              <w:t>−18.140 €</w:t>
             </w:r>
           </w:p>
         </w:tc>
@@ -9512,7 +9266,7 @@
               <w:rPr>
                 <w:sz w:val="18"/>
               </w:rPr>
-              <w:t>−212.800 €</w:t>
+              <w:t>−217.676 €</w:t>
             </w:r>
           </w:p>
         </w:tc>
@@ -9556,7 +9310,7 @@
                 <w:b/>
                 <w:sz w:val="18"/>
               </w:rPr>
-              <w:t>+9.610 €</w:t>
+              <w:t>+9.204 €</w:t>
             </w:r>
           </w:p>
         </w:tc>
@@ -9576,7 +9330,7 @@
                 <w:b/>
                 <w:sz w:val="18"/>
               </w:rPr>
-              <w:t>+115.322 €</w:t>
+              <w:t>+110.446 €</w:t>
             </w:r>
           </w:p>
         </w:tc>
@@ -9599,7 +9353,7 @@
         <w:t xml:space="preserve">Kapitaldienstdeckung (DSCR): </w:t>
       </w:r>
       <w:r>
-        <w:t>1,54 gesamt, 0,71 nur aus Miete, Büro und Pacht, 0,45 nur aus Wohnen und Büro. Banken verlangen meist mindestens 1,2.</w:t>
+        <w:t>1,51 gesamt, 0,70 nur aus Miete, Büro und Pacht, 0,44 nur aus Wohnen und Büro. Banken verlangen meist mindestens 1,2.</w:t>
       </w:r>
     </w:p>
     <w:p>
@@ -9614,7 +9368,7 @@
         <w:t xml:space="preserve">Zinsdeckung: </w:t>
       </w:r>
       <w:r>
-        <w:t>2,01 (Ertrag vor Kapitaldienst im Verhältnis zu den Zinsen).</w:t>
+        <w:t>1,95 (Ertrag vor Kapitaldienst im Verhältnis zu den Zinsen).</w:t>
       </w:r>
     </w:p>
     <w:p>
@@ -9629,7 +9383,7 @@
         <w:t xml:space="preserve">Anfangsrendite: </w:t>
       </w:r>
       <w:r>
-        <w:t>3,13 % (Nettoertrag der Immobilie auf die Gesamtkosten).</w:t>
+        <w:t>3,12 % (Nettoertrag der Immobilie auf die Gesamtkosten).</w:t>
       </w:r>
     </w:p>
     <w:p>
@@ -9644,7 +9398,7 @@
         <w:t xml:space="preserve">Break-even: </w:t>
       </w:r>
       <w:r>
-        <w:t>Das Haus ist ab ca. 33.500 € Gastro-Umsatz im Monat im Plus, alle Raten sind dann bezahlt.</w:t>
+        <w:t>Das Haus ist ab ca. 34.800 € Gastro-Umsatz im Monat im Plus, alle Raten sind dann bezahlt.</w:t>
       </w:r>
     </w:p>
     <w:p>
@@ -9822,7 +9576,7 @@
               <w:rPr>
                 <w:sz w:val="18"/>
               </w:rPr>
-              <w:t>−23.141 €</w:t>
+              <w:t>−22.421 €</w:t>
             </w:r>
           </w:p>
         </w:tc>
@@ -9868,7 +9622,7 @@
                 <w:b/>
                 <w:sz w:val="18"/>
               </w:rPr>
-              <w:t>145.106 €</w:t>
+              <w:t>145.826 €</w:t>
             </w:r>
           </w:p>
         </w:tc>
@@ -9952,7 +9706,7 @@
               <w:rPr>
                 <w:sz w:val="18"/>
               </w:rPr>
-              <w:t>2.656.444 €</w:t>
+              <w:t>2.673.663 €</w:t>
             </w:r>
           </w:p>
         </w:tc>
@@ -9998,7 +9752,7 @@
                 <w:b/>
                 <w:sz w:val="18"/>
               </w:rPr>
-              <w:t>2.877.244 €</w:t>
+              <w:t>2.894.463 €</w:t>
             </w:r>
           </w:p>
         </w:tc>
@@ -10040,7 +9794,7 @@
               <w:rPr>
                 <w:sz w:val="18"/>
               </w:rPr>
-              <w:t>1.806.745 €</w:t>
+              <w:t>1.823.964 €</w:t>
             </w:r>
           </w:p>
         </w:tc>
@@ -10280,7 +10034,7 @@
               <w:rPr>
                 <w:sz w:val="18"/>
               </w:rPr>
-              <w:t>2.589.520 €</w:t>
+              <w:t>2.605.017 €</w:t>
             </w:r>
           </w:p>
         </w:tc>
@@ -10322,7 +10076,7 @@
               <w:rPr>
                 <w:sz w:val="18"/>
               </w:rPr>
-              <w:t>4.845.506 €</w:t>
+              <w:t>4.853.028 €</w:t>
             </w:r>
           </w:p>
         </w:tc>
@@ -10368,7 +10122,7 @@
                 <w:b/>
                 <w:sz w:val="18"/>
               </w:rPr>
-              <w:t>187 %</w:t>
+              <w:t>186 %</w:t>
             </w:r>
           </w:p>
         </w:tc>
@@ -10410,7 +10164,7 @@
               <w:rPr>
                 <w:sz w:val="18"/>
               </w:rPr>
-              <w:t>−1.968.262 €</w:t>
+              <w:t>−1.958.565 €</w:t>
             </w:r>
           </w:p>
         </w:tc>
@@ -10450,7 +10204,7 @@
               <w:rPr>
                 <w:sz w:val="18"/>
               </w:rPr>
-              <w:t>2.773.890 €</w:t>
+              <w:t>2.769.015 €</w:t>
             </w:r>
           </w:p>
         </w:tc>
@@ -10480,7 +10234,7 @@
           <w:b w:val="0"/>
           <w:i w:val="0"/>
         </w:rPr>
-        <w:t>Die Mieten, Büromieten und die Pacht tragen einen Ertragswert von 2,88 Mio. €, die Kosten liegen bei 4,85 Mio. €. Bei 100 % Fremdfinanzierung ergibt sich ein Beleihungsauslauf von 187 %, Banken beleihen üblicherweise nur bis ca. 80 %. Um das Darlehen darstellen zu können, bietet der Bauherr der Bank zusätzliche Sicherheiten an, etwa Grundschulden auf weitere Immobilien, eine Bürgschaft oder Eigenkapital. Rechnerisch geht es um ca. 2,77 Mio. €. Weitere Hebel sind höhere Mieten durch Vorvermietung, niedrigere Baukosten durch die Angebote der Bekannten-Unternehmen und eine Städtebauförderung (Zuschuss der Stadt, noch offen).</w:t>
+        <w:t>Die Mieten, Büromieten und die Pacht tragen einen Ertragswert von 2,89 Mio. €, die Kosten liegen bei 4,85 Mio. €. Bei 100 % Fremdfinanzierung ergibt sich ein Beleihungsauslauf von 186 %, Banken beleihen üblicherweise nur bis ca. 80 %. Um das Darlehen darstellen zu können, bietet der Bauherr der Bank zusätzliche Sicherheiten an, etwa Grundschulden auf weitere Immobilien, eine Bürgschaft oder Eigenkapital. Rechnerisch geht es um ca. 2,77 Mio. €. Weitere Hebel sind höhere Mieten durch Vorvermietung, niedrigere Baukosten durch die Angebote der Bekannten-Unternehmen und eine Städtebauförderung (Zuschuss der Stadt, noch offen).</w:t>
       </w:r>
     </w:p>
     <w:p>
@@ -10806,7 +10560,7 @@
               <w:rPr>
                 <w:sz w:val="17"/>
               </w:rPr>
-              <w:t>−212.800 €</w:t>
+              <w:t>−217.676 €</w:t>
             </w:r>
           </w:p>
         </w:tc>
@@ -10825,7 +10579,7 @@
               <w:rPr>
                 <w:sz w:val="17"/>
               </w:rPr>
-              <w:t>−212.800 €</w:t>
+              <w:t>−217.676 €</w:t>
             </w:r>
           </w:p>
         </w:tc>
@@ -10844,7 +10598,7 @@
               <w:rPr>
                 <w:sz w:val="17"/>
               </w:rPr>
-              <w:t>−212.800 €</w:t>
+              <w:t>−217.676 €</w:t>
             </w:r>
           </w:p>
         </w:tc>
@@ -10863,7 +10617,7 @@
               <w:rPr>
                 <w:sz w:val="17"/>
               </w:rPr>
-              <w:t>−212.800 €</w:t>
+              <w:t>−217.676 €</w:t>
             </w:r>
           </w:p>
         </w:tc>
@@ -10882,7 +10636,7 @@
               <w:rPr>
                 <w:sz w:val="17"/>
               </w:rPr>
-              <w:t>−212.800 €</w:t>
+              <w:t>−217.676 €</w:t>
             </w:r>
           </w:p>
         </w:tc>
@@ -10928,7 +10682,7 @@
                 <w:b/>
                 <w:sz w:val="17"/>
               </w:rPr>
-              <w:t>115.322 €</w:t>
+              <w:t>110.446 €</w:t>
             </w:r>
           </w:p>
         </w:tc>
@@ -10949,7 +10703,7 @@
                 <w:b/>
                 <w:sz w:val="17"/>
               </w:rPr>
-              <w:t>125.415 €</w:t>
+              <w:t>120.539 €</w:t>
             </w:r>
           </w:p>
         </w:tc>
@@ -10970,7 +10724,7 @@
                 <w:b/>
                 <w:sz w:val="17"/>
               </w:rPr>
-              <w:t>135.821 €</w:t>
+              <w:t>130.945 €</w:t>
             </w:r>
           </w:p>
         </w:tc>
@@ -10991,7 +10745,7 @@
                 <w:b/>
                 <w:sz w:val="17"/>
               </w:rPr>
-              <w:t>146.548 €</w:t>
+              <w:t>141.672 €</w:t>
             </w:r>
           </w:p>
         </w:tc>
@@ -11012,7 +10766,7 @@
                 <w:b/>
                 <w:sz w:val="17"/>
               </w:rPr>
-              <w:t>163.265 €</w:t>
+              <w:t>158.389 €</w:t>
             </w:r>
           </w:p>
         </w:tc>
@@ -11054,7 +10808,7 @@
               <w:rPr>
                 <w:sz w:val="17"/>
               </w:rPr>
-              <w:t>1,54</w:t>
+              <w:t>1,51</w:t>
             </w:r>
           </w:p>
         </w:tc>
@@ -11073,7 +10827,7 @@
               <w:rPr>
                 <w:sz w:val="17"/>
               </w:rPr>
-              <w:t>1,59</w:t>
+              <w:t>1,55</w:t>
             </w:r>
           </w:p>
         </w:tc>
@@ -11092,7 +10846,7 @@
               <w:rPr>
                 <w:sz w:val="17"/>
               </w:rPr>
-              <w:t>1,64</w:t>
+              <w:t>1,60</w:t>
             </w:r>
           </w:p>
         </w:tc>
@@ -11111,7 +10865,7 @@
               <w:rPr>
                 <w:sz w:val="17"/>
               </w:rPr>
-              <w:t>1,69</w:t>
+              <w:t>1,65</w:t>
             </w:r>
           </w:p>
         </w:tc>
@@ -11130,7 +10884,7 @@
               <w:rPr>
                 <w:sz w:val="17"/>
               </w:rPr>
-              <w:t>1,77</w:t>
+              <w:t>1,73</w:t>
             </w:r>
           </w:p>
         </w:tc>
@@ -11170,7 +10924,7 @@
               <w:rPr>
                 <w:sz w:val="17"/>
               </w:rPr>
-              <w:t>4.796.290 €</w:t>
+              <w:t>4.803.715 €</w:t>
             </w:r>
           </w:p>
         </w:tc>
@@ -11188,7 +10942,7 @@
               <w:rPr>
                 <w:sz w:val="17"/>
               </w:rPr>
-              <w:t>4.692.706 €</w:t>
+              <w:t>4.699.779 €</w:t>
             </w:r>
           </w:p>
         </w:tc>
@@ -11206,7 +10960,7 @@
               <w:rPr>
                 <w:sz w:val="17"/>
               </w:rPr>
-              <w:t>4.581.834 €</w:t>
+              <w:t>4.588.326 €</w:t>
             </w:r>
           </w:p>
         </w:tc>
@@ -11224,7 +10978,7 @@
               <w:rPr>
                 <w:sz w:val="17"/>
               </w:rPr>
-              <w:t>4.463.143 €</w:t>
+              <w:t>4.468.794 €</w:t>
             </w:r>
           </w:p>
         </w:tc>
@@ -11242,7 +10996,7 @@
               <w:rPr>
                 <w:sz w:val="17"/>
               </w:rPr>
-              <w:t>4.269.180 €</w:t>
+              <w:t>4.273.010 €</w:t>
             </w:r>
           </w:p>
         </w:tc>
@@ -11261,7 +11015,7 @@
           <w:color w:val="5B6770"/>
           <w:sz w:val="18"/>
         </w:rPr>
-        <w:t>Annahme: Miete, Pacht und Gastro-Umsatz steigen um 1,5 % pro Jahr, Büromieten um 2 % (Indexmiete), der Kapitaldienst bleibt gleich. Die Kapitaldienstdeckung verbessert sich von 1,54 auf 1,77 in Jahr 10.</w:t>
+        <w:t>Annahme: Miete, Pacht und Gastro-Umsatz steigen um 1,5 % pro Jahr, Büromieten um 2 % (Indexmiete), der Kapitaldienst bleibt gleich. Die Kapitaldienstdeckung verbessert sich von 1,51 auf 1,73 in Jahr 10.</w:t>
       </w:r>
     </w:p>
     <w:tbl>
@@ -11419,7 +11173,7 @@
                 <w:b/>
                 <w:sz w:val="18"/>
               </w:rPr>
-              <w:t>+9.610 €</w:t>
+              <w:t>+9.204 €</w:t>
             </w:r>
           </w:p>
         </w:tc>
@@ -11440,7 +11194,7 @@
                 <w:b/>
                 <w:sz w:val="18"/>
               </w:rPr>
-              <w:t>1,54</w:t>
+              <w:t>1,51</w:t>
             </w:r>
           </w:p>
         </w:tc>
@@ -11502,7 +11256,7 @@
               <w:rPr>
                 <w:sz w:val="18"/>
               </w:rPr>
-              <w:t>+6.053 €</w:t>
+              <w:t>+5.643 €</w:t>
             </w:r>
           </w:p>
         </w:tc>
@@ -11521,7 +11275,7 @@
               <w:rPr>
                 <w:sz w:val="18"/>
               </w:rPr>
-              <w:t>1,28</w:t>
+              <w:t>1,26</w:t>
             </w:r>
           </w:p>
         </w:tc>
@@ -11540,7 +11294,7 @@
               <w:rPr>
                 <w:sz w:val="18"/>
               </w:rPr>
-              <w:t>−3.558 €</w:t>
+              <w:t>−3.561 €</w:t>
             </w:r>
           </w:p>
         </w:tc>
@@ -11582,7 +11336,7 @@
               <w:rPr>
                 <w:sz w:val="18"/>
               </w:rPr>
-              <w:t>+8.951 €</w:t>
+              <w:t>+8.545 €</w:t>
             </w:r>
           </w:p>
         </w:tc>
@@ -11601,7 +11355,7 @@
               <w:rPr>
                 <w:sz w:val="18"/>
               </w:rPr>
-              <w:t>1,50</w:t>
+              <w:t>1,47</w:t>
             </w:r>
           </w:p>
         </w:tc>
@@ -11662,7 +11416,7 @@
               <w:rPr>
                 <w:sz w:val="18"/>
               </w:rPr>
-              <w:t>+5.645 €</w:t>
+              <w:t>+5.239 €</w:t>
             </w:r>
           </w:p>
         </w:tc>
@@ -11681,7 +11435,7 @@
               <w:rPr>
                 <w:sz w:val="18"/>
               </w:rPr>
-              <w:t>1,32</w:t>
+              <w:t>1,29</w:t>
             </w:r>
           </w:p>
         </w:tc>
@@ -11742,7 +11496,7 @@
               <w:rPr>
                 <w:sz w:val="18"/>
               </w:rPr>
-              <w:t>+1.680 €</w:t>
+              <w:t>+1.274 €</w:t>
             </w:r>
           </w:p>
         </w:tc>
@@ -11761,7 +11515,7 @@
               <w:rPr>
                 <w:sz w:val="18"/>
               </w:rPr>
-              <w:t>1,09</w:t>
+              <w:t>1,07</w:t>
             </w:r>
           </w:p>
         </w:tc>
@@ -11822,7 +11576,7 @@
               <w:rPr>
                 <w:sz w:val="18"/>
               </w:rPr>
-              <w:t>+8.152 €</w:t>
+              <w:t>+7.714 €</w:t>
             </w:r>
           </w:p>
         </w:tc>
@@ -11841,7 +11595,7 @@
               <w:rPr>
                 <w:sz w:val="18"/>
               </w:rPr>
-              <w:t>1,42</w:t>
+              <w:t>1,39</w:t>
             </w:r>
           </w:p>
         </w:tc>
@@ -11860,7 +11614,7 @@
               <w:rPr>
                 <w:sz w:val="18"/>
               </w:rPr>
-              <w:t>−1.459 €</w:t>
+              <w:t>−1.490 €</w:t>
             </w:r>
           </w:p>
         </w:tc>
@@ -11902,7 +11656,7 @@
               <w:rPr>
                 <w:sz w:val="18"/>
               </w:rPr>
-              <w:t>+8.755 €</w:t>
+              <w:t>+8.349 €</w:t>
             </w:r>
           </w:p>
         </w:tc>
@@ -11921,7 +11675,7 @@
               <w:rPr>
                 <w:sz w:val="18"/>
               </w:rPr>
-              <w:t>1,49</w:t>
+              <w:t>1,46</w:t>
             </w:r>
           </w:p>
         </w:tc>
@@ -11982,7 +11736,7 @@
               <w:rPr>
                 <w:sz w:val="18"/>
               </w:rPr>
-              <w:t>+8.170 €</w:t>
+              <w:t>+7.764 €</w:t>
             </w:r>
           </w:p>
         </w:tc>
@@ -12001,7 +11755,7 @@
               <w:rPr>
                 <w:sz w:val="18"/>
               </w:rPr>
-              <w:t>1,46</w:t>
+              <w:t>1,43</w:t>
             </w:r>
           </w:p>
         </w:tc>
@@ -12060,7 +11814,7 @@
               <w:rPr>
                 <w:sz w:val="18"/>
               </w:rPr>
-              <w:t>−9.705 €</w:t>
+              <w:t>−10.111 €</w:t>
             </w:r>
           </w:p>
         </w:tc>
@@ -12078,7 +11832,7 @@
               <w:rPr>
                 <w:sz w:val="18"/>
               </w:rPr>
-              <w:t>0,45</w:t>
+              <w:t>0,44</w:t>
             </w:r>
           </w:p>
         </w:tc>
@@ -12667,7 +12421,7 @@
           <w:i w:val="0"/>
           <w:color w:val="2F4A3E"/>
         </w:rPr>
-        <w:t>Ergebnis: Kurzzeitvermietung lohnt sich nicht. Auch kleine Apartments bringen nach Möblierung, Kapitaldienst und Kosten weniger als langfristige Mieter. Dazu kommen Aufwand für Gäste und Reinigung und bei mehr als 12 Betten Sonderbau-Brandschutz. Alle 8 Wohnungen bleiben deshalb langfristig vermietet.</w:t>
+        <w:t>Ergebnis: Kurzzeitvermietung lohnt sich nicht. Auch kleine Apartments bringen nach Möblierung, Kapitaldienst und Kosten weniger als langfristige Mieter. Dazu kommen Aufwand für Gäste und Reinigung und bei mehr als 12 Betten Sonderbau-Brandschutz. Alle 6 Wohnungen bleiben deshalb langfristig vermietet.</w:t>
       </w:r>
     </w:p>
     <w:p>
@@ -12803,7 +12557,7 @@
               <w:rPr>
                 <w:sz w:val="17"/>
               </w:rPr>
-              <w:t>Beleihungsauslauf 187 % bei 100 % Fremdfinanzierung</w:t>
+              <w:t>Beleihungsauslauf 186 % bei 100 % Fremdfinanzierung</w:t>
             </w:r>
           </w:p>
         </w:tc>
@@ -12862,7 +12616,7 @@
               <w:rPr>
                 <w:sz w:val="17"/>
               </w:rPr>
-              <w:t>Haus ab ca. 33.000 € Umsatz im Plus; bei Ausfall der Gastro fehlen ca. 19.315 € pro Monat</w:t>
+              <w:t>Haus ab ca. 35.000 € Umsatz im Plus; bei Ausfall der Gastro fehlen ca. 19.315 € pro Monat</w:t>
             </w:r>
           </w:p>
         </w:tc>
@@ -15034,7 +14788,7 @@
           <w:color w:val="5B6770"/>
           <w:sz w:val="18"/>
         </w:rPr>
-        <w:t>Weitere Anlagen: Präsentation (Neue-Mitte-Werlte_Baufeld3_8-Wohnungen_Grosse-Gastro-EG.pptx), Gastro-Konzept (Neue-Mitte-Werlte_Baufeld3_Gastro-Konzept.pptx).</w:t>
+        <w:t>Weitere Anlagen: Präsentation (Neue-Mitte-Werlte_Baufeld3_6-Wohnungen_Grosse-Gastro-EG.pptx), Gastro-Konzept (Neue-Mitte-Werlte_Baufeld3_Gastro-Konzept.pptx).</w:t>
       </w:r>
     </w:p>
     <w:sectPr>

</xml_diff>

<commit_message>
Revert "6 Wohneinheiten (3 im 1. OG à 107 m², 3 im Staffelgeschoss à 111 m²): Excel, Decks, Businessplan, Skizzen angepasst"
This reverts commit 7a86591bd4fbb48033fa2772773b75445002c9bb.
</commit_message>
<xml_diff>
--- a/praesentation/Businessplan_Baufeld3_Neue-Mitte-Werlte.docx
+++ b/praesentation/Businessplan_Baufeld3_Neue-Mitte-Werlte.docx
@@ -21,7 +21,7 @@
         <w:pStyle w:val="Title"/>
       </w:pPr>
       <w:r>
-        <w:t>Businessplan: Große Gastro und 6 Wohnungen</w:t>
+        <w:t>Businessplan: Große Gastro und 8 Wohnungen</w:t>
       </w:r>
     </w:p>
     <w:p>
@@ -185,7 +185,7 @@
               <w:rPr>
                 <w:sz w:val="20"/>
               </w:rPr>
-              <w:t>Neubau eines gemischt genutzten Gebäudes: große Gastro im Erdgeschoss, 2 Büro-Ankermieter und 3 Wohnungen im 1. Obergeschoss, 3 Wohnungen im Staffelgeschoss in Holzbau</w:t>
+              <w:t>Neubau eines gemischt genutzten Gebäudes: große Gastro im Erdgeschoss, 2 Büro-Ankermieter und 3 Wohnungen im 1. Obergeschoss, 5 Wohnungen im Staffelgeschoss in Holzbau</w:t>
             </w:r>
           </w:p>
         </w:tc>
@@ -267,7 +267,7 @@
               <w:rPr>
                 <w:sz w:val="20"/>
               </w:rPr>
-              <w:t>4.853.028 € (100 % Fremdkapital), davon KfW-Kredite 2.047.500 €</w:t>
+              <w:t>4.845.506 € (100 % Fremdkapital), davon KfW-Kredite 2.347.500 €</w:t>
             </w:r>
           </w:p>
         </w:tc>
@@ -347,7 +347,7 @@
           <w:b w:val="0"/>
           <w:i w:val="0"/>
         </w:rPr>
-        <w:t>Auf dem Baufeld 3 der Neuen Mitte Werlte entsteht ein dreigeschossiges Gebäude (zwei Vollgeschosse plus Staffelgeschoss in Holzbau) mit 576 m² Grundfläche (32 × 18 m, das Maximum der Grundflächenzahl 0,6) und 1.650 m² Bruttogrundfläche (BGF, alle Geschossflächen zusammen). Im Erdgeschoss liegt eine große Gastro mit ca. 510 m² und ca. 190 Plätzen. Im 1. Obergeschoss mieten zwei Ankermieter Büros (100 m² Versicherungsgesellschaft o. ä., 65 m² Makler o. ä., 10 Jahre fest), dazu kommen 3 Wohnungen. Im Staffelgeschoss in Holzbau liegen 3 Wohnungen. Die 6 Wohnungen haben zusammen 655 m² Wohnfläche und werden langfristig vermietet.</w:t>
+        <w:t>Auf dem Baufeld 3 der Neuen Mitte Werlte entsteht ein dreigeschossiges Gebäude (zwei Vollgeschosse plus Staffelgeschoss in Holzbau) mit 576 m² Grundfläche (32 × 18 m, das Maximum der Grundflächenzahl 0,6) und 1.650 m² Bruttogrundfläche (BGF, alle Geschossflächen zusammen). Im Erdgeschoss liegt eine große Gastro mit ca. 510 m² und ca. 190 Plätzen. Im 1. Obergeschoss mieten zwei Ankermieter Büros (100 m² Versicherungsgesellschaft o. ä., 65 m² Makler o. ä., 10 Jahre fest), dazu kommen 3 Wohnungen. Im Staffelgeschoss in Holzbau liegen 5 Wohnungen. Die 8 Wohnungen haben zusammen 655 m² Wohnfläche und werden langfristig vermietet.</w:t>
       </w:r>
     </w:p>
     <w:tbl>
@@ -455,7 +455,7 @@
               <w:rPr>
                 <w:sz w:val="19"/>
               </w:rPr>
-              <w:t>4.853.028 €</w:t>
+              <w:t>4.845.506 €</w:t>
             </w:r>
           </w:p>
         </w:tc>
@@ -497,7 +497,7 @@
               <w:rPr>
                 <w:sz w:val="19"/>
               </w:rPr>
-              <w:t>4.853.028 €</w:t>
+              <w:t>4.845.506 €</w:t>
             </w:r>
           </w:p>
         </w:tc>
@@ -539,7 +539,7 @@
               <w:rPr>
                 <w:sz w:val="19"/>
               </w:rPr>
-              <w:t>2.047.500 € (42 %)</w:t>
+              <w:t>2.347.500 € (48 %)</w:t>
             </w:r>
           </w:p>
         </w:tc>
@@ -581,7 +581,7 @@
               <w:rPr>
                 <w:sz w:val="19"/>
               </w:rPr>
-              <w:t>3,49 %</w:t>
+              <w:t>3,39 %</w:t>
             </w:r>
           </w:p>
         </w:tc>
@@ -623,7 +623,7 @@
               <w:rPr>
                 <w:sz w:val="19"/>
               </w:rPr>
-              <w:t>18.140 €</w:t>
+              <w:t>17.733 €</w:t>
             </w:r>
           </w:p>
         </w:tc>
@@ -707,7 +707,7 @@
               <w:rPr>
                 <w:sz w:val="19"/>
               </w:rPr>
-              <w:t>+9.204 €</w:t>
+              <w:t>+9.610 €</w:t>
             </w:r>
           </w:p>
         </w:tc>
@@ -749,7 +749,7 @@
               <w:rPr>
                 <w:sz w:val="19"/>
               </w:rPr>
-              <w:t>1,51 gesamt, 0,70 nur Immobilie</w:t>
+              <w:t>1,54 gesamt, 0,71 nur Immobilie</w:t>
             </w:r>
           </w:p>
         </w:tc>
@@ -791,7 +791,7 @@
               <w:rPr>
                 <w:sz w:val="19"/>
               </w:rPr>
-              <w:t>2.894.463 €</w:t>
+              <w:t>2.877.244 €</w:t>
             </w:r>
           </w:p>
         </w:tc>
@@ -833,7 +833,7 @@
               <w:rPr>
                 <w:sz w:val="19"/>
               </w:rPr>
-              <w:t>2.605.017 €</w:t>
+              <w:t>2.589.520 €</w:t>
             </w:r>
           </w:p>
         </w:tc>
@@ -873,7 +873,7 @@
               <w:rPr>
                 <w:sz w:val="19"/>
               </w:rPr>
-              <w:t>186 %</w:t>
+              <w:t>187 %</w:t>
             </w:r>
           </w:p>
         </w:tc>
@@ -909,7 +909,7 @@
         <w:t xml:space="preserve">Der Ertrag trägt die Raten, aber nur mit der Gastro. </w:t>
       </w:r>
       <w:r>
-        <w:t>Mit dem Gastro-Gewinn liegt die Kapitaldienstdeckung bei 1,51. Allein aus Miete, Büromiete und Pacht wären es 0,70, aus Wohnen und Büro allein 0,44.</w:t>
+        <w:t>Mit dem Gastro-Gewinn liegt die Kapitaldienstdeckung bei 1,54. Allein aus Miete, Büromiete und Pacht wären es 0,71, aus Wohnen und Büro allein 0,45.</w:t>
       </w:r>
     </w:p>
     <w:p>
@@ -924,7 +924,7 @@
         <w:t xml:space="preserve">Die Büro-Ankermieter sichern einen Teil. </w:t>
       </w:r>
       <w:r>
-        <w:t>Die zwei Büros bringen 19.200 € im Jahr über 10 Jahre fest und decken 8 % des Kapitaldienstes, zusammen mit den Wohnungen decken die langfristigen Mieten 44 %.</w:t>
+        <w:t>Die zwei Büros bringen 19.200 € im Jahr über 10 Jahre fest und decken 8 % des Kapitaldienstes, zusammen mit den Wohnungen decken die langfristigen Mieten 45 %.</w:t>
       </w:r>
     </w:p>
     <w:p>
@@ -939,7 +939,7 @@
         <w:t xml:space="preserve">KfW senkt die Zinslast deutlich. </w:t>
       </w:r>
       <w:r>
-        <w:t>Die drei KfW-Kreditprogramme decken 42 % des Darlehens zu 2,5 bis 3,0 % ab, der Mischzins liegt bei 3,49 % statt 4,0 %.</w:t>
+        <w:t>Die drei KfW-Kreditprogramme decken 48 % des Darlehens zu 2,5 bis 3,0 % ab, der Mischzins liegt bei 3,39 % statt 4,0 %.</w:t>
       </w:r>
     </w:p>
     <w:p>
@@ -954,7 +954,7 @@
         <w:t xml:space="preserve">Der Beleihungswert ist die Hürde. </w:t>
       </w:r>
       <w:r>
-        <w:t>Der Ertragswert von 2,89 Mio. € liegt weit unter den Kosten von 4,85 Mio. €. Die Bank wird zusätzliche Sicherheiten oder Eigenkapital in der Größenordnung von 2,77 Mio. € verlangen.</w:t>
+        <w:t>Der Ertragswert von 2,88 Mio. € liegt weit unter den Kosten von 4,85 Mio. €. Die Bank wird zusätzliche Sicherheiten oder Eigenkapital in der Größenordnung von 2,77 Mio. € verlangen.</w:t>
       </w:r>
     </w:p>
     <w:p>
@@ -969,7 +969,7 @@
         <w:t xml:space="preserve">Airbnb lohnt sich nicht. </w:t>
       </w:r>
       <w:r>
-        <w:t>Zwei Wohnungen als Kurzzeitvermietung bringen weniger als langfristige Mieter, deshalb bleiben alle 6 Wohnungen langfristig vermietet.</w:t>
+        <w:t>Zwei Wohnungen als Kurzzeitvermietung bringen weniger als langfristige Mieter, deshalb bleiben alle 8 Wohnungen langfristig vermietet.</w:t>
       </w:r>
     </w:p>
     <w:p>
@@ -1365,7 +1365,7 @@
               <w:rPr>
                 <w:sz w:val="18"/>
               </w:rPr>
-              <w:t>ca. 6–8 auf dem Grundstück, Bedarf ca. 52</w:t>
+              <w:t>ca. 6–8 auf dem Grundstück, Bedarf ca. 55</w:t>
             </w:r>
           </w:p>
         </w:tc>
@@ -1411,7 +1411,7 @@
           <w:b w:val="0"/>
           <w:i w:val="0"/>
         </w:rPr>
-        <w:t>Das Gebäude hat eine Grundfläche von 32 × 18 m (576 m², das Maximum der Grundflächenzahl). Das Erdgeschoss ist vollverglast und gehört ganz der Gastro, Treppenhaus und Aufzug liegen am Westende und erschließen Büros und Wohnungen getrennt von der Gastro. Im 1. Obergeschoss liegen die zwei Büros und 3 Wohnungen, im Staffelgeschoss 3 Wohnungen. Das 1. Obergeschoss ist in rotbraunem Klinker mit Balkonen und Milchglas-Brüstungen ausgeführt, das Staffelgeschoss in Holzbau mit schmaler Dachterrasse (ca. 0,8 m, 77 m²) rundum. Holzbau spart ca. 184.000 € gegenüber Massivbau (Annahme, Angebot der Zimmerei nötig) und hilft beim Effizienzhaus-40-Standard.</w:t>
+        <w:t>Das Gebäude hat eine Grundfläche von 32 × 18 m (576 m², das Maximum der Grundflächenzahl). Das Erdgeschoss ist vollverglast und gehört ganz der Gastro, Treppenhaus und Aufzug liegen am Westende und erschließen Büros und Wohnungen getrennt von der Gastro. Im 1. Obergeschoss liegen die zwei Büros und 3 Wohnungen, im Staffelgeschoss 5 Wohnungen. Das 1. Obergeschoss ist in rotbraunem Klinker mit Balkonen und Milchglas-Brüstungen ausgeführt, das Staffelgeschoss in Holzbau mit schmaler Dachterrasse (ca. 0,8 m, 77 m²) rundum. Holzbau spart ca. 184.000 € gegenüber Massivbau (Annahme, Angebot der Zimmerei nötig) und hilft beim Effizienzhaus-40-Standard.</w:t>
       </w:r>
     </w:p>
     <w:tbl>
@@ -1809,7 +1809,7 @@
               <w:rPr>
                 <w:sz w:val="18"/>
               </w:rPr>
-              <w:t>3 × 111 m²</w:t>
+              <w:t>5 × 67 m²</w:t>
             </w:r>
           </w:p>
         </w:tc>
@@ -1907,7 +1907,7 @@
                 <w:b/>
                 <w:sz w:val="18"/>
               </w:rPr>
-              <w:t>6 Wohnungen, 2 Büros</w:t>
+              <w:t>8 Wohnungen, 2 Büros</w:t>
             </w:r>
           </w:p>
         </w:tc>
@@ -2515,7 +2515,7 @@
               <w:rPr>
                 <w:sz w:val="18"/>
               </w:rPr>
-              <w:t>111,3 m²</w:t>
+              <w:t>66,8 m²</w:t>
             </w:r>
           </w:p>
         </w:tc>
@@ -2553,7 +2553,7 @@
               <w:rPr>
                 <w:sz w:val="18"/>
               </w:rPr>
-              <w:t>1.244 €</w:t>
+              <w:t>747 €</w:t>
             </w:r>
           </w:p>
         </w:tc>
@@ -2572,7 +2572,7 @@
               <w:rPr>
                 <w:sz w:val="18"/>
               </w:rPr>
-              <w:t>14.932 €</w:t>
+              <w:t>8.959 €</w:t>
             </w:r>
           </w:p>
         </w:tc>
@@ -2632,7 +2632,7 @@
               <w:rPr>
                 <w:sz w:val="18"/>
               </w:rPr>
-              <w:t>111,3 m²</w:t>
+              <w:t>66,8 m²</w:t>
             </w:r>
           </w:p>
         </w:tc>
@@ -2670,7 +2670,7 @@
               <w:rPr>
                 <w:sz w:val="18"/>
               </w:rPr>
-              <w:t>1.244 €</w:t>
+              <w:t>747 €</w:t>
             </w:r>
           </w:p>
         </w:tc>
@@ -2689,7 +2689,7 @@
               <w:rPr>
                 <w:sz w:val="18"/>
               </w:rPr>
-              <w:t>14.932 €</w:t>
+              <w:t>8.959 €</w:t>
             </w:r>
           </w:p>
         </w:tc>
@@ -2749,7 +2749,7 @@
               <w:rPr>
                 <w:sz w:val="18"/>
               </w:rPr>
-              <w:t>111,3 m²</w:t>
+              <w:t>66,8 m²</w:t>
             </w:r>
           </w:p>
         </w:tc>
@@ -2787,7 +2787,7 @@
               <w:rPr>
                 <w:sz w:val="18"/>
               </w:rPr>
-              <w:t>1.244 €</w:t>
+              <w:t>747 €</w:t>
             </w:r>
           </w:p>
         </w:tc>
@@ -2806,7 +2806,7 @@
               <w:rPr>
                 <w:sz w:val="18"/>
               </w:rPr>
-              <w:t>14.932 €</w:t>
+              <w:t>8.959 €</w:t>
             </w:r>
           </w:p>
         </w:tc>
@@ -2829,7 +2829,7 @@
               <w:rPr>
                 <w:sz w:val="18"/>
               </w:rPr>
-              <w:t>Summe Wohnen</w:t>
+              <w:t>WE 7</w:t>
             </w:r>
           </w:p>
         </w:tc>
@@ -2847,6 +2847,7 @@
               <w:rPr>
                 <w:sz w:val="18"/>
               </w:rPr>
+              <w:t>Staffel</w:t>
             </w:r>
           </w:p>
         </w:tc>
@@ -2865,7 +2866,7 @@
               <w:rPr>
                 <w:sz w:val="18"/>
               </w:rPr>
-              <w:t>655,0 m²</w:t>
+              <w:t>66,8 m²</w:t>
             </w:r>
           </w:p>
         </w:tc>
@@ -2884,6 +2885,7 @@
               <w:rPr>
                 <w:sz w:val="18"/>
               </w:rPr>
+              <w:t>11,18 €</w:t>
             </w:r>
           </w:p>
         </w:tc>
@@ -2902,7 +2904,7 @@
               <w:rPr>
                 <w:sz w:val="18"/>
               </w:rPr>
-              <w:t>7.321 €</w:t>
+              <w:t>747 €</w:t>
             </w:r>
           </w:p>
         </w:tc>
@@ -2921,7 +2923,7 @@
               <w:rPr>
                 <w:sz w:val="18"/>
               </w:rPr>
-              <w:t>87.847 €</w:t>
+              <w:t>8.959 €</w:t>
             </w:r>
           </w:p>
         </w:tc>
@@ -2944,7 +2946,7 @@
               <w:rPr>
                 <w:sz w:val="18"/>
               </w:rPr>
-              <w:t>Gastro-Pacht (10 €/m²)</w:t>
+              <w:t>WE 8</w:t>
             </w:r>
           </w:p>
         </w:tc>
@@ -2962,7 +2964,7 @@
               <w:rPr>
                 <w:sz w:val="18"/>
               </w:rPr>
-              <w:t>EG</w:t>
+              <w:t>Staffel</w:t>
             </w:r>
           </w:p>
         </w:tc>
@@ -2981,7 +2983,7 @@
               <w:rPr>
                 <w:sz w:val="18"/>
               </w:rPr>
-              <w:t>510,0 m²</w:t>
+              <w:t>66,8 m²</w:t>
             </w:r>
           </w:p>
         </w:tc>
@@ -3000,7 +3002,7 @@
               <w:rPr>
                 <w:sz w:val="18"/>
               </w:rPr>
-              <w:t>10,00 €</w:t>
+              <w:t>11,18 €</w:t>
             </w:r>
           </w:p>
         </w:tc>
@@ -3019,7 +3021,7 @@
               <w:rPr>
                 <w:sz w:val="18"/>
               </w:rPr>
-              <w:t>5.100 €</w:t>
+              <w:t>747 €</w:t>
             </w:r>
           </w:p>
         </w:tc>
@@ -3038,7 +3040,7 @@
               <w:rPr>
                 <w:sz w:val="18"/>
               </w:rPr>
-              <w:t>61.200 €</w:t>
+              <w:t>8.959 €</w:t>
             </w:r>
           </w:p>
         </w:tc>
@@ -3063,7 +3065,7 @@
                 <w:b/>
                 <w:sz w:val="18"/>
               </w:rPr>
-              <w:t>Büro 1 (Ankermieter)</w:t>
+              <w:t>Summe Wohnen</w:t>
             </w:r>
           </w:p>
         </w:tc>
@@ -3083,7 +3085,6 @@
                 <w:b/>
                 <w:sz w:val="18"/>
               </w:rPr>
-              <w:t>1. OG</w:t>
             </w:r>
           </w:p>
         </w:tc>
@@ -3104,7 +3105,7 @@
                 <w:b/>
                 <w:sz w:val="18"/>
               </w:rPr>
-              <w:t>100,0 m²</w:t>
+              <w:t>655,0 m²</w:t>
             </w:r>
           </w:p>
         </w:tc>
@@ -3125,7 +3126,6 @@
                 <w:b/>
                 <w:sz w:val="18"/>
               </w:rPr>
-              <w:t>9,50 €</w:t>
             </w:r>
           </w:p>
         </w:tc>
@@ -3146,7 +3146,7 @@
                 <w:b/>
                 <w:sz w:val="18"/>
               </w:rPr>
-              <w:t>950 €</w:t>
+              <w:t>7.321 €</w:t>
             </w:r>
           </w:p>
         </w:tc>
@@ -3167,7 +3167,7 @@
                 <w:b/>
                 <w:sz w:val="18"/>
               </w:rPr>
-              <w:t>11.400 €</w:t>
+              <w:t>87.847 €</w:t>
             </w:r>
           </w:p>
         </w:tc>
@@ -3190,7 +3190,7 @@
               <w:rPr>
                 <w:sz w:val="18"/>
               </w:rPr>
-              <w:t>Büro 2 (Ankermieter)</w:t>
+              <w:t>Gastro-Pacht (10 €/m²)</w:t>
             </w:r>
           </w:p>
         </w:tc>
@@ -3208,7 +3208,7 @@
               <w:rPr>
                 <w:sz w:val="18"/>
               </w:rPr>
-              <w:t>1. OG</w:t>
+              <w:t>EG</w:t>
             </w:r>
           </w:p>
         </w:tc>
@@ -3227,7 +3227,7 @@
               <w:rPr>
                 <w:sz w:val="18"/>
               </w:rPr>
-              <w:t>65,0 m²</w:t>
+              <w:t>510,0 m²</w:t>
             </w:r>
           </w:p>
         </w:tc>
@@ -3265,7 +3265,7 @@
               <w:rPr>
                 <w:sz w:val="18"/>
               </w:rPr>
-              <w:t>650 €</w:t>
+              <w:t>5.100 €</w:t>
             </w:r>
           </w:p>
         </w:tc>
@@ -3284,7 +3284,7 @@
               <w:rPr>
                 <w:sz w:val="18"/>
               </w:rPr>
-              <w:t>7.800 €</w:t>
+              <w:t>61.200 €</w:t>
             </w:r>
           </w:p>
         </w:tc>
@@ -3299,11 +3299,247 @@
           </w:tcPr>
           <w:p>
             <w:pPr>
-              <w:spacing w:after="20" w:before="20"/>
-            </w:pPr>
-            <w:r/>
-            <w:r>
-              <w:rPr>
+              <w:keepNext/>
+              <w:spacing w:after="20" w:before="20"/>
+            </w:pPr>
+            <w:r/>
+            <w:r>
+              <w:rPr>
+                <w:sz w:val="18"/>
+              </w:rPr>
+              <w:t>Büro 1 (Ankermieter)</w:t>
+            </w:r>
+          </w:p>
+        </w:tc>
+        <w:tc>
+          <w:tcPr>
+            <w:tcW w:type="dxa" w:w="1134"/>
+          </w:tcPr>
+          <w:p>
+            <w:pPr>
+              <w:keepNext/>
+              <w:spacing w:after="20" w:before="20"/>
+            </w:pPr>
+            <w:r/>
+            <w:r>
+              <w:rPr>
+                <w:sz w:val="18"/>
+              </w:rPr>
+              <w:t>1. OG</w:t>
+            </w:r>
+          </w:p>
+        </w:tc>
+        <w:tc>
+          <w:tcPr>
+            <w:tcW w:type="dxa" w:w="1361"/>
+          </w:tcPr>
+          <w:p>
+            <w:pPr>
+              <w:keepNext/>
+              <w:spacing w:after="20" w:before="20"/>
+              <w:jc w:val="right"/>
+            </w:pPr>
+            <w:r/>
+            <w:r>
+              <w:rPr>
+                <w:sz w:val="18"/>
+              </w:rPr>
+              <w:t>100,0 m²</w:t>
+            </w:r>
+          </w:p>
+        </w:tc>
+        <w:tc>
+          <w:tcPr>
+            <w:tcW w:type="dxa" w:w="1361"/>
+          </w:tcPr>
+          <w:p>
+            <w:pPr>
+              <w:keepNext/>
+              <w:spacing w:after="20" w:before="20"/>
+              <w:jc w:val="right"/>
+            </w:pPr>
+            <w:r/>
+            <w:r>
+              <w:rPr>
+                <w:sz w:val="18"/>
+              </w:rPr>
+              <w:t>9,50 €</w:t>
+            </w:r>
+          </w:p>
+        </w:tc>
+        <w:tc>
+          <w:tcPr>
+            <w:tcW w:type="dxa" w:w="1814"/>
+          </w:tcPr>
+          <w:p>
+            <w:pPr>
+              <w:keepNext/>
+              <w:spacing w:after="20" w:before="20"/>
+              <w:jc w:val="right"/>
+            </w:pPr>
+            <w:r/>
+            <w:r>
+              <w:rPr>
+                <w:sz w:val="18"/>
+              </w:rPr>
+              <w:t>950 €</w:t>
+            </w:r>
+          </w:p>
+        </w:tc>
+        <w:tc>
+          <w:tcPr>
+            <w:tcW w:type="dxa" w:w="1701"/>
+          </w:tcPr>
+          <w:p>
+            <w:pPr>
+              <w:keepNext/>
+              <w:spacing w:after="20" w:before="20"/>
+              <w:jc w:val="right"/>
+            </w:pPr>
+            <w:r/>
+            <w:r>
+              <w:rPr>
+                <w:sz w:val="18"/>
+              </w:rPr>
+              <w:t>11.400 €</w:t>
+            </w:r>
+          </w:p>
+        </w:tc>
+      </w:tr>
+      <w:tr>
+        <w:trPr>
+          <w:cantSplit/>
+        </w:trPr>
+        <w:tc>
+          <w:tcPr>
+            <w:tcW w:type="dxa" w:w="2041"/>
+          </w:tcPr>
+          <w:p>
+            <w:pPr>
+              <w:keepNext/>
+              <w:spacing w:after="20" w:before="20"/>
+            </w:pPr>
+            <w:r/>
+            <w:r>
+              <w:rPr>
+                <w:sz w:val="18"/>
+              </w:rPr>
+              <w:t>Büro 2 (Ankermieter)</w:t>
+            </w:r>
+          </w:p>
+        </w:tc>
+        <w:tc>
+          <w:tcPr>
+            <w:tcW w:type="dxa" w:w="1134"/>
+          </w:tcPr>
+          <w:p>
+            <w:pPr>
+              <w:keepNext/>
+              <w:spacing w:after="20" w:before="20"/>
+            </w:pPr>
+            <w:r/>
+            <w:r>
+              <w:rPr>
+                <w:sz w:val="18"/>
+              </w:rPr>
+              <w:t>1. OG</w:t>
+            </w:r>
+          </w:p>
+        </w:tc>
+        <w:tc>
+          <w:tcPr>
+            <w:tcW w:type="dxa" w:w="1361"/>
+          </w:tcPr>
+          <w:p>
+            <w:pPr>
+              <w:keepNext/>
+              <w:spacing w:after="20" w:before="20"/>
+              <w:jc w:val="right"/>
+            </w:pPr>
+            <w:r/>
+            <w:r>
+              <w:rPr>
+                <w:sz w:val="18"/>
+              </w:rPr>
+              <w:t>65,0 m²</w:t>
+            </w:r>
+          </w:p>
+        </w:tc>
+        <w:tc>
+          <w:tcPr>
+            <w:tcW w:type="dxa" w:w="1361"/>
+          </w:tcPr>
+          <w:p>
+            <w:pPr>
+              <w:keepNext/>
+              <w:spacing w:after="20" w:before="20"/>
+              <w:jc w:val="right"/>
+            </w:pPr>
+            <w:r/>
+            <w:r>
+              <w:rPr>
+                <w:sz w:val="18"/>
+              </w:rPr>
+              <w:t>10,00 €</w:t>
+            </w:r>
+          </w:p>
+        </w:tc>
+        <w:tc>
+          <w:tcPr>
+            <w:tcW w:type="dxa" w:w="1814"/>
+          </w:tcPr>
+          <w:p>
+            <w:pPr>
+              <w:keepNext/>
+              <w:spacing w:after="20" w:before="20"/>
+              <w:jc w:val="right"/>
+            </w:pPr>
+            <w:r/>
+            <w:r>
+              <w:rPr>
+                <w:sz w:val="18"/>
+              </w:rPr>
+              <w:t>650 €</w:t>
+            </w:r>
+          </w:p>
+        </w:tc>
+        <w:tc>
+          <w:tcPr>
+            <w:tcW w:type="dxa" w:w="1701"/>
+          </w:tcPr>
+          <w:p>
+            <w:pPr>
+              <w:keepNext/>
+              <w:spacing w:after="20" w:before="20"/>
+              <w:jc w:val="right"/>
+            </w:pPr>
+            <w:r/>
+            <w:r>
+              <w:rPr>
+                <w:sz w:val="18"/>
+              </w:rPr>
+              <w:t>7.800 €</w:t>
+            </w:r>
+          </w:p>
+        </w:tc>
+      </w:tr>
+      <w:tr>
+        <w:trPr>
+          <w:cantSplit/>
+        </w:trPr>
+        <w:tc>
+          <w:tcPr>
+            <w:tcW w:type="dxa" w:w="2041"/>
+            <w:shd w:val="clear" w:color="auto" w:fill="E3E8E5"/>
+          </w:tcPr>
+          <w:p>
+            <w:pPr>
+              <w:spacing w:after="20" w:before="20"/>
+            </w:pPr>
+            <w:r/>
+            <w:r>
+              <w:rPr>
+                <w:b/>
                 <w:sz w:val="18"/>
               </w:rPr>
               <w:t>Rohertrag gesamt</w:t>
@@ -3313,14 +3549,16 @@
         <w:tc>
           <w:tcPr>
             <w:tcW w:type="dxa" w:w="1134"/>
-          </w:tcPr>
-          <w:p>
-            <w:pPr>
-              <w:spacing w:after="20" w:before="20"/>
-            </w:pPr>
-            <w:r/>
-            <w:r>
-              <w:rPr>
+            <w:shd w:val="clear" w:color="auto" w:fill="E3E8E5"/>
+          </w:tcPr>
+          <w:p>
+            <w:pPr>
+              <w:spacing w:after="20" w:before="20"/>
+            </w:pPr>
+            <w:r/>
+            <w:r>
+              <w:rPr>
+                <w:b/>
                 <w:sz w:val="18"/>
               </w:rPr>
             </w:r>
@@ -3329,6 +3567,7 @@
         <w:tc>
           <w:tcPr>
             <w:tcW w:type="dxa" w:w="1361"/>
+            <w:shd w:val="clear" w:color="auto" w:fill="E3E8E5"/>
           </w:tcPr>
           <w:p>
             <w:pPr>
@@ -3338,6 +3577,7 @@
             <w:r/>
             <w:r>
               <w:rPr>
+                <w:b/>
                 <w:sz w:val="18"/>
               </w:rPr>
             </w:r>
@@ -3346,6 +3586,7 @@
         <w:tc>
           <w:tcPr>
             <w:tcW w:type="dxa" w:w="1361"/>
+            <w:shd w:val="clear" w:color="auto" w:fill="E3E8E5"/>
           </w:tcPr>
           <w:p>
             <w:pPr>
@@ -3355,6 +3596,7 @@
             <w:r/>
             <w:r>
               <w:rPr>
+                <w:b/>
                 <w:sz w:val="18"/>
               </w:rPr>
             </w:r>
@@ -3363,6 +3605,7 @@
         <w:tc>
           <w:tcPr>
             <w:tcW w:type="dxa" w:w="1814"/>
+            <w:shd w:val="clear" w:color="auto" w:fill="E3E8E5"/>
           </w:tcPr>
           <w:p>
             <w:pPr>
@@ -3372,6 +3615,7 @@
             <w:r/>
             <w:r>
               <w:rPr>
+                <w:b/>
                 <w:sz w:val="18"/>
               </w:rPr>
               <w:t>14.021 €</w:t>
@@ -3381,6 +3625,7 @@
         <w:tc>
           <w:tcPr>
             <w:tcW w:type="dxa" w:w="1701"/>
+            <w:shd w:val="clear" w:color="auto" w:fill="E3E8E5"/>
           </w:tcPr>
           <w:p>
             <w:pPr>
@@ -3390,6 +3635,7 @@
             <w:r/>
             <w:r>
               <w:rPr>
+                <w:b/>
                 <w:sz w:val="18"/>
               </w:rPr>
               <w:t>168.247 €</w:t>
@@ -4512,7 +4758,7 @@
         <w:spacing w:after="60"/>
       </w:pPr>
       <w:r>
-        <w:t>Sie decken 8 % des Kapitaldienstes. Zusammen mit den Wohnungen decken die langfristigen Mieten 44 %, den Rest tragen Pacht und Gastro-Gewinn.</w:t>
+        <w:t>Sie decken 8 % des Kapitaldienstes. Zusammen mit den Wohnungen decken die langfristigen Mieten 45 %, den Rest tragen Pacht und Gastro-Gewinn.</w:t>
       </w:r>
     </w:p>
     <w:p>
@@ -5558,7 +5804,7 @@
               <w:rPr>
                 <w:sz w:val="18"/>
               </w:rPr>
-              <w:t>74,8 %</w:t>
+              <w:t>74,9 %</w:t>
             </w:r>
           </w:p>
         </w:tc>
@@ -6013,7 +6259,7 @@
               <w:rPr>
                 <w:sz w:val="18"/>
               </w:rPr>
-              <w:t>297.196 €</w:t>
+              <w:t>289.674 €</w:t>
             </w:r>
           </w:p>
         </w:tc>
@@ -6032,7 +6278,7 @@
               <w:rPr>
                 <w:sz w:val="18"/>
               </w:rPr>
-              <w:t>6,1 %</w:t>
+              <w:t>6,0 %</w:t>
             </w:r>
           </w:p>
         </w:tc>
@@ -6094,7 +6340,7 @@
                 <w:b/>
                 <w:sz w:val="18"/>
               </w:rPr>
-              <w:t>4.853.028 €</w:t>
+              <w:t>4.845.506 €</w:t>
             </w:r>
           </w:p>
         </w:tc>
@@ -6133,7 +6379,7 @@
           <w:color w:val="5B6770"/>
           <w:sz w:val="18"/>
         </w:rPr>
-        <w:t>Das entspricht 2.941 € je m² BGF. Baukosten von 2.200 €/m² (Bekanntenpreis des Bauherrn) und die Baunebenkosten sind durch Angebote von Bauunternehmen und Zimmerei zu belegen. QNG steht für das Qualitätssiegel Nachhaltiges Gebäude.</w:t>
+        <w:t>Das entspricht 2.937 € je m² BGF. Baukosten von 2.200 €/m² (Bekanntenpreis des Bauherrn) und die Baunebenkosten sind durch Angebote von Bauunternehmen und Zimmerei zu belegen. QNG steht für das Qualitätssiegel Nachhaltiges Gebäude.</w:t>
       </w:r>
     </w:p>
     <w:p>
@@ -6458,7 +6704,7 @@
               <w:rPr>
                 <w:sz w:val="18"/>
               </w:rPr>
-              <w:t>900.000 €</w:t>
+              <w:t>1.200.000 €</w:t>
             </w:r>
           </w:p>
         </w:tc>
@@ -6652,7 +6898,7 @@
               <w:rPr>
                 <w:sz w:val="18"/>
               </w:rPr>
-              <w:t>2.805.528 €</w:t>
+              <w:t>2.498.006 €</w:t>
             </w:r>
           </w:p>
         </w:tc>
@@ -6751,7 +6997,7 @@
                 <w:b/>
                 <w:sz w:val="18"/>
               </w:rPr>
-              <w:t>4.853.028 €</w:t>
+              <w:t>4.845.506 €</w:t>
             </w:r>
           </w:p>
         </w:tc>
@@ -6771,7 +7017,7 @@
                 <w:b/>
                 <w:sz w:val="18"/>
               </w:rPr>
-              <w:t>3,49 %</w:t>
+              <w:t>3,39 %</w:t>
             </w:r>
           </w:p>
         </w:tc>
@@ -6828,7 +7074,7 @@
         <w:spacing w:after="60"/>
       </w:pPr>
       <w:r>
-        <w:t>Wohnteil (297/298) und Gastro (299) werden bei gemischter Nutzung getrennt gefördert. Das Programm 297 gilt für selbst genutzte Wohnungen, 298 für vermietete, die Konditionen sind gleich. Im Rechenmodell sind alle 6 Wohnungen vermietet (298), eine Selbstnutzung lässt sich im Blatt Annahmen einstellen.</w:t>
+        <w:t>Wohnteil (297/298) und Gastro (299) werden bei gemischter Nutzung getrennt gefördert. Das Programm 297 gilt für selbst genutzte Wohnungen, 298 für vermietete, die Konditionen sind gleich. Im Rechenmodell sind alle 8 Wohnungen vermietet (298), eine Selbstnutzung lässt sich im Blatt Annahmen einstellen.</w:t>
       </w:r>
     </w:p>
     <w:p>
@@ -6859,7 +7105,7 @@
           <w:b w:val="0"/>
           <w:i w:val="0"/>
         </w:rPr>
-        <w:t>Das Grundstück wird zu Beginn bezahlt, die Baukosten fließen über 15 Monate. Danach folgen 12 Monate tilgungsfreie Anlaufzeit, in der nur Zinsen anfallen und von der Hausbank mitfinanziert werden (mit der Bank zu verhandeln). Zinsen und Bereitstellungsgebühr (3 % p. a. ab Monat 7 auf die noch nicht abgerufene Bausumme) betragen in dieser Zeit 297.196 €. Zu Beginn der Rückzahlung stehen 4.853.028 € Darlehen.</w:t>
+        <w:t>Das Grundstück wird zu Beginn bezahlt, die Baukosten fließen über 15 Monate. Danach folgen 12 Monate tilgungsfreie Anlaufzeit, in der nur Zinsen anfallen und von der Hausbank mitfinanziert werden (mit der Bank zu verhandeln). Zinsen und Bereitstellungsgebühr (3 % p. a. ab Monat 7 auf die noch nicht abgerufene Bausumme) betragen in dieser Zeit 289.674 €. Zu Beginn der Rückzahlung stehen 4.845.506 € Darlehen.</w:t>
       </w:r>
     </w:p>
     <w:p>
@@ -7076,7 +7322,7 @@
               <w:rPr>
                 <w:sz w:val="18"/>
               </w:rPr>
-              <w:t>900.000 €</w:t>
+              <w:t>1.200.000 €</w:t>
             </w:r>
           </w:p>
         </w:tc>
@@ -7133,7 +7379,7 @@
               <w:rPr>
                 <w:sz w:val="18"/>
               </w:rPr>
-              <w:t>2.625 €</w:t>
+              <w:t>3.500 €</w:t>
             </w:r>
           </w:p>
         </w:tc>
@@ -7152,7 +7398,7 @@
               <w:rPr>
                 <w:sz w:val="18"/>
               </w:rPr>
-              <w:t>31.500 €</w:t>
+              <w:t>42.000 €</w:t>
             </w:r>
           </w:p>
         </w:tc>
@@ -7312,7 +7558,7 @@
               <w:rPr>
                 <w:sz w:val="18"/>
               </w:rPr>
-              <w:t>2.805.528 €</w:t>
+              <w:t>2.498.006 €</w:t>
             </w:r>
           </w:p>
         </w:tc>
@@ -7369,7 +7615,7 @@
               <w:rPr>
                 <w:sz w:val="18"/>
               </w:rPr>
-              <w:t>11.690 €</w:t>
+              <w:t>10.408 €</w:t>
             </w:r>
           </w:p>
         </w:tc>
@@ -7388,7 +7634,7 @@
               <w:rPr>
                 <w:sz w:val="18"/>
               </w:rPr>
-              <w:t>140.276 €</w:t>
+              <w:t>124.900 €</w:t>
             </w:r>
           </w:p>
         </w:tc>
@@ -7432,7 +7678,7 @@
                 <w:b/>
                 <w:sz w:val="18"/>
               </w:rPr>
-              <w:t>4.853.028 €</w:t>
+              <w:t>4.845.506 €</w:t>
             </w:r>
           </w:p>
         </w:tc>
@@ -7452,7 +7698,7 @@
                 <w:b/>
                 <w:sz w:val="18"/>
               </w:rPr>
-              <w:t>3,49 %</w:t>
+              <w:t>3,39 %</w:t>
             </w:r>
           </w:p>
         </w:tc>
@@ -7491,7 +7737,7 @@
                 <w:b/>
                 <w:sz w:val="18"/>
               </w:rPr>
-              <w:t>18.140 €</w:t>
+              <w:t>17.733 €</w:t>
             </w:r>
           </w:p>
         </w:tc>
@@ -7511,7 +7757,7 @@
                 <w:b/>
                 <w:sz w:val="18"/>
               </w:rPr>
-              <w:t>217.676 €</w:t>
+              <w:t>212.800 €</w:t>
             </w:r>
           </w:p>
         </w:tc>
@@ -7696,7 +7942,7 @@
               <w:rPr>
                 <w:sz w:val="18"/>
               </w:rPr>
-              <w:t>168.363 €</w:t>
+              <w:t>163.585 €</w:t>
             </w:r>
           </w:p>
         </w:tc>
@@ -7715,7 +7961,7 @@
               <w:rPr>
                 <w:sz w:val="18"/>
               </w:rPr>
-              <w:t>49.313 €</w:t>
+              <w:t>49.216 €</w:t>
             </w:r>
           </w:p>
         </w:tc>
@@ -7734,7 +7980,7 @@
               <w:rPr>
                 <w:sz w:val="18"/>
               </w:rPr>
-              <w:t>217.676 €</w:t>
+              <w:t>212.800 €</w:t>
             </w:r>
           </w:p>
         </w:tc>
@@ -7753,7 +7999,7 @@
               <w:rPr>
                 <w:sz w:val="18"/>
               </w:rPr>
-              <w:t>4.803.715 €</w:t>
+              <w:t>4.796.290 €</w:t>
             </w:r>
           </w:p>
         </w:tc>
@@ -7795,7 +8041,7 @@
               <w:rPr>
                 <w:sz w:val="18"/>
               </w:rPr>
-              <w:t>166.615 €</w:t>
+              <w:t>161.887 €</w:t>
             </w:r>
           </w:p>
         </w:tc>
@@ -7814,7 +8060,7 @@
               <w:rPr>
                 <w:sz w:val="18"/>
               </w:rPr>
-              <w:t>51.062 €</w:t>
+              <w:t>50.913 €</w:t>
             </w:r>
           </w:p>
         </w:tc>
@@ -7833,7 +8079,7 @@
               <w:rPr>
                 <w:sz w:val="18"/>
               </w:rPr>
-              <w:t>217.676 €</w:t>
+              <w:t>212.800 €</w:t>
             </w:r>
           </w:p>
         </w:tc>
@@ -7852,7 +8098,7 @@
               <w:rPr>
                 <w:sz w:val="18"/>
               </w:rPr>
-              <w:t>4.752.653 €</w:t>
+              <w:t>4.745.377 €</w:t>
             </w:r>
           </w:p>
         </w:tc>
@@ -7894,7 +8140,7 @@
               <w:rPr>
                 <w:sz w:val="18"/>
               </w:rPr>
-              <w:t>164.802 €</w:t>
+              <w:t>160.129 €</w:t>
             </w:r>
           </w:p>
         </w:tc>
@@ -7913,7 +8159,7 @@
               <w:rPr>
                 <w:sz w:val="18"/>
               </w:rPr>
-              <w:t>52.874 €</w:t>
+              <w:t>52.671 €</w:t>
             </w:r>
           </w:p>
         </w:tc>
@@ -7932,7 +8178,7 @@
               <w:rPr>
                 <w:sz w:val="18"/>
               </w:rPr>
-              <w:t>217.676 €</w:t>
+              <w:t>212.800 €</w:t>
             </w:r>
           </w:p>
         </w:tc>
@@ -7951,7 +8197,7 @@
               <w:rPr>
                 <w:sz w:val="18"/>
               </w:rPr>
-              <w:t>4.699.779 €</w:t>
+              <w:t>4.692.706 €</w:t>
             </w:r>
           </w:p>
         </w:tc>
@@ -7993,7 +8239,7 @@
               <w:rPr>
                 <w:sz w:val="18"/>
               </w:rPr>
-              <w:t>160.976 €</w:t>
+              <w:t>156.421 €</w:t>
             </w:r>
           </w:p>
         </w:tc>
@@ -8012,7 +8258,7 @@
               <w:rPr>
                 <w:sz w:val="18"/>
               </w:rPr>
-              <w:t>56.700 €</w:t>
+              <w:t>56.379 €</w:t>
             </w:r>
           </w:p>
         </w:tc>
@@ -8031,7 +8277,7 @@
               <w:rPr>
                 <w:sz w:val="18"/>
               </w:rPr>
-              <w:t>217.676 €</w:t>
+              <w:t>212.800 €</w:t>
             </w:r>
           </w:p>
         </w:tc>
@@ -8050,7 +8296,7 @@
               <w:rPr>
                 <w:sz w:val="18"/>
               </w:rPr>
-              <w:t>4.588.326 €</w:t>
+              <w:t>4.581.834 €</w:t>
             </w:r>
           </w:p>
         </w:tc>
@@ -8096,7 +8342,7 @@
                 <w:b/>
                 <w:sz w:val="18"/>
               </w:rPr>
-              <w:t>150.110 €</w:t>
+              <w:t>145.921 €</w:t>
             </w:r>
           </w:p>
         </w:tc>
@@ -8117,7 +8363,7 @@
                 <w:b/>
                 <w:sz w:val="18"/>
               </w:rPr>
-              <w:t>67.567 €</w:t>
+              <w:t>66.879 €</w:t>
             </w:r>
           </w:p>
         </w:tc>
@@ -8138,7 +8384,7 @@
                 <w:b/>
                 <w:sz w:val="18"/>
               </w:rPr>
-              <w:t>217.676 €</w:t>
+              <w:t>212.800 €</w:t>
             </w:r>
           </w:p>
         </w:tc>
@@ -8159,7 +8405,7 @@
                 <w:b/>
                 <w:sz w:val="18"/>
               </w:rPr>
-              <w:t>4.273.010 €</w:t>
+              <w:t>4.269.180 €</w:t>
             </w:r>
           </w:p>
         </w:tc>
@@ -8201,7 +8447,7 @@
               <w:rPr>
                 <w:sz w:val="18"/>
               </w:rPr>
-              <w:t>137.085 €</w:t>
+              <w:t>133.383 €</w:t>
             </w:r>
           </w:p>
         </w:tc>
@@ -8220,7 +8466,7 @@
               <w:rPr>
                 <w:sz w:val="18"/>
               </w:rPr>
-              <w:t>80.591 €</w:t>
+              <w:t>79.418 €</w:t>
             </w:r>
           </w:p>
         </w:tc>
@@ -8239,7 +8485,7 @@
               <w:rPr>
                 <w:sz w:val="18"/>
               </w:rPr>
-              <w:t>217.676 €</w:t>
+              <w:t>212.800 €</w:t>
             </w:r>
           </w:p>
         </w:tc>
@@ -8258,7 +8504,7 @@
               <w:rPr>
                 <w:sz w:val="18"/>
               </w:rPr>
-              <w:t>3.897.048 €</w:t>
+              <w:t>3.898.060 €</w:t>
             </w:r>
           </w:p>
         </w:tc>
@@ -8300,7 +8546,7 @@
               <w:rPr>
                 <w:sz w:val="18"/>
               </w:rPr>
-              <w:t>121.462 €</w:t>
+              <w:t>118.398 €</w:t>
             </w:r>
           </w:p>
         </w:tc>
@@ -8319,7 +8565,7 @@
               <w:rPr>
                 <w:sz w:val="18"/>
               </w:rPr>
-              <w:t>96.214 €</w:t>
+              <w:t>94.403 €</w:t>
             </w:r>
           </w:p>
         </w:tc>
@@ -8338,7 +8584,7 @@
               <w:rPr>
                 <w:sz w:val="18"/>
               </w:rPr>
-              <w:t>217.676 €</w:t>
+              <w:t>212.800 €</w:t>
             </w:r>
           </w:p>
         </w:tc>
@@ -8357,7 +8603,7 @@
               <w:rPr>
                 <w:sz w:val="18"/>
               </w:rPr>
-              <w:t>3.448.361 €</w:t>
+              <w:t>3.457.088 €</w:t>
             </w:r>
           </w:p>
         </w:tc>
@@ -8399,7 +8645,7 @@
               <w:rPr>
                 <w:sz w:val="18"/>
               </w:rPr>
-              <w:t>102.707 €</w:t>
+              <w:t>100.473 €</w:t>
             </w:r>
           </w:p>
         </w:tc>
@@ -8418,7 +8664,7 @@
               <w:rPr>
                 <w:sz w:val="18"/>
               </w:rPr>
-              <w:t>114.969 €</w:t>
+              <w:t>112.328 €</w:t>
             </w:r>
           </w:p>
         </w:tc>
@@ -8437,7 +8683,7 @@
               <w:rPr>
                 <w:sz w:val="18"/>
               </w:rPr>
-              <w:t>217.676 €</w:t>
+              <w:t>212.800 €</w:t>
             </w:r>
           </w:p>
         </w:tc>
@@ -8456,7 +8702,7 @@
               <w:rPr>
                 <w:sz w:val="18"/>
               </w:rPr>
-              <w:t>2.912.398 €</w:t>
+              <w:t>2.932.587 €</w:t>
             </w:r>
           </w:p>
         </w:tc>
@@ -8498,7 +8744,7 @@
               <w:rPr>
                 <w:sz w:val="18"/>
               </w:rPr>
-              <w:t>80.176 €</w:t>
+              <w:t>79.012 €</w:t>
             </w:r>
           </w:p>
         </w:tc>
@@ -8517,7 +8763,7 @@
               <w:rPr>
                 <w:sz w:val="18"/>
               </w:rPr>
-              <w:t>137.500 €</w:t>
+              <w:t>133.789 €</w:t>
             </w:r>
           </w:p>
         </w:tc>
@@ -8536,7 +8782,7 @@
               <w:rPr>
                 <w:sz w:val="18"/>
               </w:rPr>
-              <w:t>217.676 €</w:t>
+              <w:t>212.800 €</w:t>
             </w:r>
           </w:p>
         </w:tc>
@@ -8555,7 +8801,7 @@
               <w:rPr>
                 <w:sz w:val="18"/>
               </w:rPr>
-              <w:t>2.271.614 €</w:t>
+              <w:t>2.308.113 €</w:t>
             </w:r>
           </w:p>
         </w:tc>
@@ -8595,7 +8841,7 @@
               <w:rPr>
                 <w:sz w:val="18"/>
               </w:rPr>
-              <w:t>53.089 €</w:t>
+              <w:t>53.296 €</w:t>
             </w:r>
           </w:p>
         </w:tc>
@@ -8613,7 +8859,7 @@
               <w:rPr>
                 <w:sz w:val="18"/>
               </w:rPr>
-              <w:t>164.587 €</w:t>
+              <w:t>159.505 €</w:t>
             </w:r>
           </w:p>
         </w:tc>
@@ -8631,7 +8877,7 @@
               <w:rPr>
                 <w:sz w:val="18"/>
               </w:rPr>
-              <w:t>217.676 €</w:t>
+              <w:t>212.800 €</w:t>
             </w:r>
           </w:p>
         </w:tc>
@@ -8649,7 +8895,7 @@
               <w:rPr>
                 <w:sz w:val="18"/>
               </w:rPr>
-              <w:t>1.504.850 €</w:t>
+              <w:t>1.563.885 €</w:t>
             </w:r>
           </w:p>
         </w:tc>
@@ -8669,7 +8915,7 @@
           <w:b w:val="0"/>
           <w:i w:val="0"/>
         </w:rPr>
-        <w:t>Nach 10 Jahren beträgt die Restschuld 4.273.010 €. Die Anschlussfinanzierung ist eingeplant, ein Zinsanstieg um einen Prozentpunkt auf die Restschuld kostet ca. 3.561 € pro Monat mehr. Die Bank kann eine höhere Tilgung verlangen, im Modell ist sie einstellbar.</w:t>
+        <w:t>Nach 10 Jahren beträgt die Restschuld 4.269.180 €. Die Anschlussfinanzierung ist eingeplant, ein Zinsanstieg um einen Prozentpunkt auf die Restschuld kostet ca. 3.558 € pro Monat mehr. Die Bank kann eine höhere Tilgung verlangen, im Modell ist sie einstellbar.</w:t>
       </w:r>
     </w:p>
     <w:p>
@@ -8789,7 +9035,7 @@
               <w:rPr>
                 <w:sz w:val="18"/>
               </w:rPr>
-              <w:t>Kaltmiete Wohnen (6 Wohnungen)</w:t>
+              <w:t>Kaltmiete Wohnen (8 Wohnungen)</w:t>
             </w:r>
           </w:p>
         </w:tc>
@@ -9247,7 +9493,7 @@
               <w:rPr>
                 <w:sz w:val="18"/>
               </w:rPr>
-              <w:t>−18.140 €</w:t>
+              <w:t>−17.733 €</w:t>
             </w:r>
           </w:p>
         </w:tc>
@@ -9266,7 +9512,7 @@
               <w:rPr>
                 <w:sz w:val="18"/>
               </w:rPr>
-              <w:t>−217.676 €</w:t>
+              <w:t>−212.800 €</w:t>
             </w:r>
           </w:p>
         </w:tc>
@@ -9310,7 +9556,7 @@
                 <w:b/>
                 <w:sz w:val="18"/>
               </w:rPr>
-              <w:t>+9.204 €</w:t>
+              <w:t>+9.610 €</w:t>
             </w:r>
           </w:p>
         </w:tc>
@@ -9330,7 +9576,7 @@
                 <w:b/>
                 <w:sz w:val="18"/>
               </w:rPr>
-              <w:t>+110.446 €</w:t>
+              <w:t>+115.322 €</w:t>
             </w:r>
           </w:p>
         </w:tc>
@@ -9353,7 +9599,7 @@
         <w:t xml:space="preserve">Kapitaldienstdeckung (DSCR): </w:t>
       </w:r>
       <w:r>
-        <w:t>1,51 gesamt, 0,70 nur aus Miete, Büro und Pacht, 0,44 nur aus Wohnen und Büro. Banken verlangen meist mindestens 1,2.</w:t>
+        <w:t>1,54 gesamt, 0,71 nur aus Miete, Büro und Pacht, 0,45 nur aus Wohnen und Büro. Banken verlangen meist mindestens 1,2.</w:t>
       </w:r>
     </w:p>
     <w:p>
@@ -9368,7 +9614,7 @@
         <w:t xml:space="preserve">Zinsdeckung: </w:t>
       </w:r>
       <w:r>
-        <w:t>1,95 (Ertrag vor Kapitaldienst im Verhältnis zu den Zinsen).</w:t>
+        <w:t>2,01 (Ertrag vor Kapitaldienst im Verhältnis zu den Zinsen).</w:t>
       </w:r>
     </w:p>
     <w:p>
@@ -9383,7 +9629,7 @@
         <w:t xml:space="preserve">Anfangsrendite: </w:t>
       </w:r>
       <w:r>
-        <w:t>3,12 % (Nettoertrag der Immobilie auf die Gesamtkosten).</w:t>
+        <w:t>3,13 % (Nettoertrag der Immobilie auf die Gesamtkosten).</w:t>
       </w:r>
     </w:p>
     <w:p>
@@ -9398,7 +9644,7 @@
         <w:t xml:space="preserve">Break-even: </w:t>
       </w:r>
       <w:r>
-        <w:t>Das Haus ist ab ca. 34.800 € Gastro-Umsatz im Monat im Plus, alle Raten sind dann bezahlt.</w:t>
+        <w:t>Das Haus ist ab ca. 33.500 € Gastro-Umsatz im Monat im Plus, alle Raten sind dann bezahlt.</w:t>
       </w:r>
     </w:p>
     <w:p>
@@ -9576,7 +9822,7 @@
               <w:rPr>
                 <w:sz w:val="18"/>
               </w:rPr>
-              <w:t>−22.421 €</w:t>
+              <w:t>−23.141 €</w:t>
             </w:r>
           </w:p>
         </w:tc>
@@ -9622,7 +9868,7 @@
                 <w:b/>
                 <w:sz w:val="18"/>
               </w:rPr>
-              <w:t>145.826 €</w:t>
+              <w:t>145.106 €</w:t>
             </w:r>
           </w:p>
         </w:tc>
@@ -9706,7 +9952,7 @@
               <w:rPr>
                 <w:sz w:val="18"/>
               </w:rPr>
-              <w:t>2.673.663 €</w:t>
+              <w:t>2.656.444 €</w:t>
             </w:r>
           </w:p>
         </w:tc>
@@ -9752,7 +9998,7 @@
                 <w:b/>
                 <w:sz w:val="18"/>
               </w:rPr>
-              <w:t>2.894.463 €</w:t>
+              <w:t>2.877.244 €</w:t>
             </w:r>
           </w:p>
         </w:tc>
@@ -9794,7 +10040,7 @@
               <w:rPr>
                 <w:sz w:val="18"/>
               </w:rPr>
-              <w:t>1.823.964 €</w:t>
+              <w:t>1.806.745 €</w:t>
             </w:r>
           </w:p>
         </w:tc>
@@ -10034,7 +10280,7 @@
               <w:rPr>
                 <w:sz w:val="18"/>
               </w:rPr>
-              <w:t>2.605.017 €</w:t>
+              <w:t>2.589.520 €</w:t>
             </w:r>
           </w:p>
         </w:tc>
@@ -10076,7 +10322,7 @@
               <w:rPr>
                 <w:sz w:val="18"/>
               </w:rPr>
-              <w:t>4.853.028 €</w:t>
+              <w:t>4.845.506 €</w:t>
             </w:r>
           </w:p>
         </w:tc>
@@ -10122,7 +10368,7 @@
                 <w:b/>
                 <w:sz w:val="18"/>
               </w:rPr>
-              <w:t>186 %</w:t>
+              <w:t>187 %</w:t>
             </w:r>
           </w:p>
         </w:tc>
@@ -10164,7 +10410,7 @@
               <w:rPr>
                 <w:sz w:val="18"/>
               </w:rPr>
-              <w:t>−1.958.565 €</w:t>
+              <w:t>−1.968.262 €</w:t>
             </w:r>
           </w:p>
         </w:tc>
@@ -10204,7 +10450,7 @@
               <w:rPr>
                 <w:sz w:val="18"/>
               </w:rPr>
-              <w:t>2.769.015 €</w:t>
+              <w:t>2.773.890 €</w:t>
             </w:r>
           </w:p>
         </w:tc>
@@ -10234,7 +10480,7 @@
           <w:b w:val="0"/>
           <w:i w:val="0"/>
         </w:rPr>
-        <w:t>Die Mieten, Büromieten und die Pacht tragen einen Ertragswert von 2,89 Mio. €, die Kosten liegen bei 4,85 Mio. €. Bei 100 % Fremdfinanzierung ergibt sich ein Beleihungsauslauf von 186 %, Banken beleihen üblicherweise nur bis ca. 80 %. Um das Darlehen darstellen zu können, bietet der Bauherr der Bank zusätzliche Sicherheiten an, etwa Grundschulden auf weitere Immobilien, eine Bürgschaft oder Eigenkapital. Rechnerisch geht es um ca. 2,77 Mio. €. Weitere Hebel sind höhere Mieten durch Vorvermietung, niedrigere Baukosten durch die Angebote der Bekannten-Unternehmen und eine Städtebauförderung (Zuschuss der Stadt, noch offen).</w:t>
+        <w:t>Die Mieten, Büromieten und die Pacht tragen einen Ertragswert von 2,88 Mio. €, die Kosten liegen bei 4,85 Mio. €. Bei 100 % Fremdfinanzierung ergibt sich ein Beleihungsauslauf von 187 %, Banken beleihen üblicherweise nur bis ca. 80 %. Um das Darlehen darstellen zu können, bietet der Bauherr der Bank zusätzliche Sicherheiten an, etwa Grundschulden auf weitere Immobilien, eine Bürgschaft oder Eigenkapital. Rechnerisch geht es um ca. 2,77 Mio. €. Weitere Hebel sind höhere Mieten durch Vorvermietung, niedrigere Baukosten durch die Angebote der Bekannten-Unternehmen und eine Städtebauförderung (Zuschuss der Stadt, noch offen).</w:t>
       </w:r>
     </w:p>
     <w:p>
@@ -10560,7 +10806,7 @@
               <w:rPr>
                 <w:sz w:val="17"/>
               </w:rPr>
-              <w:t>−217.676 €</w:t>
+              <w:t>−212.800 €</w:t>
             </w:r>
           </w:p>
         </w:tc>
@@ -10579,7 +10825,7 @@
               <w:rPr>
                 <w:sz w:val="17"/>
               </w:rPr>
-              <w:t>−217.676 €</w:t>
+              <w:t>−212.800 €</w:t>
             </w:r>
           </w:p>
         </w:tc>
@@ -10598,7 +10844,7 @@
               <w:rPr>
                 <w:sz w:val="17"/>
               </w:rPr>
-              <w:t>−217.676 €</w:t>
+              <w:t>−212.800 €</w:t>
             </w:r>
           </w:p>
         </w:tc>
@@ -10617,7 +10863,7 @@
               <w:rPr>
                 <w:sz w:val="17"/>
               </w:rPr>
-              <w:t>−217.676 €</w:t>
+              <w:t>−212.800 €</w:t>
             </w:r>
           </w:p>
         </w:tc>
@@ -10636,7 +10882,7 @@
               <w:rPr>
                 <w:sz w:val="17"/>
               </w:rPr>
-              <w:t>−217.676 €</w:t>
+              <w:t>−212.800 €</w:t>
             </w:r>
           </w:p>
         </w:tc>
@@ -10682,7 +10928,7 @@
                 <w:b/>
                 <w:sz w:val="17"/>
               </w:rPr>
-              <w:t>110.446 €</w:t>
+              <w:t>115.322 €</w:t>
             </w:r>
           </w:p>
         </w:tc>
@@ -10703,7 +10949,7 @@
                 <w:b/>
                 <w:sz w:val="17"/>
               </w:rPr>
-              <w:t>120.539 €</w:t>
+              <w:t>125.415 €</w:t>
             </w:r>
           </w:p>
         </w:tc>
@@ -10724,7 +10970,7 @@
                 <w:b/>
                 <w:sz w:val="17"/>
               </w:rPr>
-              <w:t>130.945 €</w:t>
+              <w:t>135.821 €</w:t>
             </w:r>
           </w:p>
         </w:tc>
@@ -10745,7 +10991,7 @@
                 <w:b/>
                 <w:sz w:val="17"/>
               </w:rPr>
-              <w:t>141.672 €</w:t>
+              <w:t>146.548 €</w:t>
             </w:r>
           </w:p>
         </w:tc>
@@ -10766,7 +11012,7 @@
                 <w:b/>
                 <w:sz w:val="17"/>
               </w:rPr>
-              <w:t>158.389 €</w:t>
+              <w:t>163.265 €</w:t>
             </w:r>
           </w:p>
         </w:tc>
@@ -10808,7 +11054,7 @@
               <w:rPr>
                 <w:sz w:val="17"/>
               </w:rPr>
-              <w:t>1,51</w:t>
+              <w:t>1,54</w:t>
             </w:r>
           </w:p>
         </w:tc>
@@ -10827,7 +11073,7 @@
               <w:rPr>
                 <w:sz w:val="17"/>
               </w:rPr>
-              <w:t>1,55</w:t>
+              <w:t>1,59</w:t>
             </w:r>
           </w:p>
         </w:tc>
@@ -10846,7 +11092,7 @@
               <w:rPr>
                 <w:sz w:val="17"/>
               </w:rPr>
-              <w:t>1,60</w:t>
+              <w:t>1,64</w:t>
             </w:r>
           </w:p>
         </w:tc>
@@ -10865,7 +11111,7 @@
               <w:rPr>
                 <w:sz w:val="17"/>
               </w:rPr>
-              <w:t>1,65</w:t>
+              <w:t>1,69</w:t>
             </w:r>
           </w:p>
         </w:tc>
@@ -10884,7 +11130,7 @@
               <w:rPr>
                 <w:sz w:val="17"/>
               </w:rPr>
-              <w:t>1,73</w:t>
+              <w:t>1,77</w:t>
             </w:r>
           </w:p>
         </w:tc>
@@ -10924,7 +11170,7 @@
               <w:rPr>
                 <w:sz w:val="17"/>
               </w:rPr>
-              <w:t>4.803.715 €</w:t>
+              <w:t>4.796.290 €</w:t>
             </w:r>
           </w:p>
         </w:tc>
@@ -10942,7 +11188,7 @@
               <w:rPr>
                 <w:sz w:val="17"/>
               </w:rPr>
-              <w:t>4.699.779 €</w:t>
+              <w:t>4.692.706 €</w:t>
             </w:r>
           </w:p>
         </w:tc>
@@ -10960,7 +11206,7 @@
               <w:rPr>
                 <w:sz w:val="17"/>
               </w:rPr>
-              <w:t>4.588.326 €</w:t>
+              <w:t>4.581.834 €</w:t>
             </w:r>
           </w:p>
         </w:tc>
@@ -10978,7 +11224,7 @@
               <w:rPr>
                 <w:sz w:val="17"/>
               </w:rPr>
-              <w:t>4.468.794 €</w:t>
+              <w:t>4.463.143 €</w:t>
             </w:r>
           </w:p>
         </w:tc>
@@ -10996,7 +11242,7 @@
               <w:rPr>
                 <w:sz w:val="17"/>
               </w:rPr>
-              <w:t>4.273.010 €</w:t>
+              <w:t>4.269.180 €</w:t>
             </w:r>
           </w:p>
         </w:tc>
@@ -11015,7 +11261,7 @@
           <w:color w:val="5B6770"/>
           <w:sz w:val="18"/>
         </w:rPr>
-        <w:t>Annahme: Miete, Pacht und Gastro-Umsatz steigen um 1,5 % pro Jahr, Büromieten um 2 % (Indexmiete), der Kapitaldienst bleibt gleich. Die Kapitaldienstdeckung verbessert sich von 1,51 auf 1,73 in Jahr 10.</w:t>
+        <w:t>Annahme: Miete, Pacht und Gastro-Umsatz steigen um 1,5 % pro Jahr, Büromieten um 2 % (Indexmiete), der Kapitaldienst bleibt gleich. Die Kapitaldienstdeckung verbessert sich von 1,54 auf 1,77 in Jahr 10.</w:t>
       </w:r>
     </w:p>
     <w:tbl>
@@ -11173,7 +11419,7 @@
                 <w:b/>
                 <w:sz w:val="18"/>
               </w:rPr>
-              <w:t>+9.204 €</w:t>
+              <w:t>+9.610 €</w:t>
             </w:r>
           </w:p>
         </w:tc>
@@ -11194,7 +11440,7 @@
                 <w:b/>
                 <w:sz w:val="18"/>
               </w:rPr>
-              <w:t>1,51</w:t>
+              <w:t>1,54</w:t>
             </w:r>
           </w:p>
         </w:tc>
@@ -11256,7 +11502,7 @@
               <w:rPr>
                 <w:sz w:val="18"/>
               </w:rPr>
-              <w:t>+5.643 €</w:t>
+              <w:t>+6.053 €</w:t>
             </w:r>
           </w:p>
         </w:tc>
@@ -11275,7 +11521,7 @@
               <w:rPr>
                 <w:sz w:val="18"/>
               </w:rPr>
-              <w:t>1,26</w:t>
+              <w:t>1,28</w:t>
             </w:r>
           </w:p>
         </w:tc>
@@ -11294,7 +11540,7 @@
               <w:rPr>
                 <w:sz w:val="18"/>
               </w:rPr>
-              <w:t>−3.561 €</w:t>
+              <w:t>−3.558 €</w:t>
             </w:r>
           </w:p>
         </w:tc>
@@ -11336,7 +11582,7 @@
               <w:rPr>
                 <w:sz w:val="18"/>
               </w:rPr>
-              <w:t>+8.545 €</w:t>
+              <w:t>+8.951 €</w:t>
             </w:r>
           </w:p>
         </w:tc>
@@ -11355,7 +11601,7 @@
               <w:rPr>
                 <w:sz w:val="18"/>
               </w:rPr>
-              <w:t>1,47</w:t>
+              <w:t>1,50</w:t>
             </w:r>
           </w:p>
         </w:tc>
@@ -11416,7 +11662,7 @@
               <w:rPr>
                 <w:sz w:val="18"/>
               </w:rPr>
-              <w:t>+5.239 €</w:t>
+              <w:t>+5.645 €</w:t>
             </w:r>
           </w:p>
         </w:tc>
@@ -11435,7 +11681,7 @@
               <w:rPr>
                 <w:sz w:val="18"/>
               </w:rPr>
-              <w:t>1,29</w:t>
+              <w:t>1,32</w:t>
             </w:r>
           </w:p>
         </w:tc>
@@ -11496,7 +11742,7 @@
               <w:rPr>
                 <w:sz w:val="18"/>
               </w:rPr>
-              <w:t>+1.274 €</w:t>
+              <w:t>+1.680 €</w:t>
             </w:r>
           </w:p>
         </w:tc>
@@ -11515,7 +11761,7 @@
               <w:rPr>
                 <w:sz w:val="18"/>
               </w:rPr>
-              <w:t>1,07</w:t>
+              <w:t>1,09</w:t>
             </w:r>
           </w:p>
         </w:tc>
@@ -11576,7 +11822,7 @@
               <w:rPr>
                 <w:sz w:val="18"/>
               </w:rPr>
-              <w:t>+7.714 €</w:t>
+              <w:t>+8.152 €</w:t>
             </w:r>
           </w:p>
         </w:tc>
@@ -11595,7 +11841,7 @@
               <w:rPr>
                 <w:sz w:val="18"/>
               </w:rPr>
-              <w:t>1,39</w:t>
+              <w:t>1,42</w:t>
             </w:r>
           </w:p>
         </w:tc>
@@ -11614,7 +11860,7 @@
               <w:rPr>
                 <w:sz w:val="18"/>
               </w:rPr>
-              <w:t>−1.490 €</w:t>
+              <w:t>−1.459 €</w:t>
             </w:r>
           </w:p>
         </w:tc>
@@ -11656,7 +11902,7 @@
               <w:rPr>
                 <w:sz w:val="18"/>
               </w:rPr>
-              <w:t>+8.349 €</w:t>
+              <w:t>+8.755 €</w:t>
             </w:r>
           </w:p>
         </w:tc>
@@ -11675,7 +11921,7 @@
               <w:rPr>
                 <w:sz w:val="18"/>
               </w:rPr>
-              <w:t>1,46</w:t>
+              <w:t>1,49</w:t>
             </w:r>
           </w:p>
         </w:tc>
@@ -11736,7 +11982,7 @@
               <w:rPr>
                 <w:sz w:val="18"/>
               </w:rPr>
-              <w:t>+7.764 €</w:t>
+              <w:t>+8.170 €</w:t>
             </w:r>
           </w:p>
         </w:tc>
@@ -11755,7 +12001,7 @@
               <w:rPr>
                 <w:sz w:val="18"/>
               </w:rPr>
-              <w:t>1,43</w:t>
+              <w:t>1,46</w:t>
             </w:r>
           </w:p>
         </w:tc>
@@ -11814,7 +12060,7 @@
               <w:rPr>
                 <w:sz w:val="18"/>
               </w:rPr>
-              <w:t>−10.111 €</w:t>
+              <w:t>−9.705 €</w:t>
             </w:r>
           </w:p>
         </w:tc>
@@ -11832,7 +12078,7 @@
               <w:rPr>
                 <w:sz w:val="18"/>
               </w:rPr>
-              <w:t>0,44</w:t>
+              <w:t>0,45</w:t>
             </w:r>
           </w:p>
         </w:tc>
@@ -12421,7 +12667,7 @@
           <w:i w:val="0"/>
           <w:color w:val="2F4A3E"/>
         </w:rPr>
-        <w:t>Ergebnis: Kurzzeitvermietung lohnt sich nicht. Auch kleine Apartments bringen nach Möblierung, Kapitaldienst und Kosten weniger als langfristige Mieter. Dazu kommen Aufwand für Gäste und Reinigung und bei mehr als 12 Betten Sonderbau-Brandschutz. Alle 6 Wohnungen bleiben deshalb langfristig vermietet.</w:t>
+        <w:t>Ergebnis: Kurzzeitvermietung lohnt sich nicht. Auch kleine Apartments bringen nach Möblierung, Kapitaldienst und Kosten weniger als langfristige Mieter. Dazu kommen Aufwand für Gäste und Reinigung und bei mehr als 12 Betten Sonderbau-Brandschutz. Alle 8 Wohnungen bleiben deshalb langfristig vermietet.</w:t>
       </w:r>
     </w:p>
     <w:p>
@@ -12557,7 +12803,7 @@
               <w:rPr>
                 <w:sz w:val="17"/>
               </w:rPr>
-              <w:t>Beleihungsauslauf 186 % bei 100 % Fremdfinanzierung</w:t>
+              <w:t>Beleihungsauslauf 187 % bei 100 % Fremdfinanzierung</w:t>
             </w:r>
           </w:p>
         </w:tc>
@@ -12616,7 +12862,7 @@
               <w:rPr>
                 <w:sz w:val="17"/>
               </w:rPr>
-              <w:t>Haus ab ca. 35.000 € Umsatz im Plus; bei Ausfall der Gastro fehlen ca. 19.315 € pro Monat</w:t>
+              <w:t>Haus ab ca. 33.000 € Umsatz im Plus; bei Ausfall der Gastro fehlen ca. 19.315 € pro Monat</w:t>
             </w:r>
           </w:p>
         </w:tc>
@@ -14788,7 +15034,7 @@
           <w:color w:val="5B6770"/>
           <w:sz w:val="18"/>
         </w:rPr>
-        <w:t>Weitere Anlagen: Präsentation (Neue-Mitte-Werlte_Baufeld3_6-Wohnungen_Grosse-Gastro-EG.pptx), Gastro-Konzept (Neue-Mitte-Werlte_Baufeld3_Gastro-Konzept.pptx).</w:t>
+        <w:t>Weitere Anlagen: Präsentation (Neue-Mitte-Werlte_Baufeld3_8-Wohnungen_Grosse-Gastro-EG.pptx), Gastro-Konzept (Neue-Mitte-Werlte_Baufeld3_Gastro-Konzept.pptx).</w:t>
       </w:r>
     </w:p>
     <w:sectPr>

</xml_diff>

<commit_message>
Airbnb-Prüfung: 60-m²-Apartment mit Marktdaten Werlte Q4 2026 (Excel, Präsentation, Businessplan)
Co-Authored-By: Claude Sonnet 5.5 <noreply@anthropic.com>
Claude-Session: https://claude.ai/code/session_01HJGZfxHv7bzYyqdLwg8aFJ
</commit_message>
<xml_diff>
--- a/praesentation/Businessplan_Baufeld3_Neue-Mitte-Werlte.docx
+++ b/praesentation/Businessplan_Baufeld3_Neue-Mitte-Werlte.docx
@@ -969,7 +969,7 @@
         <w:t xml:space="preserve">Airbnb lohnt sich nicht. </w:t>
       </w:r>
       <w:r>
-        <w:t>Zwei Wohnungen als Kurzzeitvermietung bringen weniger als langfristige Mieter, deshalb bleiben alle 8 Wohnungen langfristig vermietet.</w:t>
+        <w:t>Ein 60-m²-Airbnb-Apartment bringt bei der Werlter Auslastung (17 %, Emsland 36 %) deutlich weniger als eine langfristige Miete, deshalb bleiben alle 8 Wohnungen langfristig vermietet.</w:t>
       </w:r>
     </w:p>
     <w:p>
@@ -12124,7 +12124,7 @@
         <w:pStyle w:val="Heading1"/>
       </w:pPr>
       <w:r>
-        <w:t>12  Prüfung: zwei Wohnungen als Airbnb</w:t>
+        <w:t>12  Prüfung: ein 60-m²-Apartment als Airbnb</w:t>
       </w:r>
     </w:p>
     <w:p>
@@ -12133,7 +12133,7 @@
           <w:b w:val="0"/>
           <w:i w:val="0"/>
         </w:rPr>
-        <w:t>Geprüft wurde, ob zwei Wohnungen als Airbnb-Apartments (Kurzzeitvermietung) mehr bringen als langfristige Vermietung. Angesetzt sind eine Auslastung von 50 % (laut Quelle liegt der Emsland-Durchschnitt bei ca. 37 %), Möblierung von 600 €/m² im Kredit, Kosten von 56 % des Umsatzes (Plattform, Reinigung, Nebenkosten, Rücklage) und ein Mindest-Mehrertrag von 300 € pro Monat für den Mehraufwand.</w:t>
+        <w:t>Marktlage Werlte (49757), Stand Q4 2026: Die Beherbergungsbetriebe der Samtgemeinde Werlte (ab 10 Betten) hatten zuletzt eine Auslastung von 17,4 % bei 2,7 Tagen Aufenthalt, der Emsland-Schnitt liegt bei 36,2 % (Emsland Tourismus, Quelle Landesamt für Statistik). Ferienunterkünfte kosten in Werlte im Schnitt ca. 87 € pro Nacht, 89 % liegen unter 100 €. Belegungsdaten von Airbnb oder AirDNA für Werlte lagen nicht vor, deshalb sind die Szenarien Näherungen. Angesetzt sind 90 € pro Nacht, Möblierung von 600 €/m² (36.000 €) im Kredit, Kosten von 56 % des Umsatzes (Plattform, Reinigung, Nebenkosten, Rücklage) gegenüber einer langfristigen Miete von 11,18 €/m² abzüglich 10 % Rücklagen.</w:t>
       </w:r>
     </w:p>
     <w:tbl>
@@ -12179,7 +12179,7 @@
                 <w:color w:val="FFFFFF"/>
                 <w:sz w:val="18"/>
               </w:rPr>
-              <w:t>Zwei Apartments à ...</w:t>
+              <w:t>Apartment 60 m²</w:t>
             </w:r>
           </w:p>
         </w:tc>
@@ -12201,7 +12201,7 @@
                 <w:color w:val="FFFFFF"/>
                 <w:sz w:val="18"/>
               </w:rPr>
-              <w:t>45 m²</w:t>
+              <w:t>Werlte amtlich</w:t>
             </w:r>
           </w:p>
         </w:tc>
@@ -12223,7 +12223,7 @@
                 <w:color w:val="FFFFFF"/>
                 <w:sz w:val="18"/>
               </w:rPr>
-              <w:t>55 m²</w:t>
+              <w:t>Emsland-Schnitt</w:t>
             </w:r>
           </w:p>
         </w:tc>
@@ -12245,7 +12245,7 @@
                 <w:color w:val="FFFFFF"/>
                 <w:sz w:val="18"/>
               </w:rPr>
-              <w:t>67 m²</w:t>
+              <w:t>Optimistisch</w:t>
             </w:r>
           </w:p>
         </w:tc>
@@ -12268,7 +12268,7 @@
               <w:rPr>
                 <w:sz w:val="18"/>
               </w:rPr>
-              <w:t>Preis pro Nacht</w:t>
+              <w:t>Auslastung</w:t>
             </w:r>
           </w:p>
         </w:tc>
@@ -12287,7 +12287,7 @@
               <w:rPr>
                 <w:sz w:val="18"/>
               </w:rPr>
-              <w:t>80 €</w:t>
+              <w:t>17,4 %</w:t>
             </w:r>
           </w:p>
         </w:tc>
@@ -12306,7 +12306,7 @@
               <w:rPr>
                 <w:sz w:val="18"/>
               </w:rPr>
-              <w:t>90 €</w:t>
+              <w:t>36,2 %</w:t>
             </w:r>
           </w:p>
         </w:tc>
@@ -12325,7 +12325,7 @@
               <w:rPr>
                 <w:sz w:val="18"/>
               </w:rPr>
-              <w:t>105 €</w:t>
+              <w:t>60,0 %</w:t>
             </w:r>
           </w:p>
         </w:tc>
@@ -12348,7 +12348,7 @@
               <w:rPr>
                 <w:sz w:val="18"/>
               </w:rPr>
-              <w:t>Netto Airbnb je Apartment und Monat</w:t>
+              <w:t>Preis pro Nacht</w:t>
             </w:r>
           </w:p>
         </w:tc>
@@ -12367,7 +12367,7 @@
               <w:rPr>
                 <w:sz w:val="18"/>
               </w:rPr>
-              <w:t>535 €</w:t>
+              <w:t>90 €</w:t>
             </w:r>
           </w:p>
         </w:tc>
@@ -12386,7 +12386,7 @@
               <w:rPr>
                 <w:sz w:val="18"/>
               </w:rPr>
-              <w:t>602 €</w:t>
+              <w:t>90 €</w:t>
             </w:r>
           </w:p>
         </w:tc>
@@ -12405,7 +12405,7 @@
               <w:rPr>
                 <w:sz w:val="18"/>
               </w:rPr>
-              <w:t>703 €</w:t>
+              <w:t>90 €</w:t>
             </w:r>
           </w:p>
         </w:tc>
@@ -12428,7 +12428,7 @@
               <w:rPr>
                 <w:sz w:val="18"/>
               </w:rPr>
-              <w:t>Netto langfristige Miete je Apartment und Monat</w:t>
+              <w:t>Netto Airbnb pro Monat</w:t>
             </w:r>
           </w:p>
         </w:tc>
@@ -12447,7 +12447,7 @@
               <w:rPr>
                 <w:sz w:val="18"/>
               </w:rPr>
-              <w:t>453 €</w:t>
+              <w:t>210 €</w:t>
             </w:r>
           </w:p>
         </w:tc>
@@ -12466,7 +12466,7 @@
               <w:rPr>
                 <w:sz w:val="18"/>
               </w:rPr>
-              <w:t>553 €</w:t>
+              <w:t>436 €</w:t>
             </w:r>
           </w:p>
         </w:tc>
@@ -12485,7 +12485,7 @@
               <w:rPr>
                 <w:sz w:val="18"/>
               </w:rPr>
-              <w:t>674 €</w:t>
+              <w:t>723 €</w:t>
             </w:r>
           </w:p>
         </w:tc>
@@ -12508,7 +12508,7 @@
               <w:rPr>
                 <w:sz w:val="18"/>
               </w:rPr>
-              <w:t>Möblierung (im Kredit)</w:t>
+              <w:t>Netto langfristige Miete pro Monat</w:t>
             </w:r>
           </w:p>
         </w:tc>
@@ -12527,7 +12527,7 @@
               <w:rPr>
                 <w:sz w:val="18"/>
               </w:rPr>
-              <w:t>27.000 €</w:t>
+              <w:t>604 €</w:t>
             </w:r>
           </w:p>
         </w:tc>
@@ -12546,7 +12546,7 @@
               <w:rPr>
                 <w:sz w:val="18"/>
               </w:rPr>
-              <w:t>33.000 €</w:t>
+              <w:t>604 €</w:t>
             </w:r>
           </w:p>
         </w:tc>
@@ -12565,7 +12565,7 @@
               <w:rPr>
                 <w:sz w:val="18"/>
               </w:rPr>
-              <w:t>40.200 €</w:t>
+              <w:t>604 €</w:t>
             </w:r>
           </w:p>
         </w:tc>
@@ -12577,6 +12577,86 @@
         <w:tc>
           <w:tcPr>
             <w:tcW w:type="dxa" w:w="4309"/>
+          </w:tcPr>
+          <w:p>
+            <w:pPr>
+              <w:keepNext/>
+              <w:spacing w:after="20" w:before="20"/>
+            </w:pPr>
+            <w:r/>
+            <w:r>
+              <w:rPr>
+                <w:sz w:val="18"/>
+              </w:rPr>
+              <w:t>Kapitaldienst Möblierung pro Monat</w:t>
+            </w:r>
+          </w:p>
+        </w:tc>
+        <w:tc>
+          <w:tcPr>
+            <w:tcW w:type="dxa" w:w="1701"/>
+          </w:tcPr>
+          <w:p>
+            <w:pPr>
+              <w:keepNext/>
+              <w:spacing w:after="20" w:before="20"/>
+              <w:jc w:val="right"/>
+            </w:pPr>
+            <w:r/>
+            <w:r>
+              <w:rPr>
+                <w:sz w:val="18"/>
+              </w:rPr>
+              <w:t>−150 €</w:t>
+            </w:r>
+          </w:p>
+        </w:tc>
+        <w:tc>
+          <w:tcPr>
+            <w:tcW w:type="dxa" w:w="1701"/>
+          </w:tcPr>
+          <w:p>
+            <w:pPr>
+              <w:keepNext/>
+              <w:spacing w:after="20" w:before="20"/>
+              <w:jc w:val="right"/>
+            </w:pPr>
+            <w:r/>
+            <w:r>
+              <w:rPr>
+                <w:sz w:val="18"/>
+              </w:rPr>
+              <w:t>−150 €</w:t>
+            </w:r>
+          </w:p>
+        </w:tc>
+        <w:tc>
+          <w:tcPr>
+            <w:tcW w:type="dxa" w:w="1701"/>
+          </w:tcPr>
+          <w:p>
+            <w:pPr>
+              <w:keepNext/>
+              <w:spacing w:after="20" w:before="20"/>
+              <w:jc w:val="right"/>
+            </w:pPr>
+            <w:r/>
+            <w:r>
+              <w:rPr>
+                <w:sz w:val="18"/>
+              </w:rPr>
+              <w:t>−150 €</w:t>
+            </w:r>
+          </w:p>
+        </w:tc>
+      </w:tr>
+      <w:tr>
+        <w:trPr>
+          <w:cantSplit/>
+        </w:trPr>
+        <w:tc>
+          <w:tcPr>
+            <w:tcW w:type="dxa" w:w="4309"/>
             <w:shd w:val="clear" w:color="auto" w:fill="E3E8E5"/>
           </w:tcPr>
           <w:p>
@@ -12589,7 +12669,7 @@
                 <w:b/>
                 <w:sz w:val="18"/>
               </w:rPr>
-              <w:t>Mehrertrag für 2 Apartments pro Monat</w:t>
+              <w:t>Mehrertrag gegenüber langfristiger Miete pro Monat</w:t>
             </w:r>
           </w:p>
         </w:tc>
@@ -12609,7 +12689,7 @@
                 <w:b/>
                 <w:sz w:val="18"/>
               </w:rPr>
-              <w:t>−60 €</w:t>
+              <w:t>−544 €</w:t>
             </w:r>
           </w:p>
         </w:tc>
@@ -12629,7 +12709,7 @@
                 <w:b/>
                 <w:sz w:val="18"/>
               </w:rPr>
-              <w:t>−177 €</w:t>
+              <w:t>−318 €</w:t>
             </w:r>
           </w:p>
         </w:tc>
@@ -12649,7 +12729,7 @@
                 <w:b/>
                 <w:sz w:val="18"/>
               </w:rPr>
-              <w:t>−278 €</w:t>
+              <w:t>−31 €</w:t>
             </w:r>
           </w:p>
         </w:tc>
@@ -12667,7 +12747,7 @@
           <w:i w:val="0"/>
           <w:color w:val="2F4A3E"/>
         </w:rPr>
-        <w:t>Ergebnis: Kurzzeitvermietung lohnt sich nicht. Auch kleine Apartments bringen nach Möblierung, Kapitaldienst und Kosten weniger als langfristige Mieter. Dazu kommen Aufwand für Gäste und Reinigung und bei mehr als 12 Betten Sonderbau-Brandschutz. Alle 8 Wohnungen bleiben deshalb langfristig vermietet.</w:t>
+        <w:t>Ergebnis: Airbnb lohnt sich in Werlte nicht. Erst ab ca. 63 % Auslastung wäre es so gut wie die langfristige Miete, in Werlte liegt sie amtlich bei 17 %. Dazu kommen Aufwand für Gäste und Reinigung. Die Wohnung bleibt deshalb langfristig vermietet.</w:t>
       </w:r>
     </w:p>
     <w:p>

</xml_diff>

<commit_message>
Gastro: Tagesteil-Umsatzmodell (Frühstück, Mittag, Abend, Bar, Events) mit Abend-Fokus in Excel, Decks und Businessplan
Co-Authored-By: Claude Sonnet 5.5 <noreply@anthropic.com>
Claude-Session: https://claude.ai/code/session_01HJGZfxHv7bzYyqdLwg8aFJ
</commit_message>
<xml_diff>
--- a/praesentation/Businessplan_Baufeld3_Neue-Mitte-Werlte.docx
+++ b/praesentation/Businessplan_Baufeld3_Neue-Mitte-Werlte.docx
@@ -665,7 +665,7 @@
               <w:rPr>
                 <w:sz w:val="19"/>
               </w:rPr>
-              <w:t>27.344 €</w:t>
+              <w:t>36.687 €</w:t>
             </w:r>
           </w:p>
         </w:tc>
@@ -707,7 +707,7 @@
               <w:rPr>
                 <w:sz w:val="19"/>
               </w:rPr>
-              <w:t>+9.610 €</w:t>
+              <w:t>+18.954 €</w:t>
             </w:r>
           </w:p>
         </w:tc>
@@ -749,7 +749,7 @@
               <w:rPr>
                 <w:sz w:val="19"/>
               </w:rPr>
-              <w:t>1,54 gesamt, 0,71 nur Immobilie</w:t>
+              <w:t>2,07 gesamt, 0,71 nur Immobilie</w:t>
             </w:r>
           </w:p>
         </w:tc>
@@ -909,7 +909,7 @@
         <w:t xml:space="preserve">Der Ertrag trägt die Raten, aber nur mit der Gastro. </w:t>
       </w:r>
       <w:r>
-        <w:t>Mit dem Gastro-Gewinn liegt die Kapitaldienstdeckung bei 1,54. Allein aus Miete, Büromiete und Pacht wären es 0,71, aus Wohnen und Büro allein 0,45.</w:t>
+        <w:t>Mit dem Gastro-Gewinn liegt die Kapitaldienstdeckung bei 2,07. Allein aus Miete, Büromiete und Pacht wären es 0,71, aus Wohnen und Büro allein 0,45.</w:t>
       </w:r>
     </w:p>
     <w:p>
@@ -4273,7 +4273,7 @@
           <w:b w:val="0"/>
           <w:i w:val="0"/>
         </w:rPr>
-        <w:t>Der Gastro-Umsatz von 65.000 € im Monat entspricht ca. 4.105 € je Sitzplatz und Jahr. Zum Vergleich: Der Median in Österreich liegt für Betriebe mit weniger als 100 Plätzen bei ca. 12.000 € (Fitness-Check Gastronomie 2026). Die Annahme ist also sehr vorsichtig. Die Pacht von 10 €/m² entspricht 7,8 % vom Umsatz (üblich 6 bis 12 %).</w:t>
+        <w:t>Der Gastro-Umsatz von 95.635 € im Monat entspricht ca. 6.040 € je Sitzplatz und Jahr. Zum Vergleich: Der Median in Österreich liegt für Betriebe mit weniger als 100 Plätzen bei ca. 12.000 € (Fitness-Check Gastronomie 2026). Die Annahme liegt damit deutlich unter dem Branchen-Median. Die Pacht von 10 €/m² entspricht 5,3 % vom Umsatz (üblich 6 bis 12 %).</w:t>
       </w:r>
     </w:p>
     <w:p>
@@ -4793,7 +4793,7 @@
           <w:b w:val="0"/>
           <w:i w:val="0"/>
         </w:rPr>
-        <w:t>Die Gastro nutzt das ganze Erdgeschoss (ca. 510 m²) als Bar-Restaurant für den ganzen Tag: Frühstück und Brunch am Wochenende, Mittagstisch für Beschäftigte aus Rathaus und Umgebung, Abendrestaurant mit regionaler, moderner Küche, Bar mit Theke und ein Séparée (abgetrennter Raum) mit 30 Plätzen für Feiern. Die Gestaltung folgt dem Referenzbild des Bauherrn: olivgrüne Vertäfelung, Cognac-Samtbanketten, Eiche, anthrazitfarbene Theke, Stahl-Glas-Trennwand und warmes Licht.</w:t>
+        <w:t>Die Gastro nutzt das ganze Erdgeschoss (ca. 510 m²) als Bar-Restaurant für den ganzen Tag mit dem Hauptfokus auf dem Abend. Morgens gibt es Frühstück (am Wochenende Brunch), mittags einen Mittagstisch für Beschäftigte aus Rathaus und Umgebung. Ab dem späten Nachmittag wird das Haus zum Abendrestaurant mit regionaler, moderner Küche, ab 21 Uhr zur Bar mit Cocktails, Wein, Bier und leiser Musik (Fr und Sa bis 01 Uhr). Dazu kommen Feiern, Live-Abende und Themenabende im Séparée (abgetrennter Raum mit 30 Plätzen). Die Gestaltung folgt dem Referenzbild des Bauherrn: olivgrüne Vertäfelung, Cognac-Samtbanketten, Eiche, anthrazitfarbene Theke, Stahl-Glas-Trennwand und warmes Licht.</w:t>
       </w:r>
     </w:p>
     <w:tbl>
@@ -4981,7 +4981,7 @@
               <w:rPr>
                 <w:sz w:val="18"/>
               </w:rPr>
-              <w:t>65.000 € pro Monat (netto), ca. 4.100 € je Sitzplatz und Jahr, vorsichtig</w:t>
+              <w:t>95.635 € pro Monat (netto), davon 75 % am Abend, ca. 6.000 € je Sitzplatz und Jahr</w:t>
             </w:r>
           </w:p>
         </w:tc>
@@ -5063,7 +5063,7 @@
               <w:rPr>
                 <w:sz w:val="18"/>
               </w:rPr>
-              <w:t>10 €/m², 5.100 € pro Monat (ca. 8 % vom Umsatz)</w:t>
+              <w:t>10 €/m², 5.100 € pro Monat (ca. 5,3 % vom Umsatz)</w:t>
             </w:r>
           </w:p>
         </w:tc>
@@ -5103,6 +5103,1297 @@
                 <w:sz w:val="18"/>
               </w:rPr>
               <w:t>190.000 € (1.000 € je Platz nach dem Budget des Bauherrn, Angebote nötig), dazu Büro-Ausbau 150 €/m²</w:t>
+            </w:r>
+          </w:p>
+        </w:tc>
+      </w:tr>
+    </w:tbl>
+    <w:p>
+      <w:pPr>
+        <w:spacing w:after="40"/>
+      </w:pPr>
+    </w:p>
+    <w:p>
+      <w:pPr>
+        <w:spacing w:after="80"/>
+      </w:pPr>
+      <w:r>
+        <w:rPr>
+          <w:b w:val="0"/>
+          <w:i w:val="0"/>
+        </w:rPr>
+        <w:t>Der Umsatz setzt sich aus Tagesteilen zusammen. Der Abend (Restaurant, Bar, Feiern) bringt 75 % des Umsatzes, Frühstück und Mittag füllen das Haus am Tag. Öffnungstage, Gäste und Bon sind Annahmen, es liegen keine Marktdaten für Werlte vor.</w:t>
+      </w:r>
+    </w:p>
+    <w:tbl>
+      <w:tblPr>
+        <w:tblW w:type="auto" w:w="0"/>
+        <w:jc w:val="center"/>
+        <w:tblLayout w:type="fixed"/>
+        <w:tblLook w:firstColumn="1" w:firstRow="1" w:lastColumn="0" w:lastRow="0" w:noHBand="0" w:noVBand="1" w:val="04A0"/>
+        <w:tblBorders>
+          <w:top w:val="single" w:sz="4" w:color="D0D0D0"/>
+          <w:left w:val="single" w:sz="4" w:color="D0D0D0"/>
+          <w:bottom w:val="single" w:sz="4" w:color="D0D0D0"/>
+          <w:right w:val="single" w:sz="4" w:color="D0D0D0"/>
+          <w:insideH w:val="single" w:sz="4" w:color="D0D0D0"/>
+          <w:insideV w:val="single" w:sz="4" w:color="D0D0D0"/>
+        </w:tblBorders>
+        <w:tblLayout w:type="fixed"/>
+      </w:tblPr>
+      <w:tblGrid>
+        <w:gridCol w:w="2608"/>
+        <w:gridCol w:w="2381"/>
+        <w:gridCol w:w="680"/>
+        <w:gridCol w:w="964"/>
+        <w:gridCol w:w="794"/>
+        <w:gridCol w:w="1247"/>
+        <w:gridCol w:w="737"/>
+      </w:tblGrid>
+      <w:tr>
+        <w:trPr>
+          <w:cantSplit/>
+        </w:trPr>
+        <w:tc>
+          <w:tcPr>
+            <w:tcW w:type="dxa" w:w="2608"/>
+            <w:shd w:val="clear" w:color="auto" w:fill="2F4A3E"/>
+          </w:tcPr>
+          <w:p>
+            <w:pPr>
+              <w:keepNext/>
+              <w:spacing w:after="20" w:before="20"/>
+            </w:pPr>
+            <w:r/>
+            <w:r>
+              <w:rPr>
+                <w:b/>
+                <w:color w:val="FFFFFF"/>
+                <w:sz w:val="17"/>
+              </w:rPr>
+              <w:t>Tagesteil</w:t>
+            </w:r>
+          </w:p>
+        </w:tc>
+        <w:tc>
+          <w:tcPr>
+            <w:tcW w:type="dxa" w:w="2381"/>
+            <w:shd w:val="clear" w:color="auto" w:fill="2F4A3E"/>
+          </w:tcPr>
+          <w:p>
+            <w:pPr>
+              <w:keepNext/>
+              <w:spacing w:after="20" w:before="20"/>
+            </w:pPr>
+            <w:r/>
+            <w:r>
+              <w:rPr>
+                <w:b/>
+                <w:color w:val="FFFFFF"/>
+                <w:sz w:val="17"/>
+              </w:rPr>
+              <w:t>Zeit</w:t>
+            </w:r>
+          </w:p>
+        </w:tc>
+        <w:tc>
+          <w:tcPr>
+            <w:tcW w:type="dxa" w:w="680"/>
+            <w:shd w:val="clear" w:color="auto" w:fill="2F4A3E"/>
+          </w:tcPr>
+          <w:p>
+            <w:pPr>
+              <w:keepNext/>
+              <w:spacing w:after="20" w:before="20"/>
+              <w:jc w:val="right"/>
+            </w:pPr>
+            <w:r/>
+            <w:r>
+              <w:rPr>
+                <w:b/>
+                <w:color w:val="FFFFFF"/>
+                <w:sz w:val="17"/>
+              </w:rPr>
+              <w:t>Tage</w:t>
+            </w:r>
+          </w:p>
+        </w:tc>
+        <w:tc>
+          <w:tcPr>
+            <w:tcW w:type="dxa" w:w="964"/>
+            <w:shd w:val="clear" w:color="auto" w:fill="2F4A3E"/>
+          </w:tcPr>
+          <w:p>
+            <w:pPr>
+              <w:keepNext/>
+              <w:spacing w:after="20" w:before="20"/>
+              <w:jc w:val="right"/>
+            </w:pPr>
+            <w:r/>
+            <w:r>
+              <w:rPr>
+                <w:b/>
+                <w:color w:val="FFFFFF"/>
+                <w:sz w:val="17"/>
+              </w:rPr>
+              <w:t>Gäste/Tag</w:t>
+            </w:r>
+          </w:p>
+        </w:tc>
+        <w:tc>
+          <w:tcPr>
+            <w:tcW w:type="dxa" w:w="794"/>
+            <w:shd w:val="clear" w:color="auto" w:fill="2F4A3E"/>
+          </w:tcPr>
+          <w:p>
+            <w:pPr>
+              <w:keepNext/>
+              <w:spacing w:after="20" w:before="20"/>
+              <w:jc w:val="right"/>
+            </w:pPr>
+            <w:r/>
+            <w:r>
+              <w:rPr>
+                <w:b/>
+                <w:color w:val="FFFFFF"/>
+                <w:sz w:val="17"/>
+              </w:rPr>
+              <w:t>Ø Bon</w:t>
+            </w:r>
+          </w:p>
+        </w:tc>
+        <w:tc>
+          <w:tcPr>
+            <w:tcW w:type="dxa" w:w="1247"/>
+            <w:shd w:val="clear" w:color="auto" w:fill="2F4A3E"/>
+          </w:tcPr>
+          <w:p>
+            <w:pPr>
+              <w:keepNext/>
+              <w:spacing w:after="20" w:before="20"/>
+              <w:jc w:val="right"/>
+            </w:pPr>
+            <w:r/>
+            <w:r>
+              <w:rPr>
+                <w:b/>
+                <w:color w:val="FFFFFF"/>
+                <w:sz w:val="17"/>
+              </w:rPr>
+              <w:t>Umsatz/Monat</w:t>
+            </w:r>
+          </w:p>
+        </w:tc>
+        <w:tc>
+          <w:tcPr>
+            <w:tcW w:type="dxa" w:w="737"/>
+            <w:shd w:val="clear" w:color="auto" w:fill="2F4A3E"/>
+          </w:tcPr>
+          <w:p>
+            <w:pPr>
+              <w:keepNext/>
+              <w:spacing w:after="20" w:before="20"/>
+              <w:jc w:val="right"/>
+            </w:pPr>
+            <w:r/>
+            <w:r>
+              <w:rPr>
+                <w:b/>
+                <w:color w:val="FFFFFF"/>
+                <w:sz w:val="17"/>
+              </w:rPr>
+              <w:t>Anteil</w:t>
+            </w:r>
+          </w:p>
+        </w:tc>
+      </w:tr>
+      <w:tr>
+        <w:trPr>
+          <w:cantSplit/>
+        </w:trPr>
+        <w:tc>
+          <w:tcPr>
+            <w:tcW w:type="dxa" w:w="2608"/>
+          </w:tcPr>
+          <w:p>
+            <w:pPr>
+              <w:keepNext/>
+              <w:spacing w:after="20" w:before="20"/>
+            </w:pPr>
+            <w:r/>
+            <w:r>
+              <w:rPr>
+                <w:sz w:val="17"/>
+              </w:rPr>
+              <w:t>Frühstück werktags</w:t>
+            </w:r>
+          </w:p>
+        </w:tc>
+        <w:tc>
+          <w:tcPr>
+            <w:tcW w:type="dxa" w:w="2381"/>
+          </w:tcPr>
+          <w:p>
+            <w:pPr>
+              <w:keepNext/>
+              <w:spacing w:after="20" w:before="20"/>
+            </w:pPr>
+            <w:r/>
+            <w:r>
+              <w:rPr>
+                <w:sz w:val="17"/>
+              </w:rPr>
+              <w:t>Di–Fr 08:00–11:00</w:t>
+            </w:r>
+          </w:p>
+        </w:tc>
+        <w:tc>
+          <w:tcPr>
+            <w:tcW w:type="dxa" w:w="680"/>
+          </w:tcPr>
+          <w:p>
+            <w:pPr>
+              <w:keepNext/>
+              <w:spacing w:after="20" w:before="20"/>
+              <w:jc w:val="right"/>
+            </w:pPr>
+            <w:r/>
+            <w:r>
+              <w:rPr>
+                <w:sz w:val="17"/>
+              </w:rPr>
+              <w:t>17</w:t>
+            </w:r>
+          </w:p>
+        </w:tc>
+        <w:tc>
+          <w:tcPr>
+            <w:tcW w:type="dxa" w:w="964"/>
+          </w:tcPr>
+          <w:p>
+            <w:pPr>
+              <w:keepNext/>
+              <w:spacing w:after="20" w:before="20"/>
+              <w:jc w:val="right"/>
+            </w:pPr>
+            <w:r/>
+            <w:r>
+              <w:rPr>
+                <w:sz w:val="17"/>
+              </w:rPr>
+              <w:t>25</w:t>
+            </w:r>
+          </w:p>
+        </w:tc>
+        <w:tc>
+          <w:tcPr>
+            <w:tcW w:type="dxa" w:w="794"/>
+          </w:tcPr>
+          <w:p>
+            <w:pPr>
+              <w:keepNext/>
+              <w:spacing w:after="20" w:before="20"/>
+              <w:jc w:val="right"/>
+            </w:pPr>
+            <w:r/>
+            <w:r>
+              <w:rPr>
+                <w:sz w:val="17"/>
+              </w:rPr>
+              <w:t>11 €</w:t>
+            </w:r>
+          </w:p>
+        </w:tc>
+        <w:tc>
+          <w:tcPr>
+            <w:tcW w:type="dxa" w:w="1247"/>
+          </w:tcPr>
+          <w:p>
+            <w:pPr>
+              <w:keepNext/>
+              <w:spacing w:after="20" w:before="20"/>
+              <w:jc w:val="right"/>
+            </w:pPr>
+            <w:r/>
+            <w:r>
+              <w:rPr>
+                <w:sz w:val="17"/>
+              </w:rPr>
+              <w:t>4.675 €</w:t>
+            </w:r>
+          </w:p>
+        </w:tc>
+        <w:tc>
+          <w:tcPr>
+            <w:tcW w:type="dxa" w:w="737"/>
+          </w:tcPr>
+          <w:p>
+            <w:pPr>
+              <w:keepNext/>
+              <w:spacing w:after="20" w:before="20"/>
+              <w:jc w:val="right"/>
+            </w:pPr>
+            <w:r/>
+            <w:r>
+              <w:rPr>
+                <w:sz w:val="17"/>
+              </w:rPr>
+              <w:t>5 %</w:t>
+            </w:r>
+          </w:p>
+        </w:tc>
+      </w:tr>
+      <w:tr>
+        <w:trPr>
+          <w:cantSplit/>
+        </w:trPr>
+        <w:tc>
+          <w:tcPr>
+            <w:tcW w:type="dxa" w:w="2608"/>
+          </w:tcPr>
+          <w:p>
+            <w:pPr>
+              <w:keepNext/>
+              <w:spacing w:after="20" w:before="20"/>
+            </w:pPr>
+            <w:r/>
+            <w:r>
+              <w:rPr>
+                <w:sz w:val="17"/>
+              </w:rPr>
+              <w:t>Brunch am Wochenende</w:t>
+            </w:r>
+          </w:p>
+        </w:tc>
+        <w:tc>
+          <w:tcPr>
+            <w:tcW w:type="dxa" w:w="2381"/>
+          </w:tcPr>
+          <w:p>
+            <w:pPr>
+              <w:keepNext/>
+              <w:spacing w:after="20" w:before="20"/>
+            </w:pPr>
+            <w:r/>
+            <w:r>
+              <w:rPr>
+                <w:sz w:val="17"/>
+              </w:rPr>
+              <w:t>Sa, So 09:00–14:00</w:t>
+            </w:r>
+          </w:p>
+        </w:tc>
+        <w:tc>
+          <w:tcPr>
+            <w:tcW w:type="dxa" w:w="680"/>
+          </w:tcPr>
+          <w:p>
+            <w:pPr>
+              <w:keepNext/>
+              <w:spacing w:after="20" w:before="20"/>
+              <w:jc w:val="right"/>
+            </w:pPr>
+            <w:r/>
+            <w:r>
+              <w:rPr>
+                <w:sz w:val="17"/>
+              </w:rPr>
+              <w:t>9</w:t>
+            </w:r>
+          </w:p>
+        </w:tc>
+        <w:tc>
+          <w:tcPr>
+            <w:tcW w:type="dxa" w:w="964"/>
+          </w:tcPr>
+          <w:p>
+            <w:pPr>
+              <w:keepNext/>
+              <w:spacing w:after="20" w:before="20"/>
+              <w:jc w:val="right"/>
+            </w:pPr>
+            <w:r/>
+            <w:r>
+              <w:rPr>
+                <w:sz w:val="17"/>
+              </w:rPr>
+              <w:t>60</w:t>
+            </w:r>
+          </w:p>
+        </w:tc>
+        <w:tc>
+          <w:tcPr>
+            <w:tcW w:type="dxa" w:w="794"/>
+          </w:tcPr>
+          <w:p>
+            <w:pPr>
+              <w:keepNext/>
+              <w:spacing w:after="20" w:before="20"/>
+              <w:jc w:val="right"/>
+            </w:pPr>
+            <w:r/>
+            <w:r>
+              <w:rPr>
+                <w:sz w:val="17"/>
+              </w:rPr>
+              <w:t>14 €</w:t>
+            </w:r>
+          </w:p>
+        </w:tc>
+        <w:tc>
+          <w:tcPr>
+            <w:tcW w:type="dxa" w:w="1247"/>
+          </w:tcPr>
+          <w:p>
+            <w:pPr>
+              <w:keepNext/>
+              <w:spacing w:after="20" w:before="20"/>
+              <w:jc w:val="right"/>
+            </w:pPr>
+            <w:r/>
+            <w:r>
+              <w:rPr>
+                <w:sz w:val="17"/>
+              </w:rPr>
+              <w:t>7.560 €</w:t>
+            </w:r>
+          </w:p>
+        </w:tc>
+        <w:tc>
+          <w:tcPr>
+            <w:tcW w:type="dxa" w:w="737"/>
+          </w:tcPr>
+          <w:p>
+            <w:pPr>
+              <w:keepNext/>
+              <w:spacing w:after="20" w:before="20"/>
+              <w:jc w:val="right"/>
+            </w:pPr>
+            <w:r/>
+            <w:r>
+              <w:rPr>
+                <w:sz w:val="17"/>
+              </w:rPr>
+              <w:t>8 %</w:t>
+            </w:r>
+          </w:p>
+        </w:tc>
+      </w:tr>
+      <w:tr>
+        <w:trPr>
+          <w:cantSplit/>
+        </w:trPr>
+        <w:tc>
+          <w:tcPr>
+            <w:tcW w:type="dxa" w:w="2608"/>
+          </w:tcPr>
+          <w:p>
+            <w:pPr>
+              <w:keepNext/>
+              <w:spacing w:after="20" w:before="20"/>
+            </w:pPr>
+            <w:r/>
+            <w:r>
+              <w:rPr>
+                <w:sz w:val="17"/>
+              </w:rPr>
+              <w:t>Mittagstisch</w:t>
+            </w:r>
+          </w:p>
+        </w:tc>
+        <w:tc>
+          <w:tcPr>
+            <w:tcW w:type="dxa" w:w="2381"/>
+          </w:tcPr>
+          <w:p>
+            <w:pPr>
+              <w:keepNext/>
+              <w:spacing w:after="20" w:before="20"/>
+            </w:pPr>
+            <w:r/>
+            <w:r>
+              <w:rPr>
+                <w:sz w:val="17"/>
+              </w:rPr>
+              <w:t>Di–Fr 11:30–14:30</w:t>
+            </w:r>
+          </w:p>
+        </w:tc>
+        <w:tc>
+          <w:tcPr>
+            <w:tcW w:type="dxa" w:w="680"/>
+          </w:tcPr>
+          <w:p>
+            <w:pPr>
+              <w:keepNext/>
+              <w:spacing w:after="20" w:before="20"/>
+              <w:jc w:val="right"/>
+            </w:pPr>
+            <w:r/>
+            <w:r>
+              <w:rPr>
+                <w:sz w:val="17"/>
+              </w:rPr>
+              <w:t>17</w:t>
+            </w:r>
+          </w:p>
+        </w:tc>
+        <w:tc>
+          <w:tcPr>
+            <w:tcW w:type="dxa" w:w="964"/>
+          </w:tcPr>
+          <w:p>
+            <w:pPr>
+              <w:keepNext/>
+              <w:spacing w:after="20" w:before="20"/>
+              <w:jc w:val="right"/>
+            </w:pPr>
+            <w:r/>
+            <w:r>
+              <w:rPr>
+                <w:sz w:val="17"/>
+              </w:rPr>
+              <w:t>50</w:t>
+            </w:r>
+          </w:p>
+        </w:tc>
+        <w:tc>
+          <w:tcPr>
+            <w:tcW w:type="dxa" w:w="794"/>
+          </w:tcPr>
+          <w:p>
+            <w:pPr>
+              <w:keepNext/>
+              <w:spacing w:after="20" w:before="20"/>
+              <w:jc w:val="right"/>
+            </w:pPr>
+            <w:r/>
+            <w:r>
+              <w:rPr>
+                <w:sz w:val="17"/>
+              </w:rPr>
+              <w:t>14 €</w:t>
+            </w:r>
+          </w:p>
+        </w:tc>
+        <w:tc>
+          <w:tcPr>
+            <w:tcW w:type="dxa" w:w="1247"/>
+          </w:tcPr>
+          <w:p>
+            <w:pPr>
+              <w:keepNext/>
+              <w:spacing w:after="20" w:before="20"/>
+              <w:jc w:val="right"/>
+            </w:pPr>
+            <w:r/>
+            <w:r>
+              <w:rPr>
+                <w:sz w:val="17"/>
+              </w:rPr>
+              <w:t>11.900 €</w:t>
+            </w:r>
+          </w:p>
+        </w:tc>
+        <w:tc>
+          <w:tcPr>
+            <w:tcW w:type="dxa" w:w="737"/>
+          </w:tcPr>
+          <w:p>
+            <w:pPr>
+              <w:keepNext/>
+              <w:spacing w:after="20" w:before="20"/>
+              <w:jc w:val="right"/>
+            </w:pPr>
+            <w:r/>
+            <w:r>
+              <w:rPr>
+                <w:sz w:val="17"/>
+              </w:rPr>
+              <w:t>12 %</w:t>
+            </w:r>
+          </w:p>
+        </w:tc>
+      </w:tr>
+      <w:tr>
+        <w:trPr>
+          <w:cantSplit/>
+        </w:trPr>
+        <w:tc>
+          <w:tcPr>
+            <w:tcW w:type="dxa" w:w="2608"/>
+          </w:tcPr>
+          <w:p>
+            <w:pPr>
+              <w:keepNext/>
+              <w:spacing w:after="20" w:before="20"/>
+            </w:pPr>
+            <w:r/>
+            <w:r>
+              <w:rPr>
+                <w:sz w:val="17"/>
+              </w:rPr>
+              <w:t>Abendessen Restaurant</w:t>
+            </w:r>
+          </w:p>
+        </w:tc>
+        <w:tc>
+          <w:tcPr>
+            <w:tcW w:type="dxa" w:w="2381"/>
+          </w:tcPr>
+          <w:p>
+            <w:pPr>
+              <w:keepNext/>
+              <w:spacing w:after="20" w:before="20"/>
+            </w:pPr>
+            <w:r/>
+            <w:r>
+              <w:rPr>
+                <w:sz w:val="17"/>
+              </w:rPr>
+              <w:t>Di–So 17:30–22:00</w:t>
+            </w:r>
+          </w:p>
+        </w:tc>
+        <w:tc>
+          <w:tcPr>
+            <w:tcW w:type="dxa" w:w="680"/>
+          </w:tcPr>
+          <w:p>
+            <w:pPr>
+              <w:keepNext/>
+              <w:spacing w:after="20" w:before="20"/>
+              <w:jc w:val="right"/>
+            </w:pPr>
+            <w:r/>
+            <w:r>
+              <w:rPr>
+                <w:sz w:val="17"/>
+              </w:rPr>
+              <w:t>26</w:t>
+            </w:r>
+          </w:p>
+        </w:tc>
+        <w:tc>
+          <w:tcPr>
+            <w:tcW w:type="dxa" w:w="964"/>
+          </w:tcPr>
+          <w:p>
+            <w:pPr>
+              <w:keepNext/>
+              <w:spacing w:after="20" w:before="20"/>
+              <w:jc w:val="right"/>
+            </w:pPr>
+            <w:r/>
+            <w:r>
+              <w:rPr>
+                <w:sz w:val="17"/>
+              </w:rPr>
+              <w:t>55</w:t>
+            </w:r>
+          </w:p>
+        </w:tc>
+        <w:tc>
+          <w:tcPr>
+            <w:tcW w:type="dxa" w:w="794"/>
+          </w:tcPr>
+          <w:p>
+            <w:pPr>
+              <w:keepNext/>
+              <w:spacing w:after="20" w:before="20"/>
+              <w:jc w:val="right"/>
+            </w:pPr>
+            <w:r/>
+            <w:r>
+              <w:rPr>
+                <w:sz w:val="17"/>
+              </w:rPr>
+              <w:t>32 €</w:t>
+            </w:r>
+          </w:p>
+        </w:tc>
+        <w:tc>
+          <w:tcPr>
+            <w:tcW w:type="dxa" w:w="1247"/>
+          </w:tcPr>
+          <w:p>
+            <w:pPr>
+              <w:keepNext/>
+              <w:spacing w:after="20" w:before="20"/>
+              <w:jc w:val="right"/>
+            </w:pPr>
+            <w:r/>
+            <w:r>
+              <w:rPr>
+                <w:sz w:val="17"/>
+              </w:rPr>
+              <w:t>45.760 €</w:t>
+            </w:r>
+          </w:p>
+        </w:tc>
+        <w:tc>
+          <w:tcPr>
+            <w:tcW w:type="dxa" w:w="737"/>
+          </w:tcPr>
+          <w:p>
+            <w:pPr>
+              <w:keepNext/>
+              <w:spacing w:after="20" w:before="20"/>
+              <w:jc w:val="right"/>
+            </w:pPr>
+            <w:r/>
+            <w:r>
+              <w:rPr>
+                <w:sz w:val="17"/>
+              </w:rPr>
+              <w:t>48 %</w:t>
+            </w:r>
+          </w:p>
+        </w:tc>
+      </w:tr>
+      <w:tr>
+        <w:trPr>
+          <w:cantSplit/>
+        </w:trPr>
+        <w:tc>
+          <w:tcPr>
+            <w:tcW w:type="dxa" w:w="2608"/>
+          </w:tcPr>
+          <w:p>
+            <w:pPr>
+              <w:keepNext/>
+              <w:spacing w:after="20" w:before="20"/>
+            </w:pPr>
+            <w:r/>
+            <w:r>
+              <w:rPr>
+                <w:sz w:val="17"/>
+              </w:rPr>
+              <w:t>Bar Di–Do</w:t>
+            </w:r>
+          </w:p>
+        </w:tc>
+        <w:tc>
+          <w:tcPr>
+            <w:tcW w:type="dxa" w:w="2381"/>
+          </w:tcPr>
+          <w:p>
+            <w:pPr>
+              <w:keepNext/>
+              <w:spacing w:after="20" w:before="20"/>
+            </w:pPr>
+            <w:r/>
+            <w:r>
+              <w:rPr>
+                <w:sz w:val="17"/>
+              </w:rPr>
+              <w:t>ab 21:00</w:t>
+            </w:r>
+          </w:p>
+        </w:tc>
+        <w:tc>
+          <w:tcPr>
+            <w:tcW w:type="dxa" w:w="680"/>
+          </w:tcPr>
+          <w:p>
+            <w:pPr>
+              <w:keepNext/>
+              <w:spacing w:after="20" w:before="20"/>
+              <w:jc w:val="right"/>
+            </w:pPr>
+            <w:r/>
+            <w:r>
+              <w:rPr>
+                <w:sz w:val="17"/>
+              </w:rPr>
+              <w:t>13</w:t>
+            </w:r>
+          </w:p>
+        </w:tc>
+        <w:tc>
+          <w:tcPr>
+            <w:tcW w:type="dxa" w:w="964"/>
+          </w:tcPr>
+          <w:p>
+            <w:pPr>
+              <w:keepNext/>
+              <w:spacing w:after="20" w:before="20"/>
+              <w:jc w:val="right"/>
+            </w:pPr>
+            <w:r/>
+            <w:r>
+              <w:rPr>
+                <w:sz w:val="17"/>
+              </w:rPr>
+              <w:t>20</w:t>
+            </w:r>
+          </w:p>
+        </w:tc>
+        <w:tc>
+          <w:tcPr>
+            <w:tcW w:type="dxa" w:w="794"/>
+          </w:tcPr>
+          <w:p>
+            <w:pPr>
+              <w:keepNext/>
+              <w:spacing w:after="20" w:before="20"/>
+              <w:jc w:val="right"/>
+            </w:pPr>
+            <w:r/>
+            <w:r>
+              <w:rPr>
+                <w:sz w:val="17"/>
+              </w:rPr>
+              <w:t>18 €</w:t>
+            </w:r>
+          </w:p>
+        </w:tc>
+        <w:tc>
+          <w:tcPr>
+            <w:tcW w:type="dxa" w:w="1247"/>
+          </w:tcPr>
+          <w:p>
+            <w:pPr>
+              <w:keepNext/>
+              <w:spacing w:after="20" w:before="20"/>
+              <w:jc w:val="right"/>
+            </w:pPr>
+            <w:r/>
+            <w:r>
+              <w:rPr>
+                <w:sz w:val="17"/>
+              </w:rPr>
+              <w:t>4.680 €</w:t>
+            </w:r>
+          </w:p>
+        </w:tc>
+        <w:tc>
+          <w:tcPr>
+            <w:tcW w:type="dxa" w:w="737"/>
+          </w:tcPr>
+          <w:p>
+            <w:pPr>
+              <w:keepNext/>
+              <w:spacing w:after="20" w:before="20"/>
+              <w:jc w:val="right"/>
+            </w:pPr>
+            <w:r/>
+            <w:r>
+              <w:rPr>
+                <w:sz w:val="17"/>
+              </w:rPr>
+              <w:t>5 %</w:t>
+            </w:r>
+          </w:p>
+        </w:tc>
+      </w:tr>
+      <w:tr>
+        <w:trPr>
+          <w:cantSplit/>
+        </w:trPr>
+        <w:tc>
+          <w:tcPr>
+            <w:tcW w:type="dxa" w:w="2608"/>
+          </w:tcPr>
+          <w:p>
+            <w:pPr>
+              <w:keepNext/>
+              <w:spacing w:after="20" w:before="20"/>
+            </w:pPr>
+            <w:r/>
+            <w:r>
+              <w:rPr>
+                <w:sz w:val="17"/>
+              </w:rPr>
+              <w:t>Bar Fr, Sa (bis 01:00)</w:t>
+            </w:r>
+          </w:p>
+        </w:tc>
+        <w:tc>
+          <w:tcPr>
+            <w:tcW w:type="dxa" w:w="2381"/>
+          </w:tcPr>
+          <w:p>
+            <w:pPr>
+              <w:keepNext/>
+              <w:spacing w:after="20" w:before="20"/>
+            </w:pPr>
+            <w:r/>
+            <w:r>
+              <w:rPr>
+                <w:sz w:val="17"/>
+              </w:rPr>
+              <w:t>Cocktails, Wein, Bier, Musik</w:t>
+            </w:r>
+          </w:p>
+        </w:tc>
+        <w:tc>
+          <w:tcPr>
+            <w:tcW w:type="dxa" w:w="680"/>
+          </w:tcPr>
+          <w:p>
+            <w:pPr>
+              <w:keepNext/>
+              <w:spacing w:after="20" w:before="20"/>
+              <w:jc w:val="right"/>
+            </w:pPr>
+            <w:r/>
+            <w:r>
+              <w:rPr>
+                <w:sz w:val="17"/>
+              </w:rPr>
+              <w:t>9</w:t>
+            </w:r>
+          </w:p>
+        </w:tc>
+        <w:tc>
+          <w:tcPr>
+            <w:tcW w:type="dxa" w:w="964"/>
+          </w:tcPr>
+          <w:p>
+            <w:pPr>
+              <w:keepNext/>
+              <w:spacing w:after="20" w:before="20"/>
+              <w:jc w:val="right"/>
+            </w:pPr>
+            <w:r/>
+            <w:r>
+              <w:rPr>
+                <w:sz w:val="17"/>
+              </w:rPr>
+              <w:t>70</w:t>
+            </w:r>
+          </w:p>
+        </w:tc>
+        <w:tc>
+          <w:tcPr>
+            <w:tcW w:type="dxa" w:w="794"/>
+          </w:tcPr>
+          <w:p>
+            <w:pPr>
+              <w:keepNext/>
+              <w:spacing w:after="20" w:before="20"/>
+              <w:jc w:val="right"/>
+            </w:pPr>
+            <w:r/>
+            <w:r>
+              <w:rPr>
+                <w:sz w:val="17"/>
+              </w:rPr>
+              <w:t>22 €</w:t>
+            </w:r>
+          </w:p>
+        </w:tc>
+        <w:tc>
+          <w:tcPr>
+            <w:tcW w:type="dxa" w:w="1247"/>
+          </w:tcPr>
+          <w:p>
+            <w:pPr>
+              <w:keepNext/>
+              <w:spacing w:after="20" w:before="20"/>
+              <w:jc w:val="right"/>
+            </w:pPr>
+            <w:r/>
+            <w:r>
+              <w:rPr>
+                <w:sz w:val="17"/>
+              </w:rPr>
+              <w:t>13.860 €</w:t>
+            </w:r>
+          </w:p>
+        </w:tc>
+        <w:tc>
+          <w:tcPr>
+            <w:tcW w:type="dxa" w:w="737"/>
+          </w:tcPr>
+          <w:p>
+            <w:pPr>
+              <w:keepNext/>
+              <w:spacing w:after="20" w:before="20"/>
+              <w:jc w:val="right"/>
+            </w:pPr>
+            <w:r/>
+            <w:r>
+              <w:rPr>
+                <w:sz w:val="17"/>
+              </w:rPr>
+              <w:t>14 %</w:t>
+            </w:r>
+          </w:p>
+        </w:tc>
+      </w:tr>
+      <w:tr>
+        <w:trPr>
+          <w:cantSplit/>
+        </w:trPr>
+        <w:tc>
+          <w:tcPr>
+            <w:tcW w:type="dxa" w:w="2608"/>
+          </w:tcPr>
+          <w:p>
+            <w:pPr>
+              <w:keepNext/>
+              <w:spacing w:after="20" w:before="20"/>
+            </w:pPr>
+            <w:r/>
+            <w:r>
+              <w:rPr>
+                <w:sz w:val="17"/>
+              </w:rPr>
+              <w:t>Feiern, Live-Abende, Séparée</w:t>
+            </w:r>
+          </w:p>
+        </w:tc>
+        <w:tc>
+          <w:tcPr>
+            <w:tcW w:type="dxa" w:w="2381"/>
+          </w:tcPr>
+          <w:p>
+            <w:pPr>
+              <w:keepNext/>
+              <w:spacing w:after="20" w:before="20"/>
+            </w:pPr>
+            <w:r/>
+            <w:r>
+              <w:rPr>
+                <w:sz w:val="17"/>
+              </w:rPr>
+              <w:t>nach Absprache, 4 pro Monat</w:t>
+            </w:r>
+          </w:p>
+        </w:tc>
+        <w:tc>
+          <w:tcPr>
+            <w:tcW w:type="dxa" w:w="680"/>
+          </w:tcPr>
+          <w:p>
+            <w:pPr>
+              <w:keepNext/>
+              <w:spacing w:after="20" w:before="20"/>
+              <w:jc w:val="right"/>
+            </w:pPr>
+            <w:r/>
+            <w:r>
+              <w:rPr>
+                <w:sz w:val="17"/>
+              </w:rPr>
+              <w:t>4</w:t>
+            </w:r>
+          </w:p>
+        </w:tc>
+        <w:tc>
+          <w:tcPr>
+            <w:tcW w:type="dxa" w:w="964"/>
+          </w:tcPr>
+          <w:p>
+            <w:pPr>
+              <w:keepNext/>
+              <w:spacing w:after="20" w:before="20"/>
+              <w:jc w:val="right"/>
+            </w:pPr>
+            <w:r/>
+            <w:r>
+              <w:rPr>
+                <w:sz w:val="17"/>
+              </w:rPr>
+              <w:t>40</w:t>
+            </w:r>
+          </w:p>
+        </w:tc>
+        <w:tc>
+          <w:tcPr>
+            <w:tcW w:type="dxa" w:w="794"/>
+          </w:tcPr>
+          <w:p>
+            <w:pPr>
+              <w:keepNext/>
+              <w:spacing w:after="20" w:before="20"/>
+              <w:jc w:val="right"/>
+            </w:pPr>
+            <w:r/>
+            <w:r>
+              <w:rPr>
+                <w:sz w:val="17"/>
+              </w:rPr>
+              <w:t>45 €</w:t>
+            </w:r>
+          </w:p>
+        </w:tc>
+        <w:tc>
+          <w:tcPr>
+            <w:tcW w:type="dxa" w:w="1247"/>
+          </w:tcPr>
+          <w:p>
+            <w:pPr>
+              <w:keepNext/>
+              <w:spacing w:after="20" w:before="20"/>
+              <w:jc w:val="right"/>
+            </w:pPr>
+            <w:r/>
+            <w:r>
+              <w:rPr>
+                <w:sz w:val="17"/>
+              </w:rPr>
+              <w:t>7.200 €</w:t>
+            </w:r>
+          </w:p>
+        </w:tc>
+        <w:tc>
+          <w:tcPr>
+            <w:tcW w:type="dxa" w:w="737"/>
+          </w:tcPr>
+          <w:p>
+            <w:pPr>
+              <w:keepNext/>
+              <w:spacing w:after="20" w:before="20"/>
+              <w:jc w:val="right"/>
+            </w:pPr>
+            <w:r/>
+            <w:r>
+              <w:rPr>
+                <w:sz w:val="17"/>
+              </w:rPr>
+              <w:t>8 %</w:t>
+            </w:r>
+          </w:p>
+        </w:tc>
+      </w:tr>
+      <w:tr>
+        <w:trPr>
+          <w:cantSplit/>
+        </w:trPr>
+        <w:tc>
+          <w:tcPr>
+            <w:tcW w:type="dxa" w:w="2608"/>
+            <w:shd w:val="clear" w:color="auto" w:fill="E3E8E5"/>
+          </w:tcPr>
+          <w:p>
+            <w:pPr>
+              <w:spacing w:after="20" w:before="20"/>
+            </w:pPr>
+            <w:r/>
+            <w:r>
+              <w:rPr>
+                <w:b/>
+                <w:sz w:val="17"/>
+              </w:rPr>
+              <w:t>Summe</w:t>
+            </w:r>
+          </w:p>
+        </w:tc>
+        <w:tc>
+          <w:tcPr>
+            <w:tcW w:type="dxa" w:w="2381"/>
+            <w:shd w:val="clear" w:color="auto" w:fill="E3E8E5"/>
+          </w:tcPr>
+          <w:p>
+            <w:pPr>
+              <w:spacing w:after="20" w:before="20"/>
+            </w:pPr>
+            <w:r/>
+            <w:r>
+              <w:rPr>
+                <w:b/>
+                <w:sz w:val="17"/>
+              </w:rPr>
+            </w:r>
+          </w:p>
+        </w:tc>
+        <w:tc>
+          <w:tcPr>
+            <w:tcW w:type="dxa" w:w="680"/>
+            <w:shd w:val="clear" w:color="auto" w:fill="E3E8E5"/>
+          </w:tcPr>
+          <w:p>
+            <w:pPr>
+              <w:spacing w:after="20" w:before="20"/>
+              <w:jc w:val="right"/>
+            </w:pPr>
+            <w:r/>
+            <w:r>
+              <w:rPr>
+                <w:b/>
+                <w:sz w:val="17"/>
+              </w:rPr>
+            </w:r>
+          </w:p>
+        </w:tc>
+        <w:tc>
+          <w:tcPr>
+            <w:tcW w:type="dxa" w:w="964"/>
+            <w:shd w:val="clear" w:color="auto" w:fill="E3E8E5"/>
+          </w:tcPr>
+          <w:p>
+            <w:pPr>
+              <w:spacing w:after="20" w:before="20"/>
+              <w:jc w:val="right"/>
+            </w:pPr>
+            <w:r/>
+            <w:r>
+              <w:rPr>
+                <w:b/>
+                <w:sz w:val="17"/>
+              </w:rPr>
+            </w:r>
+          </w:p>
+        </w:tc>
+        <w:tc>
+          <w:tcPr>
+            <w:tcW w:type="dxa" w:w="794"/>
+            <w:shd w:val="clear" w:color="auto" w:fill="E3E8E5"/>
+          </w:tcPr>
+          <w:p>
+            <w:pPr>
+              <w:spacing w:after="20" w:before="20"/>
+              <w:jc w:val="right"/>
+            </w:pPr>
+            <w:r/>
+            <w:r>
+              <w:rPr>
+                <w:b/>
+                <w:sz w:val="17"/>
+              </w:rPr>
+            </w:r>
+          </w:p>
+        </w:tc>
+        <w:tc>
+          <w:tcPr>
+            <w:tcW w:type="dxa" w:w="1247"/>
+            <w:shd w:val="clear" w:color="auto" w:fill="E3E8E5"/>
+          </w:tcPr>
+          <w:p>
+            <w:pPr>
+              <w:spacing w:after="20" w:before="20"/>
+              <w:jc w:val="right"/>
+            </w:pPr>
+            <w:r/>
+            <w:r>
+              <w:rPr>
+                <w:b/>
+                <w:sz w:val="17"/>
+              </w:rPr>
+              <w:t>95.635 €</w:t>
+            </w:r>
+          </w:p>
+        </w:tc>
+        <w:tc>
+          <w:tcPr>
+            <w:tcW w:type="dxa" w:w="737"/>
+            <w:shd w:val="clear" w:color="auto" w:fill="E3E8E5"/>
+          </w:tcPr>
+          <w:p>
+            <w:pPr>
+              <w:spacing w:after="20" w:before="20"/>
+              <w:jc w:val="right"/>
+            </w:pPr>
+            <w:r/>
+            <w:r>
+              <w:rPr>
+                <w:b/>
+                <w:sz w:val="17"/>
+              </w:rPr>
+              <w:t>100 %</w:t>
             </w:r>
           </w:p>
         </w:tc>
@@ -5222,7 +6513,7 @@
               <w:rPr>
                 <w:sz w:val="18"/>
               </w:rPr>
-              <w:t>40.000 €</w:t>
+              <w:t>50.000 €</w:t>
             </w:r>
           </w:p>
         </w:tc>
@@ -5241,7 +6532,7 @@
               <w:rPr>
                 <w:sz w:val="18"/>
               </w:rPr>
-              <w:t>12.200 €</w:t>
+              <w:t>15.250 €</w:t>
             </w:r>
           </w:p>
         </w:tc>
@@ -5260,7 +6551,7 @@
               <w:rPr>
                 <w:sz w:val="18"/>
               </w:rPr>
-              <w:t>+7.100 €</w:t>
+              <w:t>+10.150 €</w:t>
             </w:r>
           </w:p>
         </w:tc>
@@ -5283,7 +6574,7 @@
               <w:rPr>
                 <w:sz w:val="18"/>
               </w:rPr>
-              <w:t>50.000 €</w:t>
+              <w:t>65.000 €</w:t>
             </w:r>
           </w:p>
         </w:tc>
@@ -5302,7 +6593,7 @@
               <w:rPr>
                 <w:sz w:val="18"/>
               </w:rPr>
-              <w:t>15.250 €</w:t>
+              <w:t>19.825 €</w:t>
             </w:r>
           </w:p>
         </w:tc>
@@ -5321,7 +6612,7 @@
               <w:rPr>
                 <w:sz w:val="18"/>
               </w:rPr>
-              <w:t>+10.150 €</w:t>
+              <w:t>+14.725 €</w:t>
             </w:r>
           </w:p>
         </w:tc>
@@ -5333,27 +6624,24 @@
         <w:tc>
           <w:tcPr>
             <w:tcW w:type="dxa" w:w="2835"/>
-            <w:shd w:val="clear" w:color="auto" w:fill="E3E8E5"/>
-          </w:tcPr>
-          <w:p>
-            <w:pPr>
-              <w:keepNext/>
-              <w:spacing w:after="20" w:before="20"/>
-            </w:pPr>
-            <w:r/>
-            <w:r>
-              <w:rPr>
-                <w:b/>
-                <w:sz w:val="18"/>
-              </w:rPr>
-              <w:t>65.000 €</w:t>
+          </w:tcPr>
+          <w:p>
+            <w:pPr>
+              <w:keepNext/>
+              <w:spacing w:after="20" w:before="20"/>
+            </w:pPr>
+            <w:r/>
+            <w:r>
+              <w:rPr>
+                <w:sz w:val="18"/>
+              </w:rPr>
+              <w:t>80.000 €</w:t>
             </w:r>
           </w:p>
         </w:tc>
         <w:tc>
           <w:tcPr>
             <w:tcW w:type="dxa" w:w="3288"/>
-            <w:shd w:val="clear" w:color="auto" w:fill="E3E8E5"/>
           </w:tcPr>
           <w:p>
             <w:pPr>
@@ -5364,17 +6652,15 @@
             <w:r/>
             <w:r>
               <w:rPr>
-                <w:b/>
-                <w:sz w:val="18"/>
-              </w:rPr>
-              <w:t>19.825 €</w:t>
+                <w:sz w:val="18"/>
+              </w:rPr>
+              <w:t>24.400 €</w:t>
             </w:r>
           </w:p>
         </w:tc>
         <w:tc>
           <w:tcPr>
             <w:tcW w:type="dxa" w:w="3288"/>
-            <w:shd w:val="clear" w:color="auto" w:fill="E3E8E5"/>
           </w:tcPr>
           <w:p>
             <w:pPr>
@@ -5385,10 +6671,9 @@
             <w:r/>
             <w:r>
               <w:rPr>
-                <w:b/>
-                <w:sz w:val="18"/>
-              </w:rPr>
-              <w:t>+14.725 €</w:t>
+                <w:sz w:val="18"/>
+              </w:rPr>
+              <w:t>+19.300 €</w:t>
             </w:r>
           </w:p>
         </w:tc>
@@ -5400,24 +6685,27 @@
         <w:tc>
           <w:tcPr>
             <w:tcW w:type="dxa" w:w="2835"/>
-          </w:tcPr>
-          <w:p>
-            <w:pPr>
-              <w:keepNext/>
-              <w:spacing w:after="20" w:before="20"/>
-            </w:pPr>
-            <w:r/>
-            <w:r>
-              <w:rPr>
-                <w:sz w:val="18"/>
-              </w:rPr>
-              <w:t>80.000 €</w:t>
+            <w:shd w:val="clear" w:color="auto" w:fill="E3E8E5"/>
+          </w:tcPr>
+          <w:p>
+            <w:pPr>
+              <w:keepNext/>
+              <w:spacing w:after="20" w:before="20"/>
+            </w:pPr>
+            <w:r/>
+            <w:r>
+              <w:rPr>
+                <w:b/>
+                <w:sz w:val="18"/>
+              </w:rPr>
+              <w:t>95.635 €</w:t>
             </w:r>
           </w:p>
         </w:tc>
         <w:tc>
           <w:tcPr>
             <w:tcW w:type="dxa" w:w="3288"/>
+            <w:shd w:val="clear" w:color="auto" w:fill="E3E8E5"/>
           </w:tcPr>
           <w:p>
             <w:pPr>
@@ -5428,15 +6716,17 @@
             <w:r/>
             <w:r>
               <w:rPr>
-                <w:sz w:val="18"/>
-              </w:rPr>
-              <w:t>24.400 €</w:t>
+                <w:b/>
+                <w:sz w:val="18"/>
+              </w:rPr>
+              <w:t>29.169 €</w:t>
             </w:r>
           </w:p>
         </w:tc>
         <w:tc>
           <w:tcPr>
             <w:tcW w:type="dxa" w:w="3288"/>
+            <w:shd w:val="clear" w:color="auto" w:fill="E3E8E5"/>
           </w:tcPr>
           <w:p>
             <w:pPr>
@@ -5447,9 +6737,10 @@
             <w:r/>
             <w:r>
               <w:rPr>
-                <w:sz w:val="18"/>
-              </w:rPr>
-              <w:t>+19.300 €</w:t>
+                <w:b/>
+                <w:sz w:val="18"/>
+              </w:rPr>
+              <w:t>+24.069 €</w:t>
             </w:r>
           </w:p>
         </w:tc>
@@ -5471,7 +6762,7 @@
               <w:rPr>
                 <w:sz w:val="18"/>
               </w:rPr>
-              <w:t>90.000 €</w:t>
+              <w:t>110.000 €</w:t>
             </w:r>
           </w:p>
         </w:tc>
@@ -5489,7 +6780,7 @@
               <w:rPr>
                 <w:sz w:val="18"/>
               </w:rPr>
-              <w:t>27.450 €</w:t>
+              <w:t>33.550 €</w:t>
             </w:r>
           </w:p>
         </w:tc>
@@ -5507,7 +6798,7 @@
               <w:rPr>
                 <w:sz w:val="18"/>
               </w:rPr>
-              <w:t>+22.350 €</w:t>
+              <w:t>+28.450 €</w:t>
             </w:r>
           </w:p>
         </w:tc>
@@ -9346,7 +10637,7 @@
               <w:rPr>
                 <w:sz w:val="18"/>
               </w:rPr>
-              <w:t>Betriebsergebnis Gastro nach Pacht (65.000 € Umsatz)</w:t>
+              <w:t>Betriebsergebnis Gastro nach Pacht (95.635 € Umsatz)</w:t>
             </w:r>
           </w:p>
         </w:tc>
@@ -9365,7 +10656,7 @@
               <w:rPr>
                 <w:sz w:val="18"/>
               </w:rPr>
-              <w:t>+14.725 €</w:t>
+              <w:t>+24.069 €</w:t>
             </w:r>
           </w:p>
         </w:tc>
@@ -9384,7 +10675,7 @@
               <w:rPr>
                 <w:sz w:val="18"/>
               </w:rPr>
-              <w:t>+176.700 €</w:t>
+              <w:t>+288.824 €</w:t>
             </w:r>
           </w:p>
         </w:tc>
@@ -9430,7 +10721,7 @@
                 <w:b/>
                 <w:sz w:val="18"/>
               </w:rPr>
-              <w:t>+27.344 €</w:t>
+              <w:t>+36.687 €</w:t>
             </w:r>
           </w:p>
         </w:tc>
@@ -9451,7 +10742,7 @@
                 <w:b/>
                 <w:sz w:val="18"/>
               </w:rPr>
-              <w:t>+328.122 €</w:t>
+              <w:t>+440.246 €</w:t>
             </w:r>
           </w:p>
         </w:tc>
@@ -9556,7 +10847,7 @@
                 <w:b/>
                 <w:sz w:val="18"/>
               </w:rPr>
-              <w:t>+9.610 €</w:t>
+              <w:t>+18.954 €</w:t>
             </w:r>
           </w:p>
         </w:tc>
@@ -9576,7 +10867,7 @@
                 <w:b/>
                 <w:sz w:val="18"/>
               </w:rPr>
-              <w:t>+115.322 €</w:t>
+              <w:t>+227.446 €</w:t>
             </w:r>
           </w:p>
         </w:tc>
@@ -9599,7 +10890,7 @@
         <w:t xml:space="preserve">Kapitaldienstdeckung (DSCR): </w:t>
       </w:r>
       <w:r>
-        <w:t>1,54 gesamt, 0,71 nur aus Miete, Büro und Pacht, 0,45 nur aus Wohnen und Büro. Banken verlangen meist mindestens 1,2.</w:t>
+        <w:t>2,07 gesamt, 0,71 nur aus Miete, Büro und Pacht, 0,45 nur aus Wohnen und Büro. Banken verlangen meist mindestens 1,2.</w:t>
       </w:r>
     </w:p>
     <w:p>
@@ -9614,7 +10905,7 @@
         <w:t xml:space="preserve">Zinsdeckung: </w:t>
       </w:r>
       <w:r>
-        <w:t>2,01 (Ertrag vor Kapitaldienst im Verhältnis zu den Zinsen).</w:t>
+        <w:t>2,69 (Ertrag vor Kapitaldienst im Verhältnis zu den Zinsen).</w:t>
       </w:r>
     </w:p>
     <w:p>
@@ -10688,7 +11979,7 @@
               <w:rPr>
                 <w:sz w:val="17"/>
               </w:rPr>
-              <w:t>328.122 €</w:t>
+              <w:t>440.246 €</w:t>
             </w:r>
           </w:p>
         </w:tc>
@@ -10707,7 +11998,7 @@
               <w:rPr>
                 <w:sz w:val="17"/>
               </w:rPr>
-              <w:t>338.216 €</w:t>
+              <w:t>453.729 €</w:t>
             </w:r>
           </w:p>
         </w:tc>
@@ -10726,7 +12017,7 @@
               <w:rPr>
                 <w:sz w:val="17"/>
               </w:rPr>
-              <w:t>348.621 €</w:t>
+              <w:t>467.626 €</w:t>
             </w:r>
           </w:p>
         </w:tc>
@@ -10745,7 +12036,7 @@
               <w:rPr>
                 <w:sz w:val="17"/>
               </w:rPr>
-              <w:t>359.349 €</w:t>
+              <w:t>481.950 €</w:t>
             </w:r>
           </w:p>
         </w:tc>
@@ -10764,7 +12055,7 @@
               <w:rPr>
                 <w:sz w:val="17"/>
               </w:rPr>
-              <w:t>376.065 €</w:t>
+              <w:t>504.267 €</w:t>
             </w:r>
           </w:p>
         </w:tc>
@@ -10928,7 +12219,7 @@
                 <w:b/>
                 <w:sz w:val="17"/>
               </w:rPr>
-              <w:t>115.322 €</w:t>
+              <w:t>227.446 €</w:t>
             </w:r>
           </w:p>
         </w:tc>
@@ -10949,7 +12240,7 @@
                 <w:b/>
                 <w:sz w:val="17"/>
               </w:rPr>
-              <w:t>125.415 €</w:t>
+              <w:t>240.928 €</w:t>
             </w:r>
           </w:p>
         </w:tc>
@@ -10970,7 +12261,7 @@
                 <w:b/>
                 <w:sz w:val="17"/>
               </w:rPr>
-              <w:t>135.821 €</w:t>
+              <w:t>254.825 €</w:t>
             </w:r>
           </w:p>
         </w:tc>
@@ -10991,7 +12282,7 @@
                 <w:b/>
                 <w:sz w:val="17"/>
               </w:rPr>
-              <w:t>146.548 €</w:t>
+              <w:t>269.150 €</w:t>
             </w:r>
           </w:p>
         </w:tc>
@@ -11012,7 +12303,7 @@
                 <w:b/>
                 <w:sz w:val="17"/>
               </w:rPr>
-              <w:t>163.265 €</w:t>
+              <w:t>291.467 €</w:t>
             </w:r>
           </w:p>
         </w:tc>
@@ -11054,7 +12345,7 @@
               <w:rPr>
                 <w:sz w:val="17"/>
               </w:rPr>
-              <w:t>1,54</w:t>
+              <w:t>2,07</w:t>
             </w:r>
           </w:p>
         </w:tc>
@@ -11073,7 +12364,7 @@
               <w:rPr>
                 <w:sz w:val="17"/>
               </w:rPr>
-              <w:t>1,59</w:t>
+              <w:t>2,13</w:t>
             </w:r>
           </w:p>
         </w:tc>
@@ -11092,7 +12383,7 @@
               <w:rPr>
                 <w:sz w:val="17"/>
               </w:rPr>
-              <w:t>1,64</w:t>
+              <w:t>2,20</w:t>
             </w:r>
           </w:p>
         </w:tc>
@@ -11111,7 +12402,7 @@
               <w:rPr>
                 <w:sz w:val="17"/>
               </w:rPr>
-              <w:t>1,69</w:t>
+              <w:t>2,26</w:t>
             </w:r>
           </w:p>
         </w:tc>
@@ -11130,7 +12421,7 @@
               <w:rPr>
                 <w:sz w:val="17"/>
               </w:rPr>
-              <w:t>1,77</w:t>
+              <w:t>2,37</w:t>
             </w:r>
           </w:p>
         </w:tc>
@@ -11261,7 +12552,7 @@
           <w:color w:val="5B6770"/>
           <w:sz w:val="18"/>
         </w:rPr>
-        <w:t>Annahme: Miete, Pacht und Gastro-Umsatz steigen um 1,5 % pro Jahr, Büromieten um 2 % (Indexmiete), der Kapitaldienst bleibt gleich. Die Kapitaldienstdeckung verbessert sich von 1,54 auf 1,77 in Jahr 10.</w:t>
+        <w:t>Annahme: Miete, Pacht und Gastro-Umsatz steigen um 1,5 % pro Jahr, Büromieten um 2 % (Indexmiete), der Kapitaldienst bleibt gleich. Die Kapitaldienstdeckung verbessert sich von 2,07 auf 2,37 in Jahr 10.</w:t>
       </w:r>
     </w:p>
     <w:tbl>
@@ -11419,7 +12710,7 @@
                 <w:b/>
                 <w:sz w:val="18"/>
               </w:rPr>
-              <w:t>+9.610 €</w:t>
+              <w:t>+18.954 €</w:t>
             </w:r>
           </w:p>
         </w:tc>
@@ -11440,7 +12731,7 @@
                 <w:b/>
                 <w:sz w:val="18"/>
               </w:rPr>
-              <w:t>1,54</w:t>
+              <w:t>2,07</w:t>
             </w:r>
           </w:p>
         </w:tc>
@@ -11502,7 +12793,7 @@
               <w:rPr>
                 <w:sz w:val="18"/>
               </w:rPr>
-              <w:t>+6.053 €</w:t>
+              <w:t>+15.396 €</w:t>
             </w:r>
           </w:p>
         </w:tc>
@@ -11521,7 +12812,7 @@
               <w:rPr>
                 <w:sz w:val="18"/>
               </w:rPr>
-              <w:t>1,28</w:t>
+              <w:t>1,72</w:t>
             </w:r>
           </w:p>
         </w:tc>
@@ -11582,7 +12873,7 @@
               <w:rPr>
                 <w:sz w:val="18"/>
               </w:rPr>
-              <w:t>+8.951 €</w:t>
+              <w:t>+18.295 €</w:t>
             </w:r>
           </w:p>
         </w:tc>
@@ -11601,7 +12892,7 @@
               <w:rPr>
                 <w:sz w:val="18"/>
               </w:rPr>
-              <w:t>1,50</w:t>
+              <w:t>2,03</w:t>
             </w:r>
           </w:p>
         </w:tc>
@@ -11662,7 +12953,7 @@
               <w:rPr>
                 <w:sz w:val="18"/>
               </w:rPr>
-              <w:t>+5.645 €</w:t>
+              <w:t>+13.120 €</w:t>
             </w:r>
           </w:p>
         </w:tc>
@@ -11681,7 +12972,7 @@
               <w:rPr>
                 <w:sz w:val="18"/>
               </w:rPr>
-              <w:t>1,32</w:t>
+              <w:t>1,74</w:t>
             </w:r>
           </w:p>
         </w:tc>
@@ -11700,7 +12991,7 @@
               <w:rPr>
                 <w:sz w:val="18"/>
               </w:rPr>
-              <w:t>−3.965 €</w:t>
+              <w:t>−5.834 €</w:t>
             </w:r>
           </w:p>
         </w:tc>
@@ -11742,7 +13033,7 @@
               <w:rPr>
                 <w:sz w:val="18"/>
               </w:rPr>
-              <w:t>+1.680 €</w:t>
+              <w:t>+7.286 €</w:t>
             </w:r>
           </w:p>
         </w:tc>
@@ -11761,7 +13052,7 @@
               <w:rPr>
                 <w:sz w:val="18"/>
               </w:rPr>
-              <w:t>1,09</w:t>
+              <w:t>1,41</w:t>
             </w:r>
           </w:p>
         </w:tc>
@@ -11780,7 +13071,7 @@
               <w:rPr>
                 <w:sz w:val="18"/>
               </w:rPr>
-              <w:t>−7.930 €</w:t>
+              <w:t>−11.667 €</w:t>
             </w:r>
           </w:p>
         </w:tc>
@@ -11822,7 +13113,7 @@
               <w:rPr>
                 <w:sz w:val="18"/>
               </w:rPr>
-              <w:t>+8.152 €</w:t>
+              <w:t>+17.495 €</w:t>
             </w:r>
           </w:p>
         </w:tc>
@@ -11841,7 +13132,7 @@
               <w:rPr>
                 <w:sz w:val="18"/>
               </w:rPr>
-              <w:t>1,42</w:t>
+              <w:t>1,91</w:t>
             </w:r>
           </w:p>
         </w:tc>
@@ -11902,7 +13193,7 @@
               <w:rPr>
                 <w:sz w:val="18"/>
               </w:rPr>
-              <w:t>+8.755 €</w:t>
+              <w:t>+18.099 €</w:t>
             </w:r>
           </w:p>
         </w:tc>
@@ -11921,7 +13212,7 @@
               <w:rPr>
                 <w:sz w:val="18"/>
               </w:rPr>
-              <w:t>1,49</w:t>
+              <w:t>2,02</w:t>
             </w:r>
           </w:p>
         </w:tc>
@@ -11982,7 +13273,7 @@
               <w:rPr>
                 <w:sz w:val="18"/>
               </w:rPr>
-              <w:t>+8.170 €</w:t>
+              <w:t>+17.514 €</w:t>
             </w:r>
           </w:p>
         </w:tc>
@@ -12001,7 +13292,7 @@
               <w:rPr>
                 <w:sz w:val="18"/>
               </w:rPr>
-              <w:t>1,46</w:t>
+              <w:t>1,99</w:t>
             </w:r>
           </w:p>
         </w:tc>
@@ -12096,7 +13387,7 @@
               <w:rPr>
                 <w:sz w:val="18"/>
               </w:rPr>
-              <w:t>−19.315 €</w:t>
+              <w:t>−28.659 €</w:t>
             </w:r>
           </w:p>
         </w:tc>
@@ -12116,7 +13407,7 @@
           <w:b w:val="0"/>
           <w:i w:val="0"/>
         </w:rPr>
-        <w:t>Die Tests sind vereinfacht. Das Ergebnis reagiert am stärksten auf den Gastro-Umsatz und die Pacht. Bei einem Umsatz −40 % ist die Kapitaldienstdeckung knapp über 1,0, bei einem Ausfall der Gastro reicht der Ertrag nicht mehr für die Raten. Ein Auszug eines Ankermieters ist verkraftbar.</w:t>
+        <w:t>Die Tests sind vereinfacht. Das Ergebnis reagiert am stärksten auf den Gastro-Umsatz und die Pacht. Bei einem Umsatz −40 % liegt die Kapitaldienstdeckung noch über 1,4, bei einem Ausfall der Gastro reicht der Ertrag nicht mehr für die Raten. Ein Auszug eines Ankermieters ist verkraftbar.</w:t>
       </w:r>
     </w:p>
     <w:p>
@@ -12942,7 +14233,7 @@
               <w:rPr>
                 <w:sz w:val="17"/>
               </w:rPr>
-              <w:t>Haus ab ca. 33.000 € Umsatz im Plus; bei Ausfall der Gastro fehlen ca. 19.315 € pro Monat</w:t>
+              <w:t>Haus ab ca. 33.000 € Umsatz im Plus; bei Ausfall der Gastro fehlen ca. 28.659 € pro Monat</w:t>
             </w:r>
           </w:p>
         </w:tc>

</xml_diff>

<commit_message>
Gastro-Konzept: Frühstück und Bowls tagsüber, abends Bar mit Snacks; Umsatzmodell, Flächen, Personal angepasst
Co-Authored-By: Claude Sonnet 5.5 <noreply@anthropic.com>
Claude-Session: https://claude.ai/code/session_01HJGZfxHv7bzYyqdLwg8aFJ
</commit_message>
<xml_diff>
--- a/praesentation/Businessplan_Baufeld3_Neue-Mitte-Werlte.docx
+++ b/praesentation/Businessplan_Baufeld3_Neue-Mitte-Werlte.docx
@@ -665,7 +665,7 @@
               <w:rPr>
                 <w:sz w:val="19"/>
               </w:rPr>
-              <w:t>36.687 €</w:t>
+              <w:t>27.347 €</w:t>
             </w:r>
           </w:p>
         </w:tc>
@@ -707,7 +707,7 @@
               <w:rPr>
                 <w:sz w:val="19"/>
               </w:rPr>
-              <w:t>+18.954 €</w:t>
+              <w:t>+9.613 €</w:t>
             </w:r>
           </w:p>
         </w:tc>
@@ -749,7 +749,7 @@
               <w:rPr>
                 <w:sz w:val="19"/>
               </w:rPr>
-              <w:t>2,07 gesamt, 0,71 nur Immobilie</w:t>
+              <w:t>1,54 gesamt, 0,71 nur Immobilie</w:t>
             </w:r>
           </w:p>
         </w:tc>
@@ -909,7 +909,7 @@
         <w:t xml:space="preserve">Der Ertrag trägt die Raten, aber nur mit der Gastro. </w:t>
       </w:r>
       <w:r>
-        <w:t>Mit dem Gastro-Gewinn liegt die Kapitaldienstdeckung bei 2,07. Allein aus Miete, Büromiete und Pacht wären es 0,71, aus Wohnen und Büro allein 0,45.</w:t>
+        <w:t>Mit dem Gastro-Gewinn liegt die Kapitaldienstdeckung bei 1,54. Allein aus Miete, Büromiete und Pacht wären es 0,71, aus Wohnen und Büro allein 0,45.</w:t>
       </w:r>
     </w:p>
     <w:p>
@@ -1365,7 +1365,7 @@
               <w:rPr>
                 <w:sz w:val="18"/>
               </w:rPr>
-              <w:t>ca. 6–8 auf dem Grundstück, Bedarf ca. 55</w:t>
+              <w:t>ca. 6–8 auf dem Grundstück, Bedarf ca. 57</w:t>
             </w:r>
           </w:p>
         </w:tc>
@@ -1601,7 +1601,7 @@
               <w:rPr>
                 <w:sz w:val="18"/>
               </w:rPr>
-              <w:t>Gastro mit Bar, Séparée, Küche</w:t>
+              <w:t>Gastro mit Bar, Séparée, kleiner Küche</w:t>
             </w:r>
           </w:p>
         </w:tc>
@@ -3674,7 +3674,7 @@
           <w:b w:val="0"/>
           <w:i w:val="0"/>
         </w:rPr>
-        <w:t>Die Grundfläche wurde auf das zulässige Maximum von 576 m² (GRZ 0,6 × 960 m²) vergrößert. Das Erdgeschoss gehört vollständig der Gastro, abzüglich Treppenhaus, Aufzug und Eingängen (66 m²) bleiben 510 m². Die Größe ist aus dem Platzbedarf abgeleitet: 160 Plätze im Gastraum und 30 im Séparée brauchen mit Bar, Küche, Lager, WC und Eingang genau diese Fläche. Das sind 2,7 m² je Platz (Richtwert 2,5 bis 3 m²).</w:t>
+        <w:t>Die Grundfläche wurde auf das zulässige Maximum von 576 m² (GRZ 0,6 × 960 m²) vergrößert. Das Erdgeschoss gehört vollständig der Gastro, abzüglich Treppenhaus, Aufzug und Eingängen (66 m²) bleiben 510 m². Die Größe ist aus dem Platzbedarf abgeleitet: 160 Plätze im Gastraum und 30 im Séparée brauchen mit großer Bar, kleiner Küche, Lager, WC und Eingang genau diese Fläche. Das sind 2,7 m² je Platz (Richtwert 2,5 bis 3 m²).</w:t>
       </w:r>
     </w:p>
     <w:tbl>
@@ -3946,7 +3946,7 @@
               <w:rPr>
                 <w:sz w:val="18"/>
               </w:rPr>
-              <w:t>25 m²</w:t>
+              <w:t>45 m²</w:t>
             </w:r>
           </w:p>
         </w:tc>
@@ -3969,7 +3969,7 @@
               <w:rPr>
                 <w:sz w:val="18"/>
               </w:rPr>
-              <w:t>Küche mit Spülküche</w:t>
+              <w:t>Küche (Bowls, Snacks) mit Spülküche</w:t>
             </w:r>
           </w:p>
         </w:tc>
@@ -4007,7 +4007,7 @@
               <w:rPr>
                 <w:sz w:val="18"/>
               </w:rPr>
-              <w:t>55 m²</w:t>
+              <w:t>35 m²</w:t>
             </w:r>
           </w:p>
         </w:tc>
@@ -4273,7 +4273,7 @@
           <w:b w:val="0"/>
           <w:i w:val="0"/>
         </w:rPr>
-        <w:t>Der Gastro-Umsatz von 95.635 € im Monat entspricht ca. 6.040 € je Sitzplatz und Jahr. Zum Vergleich: Der Median in Österreich liegt für Betriebe mit weniger als 100 Plätzen bei ca. 12.000 € (Fitness-Check Gastronomie 2026). Die Annahme liegt damit deutlich unter dem Branchen-Median. Die Pacht von 10 €/m² entspricht 5,3 % vom Umsatz (üblich 6 bis 12 %).</w:t>
+        <w:t>Der Gastro-Umsatz von 65.010 € im Monat entspricht ca. 4.106 € je Sitzplatz und Jahr. Zum Vergleich: Der Median in Österreich liegt für Betriebe mit weniger als 100 Plätzen bei ca. 12.000 € (Fitness-Check Gastronomie 2026). Die Annahme liegt damit deutlich unter dem Branchen-Median. Die Pacht von 10 €/m² entspricht 7,8 % vom Umsatz (üblich 6 bis 12 %).</w:t>
       </w:r>
     </w:p>
     <w:p>
@@ -4793,7 +4793,7 @@
           <w:b w:val="0"/>
           <w:i w:val="0"/>
         </w:rPr>
-        <w:t>Die Gastro nutzt das ganze Erdgeschoss (ca. 510 m²) als Bar-Restaurant für den ganzen Tag mit dem Hauptfokus auf dem Abend. Morgens gibt es Frühstück (am Wochenende Brunch), mittags einen Mittagstisch für Beschäftigte aus Rathaus und Umgebung. Ab dem späten Nachmittag wird das Haus zum Abendrestaurant mit regionaler, moderner Küche, ab 21 Uhr zur Bar mit Cocktails, Wein, Bier und leiser Musik (Fr und Sa bis 01 Uhr). Dazu kommen Feiern, Live-Abende und Themenabende im Séparée (abgetrennter Raum mit 30 Plätzen). Die Gestaltung folgt dem Referenzbild des Bauherrn: olivgrüne Vertäfelung, Cognac-Samtbanketten, Eiche, anthrazitfarbene Theke, Stahl-Glas-Trennwand und warmes Licht.</w:t>
+        <w:t>Die Gastro nutzt das ganze Erdgeschoss (ca. 510 m²) als Café und Bar für den ganzen Tag mit dem Hauptfokus auf dem Abend. Morgens gibt es Frühstück (am Wochenende Brunch), mittags Bowls, Salate und Suppe für Beschäftigte aus Rathaus und Umgebung, nachmittags Kaffee und Kuchen. Ab 17 Uhr wird das Haus zur Bar mit Cocktails, Wein, Bier und einer kleinen Snackkarte (Fr und Sa bis 01 Uhr), eine große Restaurantküche gibt es nicht. Dazu kommen Live-Musik, Feiern und Themenabende im Séparée (abgetrennter Raum mit 30 Plätzen). Die Gestaltung folgt dem Referenzbild des Bauherrn: olivgrüne Vertäfelung, Cognac-Samtbanketten, Eiche, anthrazitfarbene Theke, Stahl-Glas-Trennwand und warmes Licht.</w:t>
       </w:r>
     </w:p>
     <w:tbl>
@@ -4981,7 +4981,7 @@
               <w:rPr>
                 <w:sz w:val="18"/>
               </w:rPr>
-              <w:t>95.635 € pro Monat (netto), davon 75 % am Abend, ca. 6.000 € je Sitzplatz und Jahr</w:t>
+              <w:t>65.010 € pro Monat (netto), davon 61 % am Abend, ca. 4.100 € je Sitzplatz und Jahr</w:t>
             </w:r>
           </w:p>
         </w:tc>
@@ -5063,7 +5063,7 @@
               <w:rPr>
                 <w:sz w:val="18"/>
               </w:rPr>
-              <w:t>10 €/m², 5.100 € pro Monat (ca. 5,3 % vom Umsatz)</w:t>
+              <w:t>10 €/m², 5.100 € pro Monat (ca. 7,8 % vom Umsatz)</w:t>
             </w:r>
           </w:p>
         </w:tc>
@@ -5122,7 +5122,7 @@
           <w:b w:val="0"/>
           <w:i w:val="0"/>
         </w:rPr>
-        <w:t>Der Umsatz setzt sich aus Tagesteilen zusammen. Der Abend (Restaurant, Bar, Feiern) bringt 75 % des Umsatzes, Frühstück und Mittag füllen das Haus am Tag. Öffnungstage, Gäste und Bon sind Annahmen, es liegen keine Marktdaten für Werlte vor.</w:t>
+        <w:t>Der Umsatz setzt sich aus Tagesteilen zusammen. Der Abend (Bar mit Snacks, Events) bringt 61 % des Umsatzes, Frühstück, Bowls und Kaffee füllen das Haus am Tag. Öffnungstage, Gäste und Bon sind Annahmen, es liegen keine Marktdaten für Werlte vor.</w:t>
       </w:r>
     </w:p>
     <w:tbl>
@@ -5381,7 +5381,7 @@
               <w:rPr>
                 <w:sz w:val="17"/>
               </w:rPr>
-              <w:t>25</w:t>
+              <w:t>30</w:t>
             </w:r>
           </w:p>
         </w:tc>
@@ -5419,7 +5419,7 @@
               <w:rPr>
                 <w:sz w:val="17"/>
               </w:rPr>
-              <w:t>4.675 €</w:t>
+              <w:t>5.610 €</w:t>
             </w:r>
           </w:p>
         </w:tc>
@@ -5438,7 +5438,7 @@
               <w:rPr>
                 <w:sz w:val="17"/>
               </w:rPr>
-              <w:t>5 %</w:t>
+              <w:t>9 %</w:t>
             </w:r>
           </w:p>
         </w:tc>
@@ -5574,7 +5574,7 @@
               <w:rPr>
                 <w:sz w:val="17"/>
               </w:rPr>
-              <w:t>8 %</w:t>
+              <w:t>12 %</w:t>
             </w:r>
           </w:p>
         </w:tc>
@@ -5597,7 +5597,7 @@
               <w:rPr>
                 <w:sz w:val="17"/>
               </w:rPr>
-              <w:t>Mittagstisch</w:t>
+              <w:t>Mittag: Bowls, Salate, Suppe</w:t>
             </w:r>
           </w:p>
         </w:tc>
@@ -5653,7 +5653,7 @@
               <w:rPr>
                 <w:sz w:val="17"/>
               </w:rPr>
-              <w:t>50</w:t>
+              <w:t>40</w:t>
             </w:r>
           </w:p>
         </w:tc>
@@ -5672,7 +5672,7 @@
               <w:rPr>
                 <w:sz w:val="17"/>
               </w:rPr>
-              <w:t>14 €</w:t>
+              <w:t>13 €</w:t>
             </w:r>
           </w:p>
         </w:tc>
@@ -5691,7 +5691,7 @@
               <w:rPr>
                 <w:sz w:val="17"/>
               </w:rPr>
-              <w:t>11.900 €</w:t>
+              <w:t>8.840 €</w:t>
             </w:r>
           </w:p>
         </w:tc>
@@ -5710,7 +5710,7 @@
               <w:rPr>
                 <w:sz w:val="17"/>
               </w:rPr>
-              <w:t>12 %</w:t>
+              <w:t>14 %</w:t>
             </w:r>
           </w:p>
         </w:tc>
@@ -5733,7 +5733,7 @@
               <w:rPr>
                 <w:sz w:val="17"/>
               </w:rPr>
-              <w:t>Abendessen Restaurant</w:t>
+              <w:t>Nachmittag: Kaffee, Kuchen, Snacks</w:t>
             </w:r>
           </w:p>
         </w:tc>
@@ -5751,7 +5751,7 @@
               <w:rPr>
                 <w:sz w:val="17"/>
               </w:rPr>
-              <w:t>Di–So 17:30–22:00</w:t>
+              <w:t>Di–So 14:30–17:00</w:t>
             </w:r>
           </w:p>
         </w:tc>
@@ -5789,7 +5789,7 @@
               <w:rPr>
                 <w:sz w:val="17"/>
               </w:rPr>
-              <w:t>55</w:t>
+              <w:t>20</w:t>
             </w:r>
           </w:p>
         </w:tc>
@@ -5808,7 +5808,7 @@
               <w:rPr>
                 <w:sz w:val="17"/>
               </w:rPr>
-              <w:t>32 €</w:t>
+              <w:t>7 €</w:t>
             </w:r>
           </w:p>
         </w:tc>
@@ -5827,7 +5827,7 @@
               <w:rPr>
                 <w:sz w:val="17"/>
               </w:rPr>
-              <w:t>45.760 €</w:t>
+              <w:t>3.640 €</w:t>
             </w:r>
           </w:p>
         </w:tc>
@@ -5846,7 +5846,7 @@
               <w:rPr>
                 <w:sz w:val="17"/>
               </w:rPr>
-              <w:t>48 %</w:t>
+              <w:t>6 %</w:t>
             </w:r>
           </w:p>
         </w:tc>
@@ -5869,7 +5869,7 @@
               <w:rPr>
                 <w:sz w:val="17"/>
               </w:rPr>
-              <w:t>Bar Di–Do</w:t>
+              <w:t>Bar mit Snacks Di–Do, So</w:t>
             </w:r>
           </w:p>
         </w:tc>
@@ -5887,7 +5887,7 @@
               <w:rPr>
                 <w:sz w:val="17"/>
               </w:rPr>
-              <w:t>ab 21:00</w:t>
+              <w:t>ab 17:00</w:t>
             </w:r>
           </w:p>
         </w:tc>
@@ -5906,7 +5906,7 @@
               <w:rPr>
                 <w:sz w:val="17"/>
               </w:rPr>
-              <w:t>13</w:t>
+              <w:t>17</w:t>
             </w:r>
           </w:p>
         </w:tc>
@@ -5925,7 +5925,7 @@
               <w:rPr>
                 <w:sz w:val="17"/>
               </w:rPr>
-              <w:t>20</w:t>
+              <w:t>35</w:t>
             </w:r>
           </w:p>
         </w:tc>
@@ -5944,7 +5944,7 @@
               <w:rPr>
                 <w:sz w:val="17"/>
               </w:rPr>
-              <w:t>18 €</w:t>
+              <w:t>20 €</w:t>
             </w:r>
           </w:p>
         </w:tc>
@@ -5963,7 +5963,7 @@
               <w:rPr>
                 <w:sz w:val="17"/>
               </w:rPr>
-              <w:t>4.680 €</w:t>
+              <w:t>11.900 €</w:t>
             </w:r>
           </w:p>
         </w:tc>
@@ -5982,7 +5982,7 @@
               <w:rPr>
                 <w:sz w:val="17"/>
               </w:rPr>
-              <w:t>5 %</w:t>
+              <w:t>18 %</w:t>
             </w:r>
           </w:p>
         </w:tc>
@@ -6023,7 +6023,7 @@
               <w:rPr>
                 <w:sz w:val="17"/>
               </w:rPr>
-              <w:t>Cocktails, Wein, Bier, Musik</w:t>
+              <w:t>Cocktails, Wein, Bier, Snacks</w:t>
             </w:r>
           </w:p>
         </w:tc>
@@ -6061,7 +6061,7 @@
               <w:rPr>
                 <w:sz w:val="17"/>
               </w:rPr>
-              <w:t>70</w:t>
+              <w:t>90</w:t>
             </w:r>
           </w:p>
         </w:tc>
@@ -6080,7 +6080,7 @@
               <w:rPr>
                 <w:sz w:val="17"/>
               </w:rPr>
-              <w:t>22 €</w:t>
+              <w:t>26 €</w:t>
             </w:r>
           </w:p>
         </w:tc>
@@ -6099,7 +6099,7 @@
               <w:rPr>
                 <w:sz w:val="17"/>
               </w:rPr>
-              <w:t>13.860 €</w:t>
+              <w:t>21.060 €</w:t>
             </w:r>
           </w:p>
         </w:tc>
@@ -6118,7 +6118,7 @@
               <w:rPr>
                 <w:sz w:val="17"/>
               </w:rPr>
-              <w:t>14 %</w:t>
+              <w:t>32 %</w:t>
             </w:r>
           </w:p>
         </w:tc>
@@ -6141,7 +6141,7 @@
               <w:rPr>
                 <w:sz w:val="17"/>
               </w:rPr>
-              <w:t>Feiern, Live-Abende, Séparée</w:t>
+              <w:t>Events: Live-Musik, Feiern</w:t>
             </w:r>
           </w:p>
         </w:tc>
@@ -6216,7 +6216,7 @@
               <w:rPr>
                 <w:sz w:val="17"/>
               </w:rPr>
-              <w:t>45 €</w:t>
+              <w:t>40 €</w:t>
             </w:r>
           </w:p>
         </w:tc>
@@ -6235,7 +6235,7 @@
               <w:rPr>
                 <w:sz w:val="17"/>
               </w:rPr>
-              <w:t>7.200 €</w:t>
+              <w:t>6.400 €</w:t>
             </w:r>
           </w:p>
         </w:tc>
@@ -6254,7 +6254,7 @@
               <w:rPr>
                 <w:sz w:val="17"/>
               </w:rPr>
-              <w:t>8 %</w:t>
+              <w:t>10 %</w:t>
             </w:r>
           </w:p>
         </w:tc>
@@ -6373,7 +6373,7 @@
                 <w:b/>
                 <w:sz w:val="17"/>
               </w:rPr>
-              <w:t>95.635 €</w:t>
+              <w:t>65.010 €</w:t>
             </w:r>
           </w:p>
         </w:tc>
@@ -6513,7 +6513,7 @@
               <w:rPr>
                 <w:sz w:val="18"/>
               </w:rPr>
-              <w:t>50.000 €</w:t>
+              <w:t>40.000 €</w:t>
             </w:r>
           </w:p>
         </w:tc>
@@ -6532,7 +6532,7 @@
               <w:rPr>
                 <w:sz w:val="18"/>
               </w:rPr>
-              <w:t>15.250 €</w:t>
+              <w:t>12.200 €</w:t>
             </w:r>
           </w:p>
         </w:tc>
@@ -6551,7 +6551,7 @@
               <w:rPr>
                 <w:sz w:val="18"/>
               </w:rPr>
-              <w:t>+10.150 €</w:t>
+              <w:t>+7.100 €</w:t>
             </w:r>
           </w:p>
         </w:tc>
@@ -6574,7 +6574,7 @@
               <w:rPr>
                 <w:sz w:val="18"/>
               </w:rPr>
-              <w:t>65.000 €</w:t>
+              <w:t>50.000 €</w:t>
             </w:r>
           </w:p>
         </w:tc>
@@ -6593,7 +6593,7 @@
               <w:rPr>
                 <w:sz w:val="18"/>
               </w:rPr>
-              <w:t>19.825 €</w:t>
+              <w:t>15.250 €</w:t>
             </w:r>
           </w:p>
         </w:tc>
@@ -6612,7 +6612,7 @@
               <w:rPr>
                 <w:sz w:val="18"/>
               </w:rPr>
-              <w:t>+14.725 €</w:t>
+              <w:t>+10.150 €</w:t>
             </w:r>
           </w:p>
         </w:tc>
@@ -6624,24 +6624,27 @@
         <w:tc>
           <w:tcPr>
             <w:tcW w:type="dxa" w:w="2835"/>
-          </w:tcPr>
-          <w:p>
-            <w:pPr>
-              <w:keepNext/>
-              <w:spacing w:after="20" w:before="20"/>
-            </w:pPr>
-            <w:r/>
-            <w:r>
-              <w:rPr>
-                <w:sz w:val="18"/>
-              </w:rPr>
-              <w:t>80.000 €</w:t>
+            <w:shd w:val="clear" w:color="auto" w:fill="E3E8E5"/>
+          </w:tcPr>
+          <w:p>
+            <w:pPr>
+              <w:keepNext/>
+              <w:spacing w:after="20" w:before="20"/>
+            </w:pPr>
+            <w:r/>
+            <w:r>
+              <w:rPr>
+                <w:b/>
+                <w:sz w:val="18"/>
+              </w:rPr>
+              <w:t>65.010 €</w:t>
             </w:r>
           </w:p>
         </w:tc>
         <w:tc>
           <w:tcPr>
             <w:tcW w:type="dxa" w:w="3288"/>
+            <w:shd w:val="clear" w:color="auto" w:fill="E3E8E5"/>
           </w:tcPr>
           <w:p>
             <w:pPr>
@@ -6652,15 +6655,17 @@
             <w:r/>
             <w:r>
               <w:rPr>
-                <w:sz w:val="18"/>
-              </w:rPr>
-              <w:t>24.400 €</w:t>
+                <w:b/>
+                <w:sz w:val="18"/>
+              </w:rPr>
+              <w:t>19.828 €</w:t>
             </w:r>
           </w:p>
         </w:tc>
         <w:tc>
           <w:tcPr>
             <w:tcW w:type="dxa" w:w="3288"/>
+            <w:shd w:val="clear" w:color="auto" w:fill="E3E8E5"/>
           </w:tcPr>
           <w:p>
             <w:pPr>
@@ -6671,9 +6676,10 @@
             <w:r/>
             <w:r>
               <w:rPr>
-                <w:sz w:val="18"/>
-              </w:rPr>
-              <w:t>+19.300 €</w:t>
+                <w:b/>
+                <w:sz w:val="18"/>
+              </w:rPr>
+              <w:t>+14.728 €</w:t>
             </w:r>
           </w:p>
         </w:tc>
@@ -6685,27 +6691,24 @@
         <w:tc>
           <w:tcPr>
             <w:tcW w:type="dxa" w:w="2835"/>
-            <w:shd w:val="clear" w:color="auto" w:fill="E3E8E5"/>
-          </w:tcPr>
-          <w:p>
-            <w:pPr>
-              <w:keepNext/>
-              <w:spacing w:after="20" w:before="20"/>
-            </w:pPr>
-            <w:r/>
-            <w:r>
-              <w:rPr>
-                <w:b/>
-                <w:sz w:val="18"/>
-              </w:rPr>
-              <w:t>95.635 €</w:t>
+          </w:tcPr>
+          <w:p>
+            <w:pPr>
+              <w:keepNext/>
+              <w:spacing w:after="20" w:before="20"/>
+            </w:pPr>
+            <w:r/>
+            <w:r>
+              <w:rPr>
+                <w:sz w:val="18"/>
+              </w:rPr>
+              <w:t>80.000 €</w:t>
             </w:r>
           </w:p>
         </w:tc>
         <w:tc>
           <w:tcPr>
             <w:tcW w:type="dxa" w:w="3288"/>
-            <w:shd w:val="clear" w:color="auto" w:fill="E3E8E5"/>
           </w:tcPr>
           <w:p>
             <w:pPr>
@@ -6716,17 +6719,15 @@
             <w:r/>
             <w:r>
               <w:rPr>
-                <w:b/>
-                <w:sz w:val="18"/>
-              </w:rPr>
-              <w:t>29.169 €</w:t>
+                <w:sz w:val="18"/>
+              </w:rPr>
+              <w:t>24.400 €</w:t>
             </w:r>
           </w:p>
         </w:tc>
         <w:tc>
           <w:tcPr>
             <w:tcW w:type="dxa" w:w="3288"/>
-            <w:shd w:val="clear" w:color="auto" w:fill="E3E8E5"/>
           </w:tcPr>
           <w:p>
             <w:pPr>
@@ -6737,10 +6738,9 @@
             <w:r/>
             <w:r>
               <w:rPr>
-                <w:b/>
-                <w:sz w:val="18"/>
-              </w:rPr>
-              <w:t>+24.069 €</w:t>
+                <w:sz w:val="18"/>
+              </w:rPr>
+              <w:t>+19.300 €</w:t>
             </w:r>
           </w:p>
         </w:tc>
@@ -6762,7 +6762,7 @@
               <w:rPr>
                 <w:sz w:val="18"/>
               </w:rPr>
-              <w:t>110.000 €</w:t>
+              <w:t>95.000 €</w:t>
             </w:r>
           </w:p>
         </w:tc>
@@ -6780,7 +6780,7 @@
               <w:rPr>
                 <w:sz w:val="18"/>
               </w:rPr>
-              <w:t>33.550 €</w:t>
+              <w:t>28.975 €</w:t>
             </w:r>
           </w:p>
         </w:tc>
@@ -6798,7 +6798,7 @@
               <w:rPr>
                 <w:sz w:val="18"/>
               </w:rPr>
-              <w:t>+28.450 €</w:t>
+              <w:t>+23.875 €</w:t>
             </w:r>
           </w:p>
         </w:tc>
@@ -10637,7 +10637,7 @@
               <w:rPr>
                 <w:sz w:val="18"/>
               </w:rPr>
-              <w:t>Betriebsergebnis Gastro nach Pacht (95.635 € Umsatz)</w:t>
+              <w:t>Betriebsergebnis Gastro nach Pacht (65.010 € Umsatz)</w:t>
             </w:r>
           </w:p>
         </w:tc>
@@ -10656,7 +10656,7 @@
               <w:rPr>
                 <w:sz w:val="18"/>
               </w:rPr>
-              <w:t>+24.069 €</w:t>
+              <w:t>+14.728 €</w:t>
             </w:r>
           </w:p>
         </w:tc>
@@ -10675,7 +10675,7 @@
               <w:rPr>
                 <w:sz w:val="18"/>
               </w:rPr>
-              <w:t>+288.824 €</w:t>
+              <w:t>+176.737 €</w:t>
             </w:r>
           </w:p>
         </w:tc>
@@ -10721,7 +10721,7 @@
                 <w:b/>
                 <w:sz w:val="18"/>
               </w:rPr>
-              <w:t>+36.687 €</w:t>
+              <w:t>+27.347 €</w:t>
             </w:r>
           </w:p>
         </w:tc>
@@ -10742,7 +10742,7 @@
                 <w:b/>
                 <w:sz w:val="18"/>
               </w:rPr>
-              <w:t>+440.246 €</w:t>
+              <w:t>+328.159 €</w:t>
             </w:r>
           </w:p>
         </w:tc>
@@ -10847,7 +10847,7 @@
                 <w:b/>
                 <w:sz w:val="18"/>
               </w:rPr>
-              <w:t>+18.954 €</w:t>
+              <w:t>+9.613 €</w:t>
             </w:r>
           </w:p>
         </w:tc>
@@ -10867,7 +10867,7 @@
                 <w:b/>
                 <w:sz w:val="18"/>
               </w:rPr>
-              <w:t>+227.446 €</w:t>
+              <w:t>+115.359 €</w:t>
             </w:r>
           </w:p>
         </w:tc>
@@ -10890,7 +10890,7 @@
         <w:t xml:space="preserve">Kapitaldienstdeckung (DSCR): </w:t>
       </w:r>
       <w:r>
-        <w:t>2,07 gesamt, 0,71 nur aus Miete, Büro und Pacht, 0,45 nur aus Wohnen und Büro. Banken verlangen meist mindestens 1,2.</w:t>
+        <w:t>1,54 gesamt, 0,71 nur aus Miete, Büro und Pacht, 0,45 nur aus Wohnen und Büro. Banken verlangen meist mindestens 1,2.</w:t>
       </w:r>
     </w:p>
     <w:p>
@@ -10905,7 +10905,7 @@
         <w:t xml:space="preserve">Zinsdeckung: </w:t>
       </w:r>
       <w:r>
-        <w:t>2,69 (Ertrag vor Kapitaldienst im Verhältnis zu den Zinsen).</w:t>
+        <w:t>2,01 (Ertrag vor Kapitaldienst im Verhältnis zu den Zinsen).</w:t>
       </w:r>
     </w:p>
     <w:p>
@@ -11979,7 +11979,7 @@
               <w:rPr>
                 <w:sz w:val="17"/>
               </w:rPr>
-              <w:t>440.246 €</w:t>
+              <w:t>328.159 €</w:t>
             </w:r>
           </w:p>
         </w:tc>
@@ -11998,7 +11998,7 @@
               <w:rPr>
                 <w:sz w:val="17"/>
               </w:rPr>
-              <w:t>453.729 €</w:t>
+              <w:t>338.253 €</w:t>
             </w:r>
           </w:p>
         </w:tc>
@@ -12017,7 +12017,7 @@
               <w:rPr>
                 <w:sz w:val="17"/>
               </w:rPr>
-              <w:t>467.626 €</w:t>
+              <w:t>348.660 €</w:t>
             </w:r>
           </w:p>
         </w:tc>
@@ -12036,7 +12036,7 @@
               <w:rPr>
                 <w:sz w:val="17"/>
               </w:rPr>
-              <w:t>481.950 €</w:t>
+              <w:t>359.389 €</w:t>
             </w:r>
           </w:p>
         </w:tc>
@@ -12055,7 +12055,7 @@
               <w:rPr>
                 <w:sz w:val="17"/>
               </w:rPr>
-              <w:t>504.267 €</w:t>
+              <w:t>376.107 €</w:t>
             </w:r>
           </w:p>
         </w:tc>
@@ -12219,7 +12219,7 @@
                 <w:b/>
                 <w:sz w:val="17"/>
               </w:rPr>
-              <w:t>227.446 €</w:t>
+              <w:t>115.359 €</w:t>
             </w:r>
           </w:p>
         </w:tc>
@@ -12240,7 +12240,7 @@
                 <w:b/>
                 <w:sz w:val="17"/>
               </w:rPr>
-              <w:t>240.928 €</w:t>
+              <w:t>125.453 €</w:t>
             </w:r>
           </w:p>
         </w:tc>
@@ -12261,7 +12261,7 @@
                 <w:b/>
                 <w:sz w:val="17"/>
               </w:rPr>
-              <w:t>254.825 €</w:t>
+              <w:t>135.860 €</w:t>
             </w:r>
           </w:p>
         </w:tc>
@@ -12282,7 +12282,7 @@
                 <w:b/>
                 <w:sz w:val="17"/>
               </w:rPr>
-              <w:t>269.150 €</w:t>
+              <w:t>146.588 €</w:t>
             </w:r>
           </w:p>
         </w:tc>
@@ -12303,7 +12303,7 @@
                 <w:b/>
                 <w:sz w:val="17"/>
               </w:rPr>
-              <w:t>291.467 €</w:t>
+              <w:t>163.307 €</w:t>
             </w:r>
           </w:p>
         </w:tc>
@@ -12345,7 +12345,7 @@
               <w:rPr>
                 <w:sz w:val="17"/>
               </w:rPr>
-              <w:t>2,07</w:t>
+              <w:t>1,54</w:t>
             </w:r>
           </w:p>
         </w:tc>
@@ -12364,7 +12364,7 @@
               <w:rPr>
                 <w:sz w:val="17"/>
               </w:rPr>
-              <w:t>2,13</w:t>
+              <w:t>1,59</w:t>
             </w:r>
           </w:p>
         </w:tc>
@@ -12383,7 +12383,7 @@
               <w:rPr>
                 <w:sz w:val="17"/>
               </w:rPr>
-              <w:t>2,20</w:t>
+              <w:t>1,64</w:t>
             </w:r>
           </w:p>
         </w:tc>
@@ -12402,7 +12402,7 @@
               <w:rPr>
                 <w:sz w:val="17"/>
               </w:rPr>
-              <w:t>2,26</w:t>
+              <w:t>1,69</w:t>
             </w:r>
           </w:p>
         </w:tc>
@@ -12421,7 +12421,7 @@
               <w:rPr>
                 <w:sz w:val="17"/>
               </w:rPr>
-              <w:t>2,37</w:t>
+              <w:t>1,77</w:t>
             </w:r>
           </w:p>
         </w:tc>
@@ -12552,7 +12552,7 @@
           <w:color w:val="5B6770"/>
           <w:sz w:val="18"/>
         </w:rPr>
-        <w:t>Annahme: Miete, Pacht und Gastro-Umsatz steigen um 1,5 % pro Jahr, Büromieten um 2 % (Indexmiete), der Kapitaldienst bleibt gleich. Die Kapitaldienstdeckung verbessert sich von 2,07 auf 2,37 in Jahr 10.</w:t>
+        <w:t>Annahme: Miete, Pacht und Gastro-Umsatz steigen um 1,5 % pro Jahr, Büromieten um 2 % (Indexmiete), der Kapitaldienst bleibt gleich. Die Kapitaldienstdeckung verbessert sich von 1,54 auf 1,77 in Jahr 10.</w:t>
       </w:r>
     </w:p>
     <w:tbl>
@@ -12710,7 +12710,7 @@
                 <w:b/>
                 <w:sz w:val="18"/>
               </w:rPr>
-              <w:t>+18.954 €</w:t>
+              <w:t>+9.613 €</w:t>
             </w:r>
           </w:p>
         </w:tc>
@@ -12731,7 +12731,7 @@
                 <w:b/>
                 <w:sz w:val="18"/>
               </w:rPr>
-              <w:t>2,07</w:t>
+              <w:t>1,54</w:t>
             </w:r>
           </w:p>
         </w:tc>
@@ -12793,7 +12793,7 @@
               <w:rPr>
                 <w:sz w:val="18"/>
               </w:rPr>
-              <w:t>+15.396 €</w:t>
+              <w:t>+6.056 €</w:t>
             </w:r>
           </w:p>
         </w:tc>
@@ -12812,7 +12812,7 @@
               <w:rPr>
                 <w:sz w:val="18"/>
               </w:rPr>
-              <w:t>1,72</w:t>
+              <w:t>1,28</w:t>
             </w:r>
           </w:p>
         </w:tc>
@@ -12873,7 +12873,7 @@
               <w:rPr>
                 <w:sz w:val="18"/>
               </w:rPr>
-              <w:t>+18.295 €</w:t>
+              <w:t>+8.954 €</w:t>
             </w:r>
           </w:p>
         </w:tc>
@@ -12892,7 +12892,7 @@
               <w:rPr>
                 <w:sz w:val="18"/>
               </w:rPr>
-              <w:t>2,03</w:t>
+              <w:t>1,50</w:t>
             </w:r>
           </w:p>
         </w:tc>
@@ -12953,7 +12953,7 @@
               <w:rPr>
                 <w:sz w:val="18"/>
               </w:rPr>
-              <w:t>+13.120 €</w:t>
+              <w:t>+5.648 €</w:t>
             </w:r>
           </w:p>
         </w:tc>
@@ -12972,7 +12972,7 @@
               <w:rPr>
                 <w:sz w:val="18"/>
               </w:rPr>
-              <w:t>1,74</w:t>
+              <w:t>1,32</w:t>
             </w:r>
           </w:p>
         </w:tc>
@@ -12991,7 +12991,7 @@
               <w:rPr>
                 <w:sz w:val="18"/>
               </w:rPr>
-              <w:t>−5.834 €</w:t>
+              <w:t>−3.966 €</w:t>
             </w:r>
           </w:p>
         </w:tc>
@@ -13033,7 +13033,7 @@
               <w:rPr>
                 <w:sz w:val="18"/>
               </w:rPr>
-              <w:t>+7.286 €</w:t>
+              <w:t>+1.682 €</w:t>
             </w:r>
           </w:p>
         </w:tc>
@@ -13052,7 +13052,7 @@
               <w:rPr>
                 <w:sz w:val="18"/>
               </w:rPr>
-              <w:t>1,41</w:t>
+              <w:t>1,09</w:t>
             </w:r>
           </w:p>
         </w:tc>
@@ -13071,7 +13071,7 @@
               <w:rPr>
                 <w:sz w:val="18"/>
               </w:rPr>
-              <w:t>−11.667 €</w:t>
+              <w:t>−7.931 €</w:t>
             </w:r>
           </w:p>
         </w:tc>
@@ -13113,7 +13113,7 @@
               <w:rPr>
                 <w:sz w:val="18"/>
               </w:rPr>
-              <w:t>+17.495 €</w:t>
+              <w:t>+8.155 €</w:t>
             </w:r>
           </w:p>
         </w:tc>
@@ -13132,7 +13132,7 @@
               <w:rPr>
                 <w:sz w:val="18"/>
               </w:rPr>
-              <w:t>1,91</w:t>
+              <w:t>1,42</w:t>
             </w:r>
           </w:p>
         </w:tc>
@@ -13193,7 +13193,7 @@
               <w:rPr>
                 <w:sz w:val="18"/>
               </w:rPr>
-              <w:t>+18.099 €</w:t>
+              <w:t>+8.758 €</w:t>
             </w:r>
           </w:p>
         </w:tc>
@@ -13212,7 +13212,7 @@
               <w:rPr>
                 <w:sz w:val="18"/>
               </w:rPr>
-              <w:t>2,02</w:t>
+              <w:t>1,49</w:t>
             </w:r>
           </w:p>
         </w:tc>
@@ -13273,7 +13273,7 @@
               <w:rPr>
                 <w:sz w:val="18"/>
               </w:rPr>
-              <w:t>+17.514 €</w:t>
+              <w:t>+8.173 €</w:t>
             </w:r>
           </w:p>
         </w:tc>
@@ -13292,7 +13292,7 @@
               <w:rPr>
                 <w:sz w:val="18"/>
               </w:rPr>
-              <w:t>1,99</w:t>
+              <w:t>1,46</w:t>
             </w:r>
           </w:p>
         </w:tc>
@@ -13387,7 +13387,7 @@
               <w:rPr>
                 <w:sz w:val="18"/>
               </w:rPr>
-              <w:t>−28.659 €</w:t>
+              <w:t>−19.318 €</w:t>
             </w:r>
           </w:p>
         </w:tc>
@@ -13407,7 +13407,7 @@
           <w:b w:val="0"/>
           <w:i w:val="0"/>
         </w:rPr>
-        <w:t>Die Tests sind vereinfacht. Das Ergebnis reagiert am stärksten auf den Gastro-Umsatz und die Pacht. Bei einem Umsatz −40 % liegt die Kapitaldienstdeckung noch über 1,4, bei einem Ausfall der Gastro reicht der Ertrag nicht mehr für die Raten. Ein Auszug eines Ankermieters ist verkraftbar.</w:t>
+        <w:t>Die Tests sind vereinfacht. Das Ergebnis reagiert am stärksten auf den Gastro-Umsatz und die Pacht. Bei einem Umsatz −40 % liegt die Kapitaldienstdeckung knapp über 1,0, bei einem Ausfall der Gastro reicht der Ertrag nicht mehr für die Raten. Ein Auszug eines Ankermieters ist verkraftbar.</w:t>
       </w:r>
     </w:p>
     <w:p>
@@ -14233,7 +14233,7 @@
               <w:rPr>
                 <w:sz w:val="17"/>
               </w:rPr>
-              <w:t>Haus ab ca. 33.000 € Umsatz im Plus; bei Ausfall der Gastro fehlen ca. 28.659 € pro Monat</w:t>
+              <w:t>Haus ab ca. 33.000 € Umsatz im Plus; bei Ausfall der Gastro fehlen ca. 19.318 € pro Monat</w:t>
             </w:r>
           </w:p>
         </w:tc>

</xml_diff>

<commit_message>
Revert "Gastro-Konzept: Frühstück und Bowls tagsüber, abends Bar mit Snacks; Umsatzmodell, Flächen, Personal angepasst"
This reverts commit 93b7f1f13931f73ad5737f3663b8d404f465e8a6.
</commit_message>
<xml_diff>
--- a/praesentation/Businessplan_Baufeld3_Neue-Mitte-Werlte.docx
+++ b/praesentation/Businessplan_Baufeld3_Neue-Mitte-Werlte.docx
@@ -665,7 +665,7 @@
               <w:rPr>
                 <w:sz w:val="19"/>
               </w:rPr>
-              <w:t>27.347 €</w:t>
+              <w:t>36.687 €</w:t>
             </w:r>
           </w:p>
         </w:tc>
@@ -707,7 +707,7 @@
               <w:rPr>
                 <w:sz w:val="19"/>
               </w:rPr>
-              <w:t>+9.613 €</w:t>
+              <w:t>+18.954 €</w:t>
             </w:r>
           </w:p>
         </w:tc>
@@ -749,7 +749,7 @@
               <w:rPr>
                 <w:sz w:val="19"/>
               </w:rPr>
-              <w:t>1,54 gesamt, 0,71 nur Immobilie</w:t>
+              <w:t>2,07 gesamt, 0,71 nur Immobilie</w:t>
             </w:r>
           </w:p>
         </w:tc>
@@ -909,7 +909,7 @@
         <w:t xml:space="preserve">Der Ertrag trägt die Raten, aber nur mit der Gastro. </w:t>
       </w:r>
       <w:r>
-        <w:t>Mit dem Gastro-Gewinn liegt die Kapitaldienstdeckung bei 1,54. Allein aus Miete, Büromiete und Pacht wären es 0,71, aus Wohnen und Büro allein 0,45.</w:t>
+        <w:t>Mit dem Gastro-Gewinn liegt die Kapitaldienstdeckung bei 2,07. Allein aus Miete, Büromiete und Pacht wären es 0,71, aus Wohnen und Büro allein 0,45.</w:t>
       </w:r>
     </w:p>
     <w:p>
@@ -1365,7 +1365,7 @@
               <w:rPr>
                 <w:sz w:val="18"/>
               </w:rPr>
-              <w:t>ca. 6–8 auf dem Grundstück, Bedarf ca. 57</w:t>
+              <w:t>ca. 6–8 auf dem Grundstück, Bedarf ca. 55</w:t>
             </w:r>
           </w:p>
         </w:tc>
@@ -1601,7 +1601,7 @@
               <w:rPr>
                 <w:sz w:val="18"/>
               </w:rPr>
-              <w:t>Gastro mit Bar, Séparée, kleiner Küche</w:t>
+              <w:t>Gastro mit Bar, Séparée, Küche</w:t>
             </w:r>
           </w:p>
         </w:tc>
@@ -3674,7 +3674,7 @@
           <w:b w:val="0"/>
           <w:i w:val="0"/>
         </w:rPr>
-        <w:t>Die Grundfläche wurde auf das zulässige Maximum von 576 m² (GRZ 0,6 × 960 m²) vergrößert. Das Erdgeschoss gehört vollständig der Gastro, abzüglich Treppenhaus, Aufzug und Eingängen (66 m²) bleiben 510 m². Die Größe ist aus dem Platzbedarf abgeleitet: 160 Plätze im Gastraum und 30 im Séparée brauchen mit großer Bar, kleiner Küche, Lager, WC und Eingang genau diese Fläche. Das sind 2,7 m² je Platz (Richtwert 2,5 bis 3 m²).</w:t>
+        <w:t>Die Grundfläche wurde auf das zulässige Maximum von 576 m² (GRZ 0,6 × 960 m²) vergrößert. Das Erdgeschoss gehört vollständig der Gastro, abzüglich Treppenhaus, Aufzug und Eingängen (66 m²) bleiben 510 m². Die Größe ist aus dem Platzbedarf abgeleitet: 160 Plätze im Gastraum und 30 im Séparée brauchen mit Bar, Küche, Lager, WC und Eingang genau diese Fläche. Das sind 2,7 m² je Platz (Richtwert 2,5 bis 3 m²).</w:t>
       </w:r>
     </w:p>
     <w:tbl>
@@ -3946,7 +3946,7 @@
               <w:rPr>
                 <w:sz w:val="18"/>
               </w:rPr>
-              <w:t>45 m²</w:t>
+              <w:t>25 m²</w:t>
             </w:r>
           </w:p>
         </w:tc>
@@ -3969,7 +3969,7 @@
               <w:rPr>
                 <w:sz w:val="18"/>
               </w:rPr>
-              <w:t>Küche (Bowls, Snacks) mit Spülküche</w:t>
+              <w:t>Küche mit Spülküche</w:t>
             </w:r>
           </w:p>
         </w:tc>
@@ -4007,7 +4007,7 @@
               <w:rPr>
                 <w:sz w:val="18"/>
               </w:rPr>
-              <w:t>35 m²</w:t>
+              <w:t>55 m²</w:t>
             </w:r>
           </w:p>
         </w:tc>
@@ -4273,7 +4273,7 @@
           <w:b w:val="0"/>
           <w:i w:val="0"/>
         </w:rPr>
-        <w:t>Der Gastro-Umsatz von 65.010 € im Monat entspricht ca. 4.106 € je Sitzplatz und Jahr. Zum Vergleich: Der Median in Österreich liegt für Betriebe mit weniger als 100 Plätzen bei ca. 12.000 € (Fitness-Check Gastronomie 2026). Die Annahme liegt damit deutlich unter dem Branchen-Median. Die Pacht von 10 €/m² entspricht 7,8 % vom Umsatz (üblich 6 bis 12 %).</w:t>
+        <w:t>Der Gastro-Umsatz von 95.635 € im Monat entspricht ca. 6.040 € je Sitzplatz und Jahr. Zum Vergleich: Der Median in Österreich liegt für Betriebe mit weniger als 100 Plätzen bei ca. 12.000 € (Fitness-Check Gastronomie 2026). Die Annahme liegt damit deutlich unter dem Branchen-Median. Die Pacht von 10 €/m² entspricht 5,3 % vom Umsatz (üblich 6 bis 12 %).</w:t>
       </w:r>
     </w:p>
     <w:p>
@@ -4793,7 +4793,7 @@
           <w:b w:val="0"/>
           <w:i w:val="0"/>
         </w:rPr>
-        <w:t>Die Gastro nutzt das ganze Erdgeschoss (ca. 510 m²) als Café und Bar für den ganzen Tag mit dem Hauptfokus auf dem Abend. Morgens gibt es Frühstück (am Wochenende Brunch), mittags Bowls, Salate und Suppe für Beschäftigte aus Rathaus und Umgebung, nachmittags Kaffee und Kuchen. Ab 17 Uhr wird das Haus zur Bar mit Cocktails, Wein, Bier und einer kleinen Snackkarte (Fr und Sa bis 01 Uhr), eine große Restaurantküche gibt es nicht. Dazu kommen Live-Musik, Feiern und Themenabende im Séparée (abgetrennter Raum mit 30 Plätzen). Die Gestaltung folgt dem Referenzbild des Bauherrn: olivgrüne Vertäfelung, Cognac-Samtbanketten, Eiche, anthrazitfarbene Theke, Stahl-Glas-Trennwand und warmes Licht.</w:t>
+        <w:t>Die Gastro nutzt das ganze Erdgeschoss (ca. 510 m²) als Bar-Restaurant für den ganzen Tag mit dem Hauptfokus auf dem Abend. Morgens gibt es Frühstück (am Wochenende Brunch), mittags einen Mittagstisch für Beschäftigte aus Rathaus und Umgebung. Ab dem späten Nachmittag wird das Haus zum Abendrestaurant mit regionaler, moderner Küche, ab 21 Uhr zur Bar mit Cocktails, Wein, Bier und leiser Musik (Fr und Sa bis 01 Uhr). Dazu kommen Feiern, Live-Abende und Themenabende im Séparée (abgetrennter Raum mit 30 Plätzen). Die Gestaltung folgt dem Referenzbild des Bauherrn: olivgrüne Vertäfelung, Cognac-Samtbanketten, Eiche, anthrazitfarbene Theke, Stahl-Glas-Trennwand und warmes Licht.</w:t>
       </w:r>
     </w:p>
     <w:tbl>
@@ -4981,7 +4981,7 @@
               <w:rPr>
                 <w:sz w:val="18"/>
               </w:rPr>
-              <w:t>65.010 € pro Monat (netto), davon 61 % am Abend, ca. 4.100 € je Sitzplatz und Jahr</w:t>
+              <w:t>95.635 € pro Monat (netto), davon 75 % am Abend, ca. 6.000 € je Sitzplatz und Jahr</w:t>
             </w:r>
           </w:p>
         </w:tc>
@@ -5063,7 +5063,7 @@
               <w:rPr>
                 <w:sz w:val="18"/>
               </w:rPr>
-              <w:t>10 €/m², 5.100 € pro Monat (ca. 7,8 % vom Umsatz)</w:t>
+              <w:t>10 €/m², 5.100 € pro Monat (ca. 5,3 % vom Umsatz)</w:t>
             </w:r>
           </w:p>
         </w:tc>
@@ -5122,7 +5122,7 @@
           <w:b w:val="0"/>
           <w:i w:val="0"/>
         </w:rPr>
-        <w:t>Der Umsatz setzt sich aus Tagesteilen zusammen. Der Abend (Bar mit Snacks, Events) bringt 61 % des Umsatzes, Frühstück, Bowls und Kaffee füllen das Haus am Tag. Öffnungstage, Gäste und Bon sind Annahmen, es liegen keine Marktdaten für Werlte vor.</w:t>
+        <w:t>Der Umsatz setzt sich aus Tagesteilen zusammen. Der Abend (Restaurant, Bar, Feiern) bringt 75 % des Umsatzes, Frühstück und Mittag füllen das Haus am Tag. Öffnungstage, Gäste und Bon sind Annahmen, es liegen keine Marktdaten für Werlte vor.</w:t>
       </w:r>
     </w:p>
     <w:tbl>
@@ -5381,7 +5381,7 @@
               <w:rPr>
                 <w:sz w:val="17"/>
               </w:rPr>
-              <w:t>30</w:t>
+              <w:t>25</w:t>
             </w:r>
           </w:p>
         </w:tc>
@@ -5419,7 +5419,7 @@
               <w:rPr>
                 <w:sz w:val="17"/>
               </w:rPr>
-              <w:t>5.610 €</w:t>
+              <w:t>4.675 €</w:t>
             </w:r>
           </w:p>
         </w:tc>
@@ -5438,7 +5438,7 @@
               <w:rPr>
                 <w:sz w:val="17"/>
               </w:rPr>
-              <w:t>9 %</w:t>
+              <w:t>5 %</w:t>
             </w:r>
           </w:p>
         </w:tc>
@@ -5574,7 +5574,7 @@
               <w:rPr>
                 <w:sz w:val="17"/>
               </w:rPr>
-              <w:t>12 %</w:t>
+              <w:t>8 %</w:t>
             </w:r>
           </w:p>
         </w:tc>
@@ -5597,7 +5597,7 @@
               <w:rPr>
                 <w:sz w:val="17"/>
               </w:rPr>
-              <w:t>Mittag: Bowls, Salate, Suppe</w:t>
+              <w:t>Mittagstisch</w:t>
             </w:r>
           </w:p>
         </w:tc>
@@ -5653,7 +5653,7 @@
               <w:rPr>
                 <w:sz w:val="17"/>
               </w:rPr>
-              <w:t>40</w:t>
+              <w:t>50</w:t>
             </w:r>
           </w:p>
         </w:tc>
@@ -5672,7 +5672,7 @@
               <w:rPr>
                 <w:sz w:val="17"/>
               </w:rPr>
-              <w:t>13 €</w:t>
+              <w:t>14 €</w:t>
             </w:r>
           </w:p>
         </w:tc>
@@ -5691,7 +5691,7 @@
               <w:rPr>
                 <w:sz w:val="17"/>
               </w:rPr>
-              <w:t>8.840 €</w:t>
+              <w:t>11.900 €</w:t>
             </w:r>
           </w:p>
         </w:tc>
@@ -5710,7 +5710,7 @@
               <w:rPr>
                 <w:sz w:val="17"/>
               </w:rPr>
-              <w:t>14 %</w:t>
+              <w:t>12 %</w:t>
             </w:r>
           </w:p>
         </w:tc>
@@ -5733,7 +5733,7 @@
               <w:rPr>
                 <w:sz w:val="17"/>
               </w:rPr>
-              <w:t>Nachmittag: Kaffee, Kuchen, Snacks</w:t>
+              <w:t>Abendessen Restaurant</w:t>
             </w:r>
           </w:p>
         </w:tc>
@@ -5751,7 +5751,7 @@
               <w:rPr>
                 <w:sz w:val="17"/>
               </w:rPr>
-              <w:t>Di–So 14:30–17:00</w:t>
+              <w:t>Di–So 17:30–22:00</w:t>
             </w:r>
           </w:p>
         </w:tc>
@@ -5789,7 +5789,7 @@
               <w:rPr>
                 <w:sz w:val="17"/>
               </w:rPr>
-              <w:t>20</w:t>
+              <w:t>55</w:t>
             </w:r>
           </w:p>
         </w:tc>
@@ -5808,7 +5808,7 @@
               <w:rPr>
                 <w:sz w:val="17"/>
               </w:rPr>
-              <w:t>7 €</w:t>
+              <w:t>32 €</w:t>
             </w:r>
           </w:p>
         </w:tc>
@@ -5827,7 +5827,7 @@
               <w:rPr>
                 <w:sz w:val="17"/>
               </w:rPr>
-              <w:t>3.640 €</w:t>
+              <w:t>45.760 €</w:t>
             </w:r>
           </w:p>
         </w:tc>
@@ -5846,7 +5846,7 @@
               <w:rPr>
                 <w:sz w:val="17"/>
               </w:rPr>
-              <w:t>6 %</w:t>
+              <w:t>48 %</w:t>
             </w:r>
           </w:p>
         </w:tc>
@@ -5869,7 +5869,7 @@
               <w:rPr>
                 <w:sz w:val="17"/>
               </w:rPr>
-              <w:t>Bar mit Snacks Di–Do, So</w:t>
+              <w:t>Bar Di–Do</w:t>
             </w:r>
           </w:p>
         </w:tc>
@@ -5887,7 +5887,7 @@
               <w:rPr>
                 <w:sz w:val="17"/>
               </w:rPr>
-              <w:t>ab 17:00</w:t>
+              <w:t>ab 21:00</w:t>
             </w:r>
           </w:p>
         </w:tc>
@@ -5906,7 +5906,7 @@
               <w:rPr>
                 <w:sz w:val="17"/>
               </w:rPr>
-              <w:t>17</w:t>
+              <w:t>13</w:t>
             </w:r>
           </w:p>
         </w:tc>
@@ -5925,7 +5925,7 @@
               <w:rPr>
                 <w:sz w:val="17"/>
               </w:rPr>
-              <w:t>35</w:t>
+              <w:t>20</w:t>
             </w:r>
           </w:p>
         </w:tc>
@@ -5944,7 +5944,7 @@
               <w:rPr>
                 <w:sz w:val="17"/>
               </w:rPr>
-              <w:t>20 €</w:t>
+              <w:t>18 €</w:t>
             </w:r>
           </w:p>
         </w:tc>
@@ -5963,7 +5963,7 @@
               <w:rPr>
                 <w:sz w:val="17"/>
               </w:rPr>
-              <w:t>11.900 €</w:t>
+              <w:t>4.680 €</w:t>
             </w:r>
           </w:p>
         </w:tc>
@@ -5982,7 +5982,7 @@
               <w:rPr>
                 <w:sz w:val="17"/>
               </w:rPr>
-              <w:t>18 %</w:t>
+              <w:t>5 %</w:t>
             </w:r>
           </w:p>
         </w:tc>
@@ -6023,7 +6023,7 @@
               <w:rPr>
                 <w:sz w:val="17"/>
               </w:rPr>
-              <w:t>Cocktails, Wein, Bier, Snacks</w:t>
+              <w:t>Cocktails, Wein, Bier, Musik</w:t>
             </w:r>
           </w:p>
         </w:tc>
@@ -6061,7 +6061,7 @@
               <w:rPr>
                 <w:sz w:val="17"/>
               </w:rPr>
-              <w:t>90</w:t>
+              <w:t>70</w:t>
             </w:r>
           </w:p>
         </w:tc>
@@ -6080,7 +6080,7 @@
               <w:rPr>
                 <w:sz w:val="17"/>
               </w:rPr>
-              <w:t>26 €</w:t>
+              <w:t>22 €</w:t>
             </w:r>
           </w:p>
         </w:tc>
@@ -6099,7 +6099,7 @@
               <w:rPr>
                 <w:sz w:val="17"/>
               </w:rPr>
-              <w:t>21.060 €</w:t>
+              <w:t>13.860 €</w:t>
             </w:r>
           </w:p>
         </w:tc>
@@ -6118,7 +6118,7 @@
               <w:rPr>
                 <w:sz w:val="17"/>
               </w:rPr>
-              <w:t>32 %</w:t>
+              <w:t>14 %</w:t>
             </w:r>
           </w:p>
         </w:tc>
@@ -6141,7 +6141,7 @@
               <w:rPr>
                 <w:sz w:val="17"/>
               </w:rPr>
-              <w:t>Events: Live-Musik, Feiern</w:t>
+              <w:t>Feiern, Live-Abende, Séparée</w:t>
             </w:r>
           </w:p>
         </w:tc>
@@ -6216,7 +6216,7 @@
               <w:rPr>
                 <w:sz w:val="17"/>
               </w:rPr>
-              <w:t>40 €</w:t>
+              <w:t>45 €</w:t>
             </w:r>
           </w:p>
         </w:tc>
@@ -6235,7 +6235,7 @@
               <w:rPr>
                 <w:sz w:val="17"/>
               </w:rPr>
-              <w:t>6.400 €</w:t>
+              <w:t>7.200 €</w:t>
             </w:r>
           </w:p>
         </w:tc>
@@ -6254,7 +6254,7 @@
               <w:rPr>
                 <w:sz w:val="17"/>
               </w:rPr>
-              <w:t>10 %</w:t>
+              <w:t>8 %</w:t>
             </w:r>
           </w:p>
         </w:tc>
@@ -6373,7 +6373,7 @@
                 <w:b/>
                 <w:sz w:val="17"/>
               </w:rPr>
-              <w:t>65.010 €</w:t>
+              <w:t>95.635 €</w:t>
             </w:r>
           </w:p>
         </w:tc>
@@ -6513,7 +6513,7 @@
               <w:rPr>
                 <w:sz w:val="18"/>
               </w:rPr>
-              <w:t>40.000 €</w:t>
+              <w:t>50.000 €</w:t>
             </w:r>
           </w:p>
         </w:tc>
@@ -6532,7 +6532,7 @@
               <w:rPr>
                 <w:sz w:val="18"/>
               </w:rPr>
-              <w:t>12.200 €</w:t>
+              <w:t>15.250 €</w:t>
             </w:r>
           </w:p>
         </w:tc>
@@ -6551,7 +6551,7 @@
               <w:rPr>
                 <w:sz w:val="18"/>
               </w:rPr>
-              <w:t>+7.100 €</w:t>
+              <w:t>+10.150 €</w:t>
             </w:r>
           </w:p>
         </w:tc>
@@ -6574,7 +6574,7 @@
               <w:rPr>
                 <w:sz w:val="18"/>
               </w:rPr>
-              <w:t>50.000 €</w:t>
+              <w:t>65.000 €</w:t>
             </w:r>
           </w:p>
         </w:tc>
@@ -6593,7 +6593,7 @@
               <w:rPr>
                 <w:sz w:val="18"/>
               </w:rPr>
-              <w:t>15.250 €</w:t>
+              <w:t>19.825 €</w:t>
             </w:r>
           </w:p>
         </w:tc>
@@ -6612,7 +6612,7 @@
               <w:rPr>
                 <w:sz w:val="18"/>
               </w:rPr>
-              <w:t>+10.150 €</w:t>
+              <w:t>+14.725 €</w:t>
             </w:r>
           </w:p>
         </w:tc>
@@ -6624,27 +6624,24 @@
         <w:tc>
           <w:tcPr>
             <w:tcW w:type="dxa" w:w="2835"/>
-            <w:shd w:val="clear" w:color="auto" w:fill="E3E8E5"/>
-          </w:tcPr>
-          <w:p>
-            <w:pPr>
-              <w:keepNext/>
-              <w:spacing w:after="20" w:before="20"/>
-            </w:pPr>
-            <w:r/>
-            <w:r>
-              <w:rPr>
-                <w:b/>
-                <w:sz w:val="18"/>
-              </w:rPr>
-              <w:t>65.010 €</w:t>
+          </w:tcPr>
+          <w:p>
+            <w:pPr>
+              <w:keepNext/>
+              <w:spacing w:after="20" w:before="20"/>
+            </w:pPr>
+            <w:r/>
+            <w:r>
+              <w:rPr>
+                <w:sz w:val="18"/>
+              </w:rPr>
+              <w:t>80.000 €</w:t>
             </w:r>
           </w:p>
         </w:tc>
         <w:tc>
           <w:tcPr>
             <w:tcW w:type="dxa" w:w="3288"/>
-            <w:shd w:val="clear" w:color="auto" w:fill="E3E8E5"/>
           </w:tcPr>
           <w:p>
             <w:pPr>
@@ -6655,17 +6652,15 @@
             <w:r/>
             <w:r>
               <w:rPr>
-                <w:b/>
-                <w:sz w:val="18"/>
-              </w:rPr>
-              <w:t>19.828 €</w:t>
+                <w:sz w:val="18"/>
+              </w:rPr>
+              <w:t>24.400 €</w:t>
             </w:r>
           </w:p>
         </w:tc>
         <w:tc>
           <w:tcPr>
             <w:tcW w:type="dxa" w:w="3288"/>
-            <w:shd w:val="clear" w:color="auto" w:fill="E3E8E5"/>
           </w:tcPr>
           <w:p>
             <w:pPr>
@@ -6676,10 +6671,9 @@
             <w:r/>
             <w:r>
               <w:rPr>
-                <w:b/>
-                <w:sz w:val="18"/>
-              </w:rPr>
-              <w:t>+14.728 €</w:t>
+                <w:sz w:val="18"/>
+              </w:rPr>
+              <w:t>+19.300 €</w:t>
             </w:r>
           </w:p>
         </w:tc>
@@ -6691,24 +6685,27 @@
         <w:tc>
           <w:tcPr>
             <w:tcW w:type="dxa" w:w="2835"/>
-          </w:tcPr>
-          <w:p>
-            <w:pPr>
-              <w:keepNext/>
-              <w:spacing w:after="20" w:before="20"/>
-            </w:pPr>
-            <w:r/>
-            <w:r>
-              <w:rPr>
-                <w:sz w:val="18"/>
-              </w:rPr>
-              <w:t>80.000 €</w:t>
+            <w:shd w:val="clear" w:color="auto" w:fill="E3E8E5"/>
+          </w:tcPr>
+          <w:p>
+            <w:pPr>
+              <w:keepNext/>
+              <w:spacing w:after="20" w:before="20"/>
+            </w:pPr>
+            <w:r/>
+            <w:r>
+              <w:rPr>
+                <w:b/>
+                <w:sz w:val="18"/>
+              </w:rPr>
+              <w:t>95.635 €</w:t>
             </w:r>
           </w:p>
         </w:tc>
         <w:tc>
           <w:tcPr>
             <w:tcW w:type="dxa" w:w="3288"/>
+            <w:shd w:val="clear" w:color="auto" w:fill="E3E8E5"/>
           </w:tcPr>
           <w:p>
             <w:pPr>
@@ -6719,15 +6716,17 @@
             <w:r/>
             <w:r>
               <w:rPr>
-                <w:sz w:val="18"/>
-              </w:rPr>
-              <w:t>24.400 €</w:t>
+                <w:b/>
+                <w:sz w:val="18"/>
+              </w:rPr>
+              <w:t>29.169 €</w:t>
             </w:r>
           </w:p>
         </w:tc>
         <w:tc>
           <w:tcPr>
             <w:tcW w:type="dxa" w:w="3288"/>
+            <w:shd w:val="clear" w:color="auto" w:fill="E3E8E5"/>
           </w:tcPr>
           <w:p>
             <w:pPr>
@@ -6738,9 +6737,10 @@
             <w:r/>
             <w:r>
               <w:rPr>
-                <w:sz w:val="18"/>
-              </w:rPr>
-              <w:t>+19.300 €</w:t>
+                <w:b/>
+                <w:sz w:val="18"/>
+              </w:rPr>
+              <w:t>+24.069 €</w:t>
             </w:r>
           </w:p>
         </w:tc>
@@ -6762,7 +6762,7 @@
               <w:rPr>
                 <w:sz w:val="18"/>
               </w:rPr>
-              <w:t>95.000 €</w:t>
+              <w:t>110.000 €</w:t>
             </w:r>
           </w:p>
         </w:tc>
@@ -6780,7 +6780,7 @@
               <w:rPr>
                 <w:sz w:val="18"/>
               </w:rPr>
-              <w:t>28.975 €</w:t>
+              <w:t>33.550 €</w:t>
             </w:r>
           </w:p>
         </w:tc>
@@ -6798,7 +6798,7 @@
               <w:rPr>
                 <w:sz w:val="18"/>
               </w:rPr>
-              <w:t>+23.875 €</w:t>
+              <w:t>+28.450 €</w:t>
             </w:r>
           </w:p>
         </w:tc>
@@ -10637,7 +10637,7 @@
               <w:rPr>
                 <w:sz w:val="18"/>
               </w:rPr>
-              <w:t>Betriebsergebnis Gastro nach Pacht (65.010 € Umsatz)</w:t>
+              <w:t>Betriebsergebnis Gastro nach Pacht (95.635 € Umsatz)</w:t>
             </w:r>
           </w:p>
         </w:tc>
@@ -10656,7 +10656,7 @@
               <w:rPr>
                 <w:sz w:val="18"/>
               </w:rPr>
-              <w:t>+14.728 €</w:t>
+              <w:t>+24.069 €</w:t>
             </w:r>
           </w:p>
         </w:tc>
@@ -10675,7 +10675,7 @@
               <w:rPr>
                 <w:sz w:val="18"/>
               </w:rPr>
-              <w:t>+176.737 €</w:t>
+              <w:t>+288.824 €</w:t>
             </w:r>
           </w:p>
         </w:tc>
@@ -10721,7 +10721,7 @@
                 <w:b/>
                 <w:sz w:val="18"/>
               </w:rPr>
-              <w:t>+27.347 €</w:t>
+              <w:t>+36.687 €</w:t>
             </w:r>
           </w:p>
         </w:tc>
@@ -10742,7 +10742,7 @@
                 <w:b/>
                 <w:sz w:val="18"/>
               </w:rPr>
-              <w:t>+328.159 €</w:t>
+              <w:t>+440.246 €</w:t>
             </w:r>
           </w:p>
         </w:tc>
@@ -10847,7 +10847,7 @@
                 <w:b/>
                 <w:sz w:val="18"/>
               </w:rPr>
-              <w:t>+9.613 €</w:t>
+              <w:t>+18.954 €</w:t>
             </w:r>
           </w:p>
         </w:tc>
@@ -10867,7 +10867,7 @@
                 <w:b/>
                 <w:sz w:val="18"/>
               </w:rPr>
-              <w:t>+115.359 €</w:t>
+              <w:t>+227.446 €</w:t>
             </w:r>
           </w:p>
         </w:tc>
@@ -10890,7 +10890,7 @@
         <w:t xml:space="preserve">Kapitaldienstdeckung (DSCR): </w:t>
       </w:r>
       <w:r>
-        <w:t>1,54 gesamt, 0,71 nur aus Miete, Büro und Pacht, 0,45 nur aus Wohnen und Büro. Banken verlangen meist mindestens 1,2.</w:t>
+        <w:t>2,07 gesamt, 0,71 nur aus Miete, Büro und Pacht, 0,45 nur aus Wohnen und Büro. Banken verlangen meist mindestens 1,2.</w:t>
       </w:r>
     </w:p>
     <w:p>
@@ -10905,7 +10905,7 @@
         <w:t xml:space="preserve">Zinsdeckung: </w:t>
       </w:r>
       <w:r>
-        <w:t>2,01 (Ertrag vor Kapitaldienst im Verhältnis zu den Zinsen).</w:t>
+        <w:t>2,69 (Ertrag vor Kapitaldienst im Verhältnis zu den Zinsen).</w:t>
       </w:r>
     </w:p>
     <w:p>
@@ -11979,7 +11979,7 @@
               <w:rPr>
                 <w:sz w:val="17"/>
               </w:rPr>
-              <w:t>328.159 €</w:t>
+              <w:t>440.246 €</w:t>
             </w:r>
           </w:p>
         </w:tc>
@@ -11998,7 +11998,7 @@
               <w:rPr>
                 <w:sz w:val="17"/>
               </w:rPr>
-              <w:t>338.253 €</w:t>
+              <w:t>453.729 €</w:t>
             </w:r>
           </w:p>
         </w:tc>
@@ -12017,7 +12017,7 @@
               <w:rPr>
                 <w:sz w:val="17"/>
               </w:rPr>
-              <w:t>348.660 €</w:t>
+              <w:t>467.626 €</w:t>
             </w:r>
           </w:p>
         </w:tc>
@@ -12036,7 +12036,7 @@
               <w:rPr>
                 <w:sz w:val="17"/>
               </w:rPr>
-              <w:t>359.389 €</w:t>
+              <w:t>481.950 €</w:t>
             </w:r>
           </w:p>
         </w:tc>
@@ -12055,7 +12055,7 @@
               <w:rPr>
                 <w:sz w:val="17"/>
               </w:rPr>
-              <w:t>376.107 €</w:t>
+              <w:t>504.267 €</w:t>
             </w:r>
           </w:p>
         </w:tc>
@@ -12219,7 +12219,7 @@
                 <w:b/>
                 <w:sz w:val="17"/>
               </w:rPr>
-              <w:t>115.359 €</w:t>
+              <w:t>227.446 €</w:t>
             </w:r>
           </w:p>
         </w:tc>
@@ -12240,7 +12240,7 @@
                 <w:b/>
                 <w:sz w:val="17"/>
               </w:rPr>
-              <w:t>125.453 €</w:t>
+              <w:t>240.928 €</w:t>
             </w:r>
           </w:p>
         </w:tc>
@@ -12261,7 +12261,7 @@
                 <w:b/>
                 <w:sz w:val="17"/>
               </w:rPr>
-              <w:t>135.860 €</w:t>
+              <w:t>254.825 €</w:t>
             </w:r>
           </w:p>
         </w:tc>
@@ -12282,7 +12282,7 @@
                 <w:b/>
                 <w:sz w:val="17"/>
               </w:rPr>
-              <w:t>146.588 €</w:t>
+              <w:t>269.150 €</w:t>
             </w:r>
           </w:p>
         </w:tc>
@@ -12303,7 +12303,7 @@
                 <w:b/>
                 <w:sz w:val="17"/>
               </w:rPr>
-              <w:t>163.307 €</w:t>
+              <w:t>291.467 €</w:t>
             </w:r>
           </w:p>
         </w:tc>
@@ -12345,7 +12345,7 @@
               <w:rPr>
                 <w:sz w:val="17"/>
               </w:rPr>
-              <w:t>1,54</w:t>
+              <w:t>2,07</w:t>
             </w:r>
           </w:p>
         </w:tc>
@@ -12364,7 +12364,7 @@
               <w:rPr>
                 <w:sz w:val="17"/>
               </w:rPr>
-              <w:t>1,59</w:t>
+              <w:t>2,13</w:t>
             </w:r>
           </w:p>
         </w:tc>
@@ -12383,7 +12383,7 @@
               <w:rPr>
                 <w:sz w:val="17"/>
               </w:rPr>
-              <w:t>1,64</w:t>
+              <w:t>2,20</w:t>
             </w:r>
           </w:p>
         </w:tc>
@@ -12402,7 +12402,7 @@
               <w:rPr>
                 <w:sz w:val="17"/>
               </w:rPr>
-              <w:t>1,69</w:t>
+              <w:t>2,26</w:t>
             </w:r>
           </w:p>
         </w:tc>
@@ -12421,7 +12421,7 @@
               <w:rPr>
                 <w:sz w:val="17"/>
               </w:rPr>
-              <w:t>1,77</w:t>
+              <w:t>2,37</w:t>
             </w:r>
           </w:p>
         </w:tc>
@@ -12552,7 +12552,7 @@
           <w:color w:val="5B6770"/>
           <w:sz w:val="18"/>
         </w:rPr>
-        <w:t>Annahme: Miete, Pacht und Gastro-Umsatz steigen um 1,5 % pro Jahr, Büromieten um 2 % (Indexmiete), der Kapitaldienst bleibt gleich. Die Kapitaldienstdeckung verbessert sich von 1,54 auf 1,77 in Jahr 10.</w:t>
+        <w:t>Annahme: Miete, Pacht und Gastro-Umsatz steigen um 1,5 % pro Jahr, Büromieten um 2 % (Indexmiete), der Kapitaldienst bleibt gleich. Die Kapitaldienstdeckung verbessert sich von 2,07 auf 2,37 in Jahr 10.</w:t>
       </w:r>
     </w:p>
     <w:tbl>
@@ -12710,7 +12710,7 @@
                 <w:b/>
                 <w:sz w:val="18"/>
               </w:rPr>
-              <w:t>+9.613 €</w:t>
+              <w:t>+18.954 €</w:t>
             </w:r>
           </w:p>
         </w:tc>
@@ -12731,7 +12731,7 @@
                 <w:b/>
                 <w:sz w:val="18"/>
               </w:rPr>
-              <w:t>1,54</w:t>
+              <w:t>2,07</w:t>
             </w:r>
           </w:p>
         </w:tc>
@@ -12793,7 +12793,7 @@
               <w:rPr>
                 <w:sz w:val="18"/>
               </w:rPr>
-              <w:t>+6.056 €</w:t>
+              <w:t>+15.396 €</w:t>
             </w:r>
           </w:p>
         </w:tc>
@@ -12812,7 +12812,7 @@
               <w:rPr>
                 <w:sz w:val="18"/>
               </w:rPr>
-              <w:t>1,28</w:t>
+              <w:t>1,72</w:t>
             </w:r>
           </w:p>
         </w:tc>
@@ -12873,7 +12873,7 @@
               <w:rPr>
                 <w:sz w:val="18"/>
               </w:rPr>
-              <w:t>+8.954 €</w:t>
+              <w:t>+18.295 €</w:t>
             </w:r>
           </w:p>
         </w:tc>
@@ -12892,7 +12892,7 @@
               <w:rPr>
                 <w:sz w:val="18"/>
               </w:rPr>
-              <w:t>1,50</w:t>
+              <w:t>2,03</w:t>
             </w:r>
           </w:p>
         </w:tc>
@@ -12953,7 +12953,7 @@
               <w:rPr>
                 <w:sz w:val="18"/>
               </w:rPr>
-              <w:t>+5.648 €</w:t>
+              <w:t>+13.120 €</w:t>
             </w:r>
           </w:p>
         </w:tc>
@@ -12972,7 +12972,7 @@
               <w:rPr>
                 <w:sz w:val="18"/>
               </w:rPr>
-              <w:t>1,32</w:t>
+              <w:t>1,74</w:t>
             </w:r>
           </w:p>
         </w:tc>
@@ -12991,7 +12991,7 @@
               <w:rPr>
                 <w:sz w:val="18"/>
               </w:rPr>
-              <w:t>−3.966 €</w:t>
+              <w:t>−5.834 €</w:t>
             </w:r>
           </w:p>
         </w:tc>
@@ -13033,7 +13033,7 @@
               <w:rPr>
                 <w:sz w:val="18"/>
               </w:rPr>
-              <w:t>+1.682 €</w:t>
+              <w:t>+7.286 €</w:t>
             </w:r>
           </w:p>
         </w:tc>
@@ -13052,7 +13052,7 @@
               <w:rPr>
                 <w:sz w:val="18"/>
               </w:rPr>
-              <w:t>1,09</w:t>
+              <w:t>1,41</w:t>
             </w:r>
           </w:p>
         </w:tc>
@@ -13071,7 +13071,7 @@
               <w:rPr>
                 <w:sz w:val="18"/>
               </w:rPr>
-              <w:t>−7.931 €</w:t>
+              <w:t>−11.667 €</w:t>
             </w:r>
           </w:p>
         </w:tc>
@@ -13113,7 +13113,7 @@
               <w:rPr>
                 <w:sz w:val="18"/>
               </w:rPr>
-              <w:t>+8.155 €</w:t>
+              <w:t>+17.495 €</w:t>
             </w:r>
           </w:p>
         </w:tc>
@@ -13132,7 +13132,7 @@
               <w:rPr>
                 <w:sz w:val="18"/>
               </w:rPr>
-              <w:t>1,42</w:t>
+              <w:t>1,91</w:t>
             </w:r>
           </w:p>
         </w:tc>
@@ -13193,7 +13193,7 @@
               <w:rPr>
                 <w:sz w:val="18"/>
               </w:rPr>
-              <w:t>+8.758 €</w:t>
+              <w:t>+18.099 €</w:t>
             </w:r>
           </w:p>
         </w:tc>
@@ -13212,7 +13212,7 @@
               <w:rPr>
                 <w:sz w:val="18"/>
               </w:rPr>
-              <w:t>1,49</w:t>
+              <w:t>2,02</w:t>
             </w:r>
           </w:p>
         </w:tc>
@@ -13273,7 +13273,7 @@
               <w:rPr>
                 <w:sz w:val="18"/>
               </w:rPr>
-              <w:t>+8.173 €</w:t>
+              <w:t>+17.514 €</w:t>
             </w:r>
           </w:p>
         </w:tc>
@@ -13292,7 +13292,7 @@
               <w:rPr>
                 <w:sz w:val="18"/>
               </w:rPr>
-              <w:t>1,46</w:t>
+              <w:t>1,99</w:t>
             </w:r>
           </w:p>
         </w:tc>
@@ -13387,7 +13387,7 @@
               <w:rPr>
                 <w:sz w:val="18"/>
               </w:rPr>
-              <w:t>−19.318 €</w:t>
+              <w:t>−28.659 €</w:t>
             </w:r>
           </w:p>
         </w:tc>
@@ -13407,7 +13407,7 @@
           <w:b w:val="0"/>
           <w:i w:val="0"/>
         </w:rPr>
-        <w:t>Die Tests sind vereinfacht. Das Ergebnis reagiert am stärksten auf den Gastro-Umsatz und die Pacht. Bei einem Umsatz −40 % liegt die Kapitaldienstdeckung knapp über 1,0, bei einem Ausfall der Gastro reicht der Ertrag nicht mehr für die Raten. Ein Auszug eines Ankermieters ist verkraftbar.</w:t>
+        <w:t>Die Tests sind vereinfacht. Das Ergebnis reagiert am stärksten auf den Gastro-Umsatz und die Pacht. Bei einem Umsatz −40 % liegt die Kapitaldienstdeckung noch über 1,4, bei einem Ausfall der Gastro reicht der Ertrag nicht mehr für die Raten. Ein Auszug eines Ankermieters ist verkraftbar.</w:t>
       </w:r>
     </w:p>
     <w:p>
@@ -14233,7 +14233,7 @@
               <w:rPr>
                 <w:sz w:val="17"/>
               </w:rPr>
-              <w:t>Haus ab ca. 33.000 € Umsatz im Plus; bei Ausfall der Gastro fehlen ca. 19.318 € pro Monat</w:t>
+              <w:t>Haus ab ca. 33.000 € Umsatz im Plus; bei Ausfall der Gastro fehlen ca. 28.659 € pro Monat</w:t>
             </w:r>
           </w:p>
         </w:tc>

</xml_diff>

<commit_message>
Neue Renderings für 12 Wohnungen (Außen, Wohnungen innen, Balkon) mit einheitlichen Fassadendetails, neue Folie Die Wohnungen
Co-Authored-By: Claude Sonnet 5.5 <noreply@anthropic.com>
Claude-Session: https://claude.ai/code/session_01HJGZfxHv7bzYyqdLwg8aFJ
</commit_message>
<xml_diff>
--- a/praesentation/Businessplan_Baufeld3_Neue-Mitte-Werlte.docx
+++ b/praesentation/Businessplan_Baufeld3_Neue-Mitte-Werlte.docx
@@ -2076,6 +2076,114 @@
       <w:pPr>
         <w:spacing w:after="40"/>
       </w:pPr>
+    </w:p>
+    <w:tbl>
+      <w:tblPr>
+        <w:tblW w:type="auto" w:w="0"/>
+        <w:tblLook w:firstColumn="1" w:firstRow="1" w:lastColumn="0" w:lastRow="0" w:noHBand="0" w:noVBand="1" w:val="04A0"/>
+      </w:tblPr>
+      <w:tblGrid>
+        <w:gridCol w:w="4706"/>
+        <w:gridCol w:w="4706"/>
+      </w:tblGrid>
+      <w:tr>
+        <w:tc>
+          <w:tcPr>
+            <w:tcW w:type="dxa" w:w="4706"/>
+          </w:tcPr>
+          <w:p>
+            <w:r>
+              <w:drawing>
+                <wp:inline xmlns:a="http://schemas.openxmlformats.org/drawingml/2006/main" xmlns:pic="http://schemas.openxmlformats.org/drawingml/2006/picture">
+                  <wp:extent cx="2880000" cy="1607040"/>
+                  <wp:docPr id="2" name="Picture 2"/>
+                  <wp:cNvGraphicFramePr>
+                    <a:graphicFrameLocks noChangeAspect="1"/>
+                  </wp:cNvGraphicFramePr>
+                  <a:graphic>
+                    <a:graphicData uri="http://schemas.openxmlformats.org/drawingml/2006/picture">
+                      <pic:pic>
+                        <pic:nvPicPr>
+                          <pic:cNvPr id="0" name="ki_wohnung_og.jpg"/>
+                          <pic:cNvPicPr/>
+                        </pic:nvPicPr>
+                        <pic:blipFill>
+                          <a:blip r:embed="rId11"/>
+                          <a:stretch>
+                            <a:fillRect/>
+                          </a:stretch>
+                        </pic:blipFill>
+                        <pic:spPr>
+                          <a:xfrm>
+                            <a:off x="0" y="0"/>
+                            <a:ext cx="2880000" cy="1607040"/>
+                          </a:xfrm>
+                          <a:prstGeom prst="rect"/>
+                        </pic:spPr>
+                      </pic:pic>
+                    </a:graphicData>
+                  </a:graphic>
+                </wp:inline>
+              </w:drawing>
+            </w:r>
+          </w:p>
+        </w:tc>
+        <w:tc>
+          <w:tcPr>
+            <w:tcW w:type="dxa" w:w="4706"/>
+          </w:tcPr>
+          <w:p>
+            <w:r>
+              <w:drawing>
+                <wp:inline xmlns:a="http://schemas.openxmlformats.org/drawingml/2006/main" xmlns:pic="http://schemas.openxmlformats.org/drawingml/2006/picture">
+                  <wp:extent cx="2880000" cy="1607040"/>
+                  <wp:docPr id="3" name="Picture 3"/>
+                  <wp:cNvGraphicFramePr>
+                    <a:graphicFrameLocks noChangeAspect="1"/>
+                  </wp:cNvGraphicFramePr>
+                  <a:graphic>
+                    <a:graphicData uri="http://schemas.openxmlformats.org/drawingml/2006/picture">
+                      <pic:pic>
+                        <pic:nvPicPr>
+                          <pic:cNvPr id="0" name="ki_wohnung_staffel.jpg"/>
+                          <pic:cNvPicPr/>
+                        </pic:nvPicPr>
+                        <pic:blipFill>
+                          <a:blip r:embed="rId12"/>
+                          <a:stretch>
+                            <a:fillRect/>
+                          </a:stretch>
+                        </pic:blipFill>
+                        <pic:spPr>
+                          <a:xfrm>
+                            <a:off x="0" y="0"/>
+                            <a:ext cx="2880000" cy="1607040"/>
+                          </a:xfrm>
+                          <a:prstGeom prst="rect"/>
+                        </pic:spPr>
+                      </pic:pic>
+                    </a:graphicData>
+                  </a:graphic>
+                </wp:inline>
+              </w:drawing>
+            </w:r>
+          </w:p>
+        </w:tc>
+      </w:tr>
+    </w:tbl>
+    <w:p>
+      <w:pPr>
+        <w:spacing w:after="120"/>
+      </w:pPr>
+      <w:r>
+        <w:rPr>
+          <w:b w:val="0"/>
+          <w:i/>
+          <w:color w:val="5B6770"/>
+          <w:sz w:val="17"/>
+        </w:rPr>
+        <w:t>Renderings der Wohnungen: links 1. OG (ca. 64 m², Balkon), rechts Staffelgeschoss in Holzbau (ca. 48 m², Dachterrasse). Zur Orientierung, keine Planung.</w:t>
+      </w:r>
     </w:p>
     <w:p>
       <w:pPr>

</xml_diff>